<commit_message>
Add database connection and sign-in (plain layout)
- Company.Shared: User, LoginLog, PasswordRequest models and AppDbContext
  (EF Core + Npgsql); DateTime mapped to plain timestamp.
- OfficeApp: per-PC DbSettings (DPAPI-encrypted password) with a Database
  Settings window shown on first run or when the DB can't be reached.
- AuthService: case-insensitive usernames, lock after 5 wrong passwords,
  disabled/locked checks, every attempt logged with the PC name.
- Plain left-aligned LoginForm and a placeholder MainForm with Sign Out;
  Form1 template removed.
- Guides: Developer Guide chapters 7-8, User Manual sign-in section,
  UI Elements Guide adds the Database Settings window.

Co-Authored-By: Claude Opus 5.5 <noreply@anthropic.com>
</commit_message>
<xml_diff>
--- a/docs/User Manual.docx
+++ b/docs/User Manual.docx
@@ -641,14 +641,61 @@
         <w:rPr>
           <w:rFonts w:ascii="Calibri" w:eastAsia="Times New Roman" w:hAnsi="Calibri" w:cs="Calibri"/>
         </w:rPr>
-        <w:t xml:space="preserve">3. Signing in and out </w:t>
-      </w:r>
-      <w:r>
-        <w:rPr>
-          <w:rStyle w:val="Emphasis"/>
-          <w:rFonts w:ascii="Calibri" w:eastAsia="Times New Roman" w:hAnsi="Calibri" w:cs="Calibri"/>
-        </w:rPr>
-        <w:t>(coming soon)</w:t>
+        <w:t>3. Signing in and out</w:t>
+      </w:r>
+    </w:p>
+    <w:p>
+      <w:pPr>
+        <w:pStyle w:val="Heading2"/>
+        <w:rPr>
+          <w:rFonts w:ascii="Calibri" w:eastAsia="Times New Roman" w:hAnsi="Calibri" w:cs="Calibri"/>
+        </w:rPr>
+      </w:pPr>
+      <w:r>
+        <w:rPr>
+          <w:rFonts w:ascii="Calibri" w:eastAsia="Times New Roman" w:hAnsi="Calibri" w:cs="Calibri"/>
+        </w:rPr>
+        <w:t>First time on a computer: Database Settings</w:t>
+      </w:r>
+    </w:p>
+    <w:p>
+      <w:pPr>
+        <w:pStyle w:val="NormalWeb"/>
+        <w:rPr>
+          <w:rFonts w:ascii="Calibri" w:hAnsi="Calibri" w:cs="Calibri"/>
+          <w:color w:val="1A1A1A"/>
+          <w:sz w:val="22"/>
+          <w:szCs w:val="22"/>
+        </w:rPr>
+      </w:pPr>
+      <w:r>
+        <w:rPr>
+          <w:rFonts w:ascii="Calibri" w:hAnsi="Calibri" w:cs="Calibri"/>
+          <w:color w:val="1A1A1A"/>
+          <w:sz w:val="22"/>
+          <w:szCs w:val="22"/>
+        </w:rPr>
+        <w:lastRenderedPageBreak/>
+        <w:t xml:space="preserve">The first time the app opens on a computer (or if it can't find the database), the </w:t>
+      </w:r>
+      <w:r>
+        <w:rPr>
+          <w:rStyle w:val="Strong"/>
+          <w:rFonts w:ascii="Calibri" w:hAnsi="Calibri" w:cs="Calibri"/>
+          <w:color w:val="1A1A1A"/>
+          <w:sz w:val="22"/>
+          <w:szCs w:val="22"/>
+        </w:rPr>
+        <w:t>Database Settings</w:t>
+      </w:r>
+      <w:r>
+        <w:rPr>
+          <w:rFonts w:ascii="Calibri" w:hAnsi="Calibri" w:cs="Calibri"/>
+          <w:color w:val="1A1A1A"/>
+          <w:sz w:val="22"/>
+          <w:szCs w:val="22"/>
+        </w:rPr>
+        <w:t xml:space="preserve"> window appears. Ask your Admin for the values.</w:t>
       </w:r>
     </w:p>
     <w:p>
@@ -673,16 +720,48 @@
           <w:sz w:val="22"/>
           <w:szCs w:val="22"/>
         </w:rPr>
-        <w:t>One sign in</w:t>
-      </w:r>
-      <w:r>
-        <w:rPr>
-          <w:rFonts w:ascii="Calibri" w:eastAsia="Times New Roman" w:hAnsi="Calibri" w:cs="Calibri"/>
-          <w:color w:val="1A1A1A"/>
-          <w:sz w:val="22"/>
-          <w:szCs w:val="22"/>
-        </w:rPr>
-        <w:t xml:space="preserve"> for the whole app.</w:t>
+        <w:t>Server address:</w:t>
+      </w:r>
+      <w:r>
+        <w:rPr>
+          <w:rFonts w:ascii="Calibri" w:eastAsia="Times New Roman" w:hAnsi="Calibri" w:cs="Calibri"/>
+          <w:color w:val="1A1A1A"/>
+          <w:sz w:val="22"/>
+          <w:szCs w:val="22"/>
+        </w:rPr>
+        <w:t xml:space="preserve"> </w:t>
+      </w:r>
+      <w:r>
+        <w:rPr>
+          <w:rStyle w:val="HTMLCode"/>
+          <w:color w:val="1A1A1A"/>
+        </w:rPr>
+        <w:t>localhost</w:t>
+      </w:r>
+      <w:r>
+        <w:rPr>
+          <w:rFonts w:ascii="Calibri" w:eastAsia="Times New Roman" w:hAnsi="Calibri" w:cs="Calibri"/>
+          <w:color w:val="1A1A1A"/>
+          <w:sz w:val="22"/>
+          <w:szCs w:val="22"/>
+        </w:rPr>
+        <w:t xml:space="preserve"> on the development PC; the office server address (e.g. </w:t>
+      </w:r>
+      <w:r>
+        <w:rPr>
+          <w:rStyle w:val="HTMLCode"/>
+          <w:color w:val="1A1A1A"/>
+        </w:rPr>
+        <w:t>192.168.1.50</w:t>
+      </w:r>
+      <w:r>
+        <w:rPr>
+          <w:rFonts w:ascii="Calibri" w:eastAsia="Times New Roman" w:hAnsi="Calibri" w:cs="Calibri"/>
+          <w:color w:val="1A1A1A"/>
+          <w:sz w:val="22"/>
+          <w:szCs w:val="22"/>
+        </w:rPr>
+        <w:t>) in the office.</w:t>
       </w:r>
     </w:p>
     <w:p>
@@ -707,16 +786,32 @@
           <w:sz w:val="22"/>
           <w:szCs w:val="22"/>
         </w:rPr>
-        <w:t>5 wrong passwords</w:t>
-      </w:r>
-      <w:r>
-        <w:rPr>
-          <w:rFonts w:ascii="Calibri" w:eastAsia="Times New Roman" w:hAnsi="Calibri" w:cs="Calibri"/>
-          <w:color w:val="1A1A1A"/>
-          <w:sz w:val="22"/>
-          <w:szCs w:val="22"/>
-        </w:rPr>
-        <w:t xml:space="preserve"> lock the account. Only an Admin can unlock it.</w:t>
+        <w:t>Port:</w:t>
+      </w:r>
+      <w:r>
+        <w:rPr>
+          <w:rFonts w:ascii="Calibri" w:eastAsia="Times New Roman" w:hAnsi="Calibri" w:cs="Calibri"/>
+          <w:color w:val="1A1A1A"/>
+          <w:sz w:val="22"/>
+          <w:szCs w:val="22"/>
+        </w:rPr>
+        <w:t xml:space="preserve"> leave </w:t>
+      </w:r>
+      <w:r>
+        <w:rPr>
+          <w:rStyle w:val="HTMLCode"/>
+          <w:color w:val="1A1A1A"/>
+        </w:rPr>
+        <w:t>5432</w:t>
+      </w:r>
+      <w:r>
+        <w:rPr>
+          <w:rFonts w:ascii="Calibri" w:eastAsia="Times New Roman" w:hAnsi="Calibri" w:cs="Calibri"/>
+          <w:color w:val="1A1A1A"/>
+          <w:sz w:val="22"/>
+          <w:szCs w:val="22"/>
+        </w:rPr>
+        <w:t>.</w:t>
       </w:r>
     </w:p>
     <w:p>
@@ -741,36 +836,32 @@
           <w:sz w:val="22"/>
           <w:szCs w:val="22"/>
         </w:rPr>
-        <w:lastRenderedPageBreak/>
-        <w:t>Forgot your password?</w:t>
-      </w:r>
-      <w:r>
-        <w:rPr>
-          <w:rFonts w:ascii="Calibri" w:eastAsia="Times New Roman" w:hAnsi="Calibri" w:cs="Calibri"/>
-          <w:color w:val="1A1A1A"/>
-          <w:sz w:val="22"/>
-          <w:szCs w:val="22"/>
-        </w:rPr>
-        <w:t xml:space="preserve"> Click </w:t>
-      </w:r>
-      <w:r>
-        <w:rPr>
-          <w:rStyle w:val="Emphasis"/>
-          <w:rFonts w:ascii="Calibri" w:eastAsia="Times New Roman" w:hAnsi="Calibri" w:cs="Calibri"/>
-          <w:color w:val="1A1A1A"/>
-          <w:sz w:val="22"/>
-          <w:szCs w:val="22"/>
-        </w:rPr>
-        <w:t>Forgot Password</w:t>
-      </w:r>
-      <w:r>
-        <w:rPr>
-          <w:rFonts w:ascii="Calibri" w:eastAsia="Times New Roman" w:hAnsi="Calibri" w:cs="Calibri"/>
-          <w:color w:val="1A1A1A"/>
-          <w:sz w:val="22"/>
-          <w:szCs w:val="22"/>
-        </w:rPr>
-        <w:t xml:space="preserve"> and type your username. The Admins get a request and will give you a new password in person. (Admins use their security question instead.)</w:t>
+        <w:t>Database name:</w:t>
+      </w:r>
+      <w:r>
+        <w:rPr>
+          <w:rFonts w:ascii="Calibri" w:eastAsia="Times New Roman" w:hAnsi="Calibri" w:cs="Calibri"/>
+          <w:color w:val="1A1A1A"/>
+          <w:sz w:val="22"/>
+          <w:szCs w:val="22"/>
+        </w:rPr>
+        <w:t xml:space="preserve"> </w:t>
+      </w:r>
+      <w:r>
+        <w:rPr>
+          <w:rStyle w:val="HTMLCode"/>
+          <w:color w:val="1A1A1A"/>
+        </w:rPr>
+        <w:t>construction_db</w:t>
+      </w:r>
+      <w:r>
+        <w:rPr>
+          <w:rFonts w:ascii="Calibri" w:eastAsia="Times New Roman" w:hAnsi="Calibri" w:cs="Calibri"/>
+          <w:color w:val="1A1A1A"/>
+          <w:sz w:val="22"/>
+          <w:szCs w:val="22"/>
+        </w:rPr>
+        <w:t>.</w:t>
       </w:r>
     </w:p>
     <w:p>
@@ -795,25 +886,16 @@
           <w:sz w:val="22"/>
           <w:szCs w:val="22"/>
         </w:rPr>
-        <w:t>Only Admins change passwords.</w:t>
-      </w:r>
-      <w:r>
-        <w:rPr>
-          <w:rFonts w:ascii="Calibri" w:eastAsia="Times New Roman" w:hAnsi="Calibri" w:cs="Calibri"/>
-          <w:color w:val="1A1A1A"/>
-          <w:sz w:val="22"/>
-          <w:szCs w:val="22"/>
-        </w:rPr>
-        <w:t xml:space="preserve"> </w:t>
-      </w:r>
-      <w:r>
-        <w:rPr>
-          <w:rFonts w:ascii="Calibri" w:eastAsia="Times New Roman" w:hAnsi="Calibri" w:cs="Calibri"/>
-          <w:color w:val="1A1A1A"/>
-          <w:sz w:val="22"/>
-          <w:szCs w:val="22"/>
-        </w:rPr>
-        <w:t>Employees and Supervisors can't change their own.</w:t>
+        <w:t>Database username / password:</w:t>
+      </w:r>
+      <w:r>
+        <w:rPr>
+          <w:rFonts w:ascii="Calibri" w:eastAsia="Times New Roman" w:hAnsi="Calibri" w:cs="Calibri"/>
+          <w:color w:val="1A1A1A"/>
+          <w:sz w:val="22"/>
+          <w:szCs w:val="22"/>
+        </w:rPr>
+        <w:t xml:space="preserve"> given by your Admin.</w:t>
       </w:r>
     </w:p>
     <w:p>
@@ -832,12 +914,908 @@
       </w:pPr>
       <w:r>
         <w:rPr>
+          <w:rFonts w:ascii="Calibri" w:eastAsia="Times New Roman" w:hAnsi="Calibri" w:cs="Calibri"/>
+          <w:color w:val="1A1A1A"/>
+          <w:sz w:val="22"/>
+          <w:szCs w:val="22"/>
+        </w:rPr>
+        <w:t xml:space="preserve">Click </w:t>
+      </w:r>
+      <w:r>
+        <w:rPr>
           <w:rStyle w:val="Strong"/>
           <w:rFonts w:ascii="Calibri" w:eastAsia="Times New Roman" w:hAnsi="Calibri" w:cs="Calibri"/>
           <w:color w:val="1A1A1A"/>
           <w:sz w:val="22"/>
           <w:szCs w:val="22"/>
         </w:rPr>
+        <w:t>Test Connection</w:t>
+      </w:r>
+      <w:r>
+        <w:rPr>
+          <w:rFonts w:ascii="Calibri" w:eastAsia="Times New Roman" w:hAnsi="Calibri" w:cs="Calibri"/>
+          <w:color w:val="1A1A1A"/>
+          <w:sz w:val="22"/>
+          <w:szCs w:val="22"/>
+        </w:rPr>
+        <w:t xml:space="preserve">. When it says </w:t>
+      </w:r>
+      <w:r>
+        <w:rPr>
+          <w:rStyle w:val="Emphasis"/>
+          <w:rFonts w:ascii="Calibri" w:eastAsia="Times New Roman" w:hAnsi="Calibri" w:cs="Calibri"/>
+          <w:color w:val="1A1A1A"/>
+          <w:sz w:val="22"/>
+          <w:szCs w:val="22"/>
+        </w:rPr>
+        <w:t>Connected.</w:t>
+      </w:r>
+      <w:r>
+        <w:rPr>
+          <w:rFonts w:ascii="Calibri" w:eastAsia="Times New Roman" w:hAnsi="Calibri" w:cs="Calibri"/>
+          <w:color w:val="1A1A1A"/>
+          <w:sz w:val="22"/>
+          <w:szCs w:val="22"/>
+        </w:rPr>
+        <w:t xml:space="preserve">, click </w:t>
+      </w:r>
+      <w:r>
+        <w:rPr>
+          <w:rStyle w:val="Strong"/>
+          <w:rFonts w:ascii="Calibri" w:eastAsia="Times New Roman" w:hAnsi="Calibri" w:cs="Calibri"/>
+          <w:color w:val="1A1A1A"/>
+          <w:sz w:val="22"/>
+          <w:szCs w:val="22"/>
+        </w:rPr>
+        <w:t>Save</w:t>
+      </w:r>
+      <w:r>
+        <w:rPr>
+          <w:rFonts w:ascii="Calibri" w:eastAsia="Times New Roman" w:hAnsi="Calibri" w:cs="Calibri"/>
+          <w:color w:val="1A1A1A"/>
+          <w:sz w:val="22"/>
+          <w:szCs w:val="22"/>
+        </w:rPr>
+        <w:t>.</w:t>
+      </w:r>
+    </w:p>
+    <w:p>
+      <w:pPr>
+        <w:pStyle w:val="NormalWeb"/>
+        <w:rPr>
+          <w:rFonts w:ascii="Calibri" w:hAnsi="Calibri" w:cs="Calibri"/>
+          <w:color w:val="1A1A1A"/>
+          <w:sz w:val="22"/>
+          <w:szCs w:val="22"/>
+        </w:rPr>
+      </w:pPr>
+      <w:r>
+        <w:rPr>
+          <w:rFonts w:ascii="Calibri" w:hAnsi="Calibri" w:cs="Calibri"/>
+          <w:color w:val="1A1A1A"/>
+          <w:sz w:val="22"/>
+          <w:szCs w:val="22"/>
+        </w:rPr>
+        <w:t xml:space="preserve">The settings are saved on that computer only. To change them later, click </w:t>
+      </w:r>
+      <w:r>
+        <w:rPr>
+          <w:rStyle w:val="Strong"/>
+          <w:rFonts w:ascii="Calibri" w:hAnsi="Calibri" w:cs="Calibri"/>
+          <w:color w:val="1A1A1A"/>
+          <w:sz w:val="22"/>
+          <w:szCs w:val="22"/>
+        </w:rPr>
+        <w:t>Database settings</w:t>
+      </w:r>
+      <w:r>
+        <w:rPr>
+          <w:rFonts w:ascii="Calibri" w:hAnsi="Calibri" w:cs="Calibri"/>
+          <w:color w:val="1A1A1A"/>
+          <w:sz w:val="22"/>
+          <w:szCs w:val="22"/>
+        </w:rPr>
+        <w:t xml:space="preserve"> on the Sign In window.</w:t>
+      </w:r>
+    </w:p>
+    <w:p>
+      <w:pPr>
+        <w:pStyle w:val="Heading2"/>
+        <w:rPr>
+          <w:rFonts w:ascii="Calibri" w:eastAsia="Times New Roman" w:hAnsi="Calibri" w:cs="Calibri"/>
+        </w:rPr>
+      </w:pPr>
+      <w:r>
+        <w:rPr>
+          <w:rFonts w:ascii="Calibri" w:eastAsia="Times New Roman" w:hAnsi="Calibri" w:cs="Calibri"/>
+        </w:rPr>
+        <w:t>Signing in</w:t>
+      </w:r>
+    </w:p>
+    <w:p>
+      <w:pPr>
+        <w:numPr>
+          <w:ilvl w:val="0"/>
+          <w:numId w:val="2"/>
+        </w:numPr>
+        <w:spacing w:before="100" w:beforeAutospacing="1" w:after="100" w:afterAutospacing="1"/>
+        <w:rPr>
+          <w:rFonts w:ascii="Calibri" w:eastAsia="Times New Roman" w:hAnsi="Calibri" w:cs="Calibri"/>
+          <w:color w:val="1A1A1A"/>
+          <w:sz w:val="22"/>
+          <w:szCs w:val="22"/>
+        </w:rPr>
+      </w:pPr>
+      <w:r>
+        <w:rPr>
+          <w:rFonts w:ascii="Calibri" w:eastAsia="Times New Roman" w:hAnsi="Calibri" w:cs="Calibri"/>
+          <w:color w:val="1A1A1A"/>
+          <w:sz w:val="22"/>
+          <w:szCs w:val="22"/>
+        </w:rPr>
+        <w:t xml:space="preserve">Type your </w:t>
+      </w:r>
+      <w:r>
+        <w:rPr>
+          <w:rStyle w:val="Strong"/>
+          <w:rFonts w:ascii="Calibri" w:eastAsia="Times New Roman" w:hAnsi="Calibri" w:cs="Calibri"/>
+          <w:color w:val="1A1A1A"/>
+          <w:sz w:val="22"/>
+          <w:szCs w:val="22"/>
+        </w:rPr>
+        <w:t>username</w:t>
+      </w:r>
+      <w:r>
+        <w:rPr>
+          <w:rFonts w:ascii="Calibri" w:eastAsia="Times New Roman" w:hAnsi="Calibri" w:cs="Calibri"/>
+          <w:color w:val="1A1A1A"/>
+          <w:sz w:val="22"/>
+          <w:szCs w:val="22"/>
+        </w:rPr>
+        <w:t xml:space="preserve"> (capital letters don't matter) and </w:t>
+      </w:r>
+      <w:r>
+        <w:rPr>
+          <w:rStyle w:val="Strong"/>
+          <w:rFonts w:ascii="Calibri" w:eastAsia="Times New Roman" w:hAnsi="Calibri" w:cs="Calibri"/>
+          <w:color w:val="1A1A1A"/>
+          <w:sz w:val="22"/>
+          <w:szCs w:val="22"/>
+        </w:rPr>
+        <w:t>password</w:t>
+      </w:r>
+      <w:r>
+        <w:rPr>
+          <w:rFonts w:ascii="Calibri" w:eastAsia="Times New Roman" w:hAnsi="Calibri" w:cs="Calibri"/>
+          <w:color w:val="1A1A1A"/>
+          <w:sz w:val="22"/>
+          <w:szCs w:val="22"/>
+        </w:rPr>
+        <w:t>.</w:t>
+      </w:r>
+    </w:p>
+    <w:p>
+      <w:pPr>
+        <w:numPr>
+          <w:ilvl w:val="0"/>
+          <w:numId w:val="2"/>
+        </w:numPr>
+        <w:spacing w:before="100" w:beforeAutospacing="1" w:after="100" w:afterAutospacing="1"/>
+        <w:rPr>
+          <w:rFonts w:ascii="Calibri" w:eastAsia="Times New Roman" w:hAnsi="Calibri" w:cs="Calibri"/>
+          <w:color w:val="1A1A1A"/>
+          <w:sz w:val="22"/>
+          <w:szCs w:val="22"/>
+        </w:rPr>
+      </w:pPr>
+      <w:r>
+        <w:rPr>
+          <w:rFonts w:ascii="Calibri" w:eastAsia="Times New Roman" w:hAnsi="Calibri" w:cs="Calibri"/>
+          <w:color w:val="1A1A1A"/>
+          <w:sz w:val="22"/>
+          <w:szCs w:val="22"/>
+        </w:rPr>
+        <w:t xml:space="preserve">Tick </w:t>
+      </w:r>
+      <w:r>
+        <w:rPr>
+          <w:rStyle w:val="Strong"/>
+          <w:rFonts w:ascii="Calibri" w:eastAsia="Times New Roman" w:hAnsi="Calibri" w:cs="Calibri"/>
+          <w:color w:val="1A1A1A"/>
+          <w:sz w:val="22"/>
+          <w:szCs w:val="22"/>
+        </w:rPr>
+        <w:t>Show password</w:t>
+      </w:r>
+      <w:r>
+        <w:rPr>
+          <w:rFonts w:ascii="Calibri" w:eastAsia="Times New Roman" w:hAnsi="Calibri" w:cs="Calibri"/>
+          <w:color w:val="1A1A1A"/>
+          <w:sz w:val="22"/>
+          <w:szCs w:val="22"/>
+        </w:rPr>
+        <w:t xml:space="preserve"> if you want to check what you typed.</w:t>
+      </w:r>
+    </w:p>
+    <w:p>
+      <w:pPr>
+        <w:numPr>
+          <w:ilvl w:val="0"/>
+          <w:numId w:val="2"/>
+        </w:numPr>
+        <w:spacing w:before="100" w:beforeAutospacing="1" w:after="100" w:afterAutospacing="1"/>
+        <w:rPr>
+          <w:rFonts w:ascii="Calibri" w:eastAsia="Times New Roman" w:hAnsi="Calibri" w:cs="Calibri"/>
+          <w:color w:val="1A1A1A"/>
+          <w:sz w:val="22"/>
+          <w:szCs w:val="22"/>
+        </w:rPr>
+      </w:pPr>
+      <w:r>
+        <w:rPr>
+          <w:rFonts w:ascii="Calibri" w:eastAsia="Times New Roman" w:hAnsi="Calibri" w:cs="Calibri"/>
+          <w:color w:val="1A1A1A"/>
+          <w:sz w:val="22"/>
+          <w:szCs w:val="22"/>
+        </w:rPr>
+        <w:t xml:space="preserve">Click </w:t>
+      </w:r>
+      <w:r>
+        <w:rPr>
+          <w:rStyle w:val="Strong"/>
+          <w:rFonts w:ascii="Calibri" w:eastAsia="Times New Roman" w:hAnsi="Calibri" w:cs="Calibri"/>
+          <w:color w:val="1A1A1A"/>
+          <w:sz w:val="22"/>
+          <w:szCs w:val="22"/>
+        </w:rPr>
+        <w:t>Sign In</w:t>
+      </w:r>
+      <w:r>
+        <w:rPr>
+          <w:rFonts w:ascii="Calibri" w:eastAsia="Times New Roman" w:hAnsi="Calibri" w:cs="Calibri"/>
+          <w:color w:val="1A1A1A"/>
+          <w:sz w:val="22"/>
+          <w:szCs w:val="22"/>
+        </w:rPr>
+        <w:t xml:space="preserve"> (or press Enter).</w:t>
+      </w:r>
+    </w:p>
+    <w:p>
+      <w:pPr>
+        <w:pStyle w:val="NormalWeb"/>
+        <w:rPr>
+          <w:rFonts w:ascii="Calibri" w:hAnsi="Calibri" w:cs="Calibri"/>
+          <w:color w:val="1A1A1A"/>
+          <w:sz w:val="22"/>
+          <w:szCs w:val="22"/>
+        </w:rPr>
+      </w:pPr>
+      <w:r>
+        <w:rPr>
+          <w:rFonts w:ascii="Calibri" w:hAnsi="Calibri" w:cs="Calibri"/>
+          <w:color w:val="1A1A1A"/>
+          <w:sz w:val="22"/>
+          <w:szCs w:val="22"/>
+        </w:rPr>
+        <w:t>If it doesn't work, the message under the password box tells you why:</w:t>
+      </w:r>
+    </w:p>
+    <w:tbl>
+      <w:tblPr>
+        <w:tblW w:w="0" w:type="auto"/>
+        <w:tblCellMar>
+          <w:top w:w="15" w:type="dxa"/>
+          <w:left w:w="15" w:type="dxa"/>
+          <w:bottom w:w="15" w:type="dxa"/>
+          <w:right w:w="15" w:type="dxa"/>
+        </w:tblCellMar>
+        <w:tblLook w:val="04A0" w:firstRow="1" w:lastRow="0" w:firstColumn="1" w:lastColumn="0" w:noHBand="0" w:noVBand="1"/>
+      </w:tblPr>
+      <w:tblGrid>
+        <w:gridCol w:w="4327"/>
+        <w:gridCol w:w="5017"/>
+      </w:tblGrid>
+      <w:tr>
+        <w:trPr>
+          <w:tblHeader/>
+        </w:trPr>
+        <w:tc>
+          <w:tcPr>
+            <w:tcW w:w="0" w:type="auto"/>
+            <w:tcBorders>
+              <w:top w:val="single" w:sz="6" w:space="0" w:color="BFBFBF"/>
+              <w:left w:val="single" w:sz="6" w:space="0" w:color="BFBFBF"/>
+              <w:bottom w:val="single" w:sz="6" w:space="0" w:color="BFBFBF"/>
+              <w:right w:val="single" w:sz="6" w:space="0" w:color="BFBFBF"/>
+            </w:tcBorders>
+            <w:shd w:val="clear" w:color="auto" w:fill="1F3864"/>
+            <w:tcMar>
+              <w:top w:w="60" w:type="dxa"/>
+              <w:left w:w="120" w:type="dxa"/>
+              <w:bottom w:w="60" w:type="dxa"/>
+              <w:right w:w="120" w:type="dxa"/>
+            </w:tcMar>
+            <w:vAlign w:val="center"/>
+            <w:hideMark/>
+          </w:tcPr>
+          <w:p>
+            <w:pPr>
+              <w:spacing w:before="120" w:after="120"/>
+              <w:rPr>
+                <w:rFonts w:ascii="Calibri" w:eastAsia="Times New Roman" w:hAnsi="Calibri" w:cs="Calibri"/>
+                <w:b/>
+                <w:bCs/>
+                <w:color w:val="FFFFFF"/>
+                <w:sz w:val="22"/>
+                <w:szCs w:val="22"/>
+              </w:rPr>
+            </w:pPr>
+            <w:r>
+              <w:rPr>
+                <w:rFonts w:ascii="Calibri" w:eastAsia="Times New Roman" w:hAnsi="Calibri" w:cs="Calibri"/>
+                <w:b/>
+                <w:bCs/>
+                <w:color w:val="FFFFFF"/>
+                <w:sz w:val="22"/>
+                <w:szCs w:val="22"/>
+              </w:rPr>
+              <w:t>Message</w:t>
+            </w:r>
+          </w:p>
+        </w:tc>
+        <w:tc>
+          <w:tcPr>
+            <w:tcW w:w="0" w:type="auto"/>
+            <w:tcBorders>
+              <w:top w:val="single" w:sz="6" w:space="0" w:color="BFBFBF"/>
+              <w:left w:val="single" w:sz="6" w:space="0" w:color="BFBFBF"/>
+              <w:bottom w:val="single" w:sz="6" w:space="0" w:color="BFBFBF"/>
+              <w:right w:val="single" w:sz="6" w:space="0" w:color="BFBFBF"/>
+            </w:tcBorders>
+            <w:shd w:val="clear" w:color="auto" w:fill="1F3864"/>
+            <w:tcMar>
+              <w:top w:w="60" w:type="dxa"/>
+              <w:left w:w="120" w:type="dxa"/>
+              <w:bottom w:w="60" w:type="dxa"/>
+              <w:right w:w="120" w:type="dxa"/>
+            </w:tcMar>
+            <w:vAlign w:val="center"/>
+            <w:hideMark/>
+          </w:tcPr>
+          <w:p>
+            <w:pPr>
+              <w:spacing w:before="120" w:after="120"/>
+              <w:rPr>
+                <w:rFonts w:ascii="Calibri" w:eastAsia="Times New Roman" w:hAnsi="Calibri" w:cs="Calibri"/>
+                <w:b/>
+                <w:bCs/>
+                <w:color w:val="FFFFFF"/>
+                <w:sz w:val="22"/>
+                <w:szCs w:val="22"/>
+              </w:rPr>
+            </w:pPr>
+            <w:r>
+              <w:rPr>
+                <w:rFonts w:ascii="Calibri" w:eastAsia="Times New Roman" w:hAnsi="Calibri" w:cs="Calibri"/>
+                <w:b/>
+                <w:bCs/>
+                <w:color w:val="FFFFFF"/>
+                <w:sz w:val="22"/>
+                <w:szCs w:val="22"/>
+              </w:rPr>
+              <w:t>Meaning</w:t>
+            </w:r>
+          </w:p>
+        </w:tc>
+      </w:tr>
+      <w:tr>
+        <w:tc>
+          <w:tcPr>
+            <w:tcW w:w="0" w:type="auto"/>
+            <w:tcBorders>
+              <w:top w:val="single" w:sz="6" w:space="0" w:color="BFBFBF"/>
+              <w:left w:val="single" w:sz="6" w:space="0" w:color="BFBFBF"/>
+              <w:bottom w:val="single" w:sz="6" w:space="0" w:color="BFBFBF"/>
+              <w:right w:val="single" w:sz="6" w:space="0" w:color="BFBFBF"/>
+            </w:tcBorders>
+            <w:tcMar>
+              <w:top w:w="60" w:type="dxa"/>
+              <w:left w:w="120" w:type="dxa"/>
+              <w:bottom w:w="60" w:type="dxa"/>
+              <w:right w:w="120" w:type="dxa"/>
+            </w:tcMar>
+            <w:hideMark/>
+          </w:tcPr>
+          <w:p>
+            <w:pPr>
+              <w:spacing w:before="120" w:after="120"/>
+              <w:rPr>
+                <w:rFonts w:ascii="Calibri" w:eastAsia="Times New Roman" w:hAnsi="Calibri" w:cs="Calibri"/>
+                <w:color w:val="1A1A1A"/>
+                <w:sz w:val="22"/>
+                <w:szCs w:val="22"/>
+              </w:rPr>
+            </w:pPr>
+            <w:r>
+              <w:rPr>
+                <w:rFonts w:ascii="Calibri" w:eastAsia="Times New Roman" w:hAnsi="Calibri" w:cs="Calibri"/>
+                <w:color w:val="1A1A1A"/>
+                <w:sz w:val="22"/>
+                <w:szCs w:val="22"/>
+              </w:rPr>
+              <w:t xml:space="preserve">Wrong username or password. </w:t>
+            </w:r>
+            <w:r>
+              <w:rPr>
+                <w:rStyle w:val="Emphasis"/>
+                <w:rFonts w:ascii="Calibri" w:eastAsia="Times New Roman" w:hAnsi="Calibri" w:cs="Calibri"/>
+                <w:color w:val="1A1A1A"/>
+                <w:sz w:val="22"/>
+                <w:szCs w:val="22"/>
+              </w:rPr>
+              <w:t>N</w:t>
+            </w:r>
+            <w:r>
+              <w:rPr>
+                <w:rFonts w:ascii="Calibri" w:eastAsia="Times New Roman" w:hAnsi="Calibri" w:cs="Calibri"/>
+                <w:color w:val="1A1A1A"/>
+                <w:sz w:val="22"/>
+                <w:szCs w:val="22"/>
+              </w:rPr>
+              <w:t xml:space="preserve"> attempts left...</w:t>
+            </w:r>
+          </w:p>
+        </w:tc>
+        <w:tc>
+          <w:tcPr>
+            <w:tcW w:w="0" w:type="auto"/>
+            <w:tcBorders>
+              <w:top w:val="single" w:sz="6" w:space="0" w:color="BFBFBF"/>
+              <w:left w:val="single" w:sz="6" w:space="0" w:color="BFBFBF"/>
+              <w:bottom w:val="single" w:sz="6" w:space="0" w:color="BFBFBF"/>
+              <w:right w:val="single" w:sz="6" w:space="0" w:color="BFBFBF"/>
+            </w:tcBorders>
+            <w:tcMar>
+              <w:top w:w="60" w:type="dxa"/>
+              <w:left w:w="120" w:type="dxa"/>
+              <w:bottom w:w="60" w:type="dxa"/>
+              <w:right w:w="120" w:type="dxa"/>
+            </w:tcMar>
+            <w:hideMark/>
+          </w:tcPr>
+          <w:p>
+            <w:pPr>
+              <w:spacing w:before="120" w:after="120"/>
+              <w:rPr>
+                <w:rFonts w:ascii="Calibri" w:eastAsia="Times New Roman" w:hAnsi="Calibri" w:cs="Calibri"/>
+                <w:color w:val="1A1A1A"/>
+                <w:sz w:val="22"/>
+                <w:szCs w:val="22"/>
+              </w:rPr>
+            </w:pPr>
+            <w:r>
+              <w:rPr>
+                <w:rFonts w:ascii="Calibri" w:eastAsia="Times New Roman" w:hAnsi="Calibri" w:cs="Calibri"/>
+                <w:color w:val="1A1A1A"/>
+                <w:sz w:val="22"/>
+                <w:szCs w:val="22"/>
+              </w:rPr>
+              <w:t>Try again carefully. After 5 wrong tries the account locks.</w:t>
+            </w:r>
+          </w:p>
+        </w:tc>
+      </w:tr>
+      <w:tr>
+        <w:tc>
+          <w:tcPr>
+            <w:tcW w:w="0" w:type="auto"/>
+            <w:tcBorders>
+              <w:top w:val="single" w:sz="6" w:space="0" w:color="BFBFBF"/>
+              <w:left w:val="single" w:sz="6" w:space="0" w:color="BFBFBF"/>
+              <w:bottom w:val="single" w:sz="6" w:space="0" w:color="BFBFBF"/>
+              <w:right w:val="single" w:sz="6" w:space="0" w:color="BFBFBF"/>
+            </w:tcBorders>
+            <w:tcMar>
+              <w:top w:w="60" w:type="dxa"/>
+              <w:left w:w="120" w:type="dxa"/>
+              <w:bottom w:w="60" w:type="dxa"/>
+              <w:right w:w="120" w:type="dxa"/>
+            </w:tcMar>
+            <w:hideMark/>
+          </w:tcPr>
+          <w:p>
+            <w:pPr>
+              <w:spacing w:before="120" w:after="120"/>
+              <w:rPr>
+                <w:rFonts w:ascii="Calibri" w:eastAsia="Times New Roman" w:hAnsi="Calibri" w:cs="Calibri"/>
+                <w:color w:val="1A1A1A"/>
+                <w:sz w:val="22"/>
+                <w:szCs w:val="22"/>
+              </w:rPr>
+            </w:pPr>
+            <w:r>
+              <w:rPr>
+                <w:rFonts w:ascii="Calibri" w:eastAsia="Times New Roman" w:hAnsi="Calibri" w:cs="Calibri"/>
+                <w:color w:val="1A1A1A"/>
+                <w:sz w:val="22"/>
+                <w:szCs w:val="22"/>
+              </w:rPr>
+              <w:t>This account is locked...</w:t>
+            </w:r>
+          </w:p>
+        </w:tc>
+        <w:tc>
+          <w:tcPr>
+            <w:tcW w:w="0" w:type="auto"/>
+            <w:tcBorders>
+              <w:top w:val="single" w:sz="6" w:space="0" w:color="BFBFBF"/>
+              <w:left w:val="single" w:sz="6" w:space="0" w:color="BFBFBF"/>
+              <w:bottom w:val="single" w:sz="6" w:space="0" w:color="BFBFBF"/>
+              <w:right w:val="single" w:sz="6" w:space="0" w:color="BFBFBF"/>
+            </w:tcBorders>
+            <w:tcMar>
+              <w:top w:w="60" w:type="dxa"/>
+              <w:left w:w="120" w:type="dxa"/>
+              <w:bottom w:w="60" w:type="dxa"/>
+              <w:right w:w="120" w:type="dxa"/>
+            </w:tcMar>
+            <w:hideMark/>
+          </w:tcPr>
+          <w:p>
+            <w:pPr>
+              <w:spacing w:before="120" w:after="120"/>
+              <w:rPr>
+                <w:rFonts w:ascii="Calibri" w:eastAsia="Times New Roman" w:hAnsi="Calibri" w:cs="Calibri"/>
+                <w:color w:val="1A1A1A"/>
+                <w:sz w:val="22"/>
+                <w:szCs w:val="22"/>
+              </w:rPr>
+            </w:pPr>
+            <w:r>
+              <w:rPr>
+                <w:rFonts w:ascii="Calibri" w:eastAsia="Times New Roman" w:hAnsi="Calibri" w:cs="Calibri"/>
+                <w:color w:val="1A1A1A"/>
+                <w:sz w:val="22"/>
+                <w:szCs w:val="22"/>
+              </w:rPr>
+              <w:t>Ask an Admin to unlock it.</w:t>
+            </w:r>
+          </w:p>
+        </w:tc>
+      </w:tr>
+      <w:tr>
+        <w:tc>
+          <w:tcPr>
+            <w:tcW w:w="0" w:type="auto"/>
+            <w:tcBorders>
+              <w:top w:val="single" w:sz="6" w:space="0" w:color="BFBFBF"/>
+              <w:left w:val="single" w:sz="6" w:space="0" w:color="BFBFBF"/>
+              <w:bottom w:val="single" w:sz="6" w:space="0" w:color="BFBFBF"/>
+              <w:right w:val="single" w:sz="6" w:space="0" w:color="BFBFBF"/>
+            </w:tcBorders>
+            <w:tcMar>
+              <w:top w:w="60" w:type="dxa"/>
+              <w:left w:w="120" w:type="dxa"/>
+              <w:bottom w:w="60" w:type="dxa"/>
+              <w:right w:w="120" w:type="dxa"/>
+            </w:tcMar>
+            <w:hideMark/>
+          </w:tcPr>
+          <w:p>
+            <w:pPr>
+              <w:spacing w:before="120" w:after="120"/>
+              <w:rPr>
+                <w:rFonts w:ascii="Calibri" w:eastAsia="Times New Roman" w:hAnsi="Calibri" w:cs="Calibri"/>
+                <w:color w:val="1A1A1A"/>
+                <w:sz w:val="22"/>
+                <w:szCs w:val="22"/>
+              </w:rPr>
+            </w:pPr>
+            <w:r>
+              <w:rPr>
+                <w:rFonts w:ascii="Calibri" w:eastAsia="Times New Roman" w:hAnsi="Calibri" w:cs="Calibri"/>
+                <w:color w:val="1A1A1A"/>
+                <w:sz w:val="22"/>
+                <w:szCs w:val="22"/>
+              </w:rPr>
+              <w:t>This account is turned off...</w:t>
+            </w:r>
+          </w:p>
+        </w:tc>
+        <w:tc>
+          <w:tcPr>
+            <w:tcW w:w="0" w:type="auto"/>
+            <w:tcBorders>
+              <w:top w:val="single" w:sz="6" w:space="0" w:color="BFBFBF"/>
+              <w:left w:val="single" w:sz="6" w:space="0" w:color="BFBFBF"/>
+              <w:bottom w:val="single" w:sz="6" w:space="0" w:color="BFBFBF"/>
+              <w:right w:val="single" w:sz="6" w:space="0" w:color="BFBFBF"/>
+            </w:tcBorders>
+            <w:tcMar>
+              <w:top w:w="60" w:type="dxa"/>
+              <w:left w:w="120" w:type="dxa"/>
+              <w:bottom w:w="60" w:type="dxa"/>
+              <w:right w:w="120" w:type="dxa"/>
+            </w:tcMar>
+            <w:hideMark/>
+          </w:tcPr>
+          <w:p>
+            <w:pPr>
+              <w:spacing w:before="120" w:after="120"/>
+              <w:rPr>
+                <w:rFonts w:ascii="Calibri" w:eastAsia="Times New Roman" w:hAnsi="Calibri" w:cs="Calibri"/>
+                <w:color w:val="1A1A1A"/>
+                <w:sz w:val="22"/>
+                <w:szCs w:val="22"/>
+              </w:rPr>
+            </w:pPr>
+            <w:r>
+              <w:rPr>
+                <w:rFonts w:ascii="Calibri" w:eastAsia="Times New Roman" w:hAnsi="Calibri" w:cs="Calibri"/>
+                <w:color w:val="1A1A1A"/>
+                <w:sz w:val="22"/>
+                <w:szCs w:val="22"/>
+              </w:rPr>
+              <w:t>Your account was disabled. Ask an Admin.</w:t>
+            </w:r>
+          </w:p>
+        </w:tc>
+      </w:tr>
+    </w:tbl>
+    <w:p>
+      <w:pPr>
+        <w:pStyle w:val="Heading2"/>
+        <w:rPr>
+          <w:rFonts w:ascii="Calibri" w:eastAsia="Times New Roman" w:hAnsi="Calibri" w:cs="Calibri"/>
+        </w:rPr>
+      </w:pPr>
+      <w:r>
+        <w:rPr>
+          <w:rFonts w:ascii="Calibri" w:eastAsia="Times New Roman" w:hAnsi="Calibri" w:cs="Calibri"/>
+        </w:rPr>
+        <w:t>Signing out</w:t>
+      </w:r>
+    </w:p>
+    <w:p>
+      <w:pPr>
+        <w:pStyle w:val="NormalWeb"/>
+        <w:rPr>
+          <w:rFonts w:ascii="Calibri" w:hAnsi="Calibri" w:cs="Calibri"/>
+          <w:color w:val="1A1A1A"/>
+          <w:sz w:val="22"/>
+          <w:szCs w:val="22"/>
+        </w:rPr>
+      </w:pPr>
+      <w:r>
+        <w:rPr>
+          <w:rFonts w:ascii="Calibri" w:hAnsi="Calibri" w:cs="Calibri"/>
+          <w:color w:val="1A1A1A"/>
+          <w:sz w:val="22"/>
+          <w:szCs w:val="22"/>
+        </w:rPr>
+        <w:t xml:space="preserve">Click </w:t>
+      </w:r>
+      <w:r>
+        <w:rPr>
+          <w:rStyle w:val="Strong"/>
+          <w:rFonts w:ascii="Calibri" w:hAnsi="Calibri" w:cs="Calibri"/>
+          <w:color w:val="1A1A1A"/>
+          <w:sz w:val="22"/>
+          <w:szCs w:val="22"/>
+        </w:rPr>
+        <w:t>Sign Out</w:t>
+      </w:r>
+      <w:r>
+        <w:rPr>
+          <w:rFonts w:ascii="Calibri" w:hAnsi="Calibri" w:cs="Calibri"/>
+          <w:color w:val="1A1A1A"/>
+          <w:sz w:val="22"/>
+          <w:szCs w:val="22"/>
+        </w:rPr>
+        <w:t>, or close the window. Both are recorded.</w:t>
+      </w:r>
+    </w:p>
+    <w:p>
+      <w:pPr>
+        <w:pStyle w:val="Heading2"/>
+        <w:rPr>
+          <w:rFonts w:ascii="Calibri" w:eastAsia="Times New Roman" w:hAnsi="Calibri" w:cs="Calibri"/>
+        </w:rPr>
+      </w:pPr>
+      <w:r>
+        <w:rPr>
+          <w:rFonts w:ascii="Calibri" w:eastAsia="Times New Roman" w:hAnsi="Calibri" w:cs="Calibri"/>
+        </w:rPr>
+        <w:t>Rules</w:t>
+      </w:r>
+    </w:p>
+    <w:p>
+      <w:pPr>
+        <w:numPr>
+          <w:ilvl w:val="0"/>
+          <w:numId w:val="3"/>
+        </w:numPr>
+        <w:spacing w:before="100" w:beforeAutospacing="1" w:after="100" w:afterAutospacing="1"/>
+        <w:rPr>
+          <w:rFonts w:ascii="Calibri" w:eastAsia="Times New Roman" w:hAnsi="Calibri" w:cs="Calibri"/>
+          <w:color w:val="1A1A1A"/>
+          <w:sz w:val="22"/>
+          <w:szCs w:val="22"/>
+        </w:rPr>
+      </w:pPr>
+      <w:r>
+        <w:rPr>
+          <w:rStyle w:val="Strong"/>
+          <w:rFonts w:ascii="Calibri" w:eastAsia="Times New Roman" w:hAnsi="Calibri" w:cs="Calibri"/>
+          <w:color w:val="1A1A1A"/>
+          <w:sz w:val="22"/>
+          <w:szCs w:val="22"/>
+        </w:rPr>
+        <w:t>One sign in</w:t>
+      </w:r>
+      <w:r>
+        <w:rPr>
+          <w:rFonts w:ascii="Calibri" w:eastAsia="Times New Roman" w:hAnsi="Calibri" w:cs="Calibri"/>
+          <w:color w:val="1A1A1A"/>
+          <w:sz w:val="22"/>
+          <w:szCs w:val="22"/>
+        </w:rPr>
+        <w:t xml:space="preserve"> for the whole app.</w:t>
+      </w:r>
+    </w:p>
+    <w:p>
+      <w:pPr>
+        <w:numPr>
+          <w:ilvl w:val="0"/>
+          <w:numId w:val="3"/>
+        </w:numPr>
+        <w:spacing w:before="100" w:beforeAutospacing="1" w:after="100" w:afterAutospacing="1"/>
+        <w:rPr>
+          <w:rFonts w:ascii="Calibri" w:eastAsia="Times New Roman" w:hAnsi="Calibri" w:cs="Calibri"/>
+          <w:color w:val="1A1A1A"/>
+          <w:sz w:val="22"/>
+          <w:szCs w:val="22"/>
+        </w:rPr>
+      </w:pPr>
+      <w:r>
+        <w:rPr>
+          <w:rStyle w:val="Strong"/>
+          <w:rFonts w:ascii="Calibri" w:eastAsia="Times New Roman" w:hAnsi="Calibri" w:cs="Calibri"/>
+          <w:color w:val="1A1A1A"/>
+          <w:sz w:val="22"/>
+          <w:szCs w:val="22"/>
+        </w:rPr>
+        <w:t>5 wrong passwords</w:t>
+      </w:r>
+      <w:r>
+        <w:rPr>
+          <w:rFonts w:ascii="Calibri" w:eastAsia="Times New Roman" w:hAnsi="Calibri" w:cs="Calibri"/>
+          <w:color w:val="1A1A1A"/>
+          <w:sz w:val="22"/>
+          <w:szCs w:val="22"/>
+        </w:rPr>
+        <w:t xml:space="preserve"> lock the account. Only an Admin can unlock it.</w:t>
+      </w:r>
+    </w:p>
+    <w:p>
+      <w:pPr>
+        <w:numPr>
+          <w:ilvl w:val="0"/>
+          <w:numId w:val="3"/>
+        </w:numPr>
+        <w:spacing w:before="100" w:beforeAutospacing="1" w:after="100" w:afterAutospacing="1"/>
+        <w:rPr>
+          <w:rFonts w:ascii="Calibri" w:eastAsia="Times New Roman" w:hAnsi="Calibri" w:cs="Calibri"/>
+          <w:color w:val="1A1A1A"/>
+          <w:sz w:val="22"/>
+          <w:szCs w:val="22"/>
+        </w:rPr>
+      </w:pPr>
+      <w:r>
+        <w:rPr>
+          <w:rStyle w:val="Strong"/>
+          <w:rFonts w:ascii="Calibri" w:eastAsia="Times New Roman" w:hAnsi="Calibri" w:cs="Calibri"/>
+          <w:color w:val="1A1A1A"/>
+          <w:sz w:val="22"/>
+          <w:szCs w:val="22"/>
+        </w:rPr>
+        <w:t>Forgot your password?</w:t>
+      </w:r>
+      <w:r>
+        <w:rPr>
+          <w:rFonts w:ascii="Calibri" w:eastAsia="Times New Roman" w:hAnsi="Calibri" w:cs="Calibri"/>
+          <w:color w:val="1A1A1A"/>
+          <w:sz w:val="22"/>
+          <w:szCs w:val="22"/>
+        </w:rPr>
+        <w:t xml:space="preserve"> Click </w:t>
+      </w:r>
+      <w:r>
+        <w:rPr>
+          <w:rStyle w:val="Emphasis"/>
+          <w:rFonts w:ascii="Calibri" w:eastAsia="Times New Roman" w:hAnsi="Calibri" w:cs="Calibri"/>
+          <w:color w:val="1A1A1A"/>
+          <w:sz w:val="22"/>
+          <w:szCs w:val="22"/>
+        </w:rPr>
+        <w:t>Forgot Password</w:t>
+      </w:r>
+      <w:r>
+        <w:rPr>
+          <w:rFonts w:ascii="Calibri" w:eastAsia="Times New Roman" w:hAnsi="Calibri" w:cs="Calibri"/>
+          <w:color w:val="1A1A1A"/>
+          <w:sz w:val="22"/>
+          <w:szCs w:val="22"/>
+        </w:rPr>
+        <w:t xml:space="preserve"> </w:t>
+      </w:r>
+      <w:r>
+        <w:rPr>
+          <w:rFonts w:ascii="Calibri" w:eastAsia="Times New Roman" w:hAnsi="Calibri" w:cs="Calibri"/>
+          <w:color w:val="1A1A1A"/>
+          <w:sz w:val="22"/>
+          <w:szCs w:val="22"/>
+        </w:rPr>
+        <w:t>and type your username. The Admins get a request and will give you a new password in person. (Admins use their security question instead.)</w:t>
+      </w:r>
+    </w:p>
+    <w:p>
+      <w:pPr>
+        <w:numPr>
+          <w:ilvl w:val="0"/>
+          <w:numId w:val="3"/>
+        </w:numPr>
+        <w:spacing w:before="100" w:beforeAutospacing="1" w:after="100" w:afterAutospacing="1"/>
+        <w:rPr>
+          <w:rFonts w:ascii="Calibri" w:eastAsia="Times New Roman" w:hAnsi="Calibri" w:cs="Calibri"/>
+          <w:color w:val="1A1A1A"/>
+          <w:sz w:val="22"/>
+          <w:szCs w:val="22"/>
+        </w:rPr>
+      </w:pPr>
+      <w:r>
+        <w:rPr>
+          <w:rStyle w:val="Strong"/>
+          <w:rFonts w:ascii="Calibri" w:eastAsia="Times New Roman" w:hAnsi="Calibri" w:cs="Calibri"/>
+          <w:color w:val="1A1A1A"/>
+          <w:sz w:val="22"/>
+          <w:szCs w:val="22"/>
+        </w:rPr>
+        <w:t>Only Admins change passwords.</w:t>
+      </w:r>
+      <w:r>
+        <w:rPr>
+          <w:rFonts w:ascii="Calibri" w:eastAsia="Times New Roman" w:hAnsi="Calibri" w:cs="Calibri"/>
+          <w:color w:val="1A1A1A"/>
+          <w:sz w:val="22"/>
+          <w:szCs w:val="22"/>
+        </w:rPr>
+        <w:t xml:space="preserve"> Employees and Supervisors can't change their own.</w:t>
+      </w:r>
+    </w:p>
+    <w:p>
+      <w:pPr>
+        <w:numPr>
+          <w:ilvl w:val="0"/>
+          <w:numId w:val="3"/>
+        </w:numPr>
+        <w:spacing w:before="100" w:beforeAutospacing="1" w:after="100" w:afterAutospacing="1"/>
+        <w:rPr>
+          <w:rFonts w:ascii="Calibri" w:eastAsia="Times New Roman" w:hAnsi="Calibri" w:cs="Calibri"/>
+          <w:color w:val="1A1A1A"/>
+          <w:sz w:val="22"/>
+          <w:szCs w:val="22"/>
+        </w:rPr>
+      </w:pPr>
+      <w:r>
+        <w:rPr>
+          <w:rStyle w:val="Strong"/>
+          <w:rFonts w:ascii="Calibri" w:eastAsia="Times New Roman" w:hAnsi="Calibri" w:cs="Calibri"/>
+          <w:color w:val="1A1A1A"/>
+          <w:sz w:val="22"/>
+          <w:szCs w:val="22"/>
+        </w:rPr>
+        <w:lastRenderedPageBreak/>
         <w:t>Idle check:</w:t>
       </w:r>
       <w:r>
@@ -1029,9 +2007,9 @@
 <file path=word/numbering.xml><?xml version="1.0" encoding="utf-8"?>
 <w:numbering xmlns:wpc="http://schemas.microsoft.com/office/word/2010/wordprocessingCanvas" xmlns:cx="http://schemas.microsoft.com/office/drawing/2014/chartex" xmlns:cx1="http://schemas.microsoft.com/office/drawing/2015/9/8/chartex" xmlns:cx2="http://schemas.microsoft.com/office/drawing/2015/10/21/chartex" xmlns:cx3="http://schemas.microsoft.com/office/drawing/2016/5/9/chartex" xmlns:cx4="http://schemas.microsoft.com/office/drawing/2016/5/10/chartex" xmlns:cx5="http://schemas.microsoft.com/office/drawing/2016/5/11/chartex" xmlns:cx6="http://schemas.microsoft.com/office/drawing/2016/5/12/chartex" xmlns:cx7="http://schemas.microsoft.com/office/drawing/2016/5/13/chartex" xmlns:cx8="http://schemas.microsoft.com/office/drawing/2016/5/14/chartex" xmlns:mc="http://schemas.openxmlformats.org/markup-compatibility/2006" xmlns:aink="http://schemas.microsoft.com/office/drawing/2016/ink" xmlns:am3d="http://schemas.microsoft.com/office/drawing/2017/model3d" xmlns:o="urn:schemas-microsoft-com:office:office" xmlns:oel="http://schemas.microsoft.com/office/2019/extlst" xmlns:r="http://schemas.openxmlformats.org/officeDocument/2006/relationships" xmlns:m="http://schemas.openxmlformats.org/officeDocument/2006/math" xmlns:v="urn:schemas-microsoft-com:vml" xmlns:wp14="http://schemas.microsoft.com/office/word/2010/wordprocessingDrawing" xmlns:wp="http://schemas.openxmlformats.org/drawingml/2006/wordprocessingDrawing" xmlns:w10="urn:schemas-microsoft-com:office:word" xmlns:w="http://schemas.openxmlformats.org/wordprocessingml/2006/main" xmlns:w14="http://schemas.microsoft.com/office/word/2010/wordml" xmlns:w15="http://schemas.microsoft.com/office/word/2012/wordml" xmlns:w16cex="http://schemas.microsoft.com/office/word/2018/wordml/cex" xmlns:w16cid="http://schemas.microsoft.com/office/word/2016/wordml/cid" xmlns:w16="http://schemas.microsoft.com/office/word/2018/wordml" xmlns:w16du="http://schemas.microsoft.com/office/word/2023/wordml/word16du" xmlns:w16sdtdh="http://schemas.microsoft.com/office/word/2020/wordml/sdtdatahash" xmlns:w16sdtfl="http://schemas.microsoft.com/office/word/2024/wordml/sdtformatlock" xmlns:w16se="http://schemas.microsoft.com/office/word/2015/wordml/symex" xmlns:wpg="http://schemas.microsoft.com/office/word/2010/wordprocessingGroup" xmlns:wpi="http://schemas.microsoft.com/office/word/2010/wordprocessingInk" xmlns:wne="http://schemas.microsoft.com/office/word/2006/wordml" xmlns:wps="http://schemas.microsoft.com/office/word/2010/wordprocessingShape" mc:Ignorable="w14 w15 w16se w16cid w16 w16cex w16sdtdh w16sdtfl w16du wp14">
   <w:abstractNum w:abstractNumId="0" w15:restartNumberingAfterBreak="0">
-    <w:nsid w:val="69DF529F"/>
+    <w:nsid w:val="49B26E51"/>
     <w:multiLevelType w:val="multilevel"/>
-    <w:tmpl w:val="AD60B444"/>
+    <w:tmpl w:val="E55ECDFA"/>
     <w:lvl w:ilvl="0">
       <w:start w:val="1"/>
       <w:numFmt w:val="bullet"/>
@@ -1177,7 +2155,239 @@
       </w:rPr>
     </w:lvl>
   </w:abstractNum>
-  <w:num w:numId="1" w16cid:durableId="251663517">
+  <w:abstractNum w:abstractNumId="1" w15:restartNumberingAfterBreak="0">
+    <w:nsid w:val="55722E20"/>
+    <w:multiLevelType w:val="multilevel"/>
+    <w:tmpl w:val="624205C8"/>
+    <w:lvl w:ilvl="0">
+      <w:start w:val="1"/>
+      <w:numFmt w:val="decimal"/>
+      <w:lvlText w:val="%1."/>
+      <w:lvlJc w:val="left"/>
+      <w:pPr>
+        <w:tabs>
+          <w:tab w:val="num" w:pos="720"/>
+        </w:tabs>
+        <w:ind w:left="720" w:hanging="360"/>
+      </w:pPr>
+    </w:lvl>
+    <w:lvl w:ilvl="1" w:tentative="1">
+      <w:start w:val="1"/>
+      <w:numFmt w:val="decimal"/>
+      <w:lvlText w:val="%2."/>
+      <w:lvlJc w:val="left"/>
+      <w:pPr>
+        <w:tabs>
+          <w:tab w:val="num" w:pos="1440"/>
+        </w:tabs>
+        <w:ind w:left="1440" w:hanging="360"/>
+      </w:pPr>
+    </w:lvl>
+    <w:lvl w:ilvl="2" w:tentative="1">
+      <w:start w:val="1"/>
+      <w:numFmt w:val="decimal"/>
+      <w:lvlText w:val="%3."/>
+      <w:lvlJc w:val="left"/>
+      <w:pPr>
+        <w:tabs>
+          <w:tab w:val="num" w:pos="2160"/>
+        </w:tabs>
+        <w:ind w:left="2160" w:hanging="360"/>
+      </w:pPr>
+    </w:lvl>
+    <w:lvl w:ilvl="3" w:tentative="1">
+      <w:start w:val="1"/>
+      <w:numFmt w:val="decimal"/>
+      <w:lvlText w:val="%4."/>
+      <w:lvlJc w:val="left"/>
+      <w:pPr>
+        <w:tabs>
+          <w:tab w:val="num" w:pos="2880"/>
+        </w:tabs>
+        <w:ind w:left="2880" w:hanging="360"/>
+      </w:pPr>
+    </w:lvl>
+    <w:lvl w:ilvl="4" w:tentative="1">
+      <w:start w:val="1"/>
+      <w:numFmt w:val="decimal"/>
+      <w:lvlText w:val="%5."/>
+      <w:lvlJc w:val="left"/>
+      <w:pPr>
+        <w:tabs>
+          <w:tab w:val="num" w:pos="3600"/>
+        </w:tabs>
+        <w:ind w:left="3600" w:hanging="360"/>
+      </w:pPr>
+    </w:lvl>
+    <w:lvl w:ilvl="5" w:tentative="1">
+      <w:start w:val="1"/>
+      <w:numFmt w:val="decimal"/>
+      <w:lvlText w:val="%6."/>
+      <w:lvlJc w:val="left"/>
+      <w:pPr>
+        <w:tabs>
+          <w:tab w:val="num" w:pos="4320"/>
+        </w:tabs>
+        <w:ind w:left="4320" w:hanging="360"/>
+      </w:pPr>
+    </w:lvl>
+    <w:lvl w:ilvl="6" w:tentative="1">
+      <w:start w:val="1"/>
+      <w:numFmt w:val="decimal"/>
+      <w:lvlText w:val="%7."/>
+      <w:lvlJc w:val="left"/>
+      <w:pPr>
+        <w:tabs>
+          <w:tab w:val="num" w:pos="5040"/>
+        </w:tabs>
+        <w:ind w:left="5040" w:hanging="360"/>
+      </w:pPr>
+    </w:lvl>
+    <w:lvl w:ilvl="7" w:tentative="1">
+      <w:start w:val="1"/>
+      <w:numFmt w:val="decimal"/>
+      <w:lvlText w:val="%8."/>
+      <w:lvlJc w:val="left"/>
+      <w:pPr>
+        <w:tabs>
+          <w:tab w:val="num" w:pos="5760"/>
+        </w:tabs>
+        <w:ind w:left="5760" w:hanging="360"/>
+      </w:pPr>
+    </w:lvl>
+    <w:lvl w:ilvl="8" w:tentative="1">
+      <w:start w:val="1"/>
+      <w:numFmt w:val="decimal"/>
+      <w:lvlText w:val="%9."/>
+      <w:lvlJc w:val="left"/>
+      <w:pPr>
+        <w:tabs>
+          <w:tab w:val="num" w:pos="6480"/>
+        </w:tabs>
+        <w:ind w:left="6480" w:hanging="360"/>
+      </w:pPr>
+    </w:lvl>
+  </w:abstractNum>
+  <w:abstractNum w:abstractNumId="2" w15:restartNumberingAfterBreak="0">
+    <w:nsid w:val="711A4BD5"/>
+    <w:multiLevelType w:val="multilevel"/>
+    <w:tmpl w:val="E4FAE2F4"/>
+    <w:lvl w:ilvl="0">
+      <w:start w:val="1"/>
+      <w:numFmt w:val="decimal"/>
+      <w:lvlText w:val="%1."/>
+      <w:lvlJc w:val="left"/>
+      <w:pPr>
+        <w:tabs>
+          <w:tab w:val="num" w:pos="720"/>
+        </w:tabs>
+        <w:ind w:left="720" w:hanging="360"/>
+      </w:pPr>
+    </w:lvl>
+    <w:lvl w:ilvl="1" w:tentative="1">
+      <w:start w:val="1"/>
+      <w:numFmt w:val="decimal"/>
+      <w:lvlText w:val="%2."/>
+      <w:lvlJc w:val="left"/>
+      <w:pPr>
+        <w:tabs>
+          <w:tab w:val="num" w:pos="1440"/>
+        </w:tabs>
+        <w:ind w:left="1440" w:hanging="360"/>
+      </w:pPr>
+    </w:lvl>
+    <w:lvl w:ilvl="2" w:tentative="1">
+      <w:start w:val="1"/>
+      <w:numFmt w:val="decimal"/>
+      <w:lvlText w:val="%3."/>
+      <w:lvlJc w:val="left"/>
+      <w:pPr>
+        <w:tabs>
+          <w:tab w:val="num" w:pos="2160"/>
+        </w:tabs>
+        <w:ind w:left="2160" w:hanging="360"/>
+      </w:pPr>
+    </w:lvl>
+    <w:lvl w:ilvl="3" w:tentative="1">
+      <w:start w:val="1"/>
+      <w:numFmt w:val="decimal"/>
+      <w:lvlText w:val="%4."/>
+      <w:lvlJc w:val="left"/>
+      <w:pPr>
+        <w:tabs>
+          <w:tab w:val="num" w:pos="2880"/>
+        </w:tabs>
+        <w:ind w:left="2880" w:hanging="360"/>
+      </w:pPr>
+    </w:lvl>
+    <w:lvl w:ilvl="4" w:tentative="1">
+      <w:start w:val="1"/>
+      <w:numFmt w:val="decimal"/>
+      <w:lvlText w:val="%5."/>
+      <w:lvlJc w:val="left"/>
+      <w:pPr>
+        <w:tabs>
+          <w:tab w:val="num" w:pos="3600"/>
+        </w:tabs>
+        <w:ind w:left="3600" w:hanging="360"/>
+      </w:pPr>
+    </w:lvl>
+    <w:lvl w:ilvl="5" w:tentative="1">
+      <w:start w:val="1"/>
+      <w:numFmt w:val="decimal"/>
+      <w:lvlText w:val="%6."/>
+      <w:lvlJc w:val="left"/>
+      <w:pPr>
+        <w:tabs>
+          <w:tab w:val="num" w:pos="4320"/>
+        </w:tabs>
+        <w:ind w:left="4320" w:hanging="360"/>
+      </w:pPr>
+    </w:lvl>
+    <w:lvl w:ilvl="6" w:tentative="1">
+      <w:start w:val="1"/>
+      <w:numFmt w:val="decimal"/>
+      <w:lvlText w:val="%7."/>
+      <w:lvlJc w:val="left"/>
+      <w:pPr>
+        <w:tabs>
+          <w:tab w:val="num" w:pos="5040"/>
+        </w:tabs>
+        <w:ind w:left="5040" w:hanging="360"/>
+      </w:pPr>
+    </w:lvl>
+    <w:lvl w:ilvl="7" w:tentative="1">
+      <w:start w:val="1"/>
+      <w:numFmt w:val="decimal"/>
+      <w:lvlText w:val="%8."/>
+      <w:lvlJc w:val="left"/>
+      <w:pPr>
+        <w:tabs>
+          <w:tab w:val="num" w:pos="5760"/>
+        </w:tabs>
+        <w:ind w:left="5760" w:hanging="360"/>
+      </w:pPr>
+    </w:lvl>
+    <w:lvl w:ilvl="8" w:tentative="1">
+      <w:start w:val="1"/>
+      <w:numFmt w:val="decimal"/>
+      <w:lvlText w:val="%9."/>
+      <w:lvlJc w:val="left"/>
+      <w:pPr>
+        <w:tabs>
+          <w:tab w:val="num" w:pos="6480"/>
+        </w:tabs>
+        <w:ind w:left="6480" w:hanging="360"/>
+      </w:pPr>
+    </w:lvl>
+  </w:abstractNum>
+  <w:num w:numId="1" w16cid:durableId="54863343">
+    <w:abstractNumId w:val="1"/>
+  </w:num>
+  <w:num w:numId="2" w16cid:durableId="414518052">
+    <w:abstractNumId w:val="2"/>
+  </w:num>
+  <w:num w:numId="3" w16cid:durableId="1088038508">
     <w:abstractNumId w:val="0"/>
   </w:num>
 </w:numbering>

</xml_diff>

<commit_message>
Add Forgot Password and Admin password handling (plain layout)
- PasswordService: Employee/Supervisor requests to Admins (no duplicates),
  Admin security-question reset (answers ignore case/spaces, 10-failure
  cap), Admin Set New Password that unlocks Locked accounts and closes
  waiting requests, Dismiss, password rules (8+ chars, letter + number),
  readable generated passwords. Everything logged.
- ForgotPasswordForm (3 steps), NotificationsForm, SetNewPasswordForm;
  Admin-only "Password requests (N)" button on the placeholder main window.
- 22 checks passed against the real database with temporary accounts.
- Guides: Developer Guide chapter 9, User Manual forgot-password and
  Admin request handling, UI Elements Guide updated control lists.

Co-Authored-By: Claude Opus 5.5 <noreply@anthropic.com>
</commit_message>
<xml_diff>
--- a/docs/User Manual.docx
+++ b/docs/User Manual.docx
@@ -1573,7 +1573,7 @@
         <w:rPr>
           <w:rFonts w:ascii="Calibri" w:eastAsia="Times New Roman" w:hAnsi="Calibri" w:cs="Calibri"/>
         </w:rPr>
-        <w:t>Signing out</w:t>
+        <w:t>Forgot your password?</w:t>
       </w:r>
     </w:p>
     <w:p>
@@ -1588,45 +1588,13 @@
       </w:pPr>
       <w:r>
         <w:rPr>
-          <w:rFonts w:ascii="Calibri" w:hAnsi="Calibri" w:cs="Calibri"/>
-          <w:color w:val="1A1A1A"/>
-          <w:sz w:val="22"/>
-          <w:szCs w:val="22"/>
-        </w:rPr>
-        <w:t xml:space="preserve">Click </w:t>
-      </w:r>
-      <w:r>
-        <w:rPr>
           <w:rStyle w:val="Strong"/>
           <w:rFonts w:ascii="Calibri" w:hAnsi="Calibri" w:cs="Calibri"/>
           <w:color w:val="1A1A1A"/>
           <w:sz w:val="22"/>
           <w:szCs w:val="22"/>
         </w:rPr>
-        <w:t>Sign Out</w:t>
-      </w:r>
-      <w:r>
-        <w:rPr>
-          <w:rFonts w:ascii="Calibri" w:hAnsi="Calibri" w:cs="Calibri"/>
-          <w:color w:val="1A1A1A"/>
-          <w:sz w:val="22"/>
-          <w:szCs w:val="22"/>
-        </w:rPr>
-        <w:t>, or close the window. Both are recorded.</w:t>
-      </w:r>
-    </w:p>
-    <w:p>
-      <w:pPr>
-        <w:pStyle w:val="Heading2"/>
-        <w:rPr>
-          <w:rFonts w:ascii="Calibri" w:eastAsia="Times New Roman" w:hAnsi="Calibri" w:cs="Calibri"/>
-        </w:rPr>
-      </w:pPr>
-      <w:r>
-        <w:rPr>
-          <w:rFonts w:ascii="Calibri" w:eastAsia="Times New Roman" w:hAnsi="Calibri" w:cs="Calibri"/>
-        </w:rPr>
-        <w:t>Rules</w:t>
+        <w:t>Employees and Supervisors</w:t>
       </w:r>
     </w:p>
     <w:p>
@@ -1645,22 +1613,22 @@
       </w:pPr>
       <w:r>
         <w:rPr>
+          <w:rFonts w:ascii="Calibri" w:eastAsia="Times New Roman" w:hAnsi="Calibri" w:cs="Calibri"/>
+          <w:color w:val="1A1A1A"/>
+          <w:sz w:val="22"/>
+          <w:szCs w:val="22"/>
+        </w:rPr>
+        <w:t xml:space="preserve">On the Sign In window, click </w:t>
+      </w:r>
+      <w:r>
+        <w:rPr>
           <w:rStyle w:val="Strong"/>
           <w:rFonts w:ascii="Calibri" w:eastAsia="Times New Roman" w:hAnsi="Calibri" w:cs="Calibri"/>
           <w:color w:val="1A1A1A"/>
           <w:sz w:val="22"/>
           <w:szCs w:val="22"/>
         </w:rPr>
-        <w:t>One sign in</w:t>
-      </w:r>
-      <w:r>
-        <w:rPr>
-          <w:rFonts w:ascii="Calibri" w:eastAsia="Times New Roman" w:hAnsi="Calibri" w:cs="Calibri"/>
-          <w:color w:val="1A1A1A"/>
-          <w:sz w:val="22"/>
-          <w:szCs w:val="22"/>
-        </w:rPr>
-        <w:t xml:space="preserve"> for the whole app.</w:t>
+        <w:t>Forgot password?</w:t>
       </w:r>
     </w:p>
     <w:p>
@@ -1679,22 +1647,31 @@
       </w:pPr>
       <w:r>
         <w:rPr>
+          <w:rFonts w:ascii="Calibri" w:eastAsia="Times New Roman" w:hAnsi="Calibri" w:cs="Calibri"/>
+          <w:color w:val="1A1A1A"/>
+          <w:sz w:val="22"/>
+          <w:szCs w:val="22"/>
+        </w:rPr>
+        <w:t xml:space="preserve">Type your username and click </w:t>
+      </w:r>
+      <w:r>
+        <w:rPr>
           <w:rStyle w:val="Strong"/>
           <w:rFonts w:ascii="Calibri" w:eastAsia="Times New Roman" w:hAnsi="Calibri" w:cs="Calibri"/>
           <w:color w:val="1A1A1A"/>
           <w:sz w:val="22"/>
           <w:szCs w:val="22"/>
         </w:rPr>
-        <w:t>5 wrong passwords</w:t>
-      </w:r>
-      <w:r>
-        <w:rPr>
-          <w:rFonts w:ascii="Calibri" w:eastAsia="Times New Roman" w:hAnsi="Calibri" w:cs="Calibri"/>
-          <w:color w:val="1A1A1A"/>
-          <w:sz w:val="22"/>
-          <w:szCs w:val="22"/>
-        </w:rPr>
-        <w:t xml:space="preserve"> lock the account. Only an Admin can unlock it.</w:t>
+        <w:t>Next</w:t>
+      </w:r>
+      <w:r>
+        <w:rPr>
+          <w:rFonts w:ascii="Calibri" w:eastAsia="Times New Roman" w:hAnsi="Calibri" w:cs="Calibri"/>
+          <w:color w:val="1A1A1A"/>
+          <w:sz w:val="22"/>
+          <w:szCs w:val="22"/>
+        </w:rPr>
+        <w:t>.</w:t>
       </w:r>
     </w:p>
     <w:p>
@@ -1713,57 +1690,40 @@
       </w:pPr>
       <w:r>
         <w:rPr>
+          <w:rFonts w:ascii="Calibri" w:eastAsia="Times New Roman" w:hAnsi="Calibri" w:cs="Calibri"/>
+          <w:color w:val="1A1A1A"/>
+          <w:sz w:val="22"/>
+          <w:szCs w:val="22"/>
+        </w:rPr>
+        <w:t>The message says your request was sent to the Admins. An Admin will give you a new password in person. You can't change it yourself.</w:t>
+      </w:r>
+    </w:p>
+    <w:p>
+      <w:pPr>
+        <w:pStyle w:val="NormalWeb"/>
+        <w:rPr>
+          <w:rFonts w:ascii="Calibri" w:hAnsi="Calibri" w:cs="Calibri"/>
+          <w:color w:val="1A1A1A"/>
+          <w:sz w:val="22"/>
+          <w:szCs w:val="22"/>
+        </w:rPr>
+      </w:pPr>
+      <w:r>
+        <w:rPr>
           <w:rStyle w:val="Strong"/>
-          <w:rFonts w:ascii="Calibri" w:eastAsia="Times New Roman" w:hAnsi="Calibri" w:cs="Calibri"/>
-          <w:color w:val="1A1A1A"/>
-          <w:sz w:val="22"/>
-          <w:szCs w:val="22"/>
-        </w:rPr>
-        <w:t>Forgot your password?</w:t>
-      </w:r>
-      <w:r>
-        <w:rPr>
-          <w:rFonts w:ascii="Calibri" w:eastAsia="Times New Roman" w:hAnsi="Calibri" w:cs="Calibri"/>
-          <w:color w:val="1A1A1A"/>
-          <w:sz w:val="22"/>
-          <w:szCs w:val="22"/>
-        </w:rPr>
-        <w:t xml:space="preserve"> Click </w:t>
-      </w:r>
-      <w:r>
-        <w:rPr>
-          <w:rStyle w:val="Emphasis"/>
-          <w:rFonts w:ascii="Calibri" w:eastAsia="Times New Roman" w:hAnsi="Calibri" w:cs="Calibri"/>
-          <w:color w:val="1A1A1A"/>
-          <w:sz w:val="22"/>
-          <w:szCs w:val="22"/>
-        </w:rPr>
-        <w:t>Forgot Password</w:t>
-      </w:r>
-      <w:r>
-        <w:rPr>
-          <w:rFonts w:ascii="Calibri" w:eastAsia="Times New Roman" w:hAnsi="Calibri" w:cs="Calibri"/>
-          <w:color w:val="1A1A1A"/>
-          <w:sz w:val="22"/>
-          <w:szCs w:val="22"/>
-        </w:rPr>
-        <w:t xml:space="preserve"> </w:t>
-      </w:r>
-      <w:r>
-        <w:rPr>
-          <w:rFonts w:ascii="Calibri" w:eastAsia="Times New Roman" w:hAnsi="Calibri" w:cs="Calibri"/>
-          <w:color w:val="1A1A1A"/>
-          <w:sz w:val="22"/>
-          <w:szCs w:val="22"/>
-        </w:rPr>
-        <w:t>and type your username. The Admins get a request and will give you a new password in person. (Admins use their security question instead.)</w:t>
+          <w:rFonts w:ascii="Calibri" w:hAnsi="Calibri" w:cs="Calibri"/>
+          <w:color w:val="1A1A1A"/>
+          <w:sz w:val="22"/>
+          <w:szCs w:val="22"/>
+        </w:rPr>
+        <w:t>Admins</w:t>
       </w:r>
     </w:p>
     <w:p>
       <w:pPr>
         <w:numPr>
           <w:ilvl w:val="0"/>
-          <w:numId w:val="3"/>
+          <w:numId w:val="4"/>
         </w:numPr>
         <w:spacing w:before="100" w:beforeAutospacing="1" w:after="100" w:afterAutospacing="1"/>
         <w:rPr>
@@ -1775,29 +1735,57 @@
       </w:pPr>
       <w:r>
         <w:rPr>
+          <w:rFonts w:ascii="Calibri" w:eastAsia="Times New Roman" w:hAnsi="Calibri" w:cs="Calibri"/>
+          <w:color w:val="1A1A1A"/>
+          <w:sz w:val="22"/>
+          <w:szCs w:val="22"/>
+        </w:rPr>
+        <w:t xml:space="preserve">Click </w:t>
+      </w:r>
+      <w:r>
+        <w:rPr>
           <w:rStyle w:val="Strong"/>
           <w:rFonts w:ascii="Calibri" w:eastAsia="Times New Roman" w:hAnsi="Calibri" w:cs="Calibri"/>
           <w:color w:val="1A1A1A"/>
           <w:sz w:val="22"/>
           <w:szCs w:val="22"/>
         </w:rPr>
-        <w:t>Only Admins change passwords.</w:t>
-      </w:r>
-      <w:r>
-        <w:rPr>
-          <w:rFonts w:ascii="Calibri" w:eastAsia="Times New Roman" w:hAnsi="Calibri" w:cs="Calibri"/>
-          <w:color w:val="1A1A1A"/>
-          <w:sz w:val="22"/>
-          <w:szCs w:val="22"/>
-        </w:rPr>
-        <w:t xml:space="preserve"> Employees and Supervisors can't change their own.</w:t>
+        <w:t>Forgot password?</w:t>
+      </w:r>
+      <w:r>
+        <w:rPr>
+          <w:rFonts w:ascii="Calibri" w:eastAsia="Times New Roman" w:hAnsi="Calibri" w:cs="Calibri"/>
+          <w:color w:val="1A1A1A"/>
+          <w:sz w:val="22"/>
+          <w:szCs w:val="22"/>
+        </w:rPr>
+        <w:t xml:space="preserve">, type your username, click </w:t>
+      </w:r>
+      <w:r>
+        <w:rPr>
+          <w:rStyle w:val="Strong"/>
+          <w:rFonts w:ascii="Calibri" w:eastAsia="Times New Roman" w:hAnsi="Calibri" w:cs="Calibri"/>
+          <w:color w:val="1A1A1A"/>
+          <w:sz w:val="22"/>
+          <w:szCs w:val="22"/>
+        </w:rPr>
+        <w:t>Next</w:t>
+      </w:r>
+      <w:r>
+        <w:rPr>
+          <w:rFonts w:ascii="Calibri" w:eastAsia="Times New Roman" w:hAnsi="Calibri" w:cs="Calibri"/>
+          <w:color w:val="1A1A1A"/>
+          <w:sz w:val="22"/>
+          <w:szCs w:val="22"/>
+        </w:rPr>
+        <w:t>.</w:t>
       </w:r>
     </w:p>
     <w:p>
       <w:pPr>
         <w:numPr>
           <w:ilvl w:val="0"/>
-          <w:numId w:val="3"/>
+          <w:numId w:val="4"/>
         </w:numPr>
         <w:spacing w:before="100" w:beforeAutospacing="1" w:after="100" w:afterAutospacing="1"/>
         <w:rPr>
@@ -1809,13 +1797,603 @@
       </w:pPr>
       <w:r>
         <w:rPr>
+          <w:rFonts w:ascii="Calibri" w:eastAsia="Times New Roman" w:hAnsi="Calibri" w:cs="Calibri"/>
+          <w:color w:val="1A1A1A"/>
+          <w:sz w:val="22"/>
+          <w:szCs w:val="22"/>
+        </w:rPr>
+        <w:t xml:space="preserve">Answer your </w:t>
+      </w:r>
+      <w:r>
+        <w:rPr>
           <w:rStyle w:val="Strong"/>
           <w:rFonts w:ascii="Calibri" w:eastAsia="Times New Roman" w:hAnsi="Calibri" w:cs="Calibri"/>
           <w:color w:val="1A1A1A"/>
           <w:sz w:val="22"/>
           <w:szCs w:val="22"/>
         </w:rPr>
+        <w:t>security question</w:t>
+      </w:r>
+      <w:r>
+        <w:rPr>
+          <w:rFonts w:ascii="Calibri" w:eastAsia="Times New Roman" w:hAnsi="Calibri" w:cs="Calibri"/>
+          <w:color w:val="1A1A1A"/>
+          <w:sz w:val="22"/>
+          <w:szCs w:val="22"/>
+        </w:rPr>
+        <w:t xml:space="preserve"> (capital letters don't matter).</w:t>
+      </w:r>
+    </w:p>
+    <w:p>
+      <w:pPr>
+        <w:numPr>
+          <w:ilvl w:val="0"/>
+          <w:numId w:val="4"/>
+        </w:numPr>
+        <w:spacing w:before="100" w:beforeAutospacing="1" w:after="100" w:afterAutospacing="1"/>
+        <w:rPr>
+          <w:rFonts w:ascii="Calibri" w:eastAsia="Times New Roman" w:hAnsi="Calibri" w:cs="Calibri"/>
+          <w:color w:val="1A1A1A"/>
+          <w:sz w:val="22"/>
+          <w:szCs w:val="22"/>
+        </w:rPr>
+      </w:pPr>
+      <w:r>
+        <w:rPr>
+          <w:rFonts w:ascii="Calibri" w:eastAsia="Times New Roman" w:hAnsi="Calibri" w:cs="Calibri"/>
+          <w:color w:val="1A1A1A"/>
+          <w:sz w:val="22"/>
+          <w:szCs w:val="22"/>
+        </w:rPr>
         <w:lastRenderedPageBreak/>
+        <w:t xml:space="preserve">Type a new password twice (at least 8 characters, with a letter and a number) and click </w:t>
+      </w:r>
+      <w:r>
+        <w:rPr>
+          <w:rStyle w:val="Strong"/>
+          <w:rFonts w:ascii="Calibri" w:eastAsia="Times New Roman" w:hAnsi="Calibri" w:cs="Calibri"/>
+          <w:color w:val="1A1A1A"/>
+          <w:sz w:val="22"/>
+          <w:szCs w:val="22"/>
+        </w:rPr>
+        <w:t>Reset Password</w:t>
+      </w:r>
+      <w:r>
+        <w:rPr>
+          <w:rFonts w:ascii="Calibri" w:eastAsia="Times New Roman" w:hAnsi="Calibri" w:cs="Calibri"/>
+          <w:color w:val="1A1A1A"/>
+          <w:sz w:val="22"/>
+          <w:szCs w:val="22"/>
+        </w:rPr>
+        <w:t>.</w:t>
+      </w:r>
+    </w:p>
+    <w:p>
+      <w:pPr>
+        <w:pStyle w:val="NormalWeb"/>
+        <w:rPr>
+          <w:rFonts w:ascii="Calibri" w:hAnsi="Calibri" w:cs="Calibri"/>
+          <w:color w:val="1A1A1A"/>
+          <w:sz w:val="22"/>
+          <w:szCs w:val="22"/>
+        </w:rPr>
+      </w:pPr>
+      <w:r>
+        <w:rPr>
+          <w:rFonts w:ascii="Calibri" w:hAnsi="Calibri" w:cs="Calibri"/>
+          <w:color w:val="1A1A1A"/>
+          <w:sz w:val="22"/>
+          <w:szCs w:val="22"/>
+        </w:rPr>
+        <w:t>If you never set a security question, ask another Admin to set a new password for you.</w:t>
+      </w:r>
+    </w:p>
+    <w:p>
+      <w:pPr>
+        <w:pStyle w:val="Heading2"/>
+        <w:rPr>
+          <w:rFonts w:ascii="Calibri" w:eastAsia="Times New Roman" w:hAnsi="Calibri" w:cs="Calibri"/>
+        </w:rPr>
+      </w:pPr>
+      <w:r>
+        <w:rPr>
+          <w:rFonts w:ascii="Calibri" w:eastAsia="Times New Roman" w:hAnsi="Calibri" w:cs="Calibri"/>
+        </w:rPr>
+        <w:t>For Admins: handling password requests</w:t>
+      </w:r>
+    </w:p>
+    <w:p>
+      <w:pPr>
+        <w:numPr>
+          <w:ilvl w:val="0"/>
+          <w:numId w:val="5"/>
+        </w:numPr>
+        <w:spacing w:before="100" w:beforeAutospacing="1" w:after="100" w:afterAutospacing="1"/>
+        <w:rPr>
+          <w:rFonts w:ascii="Calibri" w:eastAsia="Times New Roman" w:hAnsi="Calibri" w:cs="Calibri"/>
+          <w:color w:val="1A1A1A"/>
+          <w:sz w:val="22"/>
+          <w:szCs w:val="22"/>
+        </w:rPr>
+      </w:pPr>
+      <w:r>
+        <w:rPr>
+          <w:rFonts w:ascii="Calibri" w:eastAsia="Times New Roman" w:hAnsi="Calibri" w:cs="Calibri"/>
+          <w:color w:val="1A1A1A"/>
+          <w:sz w:val="22"/>
+          <w:szCs w:val="22"/>
+        </w:rPr>
+        <w:t xml:space="preserve">In the main window, the </w:t>
+      </w:r>
+      <w:r>
+        <w:rPr>
+          <w:rStyle w:val="Strong"/>
+          <w:rFonts w:ascii="Calibri" w:eastAsia="Times New Roman" w:hAnsi="Calibri" w:cs="Calibri"/>
+          <w:color w:val="1A1A1A"/>
+          <w:sz w:val="22"/>
+          <w:szCs w:val="22"/>
+        </w:rPr>
+        <w:t>Password requests (N)</w:t>
+      </w:r>
+      <w:r>
+        <w:rPr>
+          <w:rFonts w:ascii="Calibri" w:eastAsia="Times New Roman" w:hAnsi="Calibri" w:cs="Calibri"/>
+          <w:color w:val="1A1A1A"/>
+          <w:sz w:val="22"/>
+          <w:szCs w:val="22"/>
+        </w:rPr>
+        <w:t xml:space="preserve"> button shows how many people are waiting.</w:t>
+      </w:r>
+    </w:p>
+    <w:p>
+      <w:pPr>
+        <w:numPr>
+          <w:ilvl w:val="0"/>
+          <w:numId w:val="5"/>
+        </w:numPr>
+        <w:spacing w:before="100" w:beforeAutospacing="1" w:after="100" w:afterAutospacing="1"/>
+        <w:rPr>
+          <w:rFonts w:ascii="Calibri" w:eastAsia="Times New Roman" w:hAnsi="Calibri" w:cs="Calibri"/>
+          <w:color w:val="1A1A1A"/>
+          <w:sz w:val="22"/>
+          <w:szCs w:val="22"/>
+        </w:rPr>
+      </w:pPr>
+      <w:r>
+        <w:rPr>
+          <w:rFonts w:ascii="Calibri" w:eastAsia="Times New Roman" w:hAnsi="Calibri" w:cs="Calibri"/>
+          <w:color w:val="1A1A1A"/>
+          <w:sz w:val="22"/>
+          <w:szCs w:val="22"/>
+        </w:rPr>
+        <w:t xml:space="preserve">Click it, select the person, and click </w:t>
+      </w:r>
+      <w:r>
+        <w:rPr>
+          <w:rStyle w:val="Strong"/>
+          <w:rFonts w:ascii="Calibri" w:eastAsia="Times New Roman" w:hAnsi="Calibri" w:cs="Calibri"/>
+          <w:color w:val="1A1A1A"/>
+          <w:sz w:val="22"/>
+          <w:szCs w:val="22"/>
+        </w:rPr>
+        <w:t>Set New Password</w:t>
+      </w:r>
+      <w:r>
+        <w:rPr>
+          <w:rFonts w:ascii="Calibri" w:eastAsia="Times New Roman" w:hAnsi="Calibri" w:cs="Calibri"/>
+          <w:color w:val="1A1A1A"/>
+          <w:sz w:val="22"/>
+          <w:szCs w:val="22"/>
+        </w:rPr>
+        <w:t>.</w:t>
+      </w:r>
+    </w:p>
+    <w:p>
+      <w:pPr>
+        <w:numPr>
+          <w:ilvl w:val="0"/>
+          <w:numId w:val="5"/>
+        </w:numPr>
+        <w:spacing w:before="100" w:beforeAutospacing="1" w:after="100" w:afterAutospacing="1"/>
+        <w:rPr>
+          <w:rFonts w:ascii="Calibri" w:eastAsia="Times New Roman" w:hAnsi="Calibri" w:cs="Calibri"/>
+          <w:color w:val="1A1A1A"/>
+          <w:sz w:val="22"/>
+          <w:szCs w:val="22"/>
+        </w:rPr>
+      </w:pPr>
+      <w:r>
+        <w:rPr>
+          <w:rFonts w:ascii="Calibri" w:eastAsia="Times New Roman" w:hAnsi="Calibri" w:cs="Calibri"/>
+          <w:color w:val="1A1A1A"/>
+          <w:sz w:val="22"/>
+          <w:szCs w:val="22"/>
+        </w:rPr>
+        <w:t xml:space="preserve">Click </w:t>
+      </w:r>
+      <w:r>
+        <w:rPr>
+          <w:rStyle w:val="Strong"/>
+          <w:rFonts w:ascii="Calibri" w:eastAsia="Times New Roman" w:hAnsi="Calibri" w:cs="Calibri"/>
+          <w:color w:val="1A1A1A"/>
+          <w:sz w:val="22"/>
+          <w:szCs w:val="22"/>
+        </w:rPr>
+        <w:t>Generate</w:t>
+      </w:r>
+      <w:r>
+        <w:rPr>
+          <w:rFonts w:ascii="Calibri" w:eastAsia="Times New Roman" w:hAnsi="Calibri" w:cs="Calibri"/>
+          <w:color w:val="1A1A1A"/>
+          <w:sz w:val="22"/>
+          <w:szCs w:val="22"/>
+        </w:rPr>
+        <w:t xml:space="preserve"> </w:t>
+      </w:r>
+      <w:r>
+        <w:rPr>
+          <w:rFonts w:ascii="Calibri" w:eastAsia="Times New Roman" w:hAnsi="Calibri" w:cs="Calibri"/>
+          <w:color w:val="1A1A1A"/>
+          <w:sz w:val="22"/>
+          <w:szCs w:val="22"/>
+        </w:rPr>
+        <w:t xml:space="preserve">(or type one), then </w:t>
+      </w:r>
+      <w:r>
+        <w:rPr>
+          <w:rStyle w:val="Strong"/>
+          <w:rFonts w:ascii="Calibri" w:eastAsia="Times New Roman" w:hAnsi="Calibri" w:cs="Calibri"/>
+          <w:color w:val="1A1A1A"/>
+          <w:sz w:val="22"/>
+          <w:szCs w:val="22"/>
+        </w:rPr>
+        <w:t>Copy</w:t>
+      </w:r>
+      <w:r>
+        <w:rPr>
+          <w:rFonts w:ascii="Calibri" w:eastAsia="Times New Roman" w:hAnsi="Calibri" w:cs="Calibri"/>
+          <w:color w:val="1A1A1A"/>
+          <w:sz w:val="22"/>
+          <w:szCs w:val="22"/>
+        </w:rPr>
+        <w:t xml:space="preserve">, and click </w:t>
+      </w:r>
+      <w:r>
+        <w:rPr>
+          <w:rStyle w:val="Strong"/>
+          <w:rFonts w:ascii="Calibri" w:eastAsia="Times New Roman" w:hAnsi="Calibri" w:cs="Calibri"/>
+          <w:color w:val="1A1A1A"/>
+          <w:sz w:val="22"/>
+          <w:szCs w:val="22"/>
+        </w:rPr>
+        <w:t>Save</w:t>
+      </w:r>
+      <w:r>
+        <w:rPr>
+          <w:rFonts w:ascii="Calibri" w:eastAsia="Times New Roman" w:hAnsi="Calibri" w:cs="Calibri"/>
+          <w:color w:val="1A1A1A"/>
+          <w:sz w:val="22"/>
+          <w:szCs w:val="22"/>
+        </w:rPr>
+        <w:t>.</w:t>
+      </w:r>
+    </w:p>
+    <w:p>
+      <w:pPr>
+        <w:numPr>
+          <w:ilvl w:val="0"/>
+          <w:numId w:val="5"/>
+        </w:numPr>
+        <w:spacing w:before="100" w:beforeAutospacing="1" w:after="100" w:afterAutospacing="1"/>
+        <w:rPr>
+          <w:rFonts w:ascii="Calibri" w:eastAsia="Times New Roman" w:hAnsi="Calibri" w:cs="Calibri"/>
+          <w:color w:val="1A1A1A"/>
+          <w:sz w:val="22"/>
+          <w:szCs w:val="22"/>
+        </w:rPr>
+      </w:pPr>
+      <w:r>
+        <w:rPr>
+          <w:rFonts w:ascii="Calibri" w:eastAsia="Times New Roman" w:hAnsi="Calibri" w:cs="Calibri"/>
+          <w:color w:val="1A1A1A"/>
+          <w:sz w:val="22"/>
+          <w:szCs w:val="22"/>
+        </w:rPr>
+        <w:t>Give the new password to the person in person. If their account was locked, it is unlocked automatically.</w:t>
+      </w:r>
+    </w:p>
+    <w:p>
+      <w:pPr>
+        <w:pStyle w:val="NormalWeb"/>
+        <w:rPr>
+          <w:rFonts w:ascii="Calibri" w:hAnsi="Calibri" w:cs="Calibri"/>
+          <w:color w:val="1A1A1A"/>
+          <w:sz w:val="22"/>
+          <w:szCs w:val="22"/>
+        </w:rPr>
+      </w:pPr>
+      <w:r>
+        <w:rPr>
+          <w:rFonts w:ascii="Calibri" w:hAnsi="Calibri" w:cs="Calibri"/>
+          <w:color w:val="1A1A1A"/>
+          <w:sz w:val="22"/>
+          <w:szCs w:val="22"/>
+        </w:rPr>
+        <w:t xml:space="preserve">Use </w:t>
+      </w:r>
+      <w:r>
+        <w:rPr>
+          <w:rStyle w:val="Strong"/>
+          <w:rFonts w:ascii="Calibri" w:hAnsi="Calibri" w:cs="Calibri"/>
+          <w:color w:val="1A1A1A"/>
+          <w:sz w:val="22"/>
+          <w:szCs w:val="22"/>
+        </w:rPr>
+        <w:t>Dismiss</w:t>
+      </w:r>
+      <w:r>
+        <w:rPr>
+          <w:rFonts w:ascii="Calibri" w:hAnsi="Calibri" w:cs="Calibri"/>
+          <w:color w:val="1A1A1A"/>
+          <w:sz w:val="22"/>
+          <w:szCs w:val="22"/>
+        </w:rPr>
+        <w:t xml:space="preserve"> if a request was sent by mistake. Every change is recorded in the log.</w:t>
+      </w:r>
+    </w:p>
+    <w:p>
+      <w:pPr>
+        <w:pStyle w:val="Heading2"/>
+        <w:rPr>
+          <w:rFonts w:ascii="Calibri" w:eastAsia="Times New Roman" w:hAnsi="Calibri" w:cs="Calibri"/>
+        </w:rPr>
+      </w:pPr>
+      <w:r>
+        <w:rPr>
+          <w:rFonts w:ascii="Calibri" w:eastAsia="Times New Roman" w:hAnsi="Calibri" w:cs="Calibri"/>
+        </w:rPr>
+        <w:t>Signing out</w:t>
+      </w:r>
+    </w:p>
+    <w:p>
+      <w:pPr>
+        <w:pStyle w:val="NormalWeb"/>
+        <w:rPr>
+          <w:rFonts w:ascii="Calibri" w:hAnsi="Calibri" w:cs="Calibri"/>
+          <w:color w:val="1A1A1A"/>
+          <w:sz w:val="22"/>
+          <w:szCs w:val="22"/>
+        </w:rPr>
+      </w:pPr>
+      <w:r>
+        <w:rPr>
+          <w:rFonts w:ascii="Calibri" w:hAnsi="Calibri" w:cs="Calibri"/>
+          <w:color w:val="1A1A1A"/>
+          <w:sz w:val="22"/>
+          <w:szCs w:val="22"/>
+        </w:rPr>
+        <w:t xml:space="preserve">Click </w:t>
+      </w:r>
+      <w:r>
+        <w:rPr>
+          <w:rStyle w:val="Strong"/>
+          <w:rFonts w:ascii="Calibri" w:hAnsi="Calibri" w:cs="Calibri"/>
+          <w:color w:val="1A1A1A"/>
+          <w:sz w:val="22"/>
+          <w:szCs w:val="22"/>
+        </w:rPr>
+        <w:t>Sign Out</w:t>
+      </w:r>
+      <w:r>
+        <w:rPr>
+          <w:rFonts w:ascii="Calibri" w:hAnsi="Calibri" w:cs="Calibri"/>
+          <w:color w:val="1A1A1A"/>
+          <w:sz w:val="22"/>
+          <w:szCs w:val="22"/>
+        </w:rPr>
+        <w:t>, or close the window. Both are recorded.</w:t>
+      </w:r>
+    </w:p>
+    <w:p>
+      <w:pPr>
+        <w:pStyle w:val="Heading2"/>
+        <w:rPr>
+          <w:rFonts w:ascii="Calibri" w:eastAsia="Times New Roman" w:hAnsi="Calibri" w:cs="Calibri"/>
+        </w:rPr>
+      </w:pPr>
+      <w:r>
+        <w:rPr>
+          <w:rFonts w:ascii="Calibri" w:eastAsia="Times New Roman" w:hAnsi="Calibri" w:cs="Calibri"/>
+        </w:rPr>
+        <w:t>Rules</w:t>
+      </w:r>
+    </w:p>
+    <w:p>
+      <w:pPr>
+        <w:numPr>
+          <w:ilvl w:val="0"/>
+          <w:numId w:val="6"/>
+        </w:numPr>
+        <w:spacing w:before="100" w:beforeAutospacing="1" w:after="100" w:afterAutospacing="1"/>
+        <w:rPr>
+          <w:rFonts w:ascii="Calibri" w:eastAsia="Times New Roman" w:hAnsi="Calibri" w:cs="Calibri"/>
+          <w:color w:val="1A1A1A"/>
+          <w:sz w:val="22"/>
+          <w:szCs w:val="22"/>
+        </w:rPr>
+      </w:pPr>
+      <w:r>
+        <w:rPr>
+          <w:rStyle w:val="Strong"/>
+          <w:rFonts w:ascii="Calibri" w:eastAsia="Times New Roman" w:hAnsi="Calibri" w:cs="Calibri"/>
+          <w:color w:val="1A1A1A"/>
+          <w:sz w:val="22"/>
+          <w:szCs w:val="22"/>
+        </w:rPr>
+        <w:t>One sign in</w:t>
+      </w:r>
+      <w:r>
+        <w:rPr>
+          <w:rFonts w:ascii="Calibri" w:eastAsia="Times New Roman" w:hAnsi="Calibri" w:cs="Calibri"/>
+          <w:color w:val="1A1A1A"/>
+          <w:sz w:val="22"/>
+          <w:szCs w:val="22"/>
+        </w:rPr>
+        <w:t xml:space="preserve"> for the whole app.</w:t>
+      </w:r>
+    </w:p>
+    <w:p>
+      <w:pPr>
+        <w:numPr>
+          <w:ilvl w:val="0"/>
+          <w:numId w:val="6"/>
+        </w:numPr>
+        <w:spacing w:before="100" w:beforeAutospacing="1" w:after="100" w:afterAutospacing="1"/>
+        <w:rPr>
+          <w:rFonts w:ascii="Calibri" w:eastAsia="Times New Roman" w:hAnsi="Calibri" w:cs="Calibri"/>
+          <w:color w:val="1A1A1A"/>
+          <w:sz w:val="22"/>
+          <w:szCs w:val="22"/>
+        </w:rPr>
+      </w:pPr>
+      <w:r>
+        <w:rPr>
+          <w:rStyle w:val="Strong"/>
+          <w:rFonts w:ascii="Calibri" w:eastAsia="Times New Roman" w:hAnsi="Calibri" w:cs="Calibri"/>
+          <w:color w:val="1A1A1A"/>
+          <w:sz w:val="22"/>
+          <w:szCs w:val="22"/>
+        </w:rPr>
+        <w:t>5 wrong passwords</w:t>
+      </w:r>
+      <w:r>
+        <w:rPr>
+          <w:rFonts w:ascii="Calibri" w:eastAsia="Times New Roman" w:hAnsi="Calibri" w:cs="Calibri"/>
+          <w:color w:val="1A1A1A"/>
+          <w:sz w:val="22"/>
+          <w:szCs w:val="22"/>
+        </w:rPr>
+        <w:t xml:space="preserve"> lock the account. Only an Admin can unlock it.</w:t>
+      </w:r>
+    </w:p>
+    <w:p>
+      <w:pPr>
+        <w:numPr>
+          <w:ilvl w:val="0"/>
+          <w:numId w:val="6"/>
+        </w:numPr>
+        <w:spacing w:before="100" w:beforeAutospacing="1" w:after="100" w:afterAutospacing="1"/>
+        <w:rPr>
+          <w:rFonts w:ascii="Calibri" w:eastAsia="Times New Roman" w:hAnsi="Calibri" w:cs="Calibri"/>
+          <w:color w:val="1A1A1A"/>
+          <w:sz w:val="22"/>
+          <w:szCs w:val="22"/>
+        </w:rPr>
+      </w:pPr>
+      <w:r>
+        <w:rPr>
+          <w:rStyle w:val="Strong"/>
+          <w:rFonts w:ascii="Calibri" w:eastAsia="Times New Roman" w:hAnsi="Calibri" w:cs="Calibri"/>
+          <w:color w:val="1A1A1A"/>
+          <w:sz w:val="22"/>
+          <w:szCs w:val="22"/>
+        </w:rPr>
+        <w:t>Forgot your password?</w:t>
+      </w:r>
+      <w:r>
+        <w:rPr>
+          <w:rFonts w:ascii="Calibri" w:eastAsia="Times New Roman" w:hAnsi="Calibri" w:cs="Calibri"/>
+          <w:color w:val="1A1A1A"/>
+          <w:sz w:val="22"/>
+          <w:szCs w:val="22"/>
+        </w:rPr>
+        <w:t xml:space="preserve"> Click </w:t>
+      </w:r>
+      <w:r>
+        <w:rPr>
+          <w:rStyle w:val="Emphasis"/>
+          <w:rFonts w:ascii="Calibri" w:eastAsia="Times New Roman" w:hAnsi="Calibri" w:cs="Calibri"/>
+          <w:color w:val="1A1A1A"/>
+          <w:sz w:val="22"/>
+          <w:szCs w:val="22"/>
+        </w:rPr>
+        <w:t>Forgot Password</w:t>
+      </w:r>
+      <w:r>
+        <w:rPr>
+          <w:rFonts w:ascii="Calibri" w:eastAsia="Times New Roman" w:hAnsi="Calibri" w:cs="Calibri"/>
+          <w:color w:val="1A1A1A"/>
+          <w:sz w:val="22"/>
+          <w:szCs w:val="22"/>
+        </w:rPr>
+        <w:t xml:space="preserve"> </w:t>
+      </w:r>
+      <w:r>
+        <w:rPr>
+          <w:rFonts w:ascii="Calibri" w:eastAsia="Times New Roman" w:hAnsi="Calibri" w:cs="Calibri"/>
+          <w:color w:val="1A1A1A"/>
+          <w:sz w:val="22"/>
+          <w:szCs w:val="22"/>
+        </w:rPr>
+        <w:t>and type your username. The Admins get a request and will give you a new password in person. (Admins use their security question instead.)</w:t>
+      </w:r>
+    </w:p>
+    <w:p>
+      <w:pPr>
+        <w:numPr>
+          <w:ilvl w:val="0"/>
+          <w:numId w:val="6"/>
+        </w:numPr>
+        <w:spacing w:before="100" w:beforeAutospacing="1" w:after="100" w:afterAutospacing="1"/>
+        <w:rPr>
+          <w:rFonts w:ascii="Calibri" w:eastAsia="Times New Roman" w:hAnsi="Calibri" w:cs="Calibri"/>
+          <w:color w:val="1A1A1A"/>
+          <w:sz w:val="22"/>
+          <w:szCs w:val="22"/>
+        </w:rPr>
+      </w:pPr>
+      <w:r>
+        <w:rPr>
+          <w:rStyle w:val="Strong"/>
+          <w:rFonts w:ascii="Calibri" w:eastAsia="Times New Roman" w:hAnsi="Calibri" w:cs="Calibri"/>
+          <w:color w:val="1A1A1A"/>
+          <w:sz w:val="22"/>
+          <w:szCs w:val="22"/>
+        </w:rPr>
+        <w:t>Only Admins change passwords.</w:t>
+      </w:r>
+      <w:r>
+        <w:rPr>
+          <w:rFonts w:ascii="Calibri" w:eastAsia="Times New Roman" w:hAnsi="Calibri" w:cs="Calibri"/>
+          <w:color w:val="1A1A1A"/>
+          <w:sz w:val="22"/>
+          <w:szCs w:val="22"/>
+        </w:rPr>
+        <w:t xml:space="preserve"> Employees and Supervisors can't change their own.</w:t>
+      </w:r>
+    </w:p>
+    <w:p>
+      <w:pPr>
+        <w:numPr>
+          <w:ilvl w:val="0"/>
+          <w:numId w:val="6"/>
+        </w:numPr>
+        <w:spacing w:before="100" w:beforeAutospacing="1" w:after="100" w:afterAutospacing="1"/>
+        <w:rPr>
+          <w:rFonts w:ascii="Calibri" w:eastAsia="Times New Roman" w:hAnsi="Calibri" w:cs="Calibri"/>
+          <w:color w:val="1A1A1A"/>
+          <w:sz w:val="22"/>
+          <w:szCs w:val="22"/>
+        </w:rPr>
+      </w:pPr>
+      <w:r>
+        <w:rPr>
+          <w:rStyle w:val="Strong"/>
+          <w:rFonts w:ascii="Calibri" w:eastAsia="Times New Roman" w:hAnsi="Calibri" w:cs="Calibri"/>
+          <w:color w:val="1A1A1A"/>
+          <w:sz w:val="22"/>
+          <w:szCs w:val="22"/>
+        </w:rPr>
         <w:t>Idle check:</w:t>
       </w:r>
       <w:r>
@@ -1942,6 +2520,7 @@
         <w:rPr>
           <w:rFonts w:ascii="Calibri" w:eastAsia="Times New Roman" w:hAnsi="Calibri" w:cs="Calibri"/>
         </w:rPr>
+        <w:lastRenderedPageBreak/>
         <w:t xml:space="preserve">8. Subcontractors </w:t>
       </w:r>
       <w:r>
@@ -2007,9 +2586,348 @@
 <file path=word/numbering.xml><?xml version="1.0" encoding="utf-8"?>
 <w:numbering xmlns:wpc="http://schemas.microsoft.com/office/word/2010/wordprocessingCanvas" xmlns:cx="http://schemas.microsoft.com/office/drawing/2014/chartex" xmlns:cx1="http://schemas.microsoft.com/office/drawing/2015/9/8/chartex" xmlns:cx2="http://schemas.microsoft.com/office/drawing/2015/10/21/chartex" xmlns:cx3="http://schemas.microsoft.com/office/drawing/2016/5/9/chartex" xmlns:cx4="http://schemas.microsoft.com/office/drawing/2016/5/10/chartex" xmlns:cx5="http://schemas.microsoft.com/office/drawing/2016/5/11/chartex" xmlns:cx6="http://schemas.microsoft.com/office/drawing/2016/5/12/chartex" xmlns:cx7="http://schemas.microsoft.com/office/drawing/2016/5/13/chartex" xmlns:cx8="http://schemas.microsoft.com/office/drawing/2016/5/14/chartex" xmlns:mc="http://schemas.openxmlformats.org/markup-compatibility/2006" xmlns:aink="http://schemas.microsoft.com/office/drawing/2016/ink" xmlns:am3d="http://schemas.microsoft.com/office/drawing/2017/model3d" xmlns:o="urn:schemas-microsoft-com:office:office" xmlns:oel="http://schemas.microsoft.com/office/2019/extlst" xmlns:r="http://schemas.openxmlformats.org/officeDocument/2006/relationships" xmlns:m="http://schemas.openxmlformats.org/officeDocument/2006/math" xmlns:v="urn:schemas-microsoft-com:vml" xmlns:wp14="http://schemas.microsoft.com/office/word/2010/wordprocessingDrawing" xmlns:wp="http://schemas.openxmlformats.org/drawingml/2006/wordprocessingDrawing" xmlns:w10="urn:schemas-microsoft-com:office:word" xmlns:w="http://schemas.openxmlformats.org/wordprocessingml/2006/main" xmlns:w14="http://schemas.microsoft.com/office/word/2010/wordml" xmlns:w15="http://schemas.microsoft.com/office/word/2012/wordml" xmlns:w16cex="http://schemas.microsoft.com/office/word/2018/wordml/cex" xmlns:w16cid="http://schemas.microsoft.com/office/word/2016/wordml/cid" xmlns:w16="http://schemas.microsoft.com/office/word/2018/wordml" xmlns:w16du="http://schemas.microsoft.com/office/word/2023/wordml/word16du" xmlns:w16sdtdh="http://schemas.microsoft.com/office/word/2020/wordml/sdtdatahash" xmlns:w16sdtfl="http://schemas.microsoft.com/office/word/2024/wordml/sdtformatlock" xmlns:w16se="http://schemas.microsoft.com/office/word/2015/wordml/symex" xmlns:wpg="http://schemas.microsoft.com/office/word/2010/wordprocessingGroup" xmlns:wpi="http://schemas.microsoft.com/office/word/2010/wordprocessingInk" xmlns:wne="http://schemas.microsoft.com/office/word/2006/wordml" xmlns:wps="http://schemas.microsoft.com/office/word/2010/wordprocessingShape" mc:Ignorable="w14 w15 w16se w16cid w16 w16cex w16sdtdh w16sdtfl w16du wp14">
   <w:abstractNum w:abstractNumId="0" w15:restartNumberingAfterBreak="0">
-    <w:nsid w:val="49B26E51"/>
+    <w:nsid w:val="292D67EF"/>
     <w:multiLevelType w:val="multilevel"/>
-    <w:tmpl w:val="E55ECDFA"/>
+    <w:tmpl w:val="2960A9FA"/>
+    <w:lvl w:ilvl="0">
+      <w:start w:val="1"/>
+      <w:numFmt w:val="decimal"/>
+      <w:lvlText w:val="%1."/>
+      <w:lvlJc w:val="left"/>
+      <w:pPr>
+        <w:tabs>
+          <w:tab w:val="num" w:pos="720"/>
+        </w:tabs>
+        <w:ind w:left="720" w:hanging="360"/>
+      </w:pPr>
+    </w:lvl>
+    <w:lvl w:ilvl="1" w:tentative="1">
+      <w:start w:val="1"/>
+      <w:numFmt w:val="decimal"/>
+      <w:lvlText w:val="%2."/>
+      <w:lvlJc w:val="left"/>
+      <w:pPr>
+        <w:tabs>
+          <w:tab w:val="num" w:pos="1440"/>
+        </w:tabs>
+        <w:ind w:left="1440" w:hanging="360"/>
+      </w:pPr>
+    </w:lvl>
+    <w:lvl w:ilvl="2" w:tentative="1">
+      <w:start w:val="1"/>
+      <w:numFmt w:val="decimal"/>
+      <w:lvlText w:val="%3."/>
+      <w:lvlJc w:val="left"/>
+      <w:pPr>
+        <w:tabs>
+          <w:tab w:val="num" w:pos="2160"/>
+        </w:tabs>
+        <w:ind w:left="2160" w:hanging="360"/>
+      </w:pPr>
+    </w:lvl>
+    <w:lvl w:ilvl="3" w:tentative="1">
+      <w:start w:val="1"/>
+      <w:numFmt w:val="decimal"/>
+      <w:lvlText w:val="%4."/>
+      <w:lvlJc w:val="left"/>
+      <w:pPr>
+        <w:tabs>
+          <w:tab w:val="num" w:pos="2880"/>
+        </w:tabs>
+        <w:ind w:left="2880" w:hanging="360"/>
+      </w:pPr>
+    </w:lvl>
+    <w:lvl w:ilvl="4" w:tentative="1">
+      <w:start w:val="1"/>
+      <w:numFmt w:val="decimal"/>
+      <w:lvlText w:val="%5."/>
+      <w:lvlJc w:val="left"/>
+      <w:pPr>
+        <w:tabs>
+          <w:tab w:val="num" w:pos="3600"/>
+        </w:tabs>
+        <w:ind w:left="3600" w:hanging="360"/>
+      </w:pPr>
+    </w:lvl>
+    <w:lvl w:ilvl="5" w:tentative="1">
+      <w:start w:val="1"/>
+      <w:numFmt w:val="decimal"/>
+      <w:lvlText w:val="%6."/>
+      <w:lvlJc w:val="left"/>
+      <w:pPr>
+        <w:tabs>
+          <w:tab w:val="num" w:pos="4320"/>
+        </w:tabs>
+        <w:ind w:left="4320" w:hanging="360"/>
+      </w:pPr>
+    </w:lvl>
+    <w:lvl w:ilvl="6" w:tentative="1">
+      <w:start w:val="1"/>
+      <w:numFmt w:val="decimal"/>
+      <w:lvlText w:val="%7."/>
+      <w:lvlJc w:val="left"/>
+      <w:pPr>
+        <w:tabs>
+          <w:tab w:val="num" w:pos="5040"/>
+        </w:tabs>
+        <w:ind w:left="5040" w:hanging="360"/>
+      </w:pPr>
+    </w:lvl>
+    <w:lvl w:ilvl="7" w:tentative="1">
+      <w:start w:val="1"/>
+      <w:numFmt w:val="decimal"/>
+      <w:lvlText w:val="%8."/>
+      <w:lvlJc w:val="left"/>
+      <w:pPr>
+        <w:tabs>
+          <w:tab w:val="num" w:pos="5760"/>
+        </w:tabs>
+        <w:ind w:left="5760" w:hanging="360"/>
+      </w:pPr>
+    </w:lvl>
+    <w:lvl w:ilvl="8" w:tentative="1">
+      <w:start w:val="1"/>
+      <w:numFmt w:val="decimal"/>
+      <w:lvlText w:val="%9."/>
+      <w:lvlJc w:val="left"/>
+      <w:pPr>
+        <w:tabs>
+          <w:tab w:val="num" w:pos="6480"/>
+        </w:tabs>
+        <w:ind w:left="6480" w:hanging="360"/>
+      </w:pPr>
+    </w:lvl>
+  </w:abstractNum>
+  <w:abstractNum w:abstractNumId="1" w15:restartNumberingAfterBreak="0">
+    <w:nsid w:val="50230C20"/>
+    <w:multiLevelType w:val="multilevel"/>
+    <w:tmpl w:val="D7F0B3B4"/>
+    <w:lvl w:ilvl="0">
+      <w:start w:val="1"/>
+      <w:numFmt w:val="decimal"/>
+      <w:lvlText w:val="%1."/>
+      <w:lvlJc w:val="left"/>
+      <w:pPr>
+        <w:tabs>
+          <w:tab w:val="num" w:pos="720"/>
+        </w:tabs>
+        <w:ind w:left="720" w:hanging="360"/>
+      </w:pPr>
+    </w:lvl>
+    <w:lvl w:ilvl="1" w:tentative="1">
+      <w:start w:val="1"/>
+      <w:numFmt w:val="decimal"/>
+      <w:lvlText w:val="%2."/>
+      <w:lvlJc w:val="left"/>
+      <w:pPr>
+        <w:tabs>
+          <w:tab w:val="num" w:pos="1440"/>
+        </w:tabs>
+        <w:ind w:left="1440" w:hanging="360"/>
+      </w:pPr>
+    </w:lvl>
+    <w:lvl w:ilvl="2" w:tentative="1">
+      <w:start w:val="1"/>
+      <w:numFmt w:val="decimal"/>
+      <w:lvlText w:val="%3."/>
+      <w:lvlJc w:val="left"/>
+      <w:pPr>
+        <w:tabs>
+          <w:tab w:val="num" w:pos="2160"/>
+        </w:tabs>
+        <w:ind w:left="2160" w:hanging="360"/>
+      </w:pPr>
+    </w:lvl>
+    <w:lvl w:ilvl="3" w:tentative="1">
+      <w:start w:val="1"/>
+      <w:numFmt w:val="decimal"/>
+      <w:lvlText w:val="%4."/>
+      <w:lvlJc w:val="left"/>
+      <w:pPr>
+        <w:tabs>
+          <w:tab w:val="num" w:pos="2880"/>
+        </w:tabs>
+        <w:ind w:left="2880" w:hanging="360"/>
+      </w:pPr>
+    </w:lvl>
+    <w:lvl w:ilvl="4" w:tentative="1">
+      <w:start w:val="1"/>
+      <w:numFmt w:val="decimal"/>
+      <w:lvlText w:val="%5."/>
+      <w:lvlJc w:val="left"/>
+      <w:pPr>
+        <w:tabs>
+          <w:tab w:val="num" w:pos="3600"/>
+        </w:tabs>
+        <w:ind w:left="3600" w:hanging="360"/>
+      </w:pPr>
+    </w:lvl>
+    <w:lvl w:ilvl="5" w:tentative="1">
+      <w:start w:val="1"/>
+      <w:numFmt w:val="decimal"/>
+      <w:lvlText w:val="%6."/>
+      <w:lvlJc w:val="left"/>
+      <w:pPr>
+        <w:tabs>
+          <w:tab w:val="num" w:pos="4320"/>
+        </w:tabs>
+        <w:ind w:left="4320" w:hanging="360"/>
+      </w:pPr>
+    </w:lvl>
+    <w:lvl w:ilvl="6" w:tentative="1">
+      <w:start w:val="1"/>
+      <w:numFmt w:val="decimal"/>
+      <w:lvlText w:val="%7."/>
+      <w:lvlJc w:val="left"/>
+      <w:pPr>
+        <w:tabs>
+          <w:tab w:val="num" w:pos="5040"/>
+        </w:tabs>
+        <w:ind w:left="5040" w:hanging="360"/>
+      </w:pPr>
+    </w:lvl>
+    <w:lvl w:ilvl="7" w:tentative="1">
+      <w:start w:val="1"/>
+      <w:numFmt w:val="decimal"/>
+      <w:lvlText w:val="%8."/>
+      <w:lvlJc w:val="left"/>
+      <w:pPr>
+        <w:tabs>
+          <w:tab w:val="num" w:pos="5760"/>
+        </w:tabs>
+        <w:ind w:left="5760" w:hanging="360"/>
+      </w:pPr>
+    </w:lvl>
+    <w:lvl w:ilvl="8" w:tentative="1">
+      <w:start w:val="1"/>
+      <w:numFmt w:val="decimal"/>
+      <w:lvlText w:val="%9."/>
+      <w:lvlJc w:val="left"/>
+      <w:pPr>
+        <w:tabs>
+          <w:tab w:val="num" w:pos="6480"/>
+        </w:tabs>
+        <w:ind w:left="6480" w:hanging="360"/>
+      </w:pPr>
+    </w:lvl>
+  </w:abstractNum>
+  <w:abstractNum w:abstractNumId="2" w15:restartNumberingAfterBreak="0">
+    <w:nsid w:val="6329659B"/>
+    <w:multiLevelType w:val="multilevel"/>
+    <w:tmpl w:val="6F50ACF8"/>
+    <w:lvl w:ilvl="0">
+      <w:start w:val="1"/>
+      <w:numFmt w:val="decimal"/>
+      <w:lvlText w:val="%1."/>
+      <w:lvlJc w:val="left"/>
+      <w:pPr>
+        <w:tabs>
+          <w:tab w:val="num" w:pos="720"/>
+        </w:tabs>
+        <w:ind w:left="720" w:hanging="360"/>
+      </w:pPr>
+    </w:lvl>
+    <w:lvl w:ilvl="1" w:tentative="1">
+      <w:start w:val="1"/>
+      <w:numFmt w:val="decimal"/>
+      <w:lvlText w:val="%2."/>
+      <w:lvlJc w:val="left"/>
+      <w:pPr>
+        <w:tabs>
+          <w:tab w:val="num" w:pos="1440"/>
+        </w:tabs>
+        <w:ind w:left="1440" w:hanging="360"/>
+      </w:pPr>
+    </w:lvl>
+    <w:lvl w:ilvl="2" w:tentative="1">
+      <w:start w:val="1"/>
+      <w:numFmt w:val="decimal"/>
+      <w:lvlText w:val="%3."/>
+      <w:lvlJc w:val="left"/>
+      <w:pPr>
+        <w:tabs>
+          <w:tab w:val="num" w:pos="2160"/>
+        </w:tabs>
+        <w:ind w:left="2160" w:hanging="360"/>
+      </w:pPr>
+    </w:lvl>
+    <w:lvl w:ilvl="3" w:tentative="1">
+      <w:start w:val="1"/>
+      <w:numFmt w:val="decimal"/>
+      <w:lvlText w:val="%4."/>
+      <w:lvlJc w:val="left"/>
+      <w:pPr>
+        <w:tabs>
+          <w:tab w:val="num" w:pos="2880"/>
+        </w:tabs>
+        <w:ind w:left="2880" w:hanging="360"/>
+      </w:pPr>
+    </w:lvl>
+    <w:lvl w:ilvl="4" w:tentative="1">
+      <w:start w:val="1"/>
+      <w:numFmt w:val="decimal"/>
+      <w:lvlText w:val="%5."/>
+      <w:lvlJc w:val="left"/>
+      <w:pPr>
+        <w:tabs>
+          <w:tab w:val="num" w:pos="3600"/>
+        </w:tabs>
+        <w:ind w:left="3600" w:hanging="360"/>
+      </w:pPr>
+    </w:lvl>
+    <w:lvl w:ilvl="5" w:tentative="1">
+      <w:start w:val="1"/>
+      <w:numFmt w:val="decimal"/>
+      <w:lvlText w:val="%6."/>
+      <w:lvlJc w:val="left"/>
+      <w:pPr>
+        <w:tabs>
+          <w:tab w:val="num" w:pos="4320"/>
+        </w:tabs>
+        <w:ind w:left="4320" w:hanging="360"/>
+      </w:pPr>
+    </w:lvl>
+    <w:lvl w:ilvl="6" w:tentative="1">
+      <w:start w:val="1"/>
+      <w:numFmt w:val="decimal"/>
+      <w:lvlText w:val="%7."/>
+      <w:lvlJc w:val="left"/>
+      <w:pPr>
+        <w:tabs>
+          <w:tab w:val="num" w:pos="5040"/>
+        </w:tabs>
+        <w:ind w:left="5040" w:hanging="360"/>
+      </w:pPr>
+    </w:lvl>
+    <w:lvl w:ilvl="7" w:tentative="1">
+      <w:start w:val="1"/>
+      <w:numFmt w:val="decimal"/>
+      <w:lvlText w:val="%8."/>
+      <w:lvlJc w:val="left"/>
+      <w:pPr>
+        <w:tabs>
+          <w:tab w:val="num" w:pos="5760"/>
+        </w:tabs>
+        <w:ind w:left="5760" w:hanging="360"/>
+      </w:pPr>
+    </w:lvl>
+    <w:lvl w:ilvl="8" w:tentative="1">
+      <w:start w:val="1"/>
+      <w:numFmt w:val="decimal"/>
+      <w:lvlText w:val="%9."/>
+      <w:lvlJc w:val="left"/>
+      <w:pPr>
+        <w:tabs>
+          <w:tab w:val="num" w:pos="6480"/>
+        </w:tabs>
+        <w:ind w:left="6480" w:hanging="360"/>
+      </w:pPr>
+    </w:lvl>
+  </w:abstractNum>
+  <w:abstractNum w:abstractNumId="3" w15:restartNumberingAfterBreak="0">
+    <w:nsid w:val="68AD08F5"/>
+    <w:multiLevelType w:val="multilevel"/>
+    <w:tmpl w:val="BF243C6C"/>
     <w:lvl w:ilvl="0">
       <w:start w:val="1"/>
       <w:numFmt w:val="bullet"/>
@@ -2155,10 +3073,10 @@
       </w:rPr>
     </w:lvl>
   </w:abstractNum>
-  <w:abstractNum w:abstractNumId="1" w15:restartNumberingAfterBreak="0">
-    <w:nsid w:val="55722E20"/>
+  <w:abstractNum w:abstractNumId="4" w15:restartNumberingAfterBreak="0">
+    <w:nsid w:val="6B833CA3"/>
     <w:multiLevelType w:val="multilevel"/>
-    <w:tmpl w:val="624205C8"/>
+    <w:tmpl w:val="085855CA"/>
     <w:lvl w:ilvl="0">
       <w:start w:val="1"/>
       <w:numFmt w:val="decimal"/>
@@ -2268,10 +3186,10 @@
       </w:pPr>
     </w:lvl>
   </w:abstractNum>
-  <w:abstractNum w:abstractNumId="2" w15:restartNumberingAfterBreak="0">
-    <w:nsid w:val="711A4BD5"/>
+  <w:abstractNum w:abstractNumId="5" w15:restartNumberingAfterBreak="0">
+    <w:nsid w:val="6C56646C"/>
     <w:multiLevelType w:val="multilevel"/>
-    <w:tmpl w:val="E4FAE2F4"/>
+    <w:tmpl w:val="818C6A2A"/>
     <w:lvl w:ilvl="0">
       <w:start w:val="1"/>
       <w:numFmt w:val="decimal"/>
@@ -2381,14 +3299,23 @@
       </w:pPr>
     </w:lvl>
   </w:abstractNum>
-  <w:num w:numId="1" w16cid:durableId="54863343">
+  <w:num w:numId="1" w16cid:durableId="988050398">
     <w:abstractNumId w:val="1"/>
   </w:num>
-  <w:num w:numId="2" w16cid:durableId="414518052">
+  <w:num w:numId="2" w16cid:durableId="817183518">
+    <w:abstractNumId w:val="5"/>
+  </w:num>
+  <w:num w:numId="3" w16cid:durableId="1311599004">
+    <w:abstractNumId w:val="4"/>
+  </w:num>
+  <w:num w:numId="4" w16cid:durableId="297496370">
     <w:abstractNumId w:val="2"/>
   </w:num>
-  <w:num w:numId="3" w16cid:durableId="1088038508">
+  <w:num w:numId="5" w16cid:durableId="1017921529">
     <w:abstractNumId w:val="0"/>
+  </w:num>
+  <w:num w:numId="6" w16cid:durableId="979269292">
+    <w:abstractNumId w:val="3"/>
   </w:num>
 </w:numbering>
 </file>

</xml_diff>

<commit_message>
Add main window sidebar by role and the 5-minute idle check (plain layout)
- Access: one place for page rules (Admin all; Supervisor dashboard + own
  department; Employee own department; My Account for everyone) and the
  first page after sign in.
- MainForm: FlowLayoutPanel sidebar, top bar, pnlContent with placeholder
  pages; X-close writes the Logout row before closing.
- IdleMonitor (IMessageFilter) + IdleWarningForm: popup after 5 minutes,
  60-second countdown, Stay / Sign Out / no answer = Idle Sign Out, and a
  notice on the Login window. TRISTONE_IDLE_SECONDS shortens it in Debug.
- Tested the real window as Admin, HR Employee and Inventory Supervisor,
  and all three idle outcomes (9 checks).
- Guides: Developer Guide chapter 10, User Manual main window and idle,
  UI Elements Guide main window details.

Co-Authored-By: Claude Opus 5.5 <noreply@anthropic.com>
</commit_message>
<xml_diff>
--- a/docs/User Manual.docx
+++ b/docs/User Manual.docx
@@ -2191,7 +2191,7 @@
           <w:sz w:val="22"/>
           <w:szCs w:val="22"/>
         </w:rPr>
-        <w:t>, or close the window. Both are recorded.</w:t>
+        <w:t xml:space="preserve"> at the bottom of the left sidebar, or close the window. Both are recorded.</w:t>
       </w:r>
     </w:p>
     <w:p>
@@ -2205,7 +2205,7 @@
         <w:rPr>
           <w:rFonts w:ascii="Calibri" w:eastAsia="Times New Roman" w:hAnsi="Calibri" w:cs="Calibri"/>
         </w:rPr>
-        <w:t>Rules</w:t>
+        <w:t>The main window</w:t>
       </w:r>
     </w:p>
     <w:p>
@@ -2230,16 +2230,35 @@
           <w:sz w:val="22"/>
           <w:szCs w:val="22"/>
         </w:rPr>
-        <w:t>One sign in</w:t>
-      </w:r>
-      <w:r>
-        <w:rPr>
-          <w:rFonts w:ascii="Calibri" w:eastAsia="Times New Roman" w:hAnsi="Calibri" w:cs="Calibri"/>
-          <w:color w:val="1A1A1A"/>
-          <w:sz w:val="22"/>
-          <w:szCs w:val="22"/>
-        </w:rPr>
-        <w:t xml:space="preserve"> for the whole app.</w:t>
+        <w:t>Left sidebar:</w:t>
+      </w:r>
+      <w:r>
+        <w:rPr>
+          <w:rFonts w:ascii="Calibri" w:eastAsia="Times New Roman" w:hAnsi="Calibri" w:cs="Calibri"/>
+          <w:color w:val="1A1A1A"/>
+          <w:sz w:val="22"/>
+          <w:szCs w:val="22"/>
+        </w:rPr>
+        <w:t xml:space="preserve"> the pages you're allowed to use. You only see your own department's page (Admins see everything). The page that's open is shown in </w:t>
+      </w:r>
+      <w:r>
+        <w:rPr>
+          <w:rStyle w:val="Strong"/>
+          <w:rFonts w:ascii="Calibri" w:eastAsia="Times New Roman" w:hAnsi="Calibri" w:cs="Calibri"/>
+          <w:color w:val="1A1A1A"/>
+          <w:sz w:val="22"/>
+          <w:szCs w:val="22"/>
+        </w:rPr>
+        <w:t>bold</w:t>
+      </w:r>
+      <w:r>
+        <w:rPr>
+          <w:rFonts w:ascii="Calibri" w:eastAsia="Times New Roman" w:hAnsi="Calibri" w:cs="Calibri"/>
+          <w:color w:val="1A1A1A"/>
+          <w:sz w:val="22"/>
+          <w:szCs w:val="22"/>
+        </w:rPr>
+        <w:t>.</w:t>
       </w:r>
     </w:p>
     <w:p>
@@ -2264,16 +2283,44 @@
           <w:sz w:val="22"/>
           <w:szCs w:val="22"/>
         </w:rPr>
-        <w:t>5 wrong passwords</w:t>
-      </w:r>
-      <w:r>
-        <w:rPr>
-          <w:rFonts w:ascii="Calibri" w:eastAsia="Times New Roman" w:hAnsi="Calibri" w:cs="Calibri"/>
-          <w:color w:val="1A1A1A"/>
-          <w:sz w:val="22"/>
-          <w:szCs w:val="22"/>
-        </w:rPr>
-        <w:t xml:space="preserve"> lock the account. Only an Admin can unlock it.</w:t>
+        <w:t>Top:</w:t>
+      </w:r>
+      <w:r>
+        <w:rPr>
+          <w:rFonts w:ascii="Calibri" w:eastAsia="Times New Roman" w:hAnsi="Calibri" w:cs="Calibri"/>
+          <w:color w:val="1A1A1A"/>
+          <w:sz w:val="22"/>
+          <w:szCs w:val="22"/>
+        </w:rPr>
+        <w:t xml:space="preserve"> </w:t>
+      </w:r>
+      <w:r>
+        <w:rPr>
+          <w:rFonts w:ascii="Calibri" w:eastAsia="Times New Roman" w:hAnsi="Calibri" w:cs="Calibri"/>
+          <w:color w:val="1A1A1A"/>
+          <w:sz w:val="22"/>
+          <w:szCs w:val="22"/>
+        </w:rPr>
+        <w:t xml:space="preserve">the page name, your name, and your department and level. Admins also see </w:t>
+      </w:r>
+      <w:r>
+        <w:rPr>
+          <w:rStyle w:val="Strong"/>
+          <w:rFonts w:ascii="Calibri" w:eastAsia="Times New Roman" w:hAnsi="Calibri" w:cs="Calibri"/>
+          <w:color w:val="1A1A1A"/>
+          <w:sz w:val="22"/>
+          <w:szCs w:val="22"/>
+        </w:rPr>
+        <w:t>Password requests (N)</w:t>
+      </w:r>
+      <w:r>
+        <w:rPr>
+          <w:rFonts w:ascii="Calibri" w:eastAsia="Times New Roman" w:hAnsi="Calibri" w:cs="Calibri"/>
+          <w:color w:val="1A1A1A"/>
+          <w:sz w:val="22"/>
+          <w:szCs w:val="22"/>
+        </w:rPr>
+        <w:t>.</w:t>
       </w:r>
     </w:p>
     <w:p>
@@ -2298,51 +2345,95 @@
           <w:sz w:val="22"/>
           <w:szCs w:val="22"/>
         </w:rPr>
-        <w:t>Forgot your password?</w:t>
-      </w:r>
-      <w:r>
-        <w:rPr>
-          <w:rFonts w:ascii="Calibri" w:eastAsia="Times New Roman" w:hAnsi="Calibri" w:cs="Calibri"/>
-          <w:color w:val="1A1A1A"/>
-          <w:sz w:val="22"/>
-          <w:szCs w:val="22"/>
-        </w:rPr>
-        <w:t xml:space="preserve"> Click </w:t>
+        <w:t>Middle:</w:t>
+      </w:r>
+      <w:r>
+        <w:rPr>
+          <w:rFonts w:ascii="Calibri" w:eastAsia="Times New Roman" w:hAnsi="Calibri" w:cs="Calibri"/>
+          <w:color w:val="1A1A1A"/>
+          <w:sz w:val="22"/>
+          <w:szCs w:val="22"/>
+        </w:rPr>
+        <w:t xml:space="preserve"> the page you chose.</w:t>
+      </w:r>
+    </w:p>
+    <w:p>
+      <w:pPr>
+        <w:pStyle w:val="Heading2"/>
+        <w:rPr>
+          <w:rFonts w:ascii="Calibri" w:eastAsia="Times New Roman" w:hAnsi="Calibri" w:cs="Calibri"/>
+        </w:rPr>
+      </w:pPr>
+      <w:r>
+        <w:rPr>
+          <w:rFonts w:ascii="Calibri" w:eastAsia="Times New Roman" w:hAnsi="Calibri" w:cs="Calibri"/>
+        </w:rPr>
+        <w:t>"Still there?"</w:t>
+      </w:r>
+    </w:p>
+    <w:p>
+      <w:pPr>
+        <w:pStyle w:val="NormalWeb"/>
+        <w:rPr>
+          <w:rFonts w:ascii="Calibri" w:hAnsi="Calibri" w:cs="Calibri"/>
+          <w:color w:val="1A1A1A"/>
+          <w:sz w:val="22"/>
+          <w:szCs w:val="22"/>
+        </w:rPr>
+      </w:pPr>
+      <w:r>
+        <w:rPr>
+          <w:rFonts w:ascii="Calibri" w:hAnsi="Calibri" w:cs="Calibri"/>
+          <w:color w:val="1A1A1A"/>
+          <w:sz w:val="22"/>
+          <w:szCs w:val="22"/>
+        </w:rPr>
+        <w:t xml:space="preserve">If you don't touch the keyboard or mouse for </w:t>
+      </w:r>
+      <w:r>
+        <w:rPr>
+          <w:rStyle w:val="Strong"/>
+          <w:rFonts w:ascii="Calibri" w:hAnsi="Calibri" w:cs="Calibri"/>
+          <w:color w:val="1A1A1A"/>
+          <w:sz w:val="22"/>
+          <w:szCs w:val="22"/>
+        </w:rPr>
+        <w:t>5 minutes</w:t>
+      </w:r>
+      <w:r>
+        <w:rPr>
+          <w:rFonts w:ascii="Calibri" w:hAnsi="Calibri" w:cs="Calibri"/>
+          <w:color w:val="1A1A1A"/>
+          <w:sz w:val="22"/>
+          <w:szCs w:val="22"/>
+        </w:rPr>
+        <w:t xml:space="preserve">, a </w:t>
       </w:r>
       <w:r>
         <w:rPr>
           <w:rStyle w:val="Emphasis"/>
-          <w:rFonts w:ascii="Calibri" w:eastAsia="Times New Roman" w:hAnsi="Calibri" w:cs="Calibri"/>
-          <w:color w:val="1A1A1A"/>
-          <w:sz w:val="22"/>
-          <w:szCs w:val="22"/>
-        </w:rPr>
-        <w:t>Forgot Password</w:t>
-      </w:r>
-      <w:r>
-        <w:rPr>
-          <w:rFonts w:ascii="Calibri" w:eastAsia="Times New Roman" w:hAnsi="Calibri" w:cs="Calibri"/>
-          <w:color w:val="1A1A1A"/>
-          <w:sz w:val="22"/>
-          <w:szCs w:val="22"/>
-        </w:rPr>
-        <w:t xml:space="preserve"> </w:t>
-      </w:r>
-      <w:r>
-        <w:rPr>
-          <w:rFonts w:ascii="Calibri" w:eastAsia="Times New Roman" w:hAnsi="Calibri" w:cs="Calibri"/>
-          <w:color w:val="1A1A1A"/>
-          <w:sz w:val="22"/>
-          <w:szCs w:val="22"/>
-        </w:rPr>
-        <w:t>and type your username. The Admins get a request and will give you a new password in person. (Admins use their security question instead.)</w:t>
+          <w:rFonts w:ascii="Calibri" w:hAnsi="Calibri" w:cs="Calibri"/>
+          <w:color w:val="1A1A1A"/>
+          <w:sz w:val="22"/>
+          <w:szCs w:val="22"/>
+        </w:rPr>
+        <w:t>"Still there?"</w:t>
+      </w:r>
+      <w:r>
+        <w:rPr>
+          <w:rFonts w:ascii="Calibri" w:hAnsi="Calibri" w:cs="Calibri"/>
+          <w:color w:val="1A1A1A"/>
+          <w:sz w:val="22"/>
+          <w:szCs w:val="22"/>
+        </w:rPr>
+        <w:t xml:space="preserve"> message appears with a 60-second countdown.</w:t>
       </w:r>
     </w:p>
     <w:p>
       <w:pPr>
         <w:numPr>
           <w:ilvl w:val="0"/>
-          <w:numId w:val="6"/>
+          <w:numId w:val="7"/>
         </w:numPr>
         <w:spacing w:before="100" w:beforeAutospacing="1" w:after="100" w:afterAutospacing="1"/>
         <w:rPr>
@@ -2354,29 +2445,38 @@
       </w:pPr>
       <w:r>
         <w:rPr>
+          <w:rFonts w:ascii="Calibri" w:eastAsia="Times New Roman" w:hAnsi="Calibri" w:cs="Calibri"/>
+          <w:color w:val="1A1A1A"/>
+          <w:sz w:val="22"/>
+          <w:szCs w:val="22"/>
+        </w:rPr>
+        <w:t xml:space="preserve">Click </w:t>
+      </w:r>
+      <w:r>
+        <w:rPr>
           <w:rStyle w:val="Strong"/>
           <w:rFonts w:ascii="Calibri" w:eastAsia="Times New Roman" w:hAnsi="Calibri" w:cs="Calibri"/>
           <w:color w:val="1A1A1A"/>
           <w:sz w:val="22"/>
           <w:szCs w:val="22"/>
         </w:rPr>
-        <w:t>Only Admins change passwords.</w:t>
-      </w:r>
-      <w:r>
-        <w:rPr>
-          <w:rFonts w:ascii="Calibri" w:eastAsia="Times New Roman" w:hAnsi="Calibri" w:cs="Calibri"/>
-          <w:color w:val="1A1A1A"/>
-          <w:sz w:val="22"/>
-          <w:szCs w:val="22"/>
-        </w:rPr>
-        <w:t xml:space="preserve"> Employees and Supervisors can't change their own.</w:t>
+        <w:t>Stay Signed In</w:t>
+      </w:r>
+      <w:r>
+        <w:rPr>
+          <w:rFonts w:ascii="Calibri" w:eastAsia="Times New Roman" w:hAnsi="Calibri" w:cs="Calibri"/>
+          <w:color w:val="1A1A1A"/>
+          <w:sz w:val="22"/>
+          <w:szCs w:val="22"/>
+        </w:rPr>
+        <w:t xml:space="preserve"> to keep working.</w:t>
       </w:r>
     </w:p>
     <w:p>
       <w:pPr>
         <w:numPr>
           <w:ilvl w:val="0"/>
-          <w:numId w:val="6"/>
+          <w:numId w:val="7"/>
         </w:numPr>
         <w:spacing w:before="100" w:beforeAutospacing="1" w:after="100" w:afterAutospacing="1"/>
         <w:rPr>
@@ -2388,12 +2488,249 @@
       </w:pPr>
       <w:r>
         <w:rPr>
+          <w:rFonts w:ascii="Calibri" w:eastAsia="Times New Roman" w:hAnsi="Calibri" w:cs="Calibri"/>
+          <w:color w:val="1A1A1A"/>
+          <w:sz w:val="22"/>
+          <w:szCs w:val="22"/>
+        </w:rPr>
+        <w:t xml:space="preserve">Click </w:t>
+      </w:r>
+      <w:r>
+        <w:rPr>
           <w:rStyle w:val="Strong"/>
           <w:rFonts w:ascii="Calibri" w:eastAsia="Times New Roman" w:hAnsi="Calibri" w:cs="Calibri"/>
           <w:color w:val="1A1A1A"/>
           <w:sz w:val="22"/>
           <w:szCs w:val="22"/>
         </w:rPr>
+        <w:t>Sign Out</w:t>
+      </w:r>
+      <w:r>
+        <w:rPr>
+          <w:rFonts w:ascii="Calibri" w:eastAsia="Times New Roman" w:hAnsi="Calibri" w:cs="Calibri"/>
+          <w:color w:val="1A1A1A"/>
+          <w:sz w:val="22"/>
+          <w:szCs w:val="22"/>
+        </w:rPr>
+        <w:t xml:space="preserve"> to sign out now.</w:t>
+      </w:r>
+    </w:p>
+    <w:p>
+      <w:pPr>
+        <w:numPr>
+          <w:ilvl w:val="0"/>
+          <w:numId w:val="7"/>
+        </w:numPr>
+        <w:spacing w:before="100" w:beforeAutospacing="1" w:after="100" w:afterAutospacing="1"/>
+        <w:rPr>
+          <w:rFonts w:ascii="Calibri" w:eastAsia="Times New Roman" w:hAnsi="Calibri" w:cs="Calibri"/>
+          <w:color w:val="1A1A1A"/>
+          <w:sz w:val="22"/>
+          <w:szCs w:val="22"/>
+        </w:rPr>
+      </w:pPr>
+      <w:r>
+        <w:rPr>
+          <w:rFonts w:ascii="Calibri" w:eastAsia="Times New Roman" w:hAnsi="Calibri" w:cs="Calibri"/>
+          <w:color w:val="1A1A1A"/>
+          <w:sz w:val="22"/>
+          <w:szCs w:val="22"/>
+        </w:rPr>
+        <w:t>If nobody answers, the app signs out by itself, and the Sign In window says why.</w:t>
+      </w:r>
+    </w:p>
+    <w:p>
+      <w:pPr>
+        <w:pStyle w:val="Heading2"/>
+        <w:rPr>
+          <w:rFonts w:ascii="Calibri" w:eastAsia="Times New Roman" w:hAnsi="Calibri" w:cs="Calibri"/>
+        </w:rPr>
+      </w:pPr>
+      <w:r>
+        <w:rPr>
+          <w:rFonts w:ascii="Calibri" w:eastAsia="Times New Roman" w:hAnsi="Calibri" w:cs="Calibri"/>
+        </w:rPr>
+        <w:t>Rules</w:t>
+      </w:r>
+    </w:p>
+    <w:p>
+      <w:pPr>
+        <w:numPr>
+          <w:ilvl w:val="0"/>
+          <w:numId w:val="8"/>
+        </w:numPr>
+        <w:spacing w:before="100" w:beforeAutospacing="1" w:after="100" w:afterAutospacing="1"/>
+        <w:rPr>
+          <w:rFonts w:ascii="Calibri" w:eastAsia="Times New Roman" w:hAnsi="Calibri" w:cs="Calibri"/>
+          <w:color w:val="1A1A1A"/>
+          <w:sz w:val="22"/>
+          <w:szCs w:val="22"/>
+        </w:rPr>
+      </w:pPr>
+      <w:r>
+        <w:rPr>
+          <w:rStyle w:val="Strong"/>
+          <w:rFonts w:ascii="Calibri" w:eastAsia="Times New Roman" w:hAnsi="Calibri" w:cs="Calibri"/>
+          <w:color w:val="1A1A1A"/>
+          <w:sz w:val="22"/>
+          <w:szCs w:val="22"/>
+        </w:rPr>
+        <w:t>One sign in</w:t>
+      </w:r>
+      <w:r>
+        <w:rPr>
+          <w:rFonts w:ascii="Calibri" w:eastAsia="Times New Roman" w:hAnsi="Calibri" w:cs="Calibri"/>
+          <w:color w:val="1A1A1A"/>
+          <w:sz w:val="22"/>
+          <w:szCs w:val="22"/>
+        </w:rPr>
+        <w:t xml:space="preserve"> for the whole app.</w:t>
+      </w:r>
+    </w:p>
+    <w:p>
+      <w:pPr>
+        <w:numPr>
+          <w:ilvl w:val="0"/>
+          <w:numId w:val="8"/>
+        </w:numPr>
+        <w:spacing w:before="100" w:beforeAutospacing="1" w:after="100" w:afterAutospacing="1"/>
+        <w:rPr>
+          <w:rFonts w:ascii="Calibri" w:eastAsia="Times New Roman" w:hAnsi="Calibri" w:cs="Calibri"/>
+          <w:color w:val="1A1A1A"/>
+          <w:sz w:val="22"/>
+          <w:szCs w:val="22"/>
+        </w:rPr>
+      </w:pPr>
+      <w:r>
+        <w:rPr>
+          <w:rStyle w:val="Strong"/>
+          <w:rFonts w:ascii="Calibri" w:eastAsia="Times New Roman" w:hAnsi="Calibri" w:cs="Calibri"/>
+          <w:color w:val="1A1A1A"/>
+          <w:sz w:val="22"/>
+          <w:szCs w:val="22"/>
+        </w:rPr>
+        <w:t>5 wrong passwords</w:t>
+      </w:r>
+      <w:r>
+        <w:rPr>
+          <w:rFonts w:ascii="Calibri" w:eastAsia="Times New Roman" w:hAnsi="Calibri" w:cs="Calibri"/>
+          <w:color w:val="1A1A1A"/>
+          <w:sz w:val="22"/>
+          <w:szCs w:val="22"/>
+        </w:rPr>
+        <w:t xml:space="preserve"> lock the account. Only an Admin can unlock it.</w:t>
+      </w:r>
+    </w:p>
+    <w:p>
+      <w:pPr>
+        <w:numPr>
+          <w:ilvl w:val="0"/>
+          <w:numId w:val="8"/>
+        </w:numPr>
+        <w:spacing w:before="100" w:beforeAutospacing="1" w:after="100" w:afterAutospacing="1"/>
+        <w:rPr>
+          <w:rFonts w:ascii="Calibri" w:eastAsia="Times New Roman" w:hAnsi="Calibri" w:cs="Calibri"/>
+          <w:color w:val="1A1A1A"/>
+          <w:sz w:val="22"/>
+          <w:szCs w:val="22"/>
+        </w:rPr>
+      </w:pPr>
+      <w:r>
+        <w:rPr>
+          <w:rStyle w:val="Strong"/>
+          <w:rFonts w:ascii="Calibri" w:eastAsia="Times New Roman" w:hAnsi="Calibri" w:cs="Calibri"/>
+          <w:color w:val="1A1A1A"/>
+          <w:sz w:val="22"/>
+          <w:szCs w:val="22"/>
+        </w:rPr>
+        <w:t>Forgot your password?</w:t>
+      </w:r>
+      <w:r>
+        <w:rPr>
+          <w:rFonts w:ascii="Calibri" w:eastAsia="Times New Roman" w:hAnsi="Calibri" w:cs="Calibri"/>
+          <w:color w:val="1A1A1A"/>
+          <w:sz w:val="22"/>
+          <w:szCs w:val="22"/>
+        </w:rPr>
+        <w:t xml:space="preserve"> Click </w:t>
+      </w:r>
+      <w:r>
+        <w:rPr>
+          <w:rStyle w:val="Emphasis"/>
+          <w:rFonts w:ascii="Calibri" w:eastAsia="Times New Roman" w:hAnsi="Calibri" w:cs="Calibri"/>
+          <w:color w:val="1A1A1A"/>
+          <w:sz w:val="22"/>
+          <w:szCs w:val="22"/>
+        </w:rPr>
+        <w:t>Forgot Password</w:t>
+      </w:r>
+      <w:r>
+        <w:rPr>
+          <w:rFonts w:ascii="Calibri" w:eastAsia="Times New Roman" w:hAnsi="Calibri" w:cs="Calibri"/>
+          <w:color w:val="1A1A1A"/>
+          <w:sz w:val="22"/>
+          <w:szCs w:val="22"/>
+        </w:rPr>
+        <w:t xml:space="preserve"> and type your username. The Admins get a request and will give you a new password in person. (Admins use their security question instead.)</w:t>
+      </w:r>
+    </w:p>
+    <w:p>
+      <w:pPr>
+        <w:numPr>
+          <w:ilvl w:val="0"/>
+          <w:numId w:val="8"/>
+        </w:numPr>
+        <w:spacing w:before="100" w:beforeAutospacing="1" w:after="100" w:afterAutospacing="1"/>
+        <w:rPr>
+          <w:rFonts w:ascii="Calibri" w:eastAsia="Times New Roman" w:hAnsi="Calibri" w:cs="Calibri"/>
+          <w:color w:val="1A1A1A"/>
+          <w:sz w:val="22"/>
+          <w:szCs w:val="22"/>
+        </w:rPr>
+      </w:pPr>
+      <w:r>
+        <w:rPr>
+          <w:rStyle w:val="Strong"/>
+          <w:rFonts w:ascii="Calibri" w:eastAsia="Times New Roman" w:hAnsi="Calibri" w:cs="Calibri"/>
+          <w:color w:val="1A1A1A"/>
+          <w:sz w:val="22"/>
+          <w:szCs w:val="22"/>
+        </w:rPr>
+        <w:t>Only Admins change passwords.</w:t>
+      </w:r>
+      <w:r>
+        <w:rPr>
+          <w:rFonts w:ascii="Calibri" w:eastAsia="Times New Roman" w:hAnsi="Calibri" w:cs="Calibri"/>
+          <w:color w:val="1A1A1A"/>
+          <w:sz w:val="22"/>
+          <w:szCs w:val="22"/>
+        </w:rPr>
+        <w:t xml:space="preserve"> Employees and Supervisors can't change their own.</w:t>
+      </w:r>
+    </w:p>
+    <w:p>
+      <w:pPr>
+        <w:numPr>
+          <w:ilvl w:val="0"/>
+          <w:numId w:val="8"/>
+        </w:numPr>
+        <w:spacing w:before="100" w:beforeAutospacing="1" w:after="100" w:afterAutospacing="1"/>
+        <w:rPr>
+          <w:rFonts w:ascii="Calibri" w:eastAsia="Times New Roman" w:hAnsi="Calibri" w:cs="Calibri"/>
+          <w:color w:val="1A1A1A"/>
+          <w:sz w:val="22"/>
+          <w:szCs w:val="22"/>
+        </w:rPr>
+      </w:pPr>
+      <w:r>
+        <w:rPr>
+          <w:rStyle w:val="Strong"/>
+          <w:rFonts w:ascii="Calibri" w:eastAsia="Times New Roman" w:hAnsi="Calibri" w:cs="Calibri"/>
+          <w:color w:val="1A1A1A"/>
+          <w:sz w:val="22"/>
+          <w:szCs w:val="22"/>
+        </w:rPr>
+        <w:lastRenderedPageBreak/>
         <w:t>Idle check:</w:t>
       </w:r>
       <w:r>
@@ -2499,7 +2836,13 @@
         <w:rPr>
           <w:rFonts w:ascii="Calibri" w:eastAsia="Times New Roman" w:hAnsi="Calibri" w:cs="Calibri"/>
         </w:rPr>
-        <w:t xml:space="preserve">7. Inventory &amp; Vendors </w:t>
+        <w:t xml:space="preserve">7. Inventory &amp; </w:t>
+      </w:r>
+      <w:r>
+        <w:rPr>
+          <w:rFonts w:ascii="Calibri" w:eastAsia="Times New Roman" w:hAnsi="Calibri" w:cs="Calibri"/>
+        </w:rPr>
+        <w:t xml:space="preserve">Vendors </w:t>
       </w:r>
       <w:r>
         <w:rPr>
@@ -2520,7 +2863,6 @@
         <w:rPr>
           <w:rFonts w:ascii="Calibri" w:eastAsia="Times New Roman" w:hAnsi="Calibri" w:cs="Calibri"/>
         </w:rPr>
-        <w:lastRenderedPageBreak/>
         <w:t xml:space="preserve">8. Subcontractors </w:t>
       </w:r>
       <w:r>
@@ -2586,9 +2928,9 @@
 <file path=word/numbering.xml><?xml version="1.0" encoding="utf-8"?>
 <w:numbering xmlns:wpc="http://schemas.microsoft.com/office/word/2010/wordprocessingCanvas" xmlns:cx="http://schemas.microsoft.com/office/drawing/2014/chartex" xmlns:cx1="http://schemas.microsoft.com/office/drawing/2015/9/8/chartex" xmlns:cx2="http://schemas.microsoft.com/office/drawing/2015/10/21/chartex" xmlns:cx3="http://schemas.microsoft.com/office/drawing/2016/5/9/chartex" xmlns:cx4="http://schemas.microsoft.com/office/drawing/2016/5/10/chartex" xmlns:cx5="http://schemas.microsoft.com/office/drawing/2016/5/11/chartex" xmlns:cx6="http://schemas.microsoft.com/office/drawing/2016/5/12/chartex" xmlns:cx7="http://schemas.microsoft.com/office/drawing/2016/5/13/chartex" xmlns:cx8="http://schemas.microsoft.com/office/drawing/2016/5/14/chartex" xmlns:mc="http://schemas.openxmlformats.org/markup-compatibility/2006" xmlns:aink="http://schemas.microsoft.com/office/drawing/2016/ink" xmlns:am3d="http://schemas.microsoft.com/office/drawing/2017/model3d" xmlns:o="urn:schemas-microsoft-com:office:office" xmlns:oel="http://schemas.microsoft.com/office/2019/extlst" xmlns:r="http://schemas.openxmlformats.org/officeDocument/2006/relationships" xmlns:m="http://schemas.openxmlformats.org/officeDocument/2006/math" xmlns:v="urn:schemas-microsoft-com:vml" xmlns:wp14="http://schemas.microsoft.com/office/word/2010/wordprocessingDrawing" xmlns:wp="http://schemas.openxmlformats.org/drawingml/2006/wordprocessingDrawing" xmlns:w10="urn:schemas-microsoft-com:office:word" xmlns:w="http://schemas.openxmlformats.org/wordprocessingml/2006/main" xmlns:w14="http://schemas.microsoft.com/office/word/2010/wordml" xmlns:w15="http://schemas.microsoft.com/office/word/2012/wordml" xmlns:w16cex="http://schemas.microsoft.com/office/word/2018/wordml/cex" xmlns:w16cid="http://schemas.microsoft.com/office/word/2016/wordml/cid" xmlns:w16="http://schemas.microsoft.com/office/word/2018/wordml" xmlns:w16du="http://schemas.microsoft.com/office/word/2023/wordml/word16du" xmlns:w16sdtdh="http://schemas.microsoft.com/office/word/2020/wordml/sdtdatahash" xmlns:w16sdtfl="http://schemas.microsoft.com/office/word/2024/wordml/sdtformatlock" xmlns:w16se="http://schemas.microsoft.com/office/word/2015/wordml/symex" xmlns:wpg="http://schemas.microsoft.com/office/word/2010/wordprocessingGroup" xmlns:wpi="http://schemas.microsoft.com/office/word/2010/wordprocessingInk" xmlns:wne="http://schemas.microsoft.com/office/word/2006/wordml" xmlns:wps="http://schemas.microsoft.com/office/word/2010/wordprocessingShape" mc:Ignorable="w14 w15 w16se w16cid w16 w16cex w16sdtdh w16sdtfl w16du wp14">
   <w:abstractNum w:abstractNumId="0" w15:restartNumberingAfterBreak="0">
-    <w:nsid w:val="292D67EF"/>
+    <w:nsid w:val="12E63E0A"/>
     <w:multiLevelType w:val="multilevel"/>
-    <w:tmpl w:val="2960A9FA"/>
+    <w:tmpl w:val="AAC249B8"/>
     <w:lvl w:ilvl="0">
       <w:start w:val="1"/>
       <w:numFmt w:val="decimal"/>
@@ -2699,9 +3041,9 @@
     </w:lvl>
   </w:abstractNum>
   <w:abstractNum w:abstractNumId="1" w15:restartNumberingAfterBreak="0">
-    <w:nsid w:val="50230C20"/>
+    <w:nsid w:val="13E14B82"/>
     <w:multiLevelType w:val="multilevel"/>
-    <w:tmpl w:val="D7F0B3B4"/>
+    <w:tmpl w:val="00423C3A"/>
     <w:lvl w:ilvl="0">
       <w:start w:val="1"/>
       <w:numFmt w:val="decimal"/>
@@ -2812,9 +3154,9 @@
     </w:lvl>
   </w:abstractNum>
   <w:abstractNum w:abstractNumId="2" w15:restartNumberingAfterBreak="0">
-    <w:nsid w:val="6329659B"/>
+    <w:nsid w:val="29DD3EB1"/>
     <w:multiLevelType w:val="multilevel"/>
-    <w:tmpl w:val="6F50ACF8"/>
+    <w:tmpl w:val="8BB643CE"/>
     <w:lvl w:ilvl="0">
       <w:start w:val="1"/>
       <w:numFmt w:val="decimal"/>
@@ -2925,9 +3267,9 @@
     </w:lvl>
   </w:abstractNum>
   <w:abstractNum w:abstractNumId="3" w15:restartNumberingAfterBreak="0">
-    <w:nsid w:val="68AD08F5"/>
+    <w:nsid w:val="3E7B284C"/>
     <w:multiLevelType w:val="multilevel"/>
-    <w:tmpl w:val="BF243C6C"/>
+    <w:tmpl w:val="64489EE6"/>
     <w:lvl w:ilvl="0">
       <w:start w:val="1"/>
       <w:numFmt w:val="bullet"/>
@@ -3074,9 +3416,9 @@
     </w:lvl>
   </w:abstractNum>
   <w:abstractNum w:abstractNumId="4" w15:restartNumberingAfterBreak="0">
-    <w:nsid w:val="6B833CA3"/>
+    <w:nsid w:val="50326082"/>
     <w:multiLevelType w:val="multilevel"/>
-    <w:tmpl w:val="085855CA"/>
+    <w:tmpl w:val="26B65AC8"/>
     <w:lvl w:ilvl="0">
       <w:start w:val="1"/>
       <w:numFmt w:val="decimal"/>
@@ -3187,9 +3529,9 @@
     </w:lvl>
   </w:abstractNum>
   <w:abstractNum w:abstractNumId="5" w15:restartNumberingAfterBreak="0">
-    <w:nsid w:val="6C56646C"/>
+    <w:nsid w:val="517F42BF"/>
     <w:multiLevelType w:val="multilevel"/>
-    <w:tmpl w:val="818C6A2A"/>
+    <w:tmpl w:val="D4043500"/>
     <w:lvl w:ilvl="0">
       <w:start w:val="1"/>
       <w:numFmt w:val="decimal"/>
@@ -3299,22 +3641,326 @@
       </w:pPr>
     </w:lvl>
   </w:abstractNum>
-  <w:num w:numId="1" w16cid:durableId="988050398">
+  <w:abstractNum w:abstractNumId="6" w15:restartNumberingAfterBreak="0">
+    <w:nsid w:val="68C47E5D"/>
+    <w:multiLevelType w:val="multilevel"/>
+    <w:tmpl w:val="03A8C088"/>
+    <w:lvl w:ilvl="0">
+      <w:start w:val="1"/>
+      <w:numFmt w:val="bullet"/>
+      <w:lvlText w:val=""/>
+      <w:lvlJc w:val="left"/>
+      <w:pPr>
+        <w:tabs>
+          <w:tab w:val="num" w:pos="720"/>
+        </w:tabs>
+        <w:ind w:left="720" w:hanging="360"/>
+      </w:pPr>
+      <w:rPr>
+        <w:rFonts w:ascii="Symbol" w:hAnsi="Symbol" w:hint="default"/>
+        <w:sz w:val="20"/>
+      </w:rPr>
+    </w:lvl>
+    <w:lvl w:ilvl="1" w:tentative="1">
+      <w:start w:val="1"/>
+      <w:numFmt w:val="bullet"/>
+      <w:lvlText w:val="o"/>
+      <w:lvlJc w:val="left"/>
+      <w:pPr>
+        <w:tabs>
+          <w:tab w:val="num" w:pos="1440"/>
+        </w:tabs>
+        <w:ind w:left="1440" w:hanging="360"/>
+      </w:pPr>
+      <w:rPr>
+        <w:rFonts w:ascii="Courier New" w:hAnsi="Courier New" w:hint="default"/>
+        <w:sz w:val="20"/>
+      </w:rPr>
+    </w:lvl>
+    <w:lvl w:ilvl="2" w:tentative="1">
+      <w:start w:val="1"/>
+      <w:numFmt w:val="bullet"/>
+      <w:lvlText w:val=""/>
+      <w:lvlJc w:val="left"/>
+      <w:pPr>
+        <w:tabs>
+          <w:tab w:val="num" w:pos="2160"/>
+        </w:tabs>
+        <w:ind w:left="2160" w:hanging="360"/>
+      </w:pPr>
+      <w:rPr>
+        <w:rFonts w:ascii="Wingdings" w:hAnsi="Wingdings" w:hint="default"/>
+        <w:sz w:val="20"/>
+      </w:rPr>
+    </w:lvl>
+    <w:lvl w:ilvl="3" w:tentative="1">
+      <w:start w:val="1"/>
+      <w:numFmt w:val="bullet"/>
+      <w:lvlText w:val=""/>
+      <w:lvlJc w:val="left"/>
+      <w:pPr>
+        <w:tabs>
+          <w:tab w:val="num" w:pos="2880"/>
+        </w:tabs>
+        <w:ind w:left="2880" w:hanging="360"/>
+      </w:pPr>
+      <w:rPr>
+        <w:rFonts w:ascii="Wingdings" w:hAnsi="Wingdings" w:hint="default"/>
+        <w:sz w:val="20"/>
+      </w:rPr>
+    </w:lvl>
+    <w:lvl w:ilvl="4" w:tentative="1">
+      <w:start w:val="1"/>
+      <w:numFmt w:val="bullet"/>
+      <w:lvlText w:val=""/>
+      <w:lvlJc w:val="left"/>
+      <w:pPr>
+        <w:tabs>
+          <w:tab w:val="num" w:pos="3600"/>
+        </w:tabs>
+        <w:ind w:left="3600" w:hanging="360"/>
+      </w:pPr>
+      <w:rPr>
+        <w:rFonts w:ascii="Wingdings" w:hAnsi="Wingdings" w:hint="default"/>
+        <w:sz w:val="20"/>
+      </w:rPr>
+    </w:lvl>
+    <w:lvl w:ilvl="5" w:tentative="1">
+      <w:start w:val="1"/>
+      <w:numFmt w:val="bullet"/>
+      <w:lvlText w:val=""/>
+      <w:lvlJc w:val="left"/>
+      <w:pPr>
+        <w:tabs>
+          <w:tab w:val="num" w:pos="4320"/>
+        </w:tabs>
+        <w:ind w:left="4320" w:hanging="360"/>
+      </w:pPr>
+      <w:rPr>
+        <w:rFonts w:ascii="Wingdings" w:hAnsi="Wingdings" w:hint="default"/>
+        <w:sz w:val="20"/>
+      </w:rPr>
+    </w:lvl>
+    <w:lvl w:ilvl="6" w:tentative="1">
+      <w:start w:val="1"/>
+      <w:numFmt w:val="bullet"/>
+      <w:lvlText w:val=""/>
+      <w:lvlJc w:val="left"/>
+      <w:pPr>
+        <w:tabs>
+          <w:tab w:val="num" w:pos="5040"/>
+        </w:tabs>
+        <w:ind w:left="5040" w:hanging="360"/>
+      </w:pPr>
+      <w:rPr>
+        <w:rFonts w:ascii="Wingdings" w:hAnsi="Wingdings" w:hint="default"/>
+        <w:sz w:val="20"/>
+      </w:rPr>
+    </w:lvl>
+    <w:lvl w:ilvl="7" w:tentative="1">
+      <w:start w:val="1"/>
+      <w:numFmt w:val="bullet"/>
+      <w:lvlText w:val=""/>
+      <w:lvlJc w:val="left"/>
+      <w:pPr>
+        <w:tabs>
+          <w:tab w:val="num" w:pos="5760"/>
+        </w:tabs>
+        <w:ind w:left="5760" w:hanging="360"/>
+      </w:pPr>
+      <w:rPr>
+        <w:rFonts w:ascii="Wingdings" w:hAnsi="Wingdings" w:hint="default"/>
+        <w:sz w:val="20"/>
+      </w:rPr>
+    </w:lvl>
+    <w:lvl w:ilvl="8" w:tentative="1">
+      <w:start w:val="1"/>
+      <w:numFmt w:val="bullet"/>
+      <w:lvlText w:val=""/>
+      <w:lvlJc w:val="left"/>
+      <w:pPr>
+        <w:tabs>
+          <w:tab w:val="num" w:pos="6480"/>
+        </w:tabs>
+        <w:ind w:left="6480" w:hanging="360"/>
+      </w:pPr>
+      <w:rPr>
+        <w:rFonts w:ascii="Wingdings" w:hAnsi="Wingdings" w:hint="default"/>
+        <w:sz w:val="20"/>
+      </w:rPr>
+    </w:lvl>
+  </w:abstractNum>
+  <w:abstractNum w:abstractNumId="7" w15:restartNumberingAfterBreak="0">
+    <w:nsid w:val="7C5F1452"/>
+    <w:multiLevelType w:val="multilevel"/>
+    <w:tmpl w:val="90883A08"/>
+    <w:lvl w:ilvl="0">
+      <w:start w:val="1"/>
+      <w:numFmt w:val="bullet"/>
+      <w:lvlText w:val=""/>
+      <w:lvlJc w:val="left"/>
+      <w:pPr>
+        <w:tabs>
+          <w:tab w:val="num" w:pos="720"/>
+        </w:tabs>
+        <w:ind w:left="720" w:hanging="360"/>
+      </w:pPr>
+      <w:rPr>
+        <w:rFonts w:ascii="Symbol" w:hAnsi="Symbol" w:hint="default"/>
+        <w:sz w:val="20"/>
+      </w:rPr>
+    </w:lvl>
+    <w:lvl w:ilvl="1" w:tentative="1">
+      <w:start w:val="1"/>
+      <w:numFmt w:val="bullet"/>
+      <w:lvlText w:val="o"/>
+      <w:lvlJc w:val="left"/>
+      <w:pPr>
+        <w:tabs>
+          <w:tab w:val="num" w:pos="1440"/>
+        </w:tabs>
+        <w:ind w:left="1440" w:hanging="360"/>
+      </w:pPr>
+      <w:rPr>
+        <w:rFonts w:ascii="Courier New" w:hAnsi="Courier New" w:hint="default"/>
+        <w:sz w:val="20"/>
+      </w:rPr>
+    </w:lvl>
+    <w:lvl w:ilvl="2" w:tentative="1">
+      <w:start w:val="1"/>
+      <w:numFmt w:val="bullet"/>
+      <w:lvlText w:val=""/>
+      <w:lvlJc w:val="left"/>
+      <w:pPr>
+        <w:tabs>
+          <w:tab w:val="num" w:pos="2160"/>
+        </w:tabs>
+        <w:ind w:left="2160" w:hanging="360"/>
+      </w:pPr>
+      <w:rPr>
+        <w:rFonts w:ascii="Wingdings" w:hAnsi="Wingdings" w:hint="default"/>
+        <w:sz w:val="20"/>
+      </w:rPr>
+    </w:lvl>
+    <w:lvl w:ilvl="3" w:tentative="1">
+      <w:start w:val="1"/>
+      <w:numFmt w:val="bullet"/>
+      <w:lvlText w:val=""/>
+      <w:lvlJc w:val="left"/>
+      <w:pPr>
+        <w:tabs>
+          <w:tab w:val="num" w:pos="2880"/>
+        </w:tabs>
+        <w:ind w:left="2880" w:hanging="360"/>
+      </w:pPr>
+      <w:rPr>
+        <w:rFonts w:ascii="Wingdings" w:hAnsi="Wingdings" w:hint="default"/>
+        <w:sz w:val="20"/>
+      </w:rPr>
+    </w:lvl>
+    <w:lvl w:ilvl="4" w:tentative="1">
+      <w:start w:val="1"/>
+      <w:numFmt w:val="bullet"/>
+      <w:lvlText w:val=""/>
+      <w:lvlJc w:val="left"/>
+      <w:pPr>
+        <w:tabs>
+          <w:tab w:val="num" w:pos="3600"/>
+        </w:tabs>
+        <w:ind w:left="3600" w:hanging="360"/>
+      </w:pPr>
+      <w:rPr>
+        <w:rFonts w:ascii="Wingdings" w:hAnsi="Wingdings" w:hint="default"/>
+        <w:sz w:val="20"/>
+      </w:rPr>
+    </w:lvl>
+    <w:lvl w:ilvl="5" w:tentative="1">
+      <w:start w:val="1"/>
+      <w:numFmt w:val="bullet"/>
+      <w:lvlText w:val=""/>
+      <w:lvlJc w:val="left"/>
+      <w:pPr>
+        <w:tabs>
+          <w:tab w:val="num" w:pos="4320"/>
+        </w:tabs>
+        <w:ind w:left="4320" w:hanging="360"/>
+      </w:pPr>
+      <w:rPr>
+        <w:rFonts w:ascii="Wingdings" w:hAnsi="Wingdings" w:hint="default"/>
+        <w:sz w:val="20"/>
+      </w:rPr>
+    </w:lvl>
+    <w:lvl w:ilvl="6" w:tentative="1">
+      <w:start w:val="1"/>
+      <w:numFmt w:val="bullet"/>
+      <w:lvlText w:val=""/>
+      <w:lvlJc w:val="left"/>
+      <w:pPr>
+        <w:tabs>
+          <w:tab w:val="num" w:pos="5040"/>
+        </w:tabs>
+        <w:ind w:left="5040" w:hanging="360"/>
+      </w:pPr>
+      <w:rPr>
+        <w:rFonts w:ascii="Wingdings" w:hAnsi="Wingdings" w:hint="default"/>
+        <w:sz w:val="20"/>
+      </w:rPr>
+    </w:lvl>
+    <w:lvl w:ilvl="7" w:tentative="1">
+      <w:start w:val="1"/>
+      <w:numFmt w:val="bullet"/>
+      <w:lvlText w:val=""/>
+      <w:lvlJc w:val="left"/>
+      <w:pPr>
+        <w:tabs>
+          <w:tab w:val="num" w:pos="5760"/>
+        </w:tabs>
+        <w:ind w:left="5760" w:hanging="360"/>
+      </w:pPr>
+      <w:rPr>
+        <w:rFonts w:ascii="Wingdings" w:hAnsi="Wingdings" w:hint="default"/>
+        <w:sz w:val="20"/>
+      </w:rPr>
+    </w:lvl>
+    <w:lvl w:ilvl="8" w:tentative="1">
+      <w:start w:val="1"/>
+      <w:numFmt w:val="bullet"/>
+      <w:lvlText w:val=""/>
+      <w:lvlJc w:val="left"/>
+      <w:pPr>
+        <w:tabs>
+          <w:tab w:val="num" w:pos="6480"/>
+        </w:tabs>
+        <w:ind w:left="6480" w:hanging="360"/>
+      </w:pPr>
+      <w:rPr>
+        <w:rFonts w:ascii="Wingdings" w:hAnsi="Wingdings" w:hint="default"/>
+        <w:sz w:val="20"/>
+      </w:rPr>
+    </w:lvl>
+  </w:abstractNum>
+  <w:num w:numId="1" w16cid:durableId="1505516511">
+    <w:abstractNumId w:val="2"/>
+  </w:num>
+  <w:num w:numId="2" w16cid:durableId="15355381">
+    <w:abstractNumId w:val="4"/>
+  </w:num>
+  <w:num w:numId="3" w16cid:durableId="1307398488">
+    <w:abstractNumId w:val="0"/>
+  </w:num>
+  <w:num w:numId="4" w16cid:durableId="1559587323">
+    <w:abstractNumId w:val="5"/>
+  </w:num>
+  <w:num w:numId="5" w16cid:durableId="1937983131">
     <w:abstractNumId w:val="1"/>
   </w:num>
-  <w:num w:numId="2" w16cid:durableId="817183518">
-    <w:abstractNumId w:val="5"/>
+  <w:num w:numId="6" w16cid:durableId="1278636913">
+    <w:abstractNumId w:val="6"/>
   </w:num>
-  <w:num w:numId="3" w16cid:durableId="1311599004">
-    <w:abstractNumId w:val="4"/>
+  <w:num w:numId="7" w16cid:durableId="1272590720">
+    <w:abstractNumId w:val="7"/>
   </w:num>
-  <w:num w:numId="4" w16cid:durableId="297496370">
-    <w:abstractNumId w:val="2"/>
-  </w:num>
-  <w:num w:numId="5" w16cid:durableId="1017921529">
-    <w:abstractNumId w:val="0"/>
-  </w:num>
-  <w:num w:numId="6" w16cid:durableId="979269292">
+  <w:num w:numId="8" w16cid:durableId="1052850967">
     <w:abstractNumId w:val="3"/>
   </w:num>
 </w:numbering>

</xml_diff>

<commit_message>
Add My Account page with Admin password change and security question
- AccountService: Admin-only own password change and security question,
  both confirmed with the current password; answers stored as bcrypt of
  the trimmed lower-case answer (matches Forgot Password).
- AuditLog model (first use of audit_logs): question change recorded,
  answer never stored readably.
- MyAccountPage (plain layout) loaded by MainForm; Employees and
  Supervisors see their details and "ask an Admin".
- 17 checks passed against the real database, including the full loop
  My Account -> Forgot Password -> sign in.
- Guides: Developer Guide chapter 11, User Manual My Account, UI guide.

Co-Authored-By: Claude Opus 5.5 <noreply@anthropic.com>
</commit_message>
<xml_diff>
--- a/docs/User Manual.docx
+++ b/docs/User Manual.docx
@@ -2368,7 +2368,7 @@
         <w:rPr>
           <w:rFonts w:ascii="Calibri" w:eastAsia="Times New Roman" w:hAnsi="Calibri" w:cs="Calibri"/>
         </w:rPr>
-        <w:t>"Still there?"</w:t>
+        <w:t>My Account</w:t>
       </w:r>
     </w:p>
     <w:p>
@@ -2388,7 +2388,7 @@
           <w:sz w:val="22"/>
           <w:szCs w:val="22"/>
         </w:rPr>
-        <w:t xml:space="preserve">If you don't touch the keyboard or mouse for </w:t>
+        <w:t xml:space="preserve">Click </w:t>
       </w:r>
       <w:r>
         <w:rPr>
@@ -2398,35 +2398,37 @@
           <w:sz w:val="22"/>
           <w:szCs w:val="22"/>
         </w:rPr>
-        <w:t>5 minutes</w:t>
-      </w:r>
-      <w:r>
-        <w:rPr>
-          <w:rFonts w:ascii="Calibri" w:hAnsi="Calibri" w:cs="Calibri"/>
-          <w:color w:val="1A1A1A"/>
-          <w:sz w:val="22"/>
-          <w:szCs w:val="22"/>
-        </w:rPr>
-        <w:t xml:space="preserve">, a </w:t>
-      </w:r>
-      <w:r>
-        <w:rPr>
-          <w:rStyle w:val="Emphasis"/>
-          <w:rFonts w:ascii="Calibri" w:hAnsi="Calibri" w:cs="Calibri"/>
-          <w:color w:val="1A1A1A"/>
-          <w:sz w:val="22"/>
-          <w:szCs w:val="22"/>
-        </w:rPr>
-        <w:t>"Still there?"</w:t>
-      </w:r>
-      <w:r>
-        <w:rPr>
-          <w:rFonts w:ascii="Calibri" w:hAnsi="Calibri" w:cs="Calibri"/>
-          <w:color w:val="1A1A1A"/>
-          <w:sz w:val="22"/>
-          <w:szCs w:val="22"/>
-        </w:rPr>
-        <w:t xml:space="preserve"> message appears with a 60-second countdown.</w:t>
+        <w:t>My Account</w:t>
+      </w:r>
+      <w:r>
+        <w:rPr>
+          <w:rFonts w:ascii="Calibri" w:hAnsi="Calibri" w:cs="Calibri"/>
+          <w:color w:val="1A1A1A"/>
+          <w:sz w:val="22"/>
+          <w:szCs w:val="22"/>
+        </w:rPr>
+        <w:t xml:space="preserve"> in the sidebar to see your name, username, department and level.</w:t>
+      </w:r>
+    </w:p>
+    <w:p>
+      <w:pPr>
+        <w:pStyle w:val="NormalWeb"/>
+        <w:rPr>
+          <w:rFonts w:ascii="Calibri" w:hAnsi="Calibri" w:cs="Calibri"/>
+          <w:color w:val="1A1A1A"/>
+          <w:sz w:val="22"/>
+          <w:szCs w:val="22"/>
+        </w:rPr>
+      </w:pPr>
+      <w:r>
+        <w:rPr>
+          <w:rStyle w:val="Strong"/>
+          <w:rFonts w:ascii="Calibri" w:hAnsi="Calibri" w:cs="Calibri"/>
+          <w:color w:val="1A1A1A"/>
+          <w:sz w:val="22"/>
+          <w:szCs w:val="22"/>
+        </w:rPr>
+        <w:t>Admins only:</w:t>
       </w:r>
     </w:p>
     <w:p>
@@ -2445,31 +2447,41 @@
       </w:pPr>
       <w:r>
         <w:rPr>
-          <w:rFonts w:ascii="Calibri" w:eastAsia="Times New Roman" w:hAnsi="Calibri" w:cs="Calibri"/>
-          <w:color w:val="1A1A1A"/>
-          <w:sz w:val="22"/>
-          <w:szCs w:val="22"/>
-        </w:rPr>
-        <w:t xml:space="preserve">Click </w:t>
-      </w:r>
-      <w:r>
-        <w:rPr>
           <w:rStyle w:val="Strong"/>
           <w:rFonts w:ascii="Calibri" w:eastAsia="Times New Roman" w:hAnsi="Calibri" w:cs="Calibri"/>
           <w:color w:val="1A1A1A"/>
           <w:sz w:val="22"/>
           <w:szCs w:val="22"/>
         </w:rPr>
-        <w:t>Stay Signed In</w:t>
-      </w:r>
-      <w:r>
-        <w:rPr>
-          <w:rFonts w:ascii="Calibri" w:eastAsia="Times New Roman" w:hAnsi="Calibri" w:cs="Calibri"/>
-          <w:color w:val="1A1A1A"/>
-          <w:sz w:val="22"/>
-          <w:szCs w:val="22"/>
-        </w:rPr>
-        <w:t xml:space="preserve"> to keep working.</w:t>
+        <w:t>Change password:</w:t>
+      </w:r>
+      <w:r>
+        <w:rPr>
+          <w:rFonts w:ascii="Calibri" w:eastAsia="Times New Roman" w:hAnsi="Calibri" w:cs="Calibri"/>
+          <w:color w:val="1A1A1A"/>
+          <w:sz w:val="22"/>
+          <w:szCs w:val="22"/>
+        </w:rPr>
+        <w:t xml:space="preserve"> type your current password, then the new one twice (at least 8 characters, with a letter and a number), and click </w:t>
+      </w:r>
+      <w:r>
+        <w:rPr>
+          <w:rStyle w:val="Strong"/>
+          <w:rFonts w:ascii="Calibri" w:eastAsia="Times New Roman" w:hAnsi="Calibri" w:cs="Calibri"/>
+          <w:color w:val="1A1A1A"/>
+          <w:sz w:val="22"/>
+          <w:szCs w:val="22"/>
+        </w:rPr>
+        <w:t>Save Password</w:t>
+      </w:r>
+      <w:r>
+        <w:rPr>
+          <w:rFonts w:ascii="Calibri" w:eastAsia="Times New Roman" w:hAnsi="Calibri" w:cs="Calibri"/>
+          <w:color w:val="1A1A1A"/>
+          <w:sz w:val="22"/>
+          <w:szCs w:val="22"/>
+        </w:rPr>
+        <w:t>.</w:t>
       </w:r>
     </w:p>
     <w:p>
@@ -2488,55 +2500,110 @@
       </w:pPr>
       <w:r>
         <w:rPr>
-          <w:rFonts w:ascii="Calibri" w:eastAsia="Times New Roman" w:hAnsi="Calibri" w:cs="Calibri"/>
-          <w:color w:val="1A1A1A"/>
-          <w:sz w:val="22"/>
-          <w:szCs w:val="22"/>
-        </w:rPr>
-        <w:t xml:space="preserve">Click </w:t>
-      </w:r>
-      <w:r>
-        <w:rPr>
           <w:rStyle w:val="Strong"/>
           <w:rFonts w:ascii="Calibri" w:eastAsia="Times New Roman" w:hAnsi="Calibri" w:cs="Calibri"/>
           <w:color w:val="1A1A1A"/>
           <w:sz w:val="22"/>
           <w:szCs w:val="22"/>
         </w:rPr>
-        <w:t>Sign Out</w:t>
-      </w:r>
-      <w:r>
-        <w:rPr>
-          <w:rFonts w:ascii="Calibri" w:eastAsia="Times New Roman" w:hAnsi="Calibri" w:cs="Calibri"/>
-          <w:color w:val="1A1A1A"/>
-          <w:sz w:val="22"/>
-          <w:szCs w:val="22"/>
-        </w:rPr>
-        <w:t xml:space="preserve"> to sign out now.</w:t>
-      </w:r>
-    </w:p>
-    <w:p>
-      <w:pPr>
-        <w:numPr>
-          <w:ilvl w:val="0"/>
-          <w:numId w:val="7"/>
-        </w:numPr>
-        <w:spacing w:before="100" w:beforeAutospacing="1" w:after="100" w:afterAutospacing="1"/>
-        <w:rPr>
-          <w:rFonts w:ascii="Calibri" w:eastAsia="Times New Roman" w:hAnsi="Calibri" w:cs="Calibri"/>
-          <w:color w:val="1A1A1A"/>
-          <w:sz w:val="22"/>
-          <w:szCs w:val="22"/>
-        </w:rPr>
-      </w:pPr>
-      <w:r>
-        <w:rPr>
-          <w:rFonts w:ascii="Calibri" w:eastAsia="Times New Roman" w:hAnsi="Calibri" w:cs="Calibri"/>
-          <w:color w:val="1A1A1A"/>
-          <w:sz w:val="22"/>
-          <w:szCs w:val="22"/>
-        </w:rPr>
-        <w:t>If nobody answers, the app signs out by itself, and the Sign In window says why.</w:t>
+        <w:t>Security question:</w:t>
+      </w:r>
+      <w:r>
+        <w:rPr>
+          <w:rFonts w:ascii="Calibri" w:eastAsia="Times New Roman" w:hAnsi="Calibri" w:cs="Calibri"/>
+          <w:color w:val="1A1A1A"/>
+          <w:sz w:val="22"/>
+          <w:szCs w:val="22"/>
+        </w:rPr>
+        <w:t xml:space="preserve"> pick a question (or type your own), type the answer, type your current password to confirm, and click </w:t>
+      </w:r>
+      <w:r>
+        <w:rPr>
+          <w:rStyle w:val="Strong"/>
+          <w:rFonts w:ascii="Calibri" w:eastAsia="Times New Roman" w:hAnsi="Calibri" w:cs="Calibri"/>
+          <w:color w:val="1A1A1A"/>
+          <w:sz w:val="22"/>
+          <w:szCs w:val="22"/>
+        </w:rPr>
+        <w:t>Save Security Question</w:t>
+      </w:r>
+      <w:r>
+        <w:rPr>
+          <w:rFonts w:ascii="Calibri" w:eastAsia="Times New Roman" w:hAnsi="Calibri" w:cs="Calibri"/>
+          <w:color w:val="1A1A1A"/>
+          <w:sz w:val="22"/>
+          <w:szCs w:val="22"/>
+        </w:rPr>
+        <w:t xml:space="preserve">. You'll need this answer if you ever use </w:t>
+      </w:r>
+      <w:r>
+        <w:rPr>
+          <w:rStyle w:val="Emphasis"/>
+          <w:rFonts w:ascii="Calibri" w:eastAsia="Times New Roman" w:hAnsi="Calibri" w:cs="Calibri"/>
+          <w:color w:val="1A1A1A"/>
+          <w:sz w:val="22"/>
+          <w:szCs w:val="22"/>
+        </w:rPr>
+        <w:t>Forgot password?</w:t>
+      </w:r>
+      <w:r>
+        <w:rPr>
+          <w:rFonts w:ascii="Calibri" w:eastAsia="Times New Roman" w:hAnsi="Calibri" w:cs="Calibri"/>
+          <w:color w:val="1A1A1A"/>
+          <w:sz w:val="22"/>
+          <w:szCs w:val="22"/>
+        </w:rPr>
+        <w:t>. Capital letters don't matter.</w:t>
+      </w:r>
+    </w:p>
+    <w:p>
+      <w:pPr>
+        <w:pStyle w:val="NormalWeb"/>
+        <w:rPr>
+          <w:rFonts w:ascii="Calibri" w:hAnsi="Calibri" w:cs="Calibri"/>
+          <w:color w:val="1A1A1A"/>
+          <w:sz w:val="22"/>
+          <w:szCs w:val="22"/>
+        </w:rPr>
+      </w:pPr>
+      <w:r>
+        <w:rPr>
+          <w:rStyle w:val="Strong"/>
+          <w:rFonts w:ascii="Calibri" w:hAnsi="Calibri" w:cs="Calibri"/>
+          <w:color w:val="1A1A1A"/>
+          <w:sz w:val="22"/>
+          <w:szCs w:val="22"/>
+        </w:rPr>
+        <w:t>Set your security question as soon as you get an Admin account.</w:t>
+      </w:r>
+      <w:r>
+        <w:rPr>
+          <w:rFonts w:ascii="Calibri" w:hAnsi="Calibri" w:cs="Calibri"/>
+          <w:color w:val="1A1A1A"/>
+          <w:sz w:val="22"/>
+          <w:szCs w:val="22"/>
+        </w:rPr>
+        <w:t xml:space="preserve"> Without it, only another Admin can reset your password.</w:t>
+      </w:r>
+    </w:p>
+    <w:p>
+      <w:pPr>
+        <w:pStyle w:val="NormalWeb"/>
+        <w:rPr>
+          <w:rFonts w:ascii="Calibri" w:hAnsi="Calibri" w:cs="Calibri"/>
+          <w:color w:val="1A1A1A"/>
+          <w:sz w:val="22"/>
+          <w:szCs w:val="22"/>
+        </w:rPr>
+      </w:pPr>
+      <w:r>
+        <w:rPr>
+          <w:rFonts w:ascii="Calibri" w:hAnsi="Calibri" w:cs="Calibri"/>
+          <w:color w:val="1A1A1A"/>
+          <w:sz w:val="22"/>
+          <w:szCs w:val="22"/>
+        </w:rPr>
+        <w:t>Employees and Supervisors can't change their password here; ask an Admin.</w:t>
       </w:r>
     </w:p>
     <w:p>
@@ -2550,7 +2617,66 @@
         <w:rPr>
           <w:rFonts w:ascii="Calibri" w:eastAsia="Times New Roman" w:hAnsi="Calibri" w:cs="Calibri"/>
         </w:rPr>
-        <w:t>Rules</w:t>
+        <w:lastRenderedPageBreak/>
+        <w:t>"Still there?"</w:t>
+      </w:r>
+    </w:p>
+    <w:p>
+      <w:pPr>
+        <w:pStyle w:val="NormalWeb"/>
+        <w:rPr>
+          <w:rFonts w:ascii="Calibri" w:hAnsi="Calibri" w:cs="Calibri"/>
+          <w:color w:val="1A1A1A"/>
+          <w:sz w:val="22"/>
+          <w:szCs w:val="22"/>
+        </w:rPr>
+      </w:pPr>
+      <w:r>
+        <w:rPr>
+          <w:rFonts w:ascii="Calibri" w:hAnsi="Calibri" w:cs="Calibri"/>
+          <w:color w:val="1A1A1A"/>
+          <w:sz w:val="22"/>
+          <w:szCs w:val="22"/>
+        </w:rPr>
+        <w:t xml:space="preserve">If you don't touch the keyboard or mouse for </w:t>
+      </w:r>
+      <w:r>
+        <w:rPr>
+          <w:rStyle w:val="Strong"/>
+          <w:rFonts w:ascii="Calibri" w:hAnsi="Calibri" w:cs="Calibri"/>
+          <w:color w:val="1A1A1A"/>
+          <w:sz w:val="22"/>
+          <w:szCs w:val="22"/>
+        </w:rPr>
+        <w:t>5 minutes</w:t>
+      </w:r>
+      <w:r>
+        <w:rPr>
+          <w:rFonts w:ascii="Calibri" w:hAnsi="Calibri" w:cs="Calibri"/>
+          <w:color w:val="1A1A1A"/>
+          <w:sz w:val="22"/>
+          <w:szCs w:val="22"/>
+        </w:rPr>
+        <w:t xml:space="preserve">, a </w:t>
+      </w:r>
+      <w:r>
+        <w:rPr>
+          <w:rStyle w:val="Emphasis"/>
+          <w:rFonts w:ascii="Calibri" w:hAnsi="Calibri" w:cs="Calibri"/>
+          <w:color w:val="1A1A1A"/>
+          <w:sz w:val="22"/>
+          <w:szCs w:val="22"/>
+        </w:rPr>
+        <w:t>"Still there?"</w:t>
+      </w:r>
+      <w:r>
+        <w:rPr>
+          <w:rFonts w:ascii="Calibri" w:hAnsi="Calibri" w:cs="Calibri"/>
+          <w:color w:val="1A1A1A"/>
+          <w:sz w:val="22"/>
+          <w:szCs w:val="22"/>
+        </w:rPr>
+        <w:t xml:space="preserve"> message appears with a 60-second countdown.</w:t>
       </w:r>
     </w:p>
     <w:p>
@@ -2569,22 +2695,31 @@
       </w:pPr>
       <w:r>
         <w:rPr>
+          <w:rFonts w:ascii="Calibri" w:eastAsia="Times New Roman" w:hAnsi="Calibri" w:cs="Calibri"/>
+          <w:color w:val="1A1A1A"/>
+          <w:sz w:val="22"/>
+          <w:szCs w:val="22"/>
+        </w:rPr>
+        <w:t xml:space="preserve">Click </w:t>
+      </w:r>
+      <w:r>
+        <w:rPr>
           <w:rStyle w:val="Strong"/>
           <w:rFonts w:ascii="Calibri" w:eastAsia="Times New Roman" w:hAnsi="Calibri" w:cs="Calibri"/>
           <w:color w:val="1A1A1A"/>
           <w:sz w:val="22"/>
           <w:szCs w:val="22"/>
         </w:rPr>
-        <w:t>One sign in</w:t>
-      </w:r>
-      <w:r>
-        <w:rPr>
-          <w:rFonts w:ascii="Calibri" w:eastAsia="Times New Roman" w:hAnsi="Calibri" w:cs="Calibri"/>
-          <w:color w:val="1A1A1A"/>
-          <w:sz w:val="22"/>
-          <w:szCs w:val="22"/>
-        </w:rPr>
-        <w:t xml:space="preserve"> for the whole app.</w:t>
+        <w:t>Stay Signed In</w:t>
+      </w:r>
+      <w:r>
+        <w:rPr>
+          <w:rFonts w:ascii="Calibri" w:eastAsia="Times New Roman" w:hAnsi="Calibri" w:cs="Calibri"/>
+          <w:color w:val="1A1A1A"/>
+          <w:sz w:val="22"/>
+          <w:szCs w:val="22"/>
+        </w:rPr>
+        <w:t xml:space="preserve"> to keep working.</w:t>
       </w:r>
     </w:p>
     <w:p>
@@ -2603,22 +2738,31 @@
       </w:pPr>
       <w:r>
         <w:rPr>
+          <w:rFonts w:ascii="Calibri" w:eastAsia="Times New Roman" w:hAnsi="Calibri" w:cs="Calibri"/>
+          <w:color w:val="1A1A1A"/>
+          <w:sz w:val="22"/>
+          <w:szCs w:val="22"/>
+        </w:rPr>
+        <w:t xml:space="preserve">Click </w:t>
+      </w:r>
+      <w:r>
+        <w:rPr>
           <w:rStyle w:val="Strong"/>
           <w:rFonts w:ascii="Calibri" w:eastAsia="Times New Roman" w:hAnsi="Calibri" w:cs="Calibri"/>
           <w:color w:val="1A1A1A"/>
           <w:sz w:val="22"/>
           <w:szCs w:val="22"/>
         </w:rPr>
-        <w:t>5 wrong passwords</w:t>
-      </w:r>
-      <w:r>
-        <w:rPr>
-          <w:rFonts w:ascii="Calibri" w:eastAsia="Times New Roman" w:hAnsi="Calibri" w:cs="Calibri"/>
-          <w:color w:val="1A1A1A"/>
-          <w:sz w:val="22"/>
-          <w:szCs w:val="22"/>
-        </w:rPr>
-        <w:t xml:space="preserve"> lock the account. Only an Admin can unlock it.</w:t>
+        <w:t>Sign Out</w:t>
+      </w:r>
+      <w:r>
+        <w:rPr>
+          <w:rFonts w:ascii="Calibri" w:eastAsia="Times New Roman" w:hAnsi="Calibri" w:cs="Calibri"/>
+          <w:color w:val="1A1A1A"/>
+          <w:sz w:val="22"/>
+          <w:szCs w:val="22"/>
+        </w:rPr>
+        <w:t xml:space="preserve"> to sign out now.</w:t>
       </w:r>
     </w:p>
     <w:p>
@@ -2637,48 +2781,33 @@
       </w:pPr>
       <w:r>
         <w:rPr>
-          <w:rStyle w:val="Strong"/>
-          <w:rFonts w:ascii="Calibri" w:eastAsia="Times New Roman" w:hAnsi="Calibri" w:cs="Calibri"/>
-          <w:color w:val="1A1A1A"/>
-          <w:sz w:val="22"/>
-          <w:szCs w:val="22"/>
-        </w:rPr>
-        <w:t>Forgot your password?</w:t>
-      </w:r>
-      <w:r>
-        <w:rPr>
-          <w:rFonts w:ascii="Calibri" w:eastAsia="Times New Roman" w:hAnsi="Calibri" w:cs="Calibri"/>
-          <w:color w:val="1A1A1A"/>
-          <w:sz w:val="22"/>
-          <w:szCs w:val="22"/>
-        </w:rPr>
-        <w:t xml:space="preserve"> Click </w:t>
-      </w:r>
-      <w:r>
-        <w:rPr>
-          <w:rStyle w:val="Emphasis"/>
-          <w:rFonts w:ascii="Calibri" w:eastAsia="Times New Roman" w:hAnsi="Calibri" w:cs="Calibri"/>
-          <w:color w:val="1A1A1A"/>
-          <w:sz w:val="22"/>
-          <w:szCs w:val="22"/>
-        </w:rPr>
-        <w:t>Forgot Password</w:t>
-      </w:r>
-      <w:r>
-        <w:rPr>
-          <w:rFonts w:ascii="Calibri" w:eastAsia="Times New Roman" w:hAnsi="Calibri" w:cs="Calibri"/>
-          <w:color w:val="1A1A1A"/>
-          <w:sz w:val="22"/>
-          <w:szCs w:val="22"/>
-        </w:rPr>
-        <w:t xml:space="preserve"> and type your username. The Admins get a request and will give you a new password in person. (Admins use their security question instead.)</w:t>
+          <w:rFonts w:ascii="Calibri" w:eastAsia="Times New Roman" w:hAnsi="Calibri" w:cs="Calibri"/>
+          <w:color w:val="1A1A1A"/>
+          <w:sz w:val="22"/>
+          <w:szCs w:val="22"/>
+        </w:rPr>
+        <w:t>If nobody answers, the app signs out by itself, and the Sign In window says why.</w:t>
+      </w:r>
+    </w:p>
+    <w:p>
+      <w:pPr>
+        <w:pStyle w:val="Heading2"/>
+        <w:rPr>
+          <w:rFonts w:ascii="Calibri" w:eastAsia="Times New Roman" w:hAnsi="Calibri" w:cs="Calibri"/>
+        </w:rPr>
+      </w:pPr>
+      <w:r>
+        <w:rPr>
+          <w:rFonts w:ascii="Calibri" w:eastAsia="Times New Roman" w:hAnsi="Calibri" w:cs="Calibri"/>
+        </w:rPr>
+        <w:t>Rules</w:t>
       </w:r>
     </w:p>
     <w:p>
       <w:pPr>
         <w:numPr>
           <w:ilvl w:val="0"/>
-          <w:numId w:val="8"/>
+          <w:numId w:val="9"/>
         </w:numPr>
         <w:spacing w:before="100" w:beforeAutospacing="1" w:after="100" w:afterAutospacing="1"/>
         <w:rPr>
@@ -2696,23 +2825,23 @@
           <w:sz w:val="22"/>
           <w:szCs w:val="22"/>
         </w:rPr>
-        <w:t>Only Admins change passwords.</w:t>
-      </w:r>
-      <w:r>
-        <w:rPr>
-          <w:rFonts w:ascii="Calibri" w:eastAsia="Times New Roman" w:hAnsi="Calibri" w:cs="Calibri"/>
-          <w:color w:val="1A1A1A"/>
-          <w:sz w:val="22"/>
-          <w:szCs w:val="22"/>
-        </w:rPr>
-        <w:t xml:space="preserve"> Employees and Supervisors can't change their own.</w:t>
+        <w:t>One sign in</w:t>
+      </w:r>
+      <w:r>
+        <w:rPr>
+          <w:rFonts w:ascii="Calibri" w:eastAsia="Times New Roman" w:hAnsi="Calibri" w:cs="Calibri"/>
+          <w:color w:val="1A1A1A"/>
+          <w:sz w:val="22"/>
+          <w:szCs w:val="22"/>
+        </w:rPr>
+        <w:t xml:space="preserve"> for the whole app.</w:t>
       </w:r>
     </w:p>
     <w:p>
       <w:pPr>
         <w:numPr>
           <w:ilvl w:val="0"/>
-          <w:numId w:val="8"/>
+          <w:numId w:val="9"/>
         </w:numPr>
         <w:spacing w:before="100" w:beforeAutospacing="1" w:after="100" w:afterAutospacing="1"/>
         <w:rPr>
@@ -2730,7 +2859,127 @@
           <w:sz w:val="22"/>
           <w:szCs w:val="22"/>
         </w:rPr>
-        <w:lastRenderedPageBreak/>
+        <w:t>5 wrong passwords</w:t>
+      </w:r>
+      <w:r>
+        <w:rPr>
+          <w:rFonts w:ascii="Calibri" w:eastAsia="Times New Roman" w:hAnsi="Calibri" w:cs="Calibri"/>
+          <w:color w:val="1A1A1A"/>
+          <w:sz w:val="22"/>
+          <w:szCs w:val="22"/>
+        </w:rPr>
+        <w:t xml:space="preserve"> lock the account. Only an Admin can unlock it.</w:t>
+      </w:r>
+    </w:p>
+    <w:p>
+      <w:pPr>
+        <w:numPr>
+          <w:ilvl w:val="0"/>
+          <w:numId w:val="9"/>
+        </w:numPr>
+        <w:spacing w:before="100" w:beforeAutospacing="1" w:after="100" w:afterAutospacing="1"/>
+        <w:rPr>
+          <w:rFonts w:ascii="Calibri" w:eastAsia="Times New Roman" w:hAnsi="Calibri" w:cs="Calibri"/>
+          <w:color w:val="1A1A1A"/>
+          <w:sz w:val="22"/>
+          <w:szCs w:val="22"/>
+        </w:rPr>
+      </w:pPr>
+      <w:r>
+        <w:rPr>
+          <w:rStyle w:val="Strong"/>
+          <w:rFonts w:ascii="Calibri" w:eastAsia="Times New Roman" w:hAnsi="Calibri" w:cs="Calibri"/>
+          <w:color w:val="1A1A1A"/>
+          <w:sz w:val="22"/>
+          <w:szCs w:val="22"/>
+        </w:rPr>
+        <w:t>Forgot your password?</w:t>
+      </w:r>
+      <w:r>
+        <w:rPr>
+          <w:rFonts w:ascii="Calibri" w:eastAsia="Times New Roman" w:hAnsi="Calibri" w:cs="Calibri"/>
+          <w:color w:val="1A1A1A"/>
+          <w:sz w:val="22"/>
+          <w:szCs w:val="22"/>
+        </w:rPr>
+        <w:t xml:space="preserve"> Click </w:t>
+      </w:r>
+      <w:r>
+        <w:rPr>
+          <w:rStyle w:val="Emphasis"/>
+          <w:rFonts w:ascii="Calibri" w:eastAsia="Times New Roman" w:hAnsi="Calibri" w:cs="Calibri"/>
+          <w:color w:val="1A1A1A"/>
+          <w:sz w:val="22"/>
+          <w:szCs w:val="22"/>
+        </w:rPr>
+        <w:t>Forgot Password</w:t>
+      </w:r>
+      <w:r>
+        <w:rPr>
+          <w:rFonts w:ascii="Calibri" w:eastAsia="Times New Roman" w:hAnsi="Calibri" w:cs="Calibri"/>
+          <w:color w:val="1A1A1A"/>
+          <w:sz w:val="22"/>
+          <w:szCs w:val="22"/>
+        </w:rPr>
+        <w:t xml:space="preserve"> and type your username. The Admins get a request and will give you a new password in person. (Admins use their security question instead.)</w:t>
+      </w:r>
+    </w:p>
+    <w:p>
+      <w:pPr>
+        <w:numPr>
+          <w:ilvl w:val="0"/>
+          <w:numId w:val="9"/>
+        </w:numPr>
+        <w:spacing w:before="100" w:beforeAutospacing="1" w:after="100" w:afterAutospacing="1"/>
+        <w:rPr>
+          <w:rFonts w:ascii="Calibri" w:eastAsia="Times New Roman" w:hAnsi="Calibri" w:cs="Calibri"/>
+          <w:color w:val="1A1A1A"/>
+          <w:sz w:val="22"/>
+          <w:szCs w:val="22"/>
+        </w:rPr>
+      </w:pPr>
+      <w:r>
+        <w:rPr>
+          <w:rStyle w:val="Strong"/>
+          <w:rFonts w:ascii="Calibri" w:eastAsia="Times New Roman" w:hAnsi="Calibri" w:cs="Calibri"/>
+          <w:color w:val="1A1A1A"/>
+          <w:sz w:val="22"/>
+          <w:szCs w:val="22"/>
+        </w:rPr>
+        <w:t>Only Admins change passwords.</w:t>
+      </w:r>
+      <w:r>
+        <w:rPr>
+          <w:rFonts w:ascii="Calibri" w:eastAsia="Times New Roman" w:hAnsi="Calibri" w:cs="Calibri"/>
+          <w:color w:val="1A1A1A"/>
+          <w:sz w:val="22"/>
+          <w:szCs w:val="22"/>
+        </w:rPr>
+        <w:t xml:space="preserve"> Employees and Supervisors can't change their own.</w:t>
+      </w:r>
+    </w:p>
+    <w:p>
+      <w:pPr>
+        <w:numPr>
+          <w:ilvl w:val="0"/>
+          <w:numId w:val="9"/>
+        </w:numPr>
+        <w:spacing w:before="100" w:beforeAutospacing="1" w:after="100" w:afterAutospacing="1"/>
+        <w:rPr>
+          <w:rFonts w:ascii="Calibri" w:eastAsia="Times New Roman" w:hAnsi="Calibri" w:cs="Calibri"/>
+          <w:color w:val="1A1A1A"/>
+          <w:sz w:val="22"/>
+          <w:szCs w:val="22"/>
+        </w:rPr>
+      </w:pPr>
+      <w:r>
+        <w:rPr>
+          <w:rStyle w:val="Strong"/>
+          <w:rFonts w:ascii="Calibri" w:eastAsia="Times New Roman" w:hAnsi="Calibri" w:cs="Calibri"/>
+          <w:color w:val="1A1A1A"/>
+          <w:sz w:val="22"/>
+          <w:szCs w:val="22"/>
+        </w:rPr>
         <w:t>Idle check:</w:t>
       </w:r>
       <w:r>
@@ -2750,7 +2999,17 @@
           <w:sz w:val="22"/>
           <w:szCs w:val="22"/>
         </w:rPr>
-        <w:t>"Still there?"</w:t>
+        <w:t>"Still there?</w:t>
+      </w:r>
+      <w:r>
+        <w:rPr>
+          <w:rStyle w:val="Emphasis"/>
+          <w:rFonts w:ascii="Calibri" w:eastAsia="Times New Roman" w:hAnsi="Calibri" w:cs="Calibri"/>
+          <w:color w:val="1A1A1A"/>
+          <w:sz w:val="22"/>
+          <w:szCs w:val="22"/>
+        </w:rPr>
+        <w:t>"</w:t>
       </w:r>
       <w:r>
         <w:rPr>
@@ -2836,13 +3095,7 @@
         <w:rPr>
           <w:rFonts w:ascii="Calibri" w:eastAsia="Times New Roman" w:hAnsi="Calibri" w:cs="Calibri"/>
         </w:rPr>
-        <w:t xml:space="preserve">7. Inventory &amp; </w:t>
-      </w:r>
-      <w:r>
-        <w:rPr>
-          <w:rFonts w:ascii="Calibri" w:eastAsia="Times New Roman" w:hAnsi="Calibri" w:cs="Calibri"/>
-        </w:rPr>
-        <w:t xml:space="preserve">Vendors </w:t>
+        <w:t xml:space="preserve">7. Inventory &amp; Vendors </w:t>
       </w:r>
       <w:r>
         <w:rPr>
@@ -2928,348 +3181,9 @@
 <file path=word/numbering.xml><?xml version="1.0" encoding="utf-8"?>
 <w:numbering xmlns:wpc="http://schemas.microsoft.com/office/word/2010/wordprocessingCanvas" xmlns:cx="http://schemas.microsoft.com/office/drawing/2014/chartex" xmlns:cx1="http://schemas.microsoft.com/office/drawing/2015/9/8/chartex" xmlns:cx2="http://schemas.microsoft.com/office/drawing/2015/10/21/chartex" xmlns:cx3="http://schemas.microsoft.com/office/drawing/2016/5/9/chartex" xmlns:cx4="http://schemas.microsoft.com/office/drawing/2016/5/10/chartex" xmlns:cx5="http://schemas.microsoft.com/office/drawing/2016/5/11/chartex" xmlns:cx6="http://schemas.microsoft.com/office/drawing/2016/5/12/chartex" xmlns:cx7="http://schemas.microsoft.com/office/drawing/2016/5/13/chartex" xmlns:cx8="http://schemas.microsoft.com/office/drawing/2016/5/14/chartex" xmlns:mc="http://schemas.openxmlformats.org/markup-compatibility/2006" xmlns:aink="http://schemas.microsoft.com/office/drawing/2016/ink" xmlns:am3d="http://schemas.microsoft.com/office/drawing/2017/model3d" xmlns:o="urn:schemas-microsoft-com:office:office" xmlns:oel="http://schemas.microsoft.com/office/2019/extlst" xmlns:r="http://schemas.openxmlformats.org/officeDocument/2006/relationships" xmlns:m="http://schemas.openxmlformats.org/officeDocument/2006/math" xmlns:v="urn:schemas-microsoft-com:vml" xmlns:wp14="http://schemas.microsoft.com/office/word/2010/wordprocessingDrawing" xmlns:wp="http://schemas.openxmlformats.org/drawingml/2006/wordprocessingDrawing" xmlns:w10="urn:schemas-microsoft-com:office:word" xmlns:w="http://schemas.openxmlformats.org/wordprocessingml/2006/main" xmlns:w14="http://schemas.microsoft.com/office/word/2010/wordml" xmlns:w15="http://schemas.microsoft.com/office/word/2012/wordml" xmlns:w16cex="http://schemas.microsoft.com/office/word/2018/wordml/cex" xmlns:w16cid="http://schemas.microsoft.com/office/word/2016/wordml/cid" xmlns:w16="http://schemas.microsoft.com/office/word/2018/wordml" xmlns:w16du="http://schemas.microsoft.com/office/word/2023/wordml/word16du" xmlns:w16sdtdh="http://schemas.microsoft.com/office/word/2020/wordml/sdtdatahash" xmlns:w16sdtfl="http://schemas.microsoft.com/office/word/2024/wordml/sdtformatlock" xmlns:w16se="http://schemas.microsoft.com/office/word/2015/wordml/symex" xmlns:wpg="http://schemas.microsoft.com/office/word/2010/wordprocessingGroup" xmlns:wpi="http://schemas.microsoft.com/office/word/2010/wordprocessingInk" xmlns:wne="http://schemas.microsoft.com/office/word/2006/wordml" xmlns:wps="http://schemas.microsoft.com/office/word/2010/wordprocessingShape" mc:Ignorable="w14 w15 w16se w16cid w16 w16cex w16sdtdh w16sdtfl w16du wp14">
   <w:abstractNum w:abstractNumId="0" w15:restartNumberingAfterBreak="0">
-    <w:nsid w:val="12E63E0A"/>
+    <w:nsid w:val="0BE17B43"/>
     <w:multiLevelType w:val="multilevel"/>
-    <w:tmpl w:val="AAC249B8"/>
-    <w:lvl w:ilvl="0">
-      <w:start w:val="1"/>
-      <w:numFmt w:val="decimal"/>
-      <w:lvlText w:val="%1."/>
-      <w:lvlJc w:val="left"/>
-      <w:pPr>
-        <w:tabs>
-          <w:tab w:val="num" w:pos="720"/>
-        </w:tabs>
-        <w:ind w:left="720" w:hanging="360"/>
-      </w:pPr>
-    </w:lvl>
-    <w:lvl w:ilvl="1" w:tentative="1">
-      <w:start w:val="1"/>
-      <w:numFmt w:val="decimal"/>
-      <w:lvlText w:val="%2."/>
-      <w:lvlJc w:val="left"/>
-      <w:pPr>
-        <w:tabs>
-          <w:tab w:val="num" w:pos="1440"/>
-        </w:tabs>
-        <w:ind w:left="1440" w:hanging="360"/>
-      </w:pPr>
-    </w:lvl>
-    <w:lvl w:ilvl="2" w:tentative="1">
-      <w:start w:val="1"/>
-      <w:numFmt w:val="decimal"/>
-      <w:lvlText w:val="%3."/>
-      <w:lvlJc w:val="left"/>
-      <w:pPr>
-        <w:tabs>
-          <w:tab w:val="num" w:pos="2160"/>
-        </w:tabs>
-        <w:ind w:left="2160" w:hanging="360"/>
-      </w:pPr>
-    </w:lvl>
-    <w:lvl w:ilvl="3" w:tentative="1">
-      <w:start w:val="1"/>
-      <w:numFmt w:val="decimal"/>
-      <w:lvlText w:val="%4."/>
-      <w:lvlJc w:val="left"/>
-      <w:pPr>
-        <w:tabs>
-          <w:tab w:val="num" w:pos="2880"/>
-        </w:tabs>
-        <w:ind w:left="2880" w:hanging="360"/>
-      </w:pPr>
-    </w:lvl>
-    <w:lvl w:ilvl="4" w:tentative="1">
-      <w:start w:val="1"/>
-      <w:numFmt w:val="decimal"/>
-      <w:lvlText w:val="%5."/>
-      <w:lvlJc w:val="left"/>
-      <w:pPr>
-        <w:tabs>
-          <w:tab w:val="num" w:pos="3600"/>
-        </w:tabs>
-        <w:ind w:left="3600" w:hanging="360"/>
-      </w:pPr>
-    </w:lvl>
-    <w:lvl w:ilvl="5" w:tentative="1">
-      <w:start w:val="1"/>
-      <w:numFmt w:val="decimal"/>
-      <w:lvlText w:val="%6."/>
-      <w:lvlJc w:val="left"/>
-      <w:pPr>
-        <w:tabs>
-          <w:tab w:val="num" w:pos="4320"/>
-        </w:tabs>
-        <w:ind w:left="4320" w:hanging="360"/>
-      </w:pPr>
-    </w:lvl>
-    <w:lvl w:ilvl="6" w:tentative="1">
-      <w:start w:val="1"/>
-      <w:numFmt w:val="decimal"/>
-      <w:lvlText w:val="%7."/>
-      <w:lvlJc w:val="left"/>
-      <w:pPr>
-        <w:tabs>
-          <w:tab w:val="num" w:pos="5040"/>
-        </w:tabs>
-        <w:ind w:left="5040" w:hanging="360"/>
-      </w:pPr>
-    </w:lvl>
-    <w:lvl w:ilvl="7" w:tentative="1">
-      <w:start w:val="1"/>
-      <w:numFmt w:val="decimal"/>
-      <w:lvlText w:val="%8."/>
-      <w:lvlJc w:val="left"/>
-      <w:pPr>
-        <w:tabs>
-          <w:tab w:val="num" w:pos="5760"/>
-        </w:tabs>
-        <w:ind w:left="5760" w:hanging="360"/>
-      </w:pPr>
-    </w:lvl>
-    <w:lvl w:ilvl="8" w:tentative="1">
-      <w:start w:val="1"/>
-      <w:numFmt w:val="decimal"/>
-      <w:lvlText w:val="%9."/>
-      <w:lvlJc w:val="left"/>
-      <w:pPr>
-        <w:tabs>
-          <w:tab w:val="num" w:pos="6480"/>
-        </w:tabs>
-        <w:ind w:left="6480" w:hanging="360"/>
-      </w:pPr>
-    </w:lvl>
-  </w:abstractNum>
-  <w:abstractNum w:abstractNumId="1" w15:restartNumberingAfterBreak="0">
-    <w:nsid w:val="13E14B82"/>
-    <w:multiLevelType w:val="multilevel"/>
-    <w:tmpl w:val="00423C3A"/>
-    <w:lvl w:ilvl="0">
-      <w:start w:val="1"/>
-      <w:numFmt w:val="decimal"/>
-      <w:lvlText w:val="%1."/>
-      <w:lvlJc w:val="left"/>
-      <w:pPr>
-        <w:tabs>
-          <w:tab w:val="num" w:pos="720"/>
-        </w:tabs>
-        <w:ind w:left="720" w:hanging="360"/>
-      </w:pPr>
-    </w:lvl>
-    <w:lvl w:ilvl="1" w:tentative="1">
-      <w:start w:val="1"/>
-      <w:numFmt w:val="decimal"/>
-      <w:lvlText w:val="%2."/>
-      <w:lvlJc w:val="left"/>
-      <w:pPr>
-        <w:tabs>
-          <w:tab w:val="num" w:pos="1440"/>
-        </w:tabs>
-        <w:ind w:left="1440" w:hanging="360"/>
-      </w:pPr>
-    </w:lvl>
-    <w:lvl w:ilvl="2" w:tentative="1">
-      <w:start w:val="1"/>
-      <w:numFmt w:val="decimal"/>
-      <w:lvlText w:val="%3."/>
-      <w:lvlJc w:val="left"/>
-      <w:pPr>
-        <w:tabs>
-          <w:tab w:val="num" w:pos="2160"/>
-        </w:tabs>
-        <w:ind w:left="2160" w:hanging="360"/>
-      </w:pPr>
-    </w:lvl>
-    <w:lvl w:ilvl="3" w:tentative="1">
-      <w:start w:val="1"/>
-      <w:numFmt w:val="decimal"/>
-      <w:lvlText w:val="%4."/>
-      <w:lvlJc w:val="left"/>
-      <w:pPr>
-        <w:tabs>
-          <w:tab w:val="num" w:pos="2880"/>
-        </w:tabs>
-        <w:ind w:left="2880" w:hanging="360"/>
-      </w:pPr>
-    </w:lvl>
-    <w:lvl w:ilvl="4" w:tentative="1">
-      <w:start w:val="1"/>
-      <w:numFmt w:val="decimal"/>
-      <w:lvlText w:val="%5."/>
-      <w:lvlJc w:val="left"/>
-      <w:pPr>
-        <w:tabs>
-          <w:tab w:val="num" w:pos="3600"/>
-        </w:tabs>
-        <w:ind w:left="3600" w:hanging="360"/>
-      </w:pPr>
-    </w:lvl>
-    <w:lvl w:ilvl="5" w:tentative="1">
-      <w:start w:val="1"/>
-      <w:numFmt w:val="decimal"/>
-      <w:lvlText w:val="%6."/>
-      <w:lvlJc w:val="left"/>
-      <w:pPr>
-        <w:tabs>
-          <w:tab w:val="num" w:pos="4320"/>
-        </w:tabs>
-        <w:ind w:left="4320" w:hanging="360"/>
-      </w:pPr>
-    </w:lvl>
-    <w:lvl w:ilvl="6" w:tentative="1">
-      <w:start w:val="1"/>
-      <w:numFmt w:val="decimal"/>
-      <w:lvlText w:val="%7."/>
-      <w:lvlJc w:val="left"/>
-      <w:pPr>
-        <w:tabs>
-          <w:tab w:val="num" w:pos="5040"/>
-        </w:tabs>
-        <w:ind w:left="5040" w:hanging="360"/>
-      </w:pPr>
-    </w:lvl>
-    <w:lvl w:ilvl="7" w:tentative="1">
-      <w:start w:val="1"/>
-      <w:numFmt w:val="decimal"/>
-      <w:lvlText w:val="%8."/>
-      <w:lvlJc w:val="left"/>
-      <w:pPr>
-        <w:tabs>
-          <w:tab w:val="num" w:pos="5760"/>
-        </w:tabs>
-        <w:ind w:left="5760" w:hanging="360"/>
-      </w:pPr>
-    </w:lvl>
-    <w:lvl w:ilvl="8" w:tentative="1">
-      <w:start w:val="1"/>
-      <w:numFmt w:val="decimal"/>
-      <w:lvlText w:val="%9."/>
-      <w:lvlJc w:val="left"/>
-      <w:pPr>
-        <w:tabs>
-          <w:tab w:val="num" w:pos="6480"/>
-        </w:tabs>
-        <w:ind w:left="6480" w:hanging="360"/>
-      </w:pPr>
-    </w:lvl>
-  </w:abstractNum>
-  <w:abstractNum w:abstractNumId="2" w15:restartNumberingAfterBreak="0">
-    <w:nsid w:val="29DD3EB1"/>
-    <w:multiLevelType w:val="multilevel"/>
-    <w:tmpl w:val="8BB643CE"/>
-    <w:lvl w:ilvl="0">
-      <w:start w:val="1"/>
-      <w:numFmt w:val="decimal"/>
-      <w:lvlText w:val="%1."/>
-      <w:lvlJc w:val="left"/>
-      <w:pPr>
-        <w:tabs>
-          <w:tab w:val="num" w:pos="720"/>
-        </w:tabs>
-        <w:ind w:left="720" w:hanging="360"/>
-      </w:pPr>
-    </w:lvl>
-    <w:lvl w:ilvl="1" w:tentative="1">
-      <w:start w:val="1"/>
-      <w:numFmt w:val="decimal"/>
-      <w:lvlText w:val="%2."/>
-      <w:lvlJc w:val="left"/>
-      <w:pPr>
-        <w:tabs>
-          <w:tab w:val="num" w:pos="1440"/>
-        </w:tabs>
-        <w:ind w:left="1440" w:hanging="360"/>
-      </w:pPr>
-    </w:lvl>
-    <w:lvl w:ilvl="2" w:tentative="1">
-      <w:start w:val="1"/>
-      <w:numFmt w:val="decimal"/>
-      <w:lvlText w:val="%3."/>
-      <w:lvlJc w:val="left"/>
-      <w:pPr>
-        <w:tabs>
-          <w:tab w:val="num" w:pos="2160"/>
-        </w:tabs>
-        <w:ind w:left="2160" w:hanging="360"/>
-      </w:pPr>
-    </w:lvl>
-    <w:lvl w:ilvl="3" w:tentative="1">
-      <w:start w:val="1"/>
-      <w:numFmt w:val="decimal"/>
-      <w:lvlText w:val="%4."/>
-      <w:lvlJc w:val="left"/>
-      <w:pPr>
-        <w:tabs>
-          <w:tab w:val="num" w:pos="2880"/>
-        </w:tabs>
-        <w:ind w:left="2880" w:hanging="360"/>
-      </w:pPr>
-    </w:lvl>
-    <w:lvl w:ilvl="4" w:tentative="1">
-      <w:start w:val="1"/>
-      <w:numFmt w:val="decimal"/>
-      <w:lvlText w:val="%5."/>
-      <w:lvlJc w:val="left"/>
-      <w:pPr>
-        <w:tabs>
-          <w:tab w:val="num" w:pos="3600"/>
-        </w:tabs>
-        <w:ind w:left="3600" w:hanging="360"/>
-      </w:pPr>
-    </w:lvl>
-    <w:lvl w:ilvl="5" w:tentative="1">
-      <w:start w:val="1"/>
-      <w:numFmt w:val="decimal"/>
-      <w:lvlText w:val="%6."/>
-      <w:lvlJc w:val="left"/>
-      <w:pPr>
-        <w:tabs>
-          <w:tab w:val="num" w:pos="4320"/>
-        </w:tabs>
-        <w:ind w:left="4320" w:hanging="360"/>
-      </w:pPr>
-    </w:lvl>
-    <w:lvl w:ilvl="6" w:tentative="1">
-      <w:start w:val="1"/>
-      <w:numFmt w:val="decimal"/>
-      <w:lvlText w:val="%7."/>
-      <w:lvlJc w:val="left"/>
-      <w:pPr>
-        <w:tabs>
-          <w:tab w:val="num" w:pos="5040"/>
-        </w:tabs>
-        <w:ind w:left="5040" w:hanging="360"/>
-      </w:pPr>
-    </w:lvl>
-    <w:lvl w:ilvl="7" w:tentative="1">
-      <w:start w:val="1"/>
-      <w:numFmt w:val="decimal"/>
-      <w:lvlText w:val="%8."/>
-      <w:lvlJc w:val="left"/>
-      <w:pPr>
-        <w:tabs>
-          <w:tab w:val="num" w:pos="5760"/>
-        </w:tabs>
-        <w:ind w:left="5760" w:hanging="360"/>
-      </w:pPr>
-    </w:lvl>
-    <w:lvl w:ilvl="8" w:tentative="1">
-      <w:start w:val="1"/>
-      <w:numFmt w:val="decimal"/>
-      <w:lvlText w:val="%9."/>
-      <w:lvlJc w:val="left"/>
-      <w:pPr>
-        <w:tabs>
-          <w:tab w:val="num" w:pos="6480"/>
-        </w:tabs>
-        <w:ind w:left="6480" w:hanging="360"/>
-      </w:pPr>
-    </w:lvl>
-  </w:abstractNum>
-  <w:abstractNum w:abstractNumId="3" w15:restartNumberingAfterBreak="0">
-    <w:nsid w:val="3E7B284C"/>
-    <w:multiLevelType w:val="multilevel"/>
-    <w:tmpl w:val="64489EE6"/>
+    <w:tmpl w:val="117E4DB2"/>
     <w:lvl w:ilvl="0">
       <w:start w:val="1"/>
       <w:numFmt w:val="bullet"/>
@@ -3415,236 +3329,10 @@
       </w:rPr>
     </w:lvl>
   </w:abstractNum>
-  <w:abstractNum w:abstractNumId="4" w15:restartNumberingAfterBreak="0">
-    <w:nsid w:val="50326082"/>
+  <w:abstractNum w:abstractNumId="1" w15:restartNumberingAfterBreak="0">
+    <w:nsid w:val="0F1F3E68"/>
     <w:multiLevelType w:val="multilevel"/>
-    <w:tmpl w:val="26B65AC8"/>
-    <w:lvl w:ilvl="0">
-      <w:start w:val="1"/>
-      <w:numFmt w:val="decimal"/>
-      <w:lvlText w:val="%1."/>
-      <w:lvlJc w:val="left"/>
-      <w:pPr>
-        <w:tabs>
-          <w:tab w:val="num" w:pos="720"/>
-        </w:tabs>
-        <w:ind w:left="720" w:hanging="360"/>
-      </w:pPr>
-    </w:lvl>
-    <w:lvl w:ilvl="1" w:tentative="1">
-      <w:start w:val="1"/>
-      <w:numFmt w:val="decimal"/>
-      <w:lvlText w:val="%2."/>
-      <w:lvlJc w:val="left"/>
-      <w:pPr>
-        <w:tabs>
-          <w:tab w:val="num" w:pos="1440"/>
-        </w:tabs>
-        <w:ind w:left="1440" w:hanging="360"/>
-      </w:pPr>
-    </w:lvl>
-    <w:lvl w:ilvl="2" w:tentative="1">
-      <w:start w:val="1"/>
-      <w:numFmt w:val="decimal"/>
-      <w:lvlText w:val="%3."/>
-      <w:lvlJc w:val="left"/>
-      <w:pPr>
-        <w:tabs>
-          <w:tab w:val="num" w:pos="2160"/>
-        </w:tabs>
-        <w:ind w:left="2160" w:hanging="360"/>
-      </w:pPr>
-    </w:lvl>
-    <w:lvl w:ilvl="3" w:tentative="1">
-      <w:start w:val="1"/>
-      <w:numFmt w:val="decimal"/>
-      <w:lvlText w:val="%4."/>
-      <w:lvlJc w:val="left"/>
-      <w:pPr>
-        <w:tabs>
-          <w:tab w:val="num" w:pos="2880"/>
-        </w:tabs>
-        <w:ind w:left="2880" w:hanging="360"/>
-      </w:pPr>
-    </w:lvl>
-    <w:lvl w:ilvl="4" w:tentative="1">
-      <w:start w:val="1"/>
-      <w:numFmt w:val="decimal"/>
-      <w:lvlText w:val="%5."/>
-      <w:lvlJc w:val="left"/>
-      <w:pPr>
-        <w:tabs>
-          <w:tab w:val="num" w:pos="3600"/>
-        </w:tabs>
-        <w:ind w:left="3600" w:hanging="360"/>
-      </w:pPr>
-    </w:lvl>
-    <w:lvl w:ilvl="5" w:tentative="1">
-      <w:start w:val="1"/>
-      <w:numFmt w:val="decimal"/>
-      <w:lvlText w:val="%6."/>
-      <w:lvlJc w:val="left"/>
-      <w:pPr>
-        <w:tabs>
-          <w:tab w:val="num" w:pos="4320"/>
-        </w:tabs>
-        <w:ind w:left="4320" w:hanging="360"/>
-      </w:pPr>
-    </w:lvl>
-    <w:lvl w:ilvl="6" w:tentative="1">
-      <w:start w:val="1"/>
-      <w:numFmt w:val="decimal"/>
-      <w:lvlText w:val="%7."/>
-      <w:lvlJc w:val="left"/>
-      <w:pPr>
-        <w:tabs>
-          <w:tab w:val="num" w:pos="5040"/>
-        </w:tabs>
-        <w:ind w:left="5040" w:hanging="360"/>
-      </w:pPr>
-    </w:lvl>
-    <w:lvl w:ilvl="7" w:tentative="1">
-      <w:start w:val="1"/>
-      <w:numFmt w:val="decimal"/>
-      <w:lvlText w:val="%8."/>
-      <w:lvlJc w:val="left"/>
-      <w:pPr>
-        <w:tabs>
-          <w:tab w:val="num" w:pos="5760"/>
-        </w:tabs>
-        <w:ind w:left="5760" w:hanging="360"/>
-      </w:pPr>
-    </w:lvl>
-    <w:lvl w:ilvl="8" w:tentative="1">
-      <w:start w:val="1"/>
-      <w:numFmt w:val="decimal"/>
-      <w:lvlText w:val="%9."/>
-      <w:lvlJc w:val="left"/>
-      <w:pPr>
-        <w:tabs>
-          <w:tab w:val="num" w:pos="6480"/>
-        </w:tabs>
-        <w:ind w:left="6480" w:hanging="360"/>
-      </w:pPr>
-    </w:lvl>
-  </w:abstractNum>
-  <w:abstractNum w:abstractNumId="5" w15:restartNumberingAfterBreak="0">
-    <w:nsid w:val="517F42BF"/>
-    <w:multiLevelType w:val="multilevel"/>
-    <w:tmpl w:val="D4043500"/>
-    <w:lvl w:ilvl="0">
-      <w:start w:val="1"/>
-      <w:numFmt w:val="decimal"/>
-      <w:lvlText w:val="%1."/>
-      <w:lvlJc w:val="left"/>
-      <w:pPr>
-        <w:tabs>
-          <w:tab w:val="num" w:pos="720"/>
-        </w:tabs>
-        <w:ind w:left="720" w:hanging="360"/>
-      </w:pPr>
-    </w:lvl>
-    <w:lvl w:ilvl="1" w:tentative="1">
-      <w:start w:val="1"/>
-      <w:numFmt w:val="decimal"/>
-      <w:lvlText w:val="%2."/>
-      <w:lvlJc w:val="left"/>
-      <w:pPr>
-        <w:tabs>
-          <w:tab w:val="num" w:pos="1440"/>
-        </w:tabs>
-        <w:ind w:left="1440" w:hanging="360"/>
-      </w:pPr>
-    </w:lvl>
-    <w:lvl w:ilvl="2" w:tentative="1">
-      <w:start w:val="1"/>
-      <w:numFmt w:val="decimal"/>
-      <w:lvlText w:val="%3."/>
-      <w:lvlJc w:val="left"/>
-      <w:pPr>
-        <w:tabs>
-          <w:tab w:val="num" w:pos="2160"/>
-        </w:tabs>
-        <w:ind w:left="2160" w:hanging="360"/>
-      </w:pPr>
-    </w:lvl>
-    <w:lvl w:ilvl="3" w:tentative="1">
-      <w:start w:val="1"/>
-      <w:numFmt w:val="decimal"/>
-      <w:lvlText w:val="%4."/>
-      <w:lvlJc w:val="left"/>
-      <w:pPr>
-        <w:tabs>
-          <w:tab w:val="num" w:pos="2880"/>
-        </w:tabs>
-        <w:ind w:left="2880" w:hanging="360"/>
-      </w:pPr>
-    </w:lvl>
-    <w:lvl w:ilvl="4" w:tentative="1">
-      <w:start w:val="1"/>
-      <w:numFmt w:val="decimal"/>
-      <w:lvlText w:val="%5."/>
-      <w:lvlJc w:val="left"/>
-      <w:pPr>
-        <w:tabs>
-          <w:tab w:val="num" w:pos="3600"/>
-        </w:tabs>
-        <w:ind w:left="3600" w:hanging="360"/>
-      </w:pPr>
-    </w:lvl>
-    <w:lvl w:ilvl="5" w:tentative="1">
-      <w:start w:val="1"/>
-      <w:numFmt w:val="decimal"/>
-      <w:lvlText w:val="%6."/>
-      <w:lvlJc w:val="left"/>
-      <w:pPr>
-        <w:tabs>
-          <w:tab w:val="num" w:pos="4320"/>
-        </w:tabs>
-        <w:ind w:left="4320" w:hanging="360"/>
-      </w:pPr>
-    </w:lvl>
-    <w:lvl w:ilvl="6" w:tentative="1">
-      <w:start w:val="1"/>
-      <w:numFmt w:val="decimal"/>
-      <w:lvlText w:val="%7."/>
-      <w:lvlJc w:val="left"/>
-      <w:pPr>
-        <w:tabs>
-          <w:tab w:val="num" w:pos="5040"/>
-        </w:tabs>
-        <w:ind w:left="5040" w:hanging="360"/>
-      </w:pPr>
-    </w:lvl>
-    <w:lvl w:ilvl="7" w:tentative="1">
-      <w:start w:val="1"/>
-      <w:numFmt w:val="decimal"/>
-      <w:lvlText w:val="%8."/>
-      <w:lvlJc w:val="left"/>
-      <w:pPr>
-        <w:tabs>
-          <w:tab w:val="num" w:pos="5760"/>
-        </w:tabs>
-        <w:ind w:left="5760" w:hanging="360"/>
-      </w:pPr>
-    </w:lvl>
-    <w:lvl w:ilvl="8" w:tentative="1">
-      <w:start w:val="1"/>
-      <w:numFmt w:val="decimal"/>
-      <w:lvlText w:val="%9."/>
-      <w:lvlJc w:val="left"/>
-      <w:pPr>
-        <w:tabs>
-          <w:tab w:val="num" w:pos="6480"/>
-        </w:tabs>
-        <w:ind w:left="6480" w:hanging="360"/>
-      </w:pPr>
-    </w:lvl>
-  </w:abstractNum>
-  <w:abstractNum w:abstractNumId="6" w15:restartNumberingAfterBreak="0">
-    <w:nsid w:val="68C47E5D"/>
-    <w:multiLevelType w:val="multilevel"/>
-    <w:tmpl w:val="03A8C088"/>
+    <w:tmpl w:val="DFC6428E"/>
     <w:lvl w:ilvl="0">
       <w:start w:val="1"/>
       <w:numFmt w:val="bullet"/>
@@ -3790,10 +3478,575 @@
       </w:rPr>
     </w:lvl>
   </w:abstractNum>
+  <w:abstractNum w:abstractNumId="2" w15:restartNumberingAfterBreak="0">
+    <w:nsid w:val="1B0262E2"/>
+    <w:multiLevelType w:val="multilevel"/>
+    <w:tmpl w:val="6994F336"/>
+    <w:lvl w:ilvl="0">
+      <w:start w:val="1"/>
+      <w:numFmt w:val="decimal"/>
+      <w:lvlText w:val="%1."/>
+      <w:lvlJc w:val="left"/>
+      <w:pPr>
+        <w:tabs>
+          <w:tab w:val="num" w:pos="720"/>
+        </w:tabs>
+        <w:ind w:left="720" w:hanging="360"/>
+      </w:pPr>
+    </w:lvl>
+    <w:lvl w:ilvl="1" w:tentative="1">
+      <w:start w:val="1"/>
+      <w:numFmt w:val="decimal"/>
+      <w:lvlText w:val="%2."/>
+      <w:lvlJc w:val="left"/>
+      <w:pPr>
+        <w:tabs>
+          <w:tab w:val="num" w:pos="1440"/>
+        </w:tabs>
+        <w:ind w:left="1440" w:hanging="360"/>
+      </w:pPr>
+    </w:lvl>
+    <w:lvl w:ilvl="2" w:tentative="1">
+      <w:start w:val="1"/>
+      <w:numFmt w:val="decimal"/>
+      <w:lvlText w:val="%3."/>
+      <w:lvlJc w:val="left"/>
+      <w:pPr>
+        <w:tabs>
+          <w:tab w:val="num" w:pos="2160"/>
+        </w:tabs>
+        <w:ind w:left="2160" w:hanging="360"/>
+      </w:pPr>
+    </w:lvl>
+    <w:lvl w:ilvl="3" w:tentative="1">
+      <w:start w:val="1"/>
+      <w:numFmt w:val="decimal"/>
+      <w:lvlText w:val="%4."/>
+      <w:lvlJc w:val="left"/>
+      <w:pPr>
+        <w:tabs>
+          <w:tab w:val="num" w:pos="2880"/>
+        </w:tabs>
+        <w:ind w:left="2880" w:hanging="360"/>
+      </w:pPr>
+    </w:lvl>
+    <w:lvl w:ilvl="4" w:tentative="1">
+      <w:start w:val="1"/>
+      <w:numFmt w:val="decimal"/>
+      <w:lvlText w:val="%5."/>
+      <w:lvlJc w:val="left"/>
+      <w:pPr>
+        <w:tabs>
+          <w:tab w:val="num" w:pos="3600"/>
+        </w:tabs>
+        <w:ind w:left="3600" w:hanging="360"/>
+      </w:pPr>
+    </w:lvl>
+    <w:lvl w:ilvl="5" w:tentative="1">
+      <w:start w:val="1"/>
+      <w:numFmt w:val="decimal"/>
+      <w:lvlText w:val="%6."/>
+      <w:lvlJc w:val="left"/>
+      <w:pPr>
+        <w:tabs>
+          <w:tab w:val="num" w:pos="4320"/>
+        </w:tabs>
+        <w:ind w:left="4320" w:hanging="360"/>
+      </w:pPr>
+    </w:lvl>
+    <w:lvl w:ilvl="6" w:tentative="1">
+      <w:start w:val="1"/>
+      <w:numFmt w:val="decimal"/>
+      <w:lvlText w:val="%7."/>
+      <w:lvlJc w:val="left"/>
+      <w:pPr>
+        <w:tabs>
+          <w:tab w:val="num" w:pos="5040"/>
+        </w:tabs>
+        <w:ind w:left="5040" w:hanging="360"/>
+      </w:pPr>
+    </w:lvl>
+    <w:lvl w:ilvl="7" w:tentative="1">
+      <w:start w:val="1"/>
+      <w:numFmt w:val="decimal"/>
+      <w:lvlText w:val="%8."/>
+      <w:lvlJc w:val="left"/>
+      <w:pPr>
+        <w:tabs>
+          <w:tab w:val="num" w:pos="5760"/>
+        </w:tabs>
+        <w:ind w:left="5760" w:hanging="360"/>
+      </w:pPr>
+    </w:lvl>
+    <w:lvl w:ilvl="8" w:tentative="1">
+      <w:start w:val="1"/>
+      <w:numFmt w:val="decimal"/>
+      <w:lvlText w:val="%9."/>
+      <w:lvlJc w:val="left"/>
+      <w:pPr>
+        <w:tabs>
+          <w:tab w:val="num" w:pos="6480"/>
+        </w:tabs>
+        <w:ind w:left="6480" w:hanging="360"/>
+      </w:pPr>
+    </w:lvl>
+  </w:abstractNum>
+  <w:abstractNum w:abstractNumId="3" w15:restartNumberingAfterBreak="0">
+    <w:nsid w:val="1F3278CA"/>
+    <w:multiLevelType w:val="multilevel"/>
+    <w:tmpl w:val="3C7A846E"/>
+    <w:lvl w:ilvl="0">
+      <w:start w:val="1"/>
+      <w:numFmt w:val="decimal"/>
+      <w:lvlText w:val="%1."/>
+      <w:lvlJc w:val="left"/>
+      <w:pPr>
+        <w:tabs>
+          <w:tab w:val="num" w:pos="720"/>
+        </w:tabs>
+        <w:ind w:left="720" w:hanging="360"/>
+      </w:pPr>
+    </w:lvl>
+    <w:lvl w:ilvl="1" w:tentative="1">
+      <w:start w:val="1"/>
+      <w:numFmt w:val="decimal"/>
+      <w:lvlText w:val="%2."/>
+      <w:lvlJc w:val="left"/>
+      <w:pPr>
+        <w:tabs>
+          <w:tab w:val="num" w:pos="1440"/>
+        </w:tabs>
+        <w:ind w:left="1440" w:hanging="360"/>
+      </w:pPr>
+    </w:lvl>
+    <w:lvl w:ilvl="2" w:tentative="1">
+      <w:start w:val="1"/>
+      <w:numFmt w:val="decimal"/>
+      <w:lvlText w:val="%3."/>
+      <w:lvlJc w:val="left"/>
+      <w:pPr>
+        <w:tabs>
+          <w:tab w:val="num" w:pos="2160"/>
+        </w:tabs>
+        <w:ind w:left="2160" w:hanging="360"/>
+      </w:pPr>
+    </w:lvl>
+    <w:lvl w:ilvl="3" w:tentative="1">
+      <w:start w:val="1"/>
+      <w:numFmt w:val="decimal"/>
+      <w:lvlText w:val="%4."/>
+      <w:lvlJc w:val="left"/>
+      <w:pPr>
+        <w:tabs>
+          <w:tab w:val="num" w:pos="2880"/>
+        </w:tabs>
+        <w:ind w:left="2880" w:hanging="360"/>
+      </w:pPr>
+    </w:lvl>
+    <w:lvl w:ilvl="4" w:tentative="1">
+      <w:start w:val="1"/>
+      <w:numFmt w:val="decimal"/>
+      <w:lvlText w:val="%5."/>
+      <w:lvlJc w:val="left"/>
+      <w:pPr>
+        <w:tabs>
+          <w:tab w:val="num" w:pos="3600"/>
+        </w:tabs>
+        <w:ind w:left="3600" w:hanging="360"/>
+      </w:pPr>
+    </w:lvl>
+    <w:lvl w:ilvl="5" w:tentative="1">
+      <w:start w:val="1"/>
+      <w:numFmt w:val="decimal"/>
+      <w:lvlText w:val="%6."/>
+      <w:lvlJc w:val="left"/>
+      <w:pPr>
+        <w:tabs>
+          <w:tab w:val="num" w:pos="4320"/>
+        </w:tabs>
+        <w:ind w:left="4320" w:hanging="360"/>
+      </w:pPr>
+    </w:lvl>
+    <w:lvl w:ilvl="6" w:tentative="1">
+      <w:start w:val="1"/>
+      <w:numFmt w:val="decimal"/>
+      <w:lvlText w:val="%7."/>
+      <w:lvlJc w:val="left"/>
+      <w:pPr>
+        <w:tabs>
+          <w:tab w:val="num" w:pos="5040"/>
+        </w:tabs>
+        <w:ind w:left="5040" w:hanging="360"/>
+      </w:pPr>
+    </w:lvl>
+    <w:lvl w:ilvl="7" w:tentative="1">
+      <w:start w:val="1"/>
+      <w:numFmt w:val="decimal"/>
+      <w:lvlText w:val="%8."/>
+      <w:lvlJc w:val="left"/>
+      <w:pPr>
+        <w:tabs>
+          <w:tab w:val="num" w:pos="5760"/>
+        </w:tabs>
+        <w:ind w:left="5760" w:hanging="360"/>
+      </w:pPr>
+    </w:lvl>
+    <w:lvl w:ilvl="8" w:tentative="1">
+      <w:start w:val="1"/>
+      <w:numFmt w:val="decimal"/>
+      <w:lvlText w:val="%9."/>
+      <w:lvlJc w:val="left"/>
+      <w:pPr>
+        <w:tabs>
+          <w:tab w:val="num" w:pos="6480"/>
+        </w:tabs>
+        <w:ind w:left="6480" w:hanging="360"/>
+      </w:pPr>
+    </w:lvl>
+  </w:abstractNum>
+  <w:abstractNum w:abstractNumId="4" w15:restartNumberingAfterBreak="0">
+    <w:nsid w:val="2B5236F9"/>
+    <w:multiLevelType w:val="multilevel"/>
+    <w:tmpl w:val="7206EBAE"/>
+    <w:lvl w:ilvl="0">
+      <w:start w:val="1"/>
+      <w:numFmt w:val="decimal"/>
+      <w:lvlText w:val="%1."/>
+      <w:lvlJc w:val="left"/>
+      <w:pPr>
+        <w:tabs>
+          <w:tab w:val="num" w:pos="720"/>
+        </w:tabs>
+        <w:ind w:left="720" w:hanging="360"/>
+      </w:pPr>
+    </w:lvl>
+    <w:lvl w:ilvl="1" w:tentative="1">
+      <w:start w:val="1"/>
+      <w:numFmt w:val="decimal"/>
+      <w:lvlText w:val="%2."/>
+      <w:lvlJc w:val="left"/>
+      <w:pPr>
+        <w:tabs>
+          <w:tab w:val="num" w:pos="1440"/>
+        </w:tabs>
+        <w:ind w:left="1440" w:hanging="360"/>
+      </w:pPr>
+    </w:lvl>
+    <w:lvl w:ilvl="2" w:tentative="1">
+      <w:start w:val="1"/>
+      <w:numFmt w:val="decimal"/>
+      <w:lvlText w:val="%3."/>
+      <w:lvlJc w:val="left"/>
+      <w:pPr>
+        <w:tabs>
+          <w:tab w:val="num" w:pos="2160"/>
+        </w:tabs>
+        <w:ind w:left="2160" w:hanging="360"/>
+      </w:pPr>
+    </w:lvl>
+    <w:lvl w:ilvl="3" w:tentative="1">
+      <w:start w:val="1"/>
+      <w:numFmt w:val="decimal"/>
+      <w:lvlText w:val="%4."/>
+      <w:lvlJc w:val="left"/>
+      <w:pPr>
+        <w:tabs>
+          <w:tab w:val="num" w:pos="2880"/>
+        </w:tabs>
+        <w:ind w:left="2880" w:hanging="360"/>
+      </w:pPr>
+    </w:lvl>
+    <w:lvl w:ilvl="4" w:tentative="1">
+      <w:start w:val="1"/>
+      <w:numFmt w:val="decimal"/>
+      <w:lvlText w:val="%5."/>
+      <w:lvlJc w:val="left"/>
+      <w:pPr>
+        <w:tabs>
+          <w:tab w:val="num" w:pos="3600"/>
+        </w:tabs>
+        <w:ind w:left="3600" w:hanging="360"/>
+      </w:pPr>
+    </w:lvl>
+    <w:lvl w:ilvl="5" w:tentative="1">
+      <w:start w:val="1"/>
+      <w:numFmt w:val="decimal"/>
+      <w:lvlText w:val="%6."/>
+      <w:lvlJc w:val="left"/>
+      <w:pPr>
+        <w:tabs>
+          <w:tab w:val="num" w:pos="4320"/>
+        </w:tabs>
+        <w:ind w:left="4320" w:hanging="360"/>
+      </w:pPr>
+    </w:lvl>
+    <w:lvl w:ilvl="6" w:tentative="1">
+      <w:start w:val="1"/>
+      <w:numFmt w:val="decimal"/>
+      <w:lvlText w:val="%7."/>
+      <w:lvlJc w:val="left"/>
+      <w:pPr>
+        <w:tabs>
+          <w:tab w:val="num" w:pos="5040"/>
+        </w:tabs>
+        <w:ind w:left="5040" w:hanging="360"/>
+      </w:pPr>
+    </w:lvl>
+    <w:lvl w:ilvl="7" w:tentative="1">
+      <w:start w:val="1"/>
+      <w:numFmt w:val="decimal"/>
+      <w:lvlText w:val="%8."/>
+      <w:lvlJc w:val="left"/>
+      <w:pPr>
+        <w:tabs>
+          <w:tab w:val="num" w:pos="5760"/>
+        </w:tabs>
+        <w:ind w:left="5760" w:hanging="360"/>
+      </w:pPr>
+    </w:lvl>
+    <w:lvl w:ilvl="8" w:tentative="1">
+      <w:start w:val="1"/>
+      <w:numFmt w:val="decimal"/>
+      <w:lvlText w:val="%9."/>
+      <w:lvlJc w:val="left"/>
+      <w:pPr>
+        <w:tabs>
+          <w:tab w:val="num" w:pos="6480"/>
+        </w:tabs>
+        <w:ind w:left="6480" w:hanging="360"/>
+      </w:pPr>
+    </w:lvl>
+  </w:abstractNum>
+  <w:abstractNum w:abstractNumId="5" w15:restartNumberingAfterBreak="0">
+    <w:nsid w:val="42057050"/>
+    <w:multiLevelType w:val="multilevel"/>
+    <w:tmpl w:val="1972A814"/>
+    <w:lvl w:ilvl="0">
+      <w:start w:val="1"/>
+      <w:numFmt w:val="decimal"/>
+      <w:lvlText w:val="%1."/>
+      <w:lvlJc w:val="left"/>
+      <w:pPr>
+        <w:tabs>
+          <w:tab w:val="num" w:pos="720"/>
+        </w:tabs>
+        <w:ind w:left="720" w:hanging="360"/>
+      </w:pPr>
+    </w:lvl>
+    <w:lvl w:ilvl="1" w:tentative="1">
+      <w:start w:val="1"/>
+      <w:numFmt w:val="decimal"/>
+      <w:lvlText w:val="%2."/>
+      <w:lvlJc w:val="left"/>
+      <w:pPr>
+        <w:tabs>
+          <w:tab w:val="num" w:pos="1440"/>
+        </w:tabs>
+        <w:ind w:left="1440" w:hanging="360"/>
+      </w:pPr>
+    </w:lvl>
+    <w:lvl w:ilvl="2" w:tentative="1">
+      <w:start w:val="1"/>
+      <w:numFmt w:val="decimal"/>
+      <w:lvlText w:val="%3."/>
+      <w:lvlJc w:val="left"/>
+      <w:pPr>
+        <w:tabs>
+          <w:tab w:val="num" w:pos="2160"/>
+        </w:tabs>
+        <w:ind w:left="2160" w:hanging="360"/>
+      </w:pPr>
+    </w:lvl>
+    <w:lvl w:ilvl="3" w:tentative="1">
+      <w:start w:val="1"/>
+      <w:numFmt w:val="decimal"/>
+      <w:lvlText w:val="%4."/>
+      <w:lvlJc w:val="left"/>
+      <w:pPr>
+        <w:tabs>
+          <w:tab w:val="num" w:pos="2880"/>
+        </w:tabs>
+        <w:ind w:left="2880" w:hanging="360"/>
+      </w:pPr>
+    </w:lvl>
+    <w:lvl w:ilvl="4" w:tentative="1">
+      <w:start w:val="1"/>
+      <w:numFmt w:val="decimal"/>
+      <w:lvlText w:val="%5."/>
+      <w:lvlJc w:val="left"/>
+      <w:pPr>
+        <w:tabs>
+          <w:tab w:val="num" w:pos="3600"/>
+        </w:tabs>
+        <w:ind w:left="3600" w:hanging="360"/>
+      </w:pPr>
+    </w:lvl>
+    <w:lvl w:ilvl="5" w:tentative="1">
+      <w:start w:val="1"/>
+      <w:numFmt w:val="decimal"/>
+      <w:lvlText w:val="%6."/>
+      <w:lvlJc w:val="left"/>
+      <w:pPr>
+        <w:tabs>
+          <w:tab w:val="num" w:pos="4320"/>
+        </w:tabs>
+        <w:ind w:left="4320" w:hanging="360"/>
+      </w:pPr>
+    </w:lvl>
+    <w:lvl w:ilvl="6" w:tentative="1">
+      <w:start w:val="1"/>
+      <w:numFmt w:val="decimal"/>
+      <w:lvlText w:val="%7."/>
+      <w:lvlJc w:val="left"/>
+      <w:pPr>
+        <w:tabs>
+          <w:tab w:val="num" w:pos="5040"/>
+        </w:tabs>
+        <w:ind w:left="5040" w:hanging="360"/>
+      </w:pPr>
+    </w:lvl>
+    <w:lvl w:ilvl="7" w:tentative="1">
+      <w:start w:val="1"/>
+      <w:numFmt w:val="decimal"/>
+      <w:lvlText w:val="%8."/>
+      <w:lvlJc w:val="left"/>
+      <w:pPr>
+        <w:tabs>
+          <w:tab w:val="num" w:pos="5760"/>
+        </w:tabs>
+        <w:ind w:left="5760" w:hanging="360"/>
+      </w:pPr>
+    </w:lvl>
+    <w:lvl w:ilvl="8" w:tentative="1">
+      <w:start w:val="1"/>
+      <w:numFmt w:val="decimal"/>
+      <w:lvlText w:val="%9."/>
+      <w:lvlJc w:val="left"/>
+      <w:pPr>
+        <w:tabs>
+          <w:tab w:val="num" w:pos="6480"/>
+        </w:tabs>
+        <w:ind w:left="6480" w:hanging="360"/>
+      </w:pPr>
+    </w:lvl>
+  </w:abstractNum>
+  <w:abstractNum w:abstractNumId="6" w15:restartNumberingAfterBreak="0">
+    <w:nsid w:val="4A75279D"/>
+    <w:multiLevelType w:val="multilevel"/>
+    <w:tmpl w:val="D17AE19A"/>
+    <w:lvl w:ilvl="0">
+      <w:start w:val="1"/>
+      <w:numFmt w:val="decimal"/>
+      <w:lvlText w:val="%1."/>
+      <w:lvlJc w:val="left"/>
+      <w:pPr>
+        <w:tabs>
+          <w:tab w:val="num" w:pos="720"/>
+        </w:tabs>
+        <w:ind w:left="720" w:hanging="360"/>
+      </w:pPr>
+    </w:lvl>
+    <w:lvl w:ilvl="1" w:tentative="1">
+      <w:start w:val="1"/>
+      <w:numFmt w:val="decimal"/>
+      <w:lvlText w:val="%2."/>
+      <w:lvlJc w:val="left"/>
+      <w:pPr>
+        <w:tabs>
+          <w:tab w:val="num" w:pos="1440"/>
+        </w:tabs>
+        <w:ind w:left="1440" w:hanging="360"/>
+      </w:pPr>
+    </w:lvl>
+    <w:lvl w:ilvl="2" w:tentative="1">
+      <w:start w:val="1"/>
+      <w:numFmt w:val="decimal"/>
+      <w:lvlText w:val="%3."/>
+      <w:lvlJc w:val="left"/>
+      <w:pPr>
+        <w:tabs>
+          <w:tab w:val="num" w:pos="2160"/>
+        </w:tabs>
+        <w:ind w:left="2160" w:hanging="360"/>
+      </w:pPr>
+    </w:lvl>
+    <w:lvl w:ilvl="3" w:tentative="1">
+      <w:start w:val="1"/>
+      <w:numFmt w:val="decimal"/>
+      <w:lvlText w:val="%4."/>
+      <w:lvlJc w:val="left"/>
+      <w:pPr>
+        <w:tabs>
+          <w:tab w:val="num" w:pos="2880"/>
+        </w:tabs>
+        <w:ind w:left="2880" w:hanging="360"/>
+      </w:pPr>
+    </w:lvl>
+    <w:lvl w:ilvl="4" w:tentative="1">
+      <w:start w:val="1"/>
+      <w:numFmt w:val="decimal"/>
+      <w:lvlText w:val="%5."/>
+      <w:lvlJc w:val="left"/>
+      <w:pPr>
+        <w:tabs>
+          <w:tab w:val="num" w:pos="3600"/>
+        </w:tabs>
+        <w:ind w:left="3600" w:hanging="360"/>
+      </w:pPr>
+    </w:lvl>
+    <w:lvl w:ilvl="5" w:tentative="1">
+      <w:start w:val="1"/>
+      <w:numFmt w:val="decimal"/>
+      <w:lvlText w:val="%6."/>
+      <w:lvlJc w:val="left"/>
+      <w:pPr>
+        <w:tabs>
+          <w:tab w:val="num" w:pos="4320"/>
+        </w:tabs>
+        <w:ind w:left="4320" w:hanging="360"/>
+      </w:pPr>
+    </w:lvl>
+    <w:lvl w:ilvl="6" w:tentative="1">
+      <w:start w:val="1"/>
+      <w:numFmt w:val="decimal"/>
+      <w:lvlText w:val="%7."/>
+      <w:lvlJc w:val="left"/>
+      <w:pPr>
+        <w:tabs>
+          <w:tab w:val="num" w:pos="5040"/>
+        </w:tabs>
+        <w:ind w:left="5040" w:hanging="360"/>
+      </w:pPr>
+    </w:lvl>
+    <w:lvl w:ilvl="7" w:tentative="1">
+      <w:start w:val="1"/>
+      <w:numFmt w:val="decimal"/>
+      <w:lvlText w:val="%8."/>
+      <w:lvlJc w:val="left"/>
+      <w:pPr>
+        <w:tabs>
+          <w:tab w:val="num" w:pos="5760"/>
+        </w:tabs>
+        <w:ind w:left="5760" w:hanging="360"/>
+      </w:pPr>
+    </w:lvl>
+    <w:lvl w:ilvl="8" w:tentative="1">
+      <w:start w:val="1"/>
+      <w:numFmt w:val="decimal"/>
+      <w:lvlText w:val="%9."/>
+      <w:lvlJc w:val="left"/>
+      <w:pPr>
+        <w:tabs>
+          <w:tab w:val="num" w:pos="6480"/>
+        </w:tabs>
+        <w:ind w:left="6480" w:hanging="360"/>
+      </w:pPr>
+    </w:lvl>
+  </w:abstractNum>
   <w:abstractNum w:abstractNumId="7" w15:restartNumberingAfterBreak="0">
-    <w:nsid w:val="7C5F1452"/>
+    <w:nsid w:val="723F2EDA"/>
     <w:multiLevelType w:val="multilevel"/>
-    <w:tmpl w:val="90883A08"/>
+    <w:tmpl w:val="4936062E"/>
     <w:lvl w:ilvl="0">
       <w:start w:val="1"/>
       <w:numFmt w:val="bullet"/>
@@ -3939,29 +4192,181 @@
       </w:rPr>
     </w:lvl>
   </w:abstractNum>
-  <w:num w:numId="1" w16cid:durableId="1505516511">
+  <w:abstractNum w:abstractNumId="8" w15:restartNumberingAfterBreak="0">
+    <w:nsid w:val="73EC650E"/>
+    <w:multiLevelType w:val="multilevel"/>
+    <w:tmpl w:val="1B10A096"/>
+    <w:lvl w:ilvl="0">
+      <w:start w:val="1"/>
+      <w:numFmt w:val="bullet"/>
+      <w:lvlText w:val=""/>
+      <w:lvlJc w:val="left"/>
+      <w:pPr>
+        <w:tabs>
+          <w:tab w:val="num" w:pos="720"/>
+        </w:tabs>
+        <w:ind w:left="720" w:hanging="360"/>
+      </w:pPr>
+      <w:rPr>
+        <w:rFonts w:ascii="Symbol" w:hAnsi="Symbol" w:hint="default"/>
+        <w:sz w:val="20"/>
+      </w:rPr>
+    </w:lvl>
+    <w:lvl w:ilvl="1" w:tentative="1">
+      <w:start w:val="1"/>
+      <w:numFmt w:val="bullet"/>
+      <w:lvlText w:val="o"/>
+      <w:lvlJc w:val="left"/>
+      <w:pPr>
+        <w:tabs>
+          <w:tab w:val="num" w:pos="1440"/>
+        </w:tabs>
+        <w:ind w:left="1440" w:hanging="360"/>
+      </w:pPr>
+      <w:rPr>
+        <w:rFonts w:ascii="Courier New" w:hAnsi="Courier New" w:hint="default"/>
+        <w:sz w:val="20"/>
+      </w:rPr>
+    </w:lvl>
+    <w:lvl w:ilvl="2" w:tentative="1">
+      <w:start w:val="1"/>
+      <w:numFmt w:val="bullet"/>
+      <w:lvlText w:val=""/>
+      <w:lvlJc w:val="left"/>
+      <w:pPr>
+        <w:tabs>
+          <w:tab w:val="num" w:pos="2160"/>
+        </w:tabs>
+        <w:ind w:left="2160" w:hanging="360"/>
+      </w:pPr>
+      <w:rPr>
+        <w:rFonts w:ascii="Wingdings" w:hAnsi="Wingdings" w:hint="default"/>
+        <w:sz w:val="20"/>
+      </w:rPr>
+    </w:lvl>
+    <w:lvl w:ilvl="3" w:tentative="1">
+      <w:start w:val="1"/>
+      <w:numFmt w:val="bullet"/>
+      <w:lvlText w:val=""/>
+      <w:lvlJc w:val="left"/>
+      <w:pPr>
+        <w:tabs>
+          <w:tab w:val="num" w:pos="2880"/>
+        </w:tabs>
+        <w:ind w:left="2880" w:hanging="360"/>
+      </w:pPr>
+      <w:rPr>
+        <w:rFonts w:ascii="Wingdings" w:hAnsi="Wingdings" w:hint="default"/>
+        <w:sz w:val="20"/>
+      </w:rPr>
+    </w:lvl>
+    <w:lvl w:ilvl="4" w:tentative="1">
+      <w:start w:val="1"/>
+      <w:numFmt w:val="bullet"/>
+      <w:lvlText w:val=""/>
+      <w:lvlJc w:val="left"/>
+      <w:pPr>
+        <w:tabs>
+          <w:tab w:val="num" w:pos="3600"/>
+        </w:tabs>
+        <w:ind w:left="3600" w:hanging="360"/>
+      </w:pPr>
+      <w:rPr>
+        <w:rFonts w:ascii="Wingdings" w:hAnsi="Wingdings" w:hint="default"/>
+        <w:sz w:val="20"/>
+      </w:rPr>
+    </w:lvl>
+    <w:lvl w:ilvl="5" w:tentative="1">
+      <w:start w:val="1"/>
+      <w:numFmt w:val="bullet"/>
+      <w:lvlText w:val=""/>
+      <w:lvlJc w:val="left"/>
+      <w:pPr>
+        <w:tabs>
+          <w:tab w:val="num" w:pos="4320"/>
+        </w:tabs>
+        <w:ind w:left="4320" w:hanging="360"/>
+      </w:pPr>
+      <w:rPr>
+        <w:rFonts w:ascii="Wingdings" w:hAnsi="Wingdings" w:hint="default"/>
+        <w:sz w:val="20"/>
+      </w:rPr>
+    </w:lvl>
+    <w:lvl w:ilvl="6" w:tentative="1">
+      <w:start w:val="1"/>
+      <w:numFmt w:val="bullet"/>
+      <w:lvlText w:val=""/>
+      <w:lvlJc w:val="left"/>
+      <w:pPr>
+        <w:tabs>
+          <w:tab w:val="num" w:pos="5040"/>
+        </w:tabs>
+        <w:ind w:left="5040" w:hanging="360"/>
+      </w:pPr>
+      <w:rPr>
+        <w:rFonts w:ascii="Wingdings" w:hAnsi="Wingdings" w:hint="default"/>
+        <w:sz w:val="20"/>
+      </w:rPr>
+    </w:lvl>
+    <w:lvl w:ilvl="7" w:tentative="1">
+      <w:start w:val="1"/>
+      <w:numFmt w:val="bullet"/>
+      <w:lvlText w:val=""/>
+      <w:lvlJc w:val="left"/>
+      <w:pPr>
+        <w:tabs>
+          <w:tab w:val="num" w:pos="5760"/>
+        </w:tabs>
+        <w:ind w:left="5760" w:hanging="360"/>
+      </w:pPr>
+      <w:rPr>
+        <w:rFonts w:ascii="Wingdings" w:hAnsi="Wingdings" w:hint="default"/>
+        <w:sz w:val="20"/>
+      </w:rPr>
+    </w:lvl>
+    <w:lvl w:ilvl="8" w:tentative="1">
+      <w:start w:val="1"/>
+      <w:numFmt w:val="bullet"/>
+      <w:lvlText w:val=""/>
+      <w:lvlJc w:val="left"/>
+      <w:pPr>
+        <w:tabs>
+          <w:tab w:val="num" w:pos="6480"/>
+        </w:tabs>
+        <w:ind w:left="6480" w:hanging="360"/>
+      </w:pPr>
+      <w:rPr>
+        <w:rFonts w:ascii="Wingdings" w:hAnsi="Wingdings" w:hint="default"/>
+        <w:sz w:val="20"/>
+      </w:rPr>
+    </w:lvl>
+  </w:abstractNum>
+  <w:num w:numId="1" w16cid:durableId="50471628">
+    <w:abstractNumId w:val="3"/>
+  </w:num>
+  <w:num w:numId="2" w16cid:durableId="392391051">
+    <w:abstractNumId w:val="4"/>
+  </w:num>
+  <w:num w:numId="3" w16cid:durableId="627664924">
+    <w:abstractNumId w:val="6"/>
+  </w:num>
+  <w:num w:numId="4" w16cid:durableId="1477644032">
+    <w:abstractNumId w:val="5"/>
+  </w:num>
+  <w:num w:numId="5" w16cid:durableId="258370203">
     <w:abstractNumId w:val="2"/>
   </w:num>
-  <w:num w:numId="2" w16cid:durableId="15355381">
-    <w:abstractNumId w:val="4"/>
-  </w:num>
-  <w:num w:numId="3" w16cid:durableId="1307398488">
+  <w:num w:numId="6" w16cid:durableId="516038067">
     <w:abstractNumId w:val="0"/>
   </w:num>
-  <w:num w:numId="4" w16cid:durableId="1559587323">
-    <w:abstractNumId w:val="5"/>
-  </w:num>
-  <w:num w:numId="5" w16cid:durableId="1937983131">
+  <w:num w:numId="7" w16cid:durableId="1806044436">
     <w:abstractNumId w:val="1"/>
   </w:num>
-  <w:num w:numId="6" w16cid:durableId="1278636913">
-    <w:abstractNumId w:val="6"/>
+  <w:num w:numId="8" w16cid:durableId="495460970">
+    <w:abstractNumId w:val="8"/>
   </w:num>
-  <w:num w:numId="7" w16cid:durableId="1272590720">
+  <w:num w:numId="9" w16cid:durableId="1236011574">
     <w:abstractNumId w:val="7"/>
-  </w:num>
-  <w:num w:numId="8" w16cid:durableId="1052850967">
-    <w:abstractNumId w:val="3"/>
   </w:num>
 </w:numbering>
 </file>

</xml_diff>

<commit_message>
Add User Accounts page for Admins (plain layout)
- UserAdminService: list/search/filter, create (username rules, unique
  ignoring case, first-password rules), edit, unlock, disable, enable.
  Guards: Admin only; no self-disable or self-demotion; last active Admin
  protected; asks before a second active person at the same
  department + level. Every change in audit_logs without passwords.
- UserAccountsPage (full name typed for now; employee link comes with
  HR & Payroll), loaded by MainForm.
- 23 checks passed against the real database (last-admin guard not yet
  tested: needs a separate test database).
- Guides: Developer Guide chapter 12, User Manual User Accounts, UI guide.

Co-Authored-By: Claude Opus 5.5 <noreply@anthropic.com>
</commit_message>
<xml_diff>
--- a/docs/User Manual.docx
+++ b/docs/User Manual.docx
@@ -2618,7 +2618,7 @@
           <w:rFonts w:ascii="Calibri" w:eastAsia="Times New Roman" w:hAnsi="Calibri" w:cs="Calibri"/>
         </w:rPr>
         <w:lastRenderedPageBreak/>
-        <w:t>"Still there?"</w:t>
+        <w:t>For Admins: User Accounts</w:t>
       </w:r>
     </w:p>
     <w:p>
@@ -2638,45 +2638,47 @@
           <w:sz w:val="22"/>
           <w:szCs w:val="22"/>
         </w:rPr>
-        <w:t xml:space="preserve">If you don't touch the keyboard or mouse for </w:t>
-      </w:r>
-      <w:r>
-        <w:rPr>
-          <w:rStyle w:val="Strong"/>
-          <w:rFonts w:ascii="Calibri" w:hAnsi="Calibri" w:cs="Calibri"/>
-          <w:color w:val="1A1A1A"/>
-          <w:sz w:val="22"/>
-          <w:szCs w:val="22"/>
-        </w:rPr>
-        <w:t>5 minutes</w:t>
-      </w:r>
-      <w:r>
-        <w:rPr>
-          <w:rFonts w:ascii="Calibri" w:hAnsi="Calibri" w:cs="Calibri"/>
-          <w:color w:val="1A1A1A"/>
-          <w:sz w:val="22"/>
-          <w:szCs w:val="22"/>
-        </w:rPr>
-        <w:t xml:space="preserve">, a </w:t>
-      </w:r>
-      <w:r>
-        <w:rPr>
-          <w:rStyle w:val="Emphasis"/>
-          <w:rFonts w:ascii="Calibri" w:hAnsi="Calibri" w:cs="Calibri"/>
-          <w:color w:val="1A1A1A"/>
-          <w:sz w:val="22"/>
-          <w:szCs w:val="22"/>
-        </w:rPr>
-        <w:t>"Still there?"</w:t>
-      </w:r>
-      <w:r>
-        <w:rPr>
-          <w:rFonts w:ascii="Calibri" w:hAnsi="Calibri" w:cs="Calibri"/>
-          <w:color w:val="1A1A1A"/>
-          <w:sz w:val="22"/>
-          <w:szCs w:val="22"/>
-        </w:rPr>
-        <w:t xml:space="preserve"> message appears with a 60-second countdown.</w:t>
+        <w:t xml:space="preserve">Click </w:t>
+      </w:r>
+      <w:r>
+        <w:rPr>
+          <w:rStyle w:val="Strong"/>
+          <w:rFonts w:ascii="Calibri" w:hAnsi="Calibri" w:cs="Calibri"/>
+          <w:color w:val="1A1A1A"/>
+          <w:sz w:val="22"/>
+          <w:szCs w:val="22"/>
+        </w:rPr>
+        <w:t>User Accounts</w:t>
+      </w:r>
+      <w:r>
+        <w:rPr>
+          <w:rFonts w:ascii="Calibri" w:hAnsi="Calibri" w:cs="Calibri"/>
+          <w:color w:val="1A1A1A"/>
+          <w:sz w:val="22"/>
+          <w:szCs w:val="22"/>
+        </w:rPr>
+        <w:t xml:space="preserve"> in the sidebar.</w:t>
+      </w:r>
+    </w:p>
+    <w:p>
+      <w:pPr>
+        <w:pStyle w:val="NormalWeb"/>
+        <w:rPr>
+          <w:rFonts w:ascii="Calibri" w:hAnsi="Calibri" w:cs="Calibri"/>
+          <w:color w:val="1A1A1A"/>
+          <w:sz w:val="22"/>
+          <w:szCs w:val="22"/>
+        </w:rPr>
+      </w:pPr>
+      <w:r>
+        <w:rPr>
+          <w:rStyle w:val="Strong"/>
+          <w:rFonts w:ascii="Calibri" w:hAnsi="Calibri" w:cs="Calibri"/>
+          <w:color w:val="1A1A1A"/>
+          <w:sz w:val="22"/>
+          <w:szCs w:val="22"/>
+        </w:rPr>
+        <w:t>Make a new account</w:t>
       </w:r>
     </w:p>
     <w:p>
@@ -2710,16 +2712,16 @@
           <w:sz w:val="22"/>
           <w:szCs w:val="22"/>
         </w:rPr>
-        <w:t>Stay Signed In</w:t>
-      </w:r>
-      <w:r>
-        <w:rPr>
-          <w:rFonts w:ascii="Calibri" w:eastAsia="Times New Roman" w:hAnsi="Calibri" w:cs="Calibri"/>
-          <w:color w:val="1A1A1A"/>
-          <w:sz w:val="22"/>
-          <w:szCs w:val="22"/>
-        </w:rPr>
-        <w:t xml:space="preserve"> to keep working.</w:t>
+        <w:t>Create Account</w:t>
+      </w:r>
+      <w:r>
+        <w:rPr>
+          <w:rFonts w:ascii="Calibri" w:eastAsia="Times New Roman" w:hAnsi="Calibri" w:cs="Calibri"/>
+          <w:color w:val="1A1A1A"/>
+          <w:sz w:val="22"/>
+          <w:szCs w:val="22"/>
+        </w:rPr>
+        <w:t>.</w:t>
       </w:r>
     </w:p>
     <w:p>
@@ -2743,26 +2745,45 @@
           <w:sz w:val="22"/>
           <w:szCs w:val="22"/>
         </w:rPr>
-        <w:t xml:space="preserve">Click </w:t>
-      </w:r>
-      <w:r>
-        <w:rPr>
-          <w:rStyle w:val="Strong"/>
-          <w:rFonts w:ascii="Calibri" w:eastAsia="Times New Roman" w:hAnsi="Calibri" w:cs="Calibri"/>
-          <w:color w:val="1A1A1A"/>
-          <w:sz w:val="22"/>
-          <w:szCs w:val="22"/>
-        </w:rPr>
-        <w:t>Sign Out</w:t>
-      </w:r>
-      <w:r>
-        <w:rPr>
-          <w:rFonts w:ascii="Calibri" w:eastAsia="Times New Roman" w:hAnsi="Calibri" w:cs="Calibri"/>
-          <w:color w:val="1A1A1A"/>
-          <w:sz w:val="22"/>
-          <w:szCs w:val="22"/>
-        </w:rPr>
-        <w:t xml:space="preserve"> to sign out now.</w:t>
+        <w:t xml:space="preserve">Type the person's </w:t>
+      </w:r>
+      <w:r>
+        <w:rPr>
+          <w:rStyle w:val="Strong"/>
+          <w:rFonts w:ascii="Calibri" w:eastAsia="Times New Roman" w:hAnsi="Calibri" w:cs="Calibri"/>
+          <w:color w:val="1A1A1A"/>
+          <w:sz w:val="22"/>
+          <w:szCs w:val="22"/>
+        </w:rPr>
+        <w:t>full name</w:t>
+      </w:r>
+      <w:r>
+        <w:rPr>
+          <w:rFonts w:ascii="Calibri" w:eastAsia="Times New Roman" w:hAnsi="Calibri" w:cs="Calibri"/>
+          <w:color w:val="1A1A1A"/>
+          <w:sz w:val="22"/>
+          <w:szCs w:val="22"/>
+        </w:rPr>
+        <w:t xml:space="preserve"> and a </w:t>
+      </w:r>
+      <w:r>
+        <w:rPr>
+          <w:rStyle w:val="Strong"/>
+          <w:rFonts w:ascii="Calibri" w:eastAsia="Times New Roman" w:hAnsi="Calibri" w:cs="Calibri"/>
+          <w:color w:val="1A1A1A"/>
+          <w:sz w:val="22"/>
+          <w:szCs w:val="22"/>
+        </w:rPr>
+        <w:t>username</w:t>
+      </w:r>
+      <w:r>
+        <w:rPr>
+          <w:rFonts w:ascii="Calibri" w:eastAsia="Times New Roman" w:hAnsi="Calibri" w:cs="Calibri"/>
+          <w:color w:val="1A1A1A"/>
+          <w:sz w:val="22"/>
+          <w:szCs w:val="22"/>
+        </w:rPr>
+        <w:t xml:space="preserve"> (letters, numbers, dots, dashes or underscores; no spaces).</w:t>
       </w:r>
     </w:p>
     <w:p>
@@ -2786,7 +2807,690 @@
           <w:sz w:val="22"/>
           <w:szCs w:val="22"/>
         </w:rPr>
-        <w:t>If nobody answers, the app signs out by itself, and the Sign In window says why.</w:t>
+        <w:t xml:space="preserve">Type a first password, or click </w:t>
+      </w:r>
+      <w:r>
+        <w:rPr>
+          <w:rStyle w:val="Strong"/>
+          <w:rFonts w:ascii="Calibri" w:eastAsia="Times New Roman" w:hAnsi="Calibri" w:cs="Calibri"/>
+          <w:color w:val="1A1A1A"/>
+          <w:sz w:val="22"/>
+          <w:szCs w:val="22"/>
+        </w:rPr>
+        <w:t>Generate</w:t>
+      </w:r>
+      <w:r>
+        <w:rPr>
+          <w:rFonts w:ascii="Calibri" w:eastAsia="Times New Roman" w:hAnsi="Calibri" w:cs="Calibri"/>
+          <w:color w:val="1A1A1A"/>
+          <w:sz w:val="22"/>
+          <w:szCs w:val="22"/>
+        </w:rPr>
+        <w:t>.</w:t>
+      </w:r>
+    </w:p>
+    <w:p>
+      <w:pPr>
+        <w:numPr>
+          <w:ilvl w:val="0"/>
+          <w:numId w:val="8"/>
+        </w:numPr>
+        <w:spacing w:before="100" w:beforeAutospacing="1" w:after="100" w:afterAutospacing="1"/>
+        <w:rPr>
+          <w:rFonts w:ascii="Calibri" w:eastAsia="Times New Roman" w:hAnsi="Calibri" w:cs="Calibri"/>
+          <w:color w:val="1A1A1A"/>
+          <w:sz w:val="22"/>
+          <w:szCs w:val="22"/>
+        </w:rPr>
+      </w:pPr>
+      <w:r>
+        <w:rPr>
+          <w:rFonts w:ascii="Calibri" w:eastAsia="Times New Roman" w:hAnsi="Calibri" w:cs="Calibri"/>
+          <w:color w:val="1A1A1A"/>
+          <w:sz w:val="22"/>
+          <w:szCs w:val="22"/>
+        </w:rPr>
+        <w:t xml:space="preserve">Choose the </w:t>
+      </w:r>
+      <w:r>
+        <w:rPr>
+          <w:rStyle w:val="Strong"/>
+          <w:rFonts w:ascii="Calibri" w:eastAsia="Times New Roman" w:hAnsi="Calibri" w:cs="Calibri"/>
+          <w:color w:val="1A1A1A"/>
+          <w:sz w:val="22"/>
+          <w:szCs w:val="22"/>
+        </w:rPr>
+        <w:t>Level</w:t>
+      </w:r>
+      <w:r>
+        <w:rPr>
+          <w:rFonts w:ascii="Calibri" w:eastAsia="Times New Roman" w:hAnsi="Calibri" w:cs="Calibri"/>
+          <w:color w:val="1A1A1A"/>
+          <w:sz w:val="22"/>
+          <w:szCs w:val="22"/>
+        </w:rPr>
+        <w:t xml:space="preserve">. For Supervisors and Employees, also choose the </w:t>
+      </w:r>
+      <w:r>
+        <w:rPr>
+          <w:rStyle w:val="Strong"/>
+          <w:rFonts w:ascii="Calibri" w:eastAsia="Times New Roman" w:hAnsi="Calibri" w:cs="Calibri"/>
+          <w:color w:val="1A1A1A"/>
+          <w:sz w:val="22"/>
+          <w:szCs w:val="22"/>
+        </w:rPr>
+        <w:t>Department</w:t>
+      </w:r>
+      <w:r>
+        <w:rPr>
+          <w:rFonts w:ascii="Calibri" w:eastAsia="Times New Roman" w:hAnsi="Calibri" w:cs="Calibri"/>
+          <w:color w:val="1A1A1A"/>
+          <w:sz w:val="22"/>
+          <w:szCs w:val="22"/>
+        </w:rPr>
+        <w:t>. Admins have no department.</w:t>
+      </w:r>
+    </w:p>
+    <w:p>
+      <w:pPr>
+        <w:numPr>
+          <w:ilvl w:val="0"/>
+          <w:numId w:val="8"/>
+        </w:numPr>
+        <w:spacing w:before="100" w:beforeAutospacing="1" w:after="100" w:afterAutospacing="1"/>
+        <w:rPr>
+          <w:rFonts w:ascii="Calibri" w:eastAsia="Times New Roman" w:hAnsi="Calibri" w:cs="Calibri"/>
+          <w:color w:val="1A1A1A"/>
+          <w:sz w:val="22"/>
+          <w:szCs w:val="22"/>
+        </w:rPr>
+      </w:pPr>
+      <w:r>
+        <w:rPr>
+          <w:rFonts w:ascii="Calibri" w:eastAsia="Times New Roman" w:hAnsi="Calibri" w:cs="Calibri"/>
+          <w:color w:val="1A1A1A"/>
+          <w:sz w:val="22"/>
+          <w:szCs w:val="22"/>
+        </w:rPr>
+        <w:t xml:space="preserve">Click </w:t>
+      </w:r>
+      <w:r>
+        <w:rPr>
+          <w:rStyle w:val="Strong"/>
+          <w:rFonts w:ascii="Calibri" w:eastAsia="Times New Roman" w:hAnsi="Calibri" w:cs="Calibri"/>
+          <w:color w:val="1A1A1A"/>
+          <w:sz w:val="22"/>
+          <w:szCs w:val="22"/>
+        </w:rPr>
+        <w:t>Save</w:t>
+      </w:r>
+      <w:r>
+        <w:rPr>
+          <w:rFonts w:ascii="Calibri" w:eastAsia="Times New Roman" w:hAnsi="Calibri" w:cs="Calibri"/>
+          <w:color w:val="1A1A1A"/>
+          <w:sz w:val="22"/>
+          <w:szCs w:val="22"/>
+        </w:rPr>
+        <w:t>. Give the username and password to the person in person.</w:t>
+      </w:r>
+    </w:p>
+    <w:p>
+      <w:pPr>
+        <w:pStyle w:val="NormalWeb"/>
+        <w:rPr>
+          <w:rFonts w:ascii="Calibri" w:hAnsi="Calibri" w:cs="Calibri"/>
+          <w:color w:val="1A1A1A"/>
+          <w:sz w:val="22"/>
+          <w:szCs w:val="22"/>
+        </w:rPr>
+      </w:pPr>
+      <w:r>
+        <w:rPr>
+          <w:rFonts w:ascii="Calibri" w:hAnsi="Calibri" w:cs="Calibri"/>
+          <w:color w:val="1A1A1A"/>
+          <w:sz w:val="22"/>
+          <w:szCs w:val="22"/>
+        </w:rPr>
+        <w:t>If the department already has an active person at that level (the plan is 1 Employee and 1 Supervisor per department), the app asks before saving.</w:t>
+      </w:r>
+    </w:p>
+    <w:p>
+      <w:pPr>
+        <w:pStyle w:val="NormalWeb"/>
+        <w:rPr>
+          <w:rFonts w:ascii="Calibri" w:hAnsi="Calibri" w:cs="Calibri"/>
+          <w:color w:val="1A1A1A"/>
+          <w:sz w:val="22"/>
+          <w:szCs w:val="22"/>
+        </w:rPr>
+      </w:pPr>
+      <w:r>
+        <w:rPr>
+          <w:rStyle w:val="Strong"/>
+          <w:rFonts w:ascii="Calibri" w:hAnsi="Calibri" w:cs="Calibri"/>
+          <w:color w:val="1A1A1A"/>
+          <w:sz w:val="22"/>
+          <w:szCs w:val="22"/>
+        </w:rPr>
+        <w:t>Change an account:</w:t>
+      </w:r>
+      <w:r>
+        <w:rPr>
+          <w:rFonts w:ascii="Calibri" w:hAnsi="Calibri" w:cs="Calibri"/>
+          <w:color w:val="1A1A1A"/>
+          <w:sz w:val="22"/>
+          <w:szCs w:val="22"/>
+        </w:rPr>
+        <w:t xml:space="preserve"> click it in the list, change the name, username, level or department, and click </w:t>
+      </w:r>
+      <w:r>
+        <w:rPr>
+          <w:rStyle w:val="Strong"/>
+          <w:rFonts w:ascii="Calibri" w:hAnsi="Calibri" w:cs="Calibri"/>
+          <w:color w:val="1A1A1A"/>
+          <w:sz w:val="22"/>
+          <w:szCs w:val="22"/>
+        </w:rPr>
+        <w:t>Save</w:t>
+      </w:r>
+      <w:r>
+        <w:rPr>
+          <w:rFonts w:ascii="Calibri" w:hAnsi="Calibri" w:cs="Calibri"/>
+          <w:color w:val="1A1A1A"/>
+          <w:sz w:val="22"/>
+          <w:szCs w:val="22"/>
+        </w:rPr>
+        <w:t xml:space="preserve">. To change the password, use </w:t>
+      </w:r>
+      <w:r>
+        <w:rPr>
+          <w:rStyle w:val="Strong"/>
+          <w:rFonts w:ascii="Calibri" w:hAnsi="Calibri" w:cs="Calibri"/>
+          <w:color w:val="1A1A1A"/>
+          <w:sz w:val="22"/>
+          <w:szCs w:val="22"/>
+        </w:rPr>
+        <w:t>Set New Password</w:t>
+      </w:r>
+      <w:r>
+        <w:rPr>
+          <w:rFonts w:ascii="Calibri" w:hAnsi="Calibri" w:cs="Calibri"/>
+          <w:color w:val="1A1A1A"/>
+          <w:sz w:val="22"/>
+          <w:szCs w:val="22"/>
+        </w:rPr>
+        <w:t>.</w:t>
+      </w:r>
+    </w:p>
+    <w:p>
+      <w:pPr>
+        <w:pStyle w:val="NormalWeb"/>
+        <w:rPr>
+          <w:rFonts w:ascii="Calibri" w:hAnsi="Calibri" w:cs="Calibri"/>
+          <w:color w:val="1A1A1A"/>
+          <w:sz w:val="22"/>
+          <w:szCs w:val="22"/>
+        </w:rPr>
+      </w:pPr>
+      <w:r>
+        <w:rPr>
+          <w:rStyle w:val="Strong"/>
+          <w:rFonts w:ascii="Calibri" w:hAnsi="Calibri" w:cs="Calibri"/>
+          <w:color w:val="1A1A1A"/>
+          <w:sz w:val="22"/>
+          <w:szCs w:val="22"/>
+        </w:rPr>
+        <w:t>Other buttons</w:t>
+      </w:r>
+      <w:r>
+        <w:rPr>
+          <w:rFonts w:ascii="Calibri" w:hAnsi="Calibri" w:cs="Calibri"/>
+          <w:color w:val="1A1A1A"/>
+          <w:sz w:val="22"/>
+          <w:szCs w:val="22"/>
+        </w:rPr>
+        <w:t xml:space="preserve"> (click the account first):</w:t>
+      </w:r>
+    </w:p>
+    <w:tbl>
+      <w:tblPr>
+        <w:tblW w:w="0" w:type="auto"/>
+        <w:tblCellMar>
+          <w:top w:w="15" w:type="dxa"/>
+          <w:left w:w="15" w:type="dxa"/>
+          <w:bottom w:w="15" w:type="dxa"/>
+          <w:right w:w="15" w:type="dxa"/>
+        </w:tblCellMar>
+        <w:tblLook w:val="04A0" w:firstRow="1" w:lastRow="0" w:firstColumn="1" w:lastColumn="0" w:noHBand="0" w:noVBand="1"/>
+      </w:tblPr>
+      <w:tblGrid>
+        <w:gridCol w:w="1890"/>
+        <w:gridCol w:w="6750"/>
+      </w:tblGrid>
+      <w:tr>
+        <w:trPr>
+          <w:tblHeader/>
+        </w:trPr>
+        <w:tc>
+          <w:tcPr>
+            <w:tcW w:w="0" w:type="auto"/>
+            <w:tcBorders>
+              <w:top w:val="single" w:sz="6" w:space="0" w:color="BFBFBF"/>
+              <w:left w:val="single" w:sz="6" w:space="0" w:color="BFBFBF"/>
+              <w:bottom w:val="single" w:sz="6" w:space="0" w:color="BFBFBF"/>
+              <w:right w:val="single" w:sz="6" w:space="0" w:color="BFBFBF"/>
+            </w:tcBorders>
+            <w:shd w:val="clear" w:color="auto" w:fill="1F3864"/>
+            <w:tcMar>
+              <w:top w:w="60" w:type="dxa"/>
+              <w:left w:w="120" w:type="dxa"/>
+              <w:bottom w:w="60" w:type="dxa"/>
+              <w:right w:w="120" w:type="dxa"/>
+            </w:tcMar>
+            <w:vAlign w:val="center"/>
+            <w:hideMark/>
+          </w:tcPr>
+          <w:p>
+            <w:pPr>
+              <w:spacing w:before="120" w:after="120"/>
+              <w:rPr>
+                <w:rFonts w:ascii="Calibri" w:eastAsia="Times New Roman" w:hAnsi="Calibri" w:cs="Calibri"/>
+                <w:b/>
+                <w:bCs/>
+                <w:color w:val="FFFFFF"/>
+                <w:sz w:val="22"/>
+                <w:szCs w:val="22"/>
+              </w:rPr>
+            </w:pPr>
+            <w:r>
+              <w:rPr>
+                <w:rFonts w:ascii="Calibri" w:eastAsia="Times New Roman" w:hAnsi="Calibri" w:cs="Calibri"/>
+                <w:b/>
+                <w:bCs/>
+                <w:color w:val="FFFFFF"/>
+                <w:sz w:val="22"/>
+                <w:szCs w:val="22"/>
+              </w:rPr>
+              <w:t>Button</w:t>
+            </w:r>
+          </w:p>
+        </w:tc>
+        <w:tc>
+          <w:tcPr>
+            <w:tcW w:w="0" w:type="auto"/>
+            <w:tcBorders>
+              <w:top w:val="single" w:sz="6" w:space="0" w:color="BFBFBF"/>
+              <w:left w:val="single" w:sz="6" w:space="0" w:color="BFBFBF"/>
+              <w:bottom w:val="single" w:sz="6" w:space="0" w:color="BFBFBF"/>
+              <w:right w:val="single" w:sz="6" w:space="0" w:color="BFBFBF"/>
+            </w:tcBorders>
+            <w:shd w:val="clear" w:color="auto" w:fill="1F3864"/>
+            <w:tcMar>
+              <w:top w:w="60" w:type="dxa"/>
+              <w:left w:w="120" w:type="dxa"/>
+              <w:bottom w:w="60" w:type="dxa"/>
+              <w:right w:w="120" w:type="dxa"/>
+            </w:tcMar>
+            <w:vAlign w:val="center"/>
+            <w:hideMark/>
+          </w:tcPr>
+          <w:p>
+            <w:pPr>
+              <w:spacing w:before="120" w:after="120"/>
+              <w:rPr>
+                <w:rFonts w:ascii="Calibri" w:eastAsia="Times New Roman" w:hAnsi="Calibri" w:cs="Calibri"/>
+                <w:b/>
+                <w:bCs/>
+                <w:color w:val="FFFFFF"/>
+                <w:sz w:val="22"/>
+                <w:szCs w:val="22"/>
+              </w:rPr>
+            </w:pPr>
+            <w:r>
+              <w:rPr>
+                <w:rFonts w:ascii="Calibri" w:eastAsia="Times New Roman" w:hAnsi="Calibri" w:cs="Calibri"/>
+                <w:b/>
+                <w:bCs/>
+                <w:color w:val="FFFFFF"/>
+                <w:sz w:val="22"/>
+                <w:szCs w:val="22"/>
+              </w:rPr>
+              <w:t>Does</w:t>
+            </w:r>
+          </w:p>
+        </w:tc>
+      </w:tr>
+      <w:tr>
+        <w:tc>
+          <w:tcPr>
+            <w:tcW w:w="0" w:type="auto"/>
+            <w:tcBorders>
+              <w:top w:val="single" w:sz="6" w:space="0" w:color="BFBFBF"/>
+              <w:left w:val="single" w:sz="6" w:space="0" w:color="BFBFBF"/>
+              <w:bottom w:val="single" w:sz="6" w:space="0" w:color="BFBFBF"/>
+              <w:right w:val="single" w:sz="6" w:space="0" w:color="BFBFBF"/>
+            </w:tcBorders>
+            <w:tcMar>
+              <w:top w:w="60" w:type="dxa"/>
+              <w:left w:w="120" w:type="dxa"/>
+              <w:bottom w:w="60" w:type="dxa"/>
+              <w:right w:w="120" w:type="dxa"/>
+            </w:tcMar>
+            <w:hideMark/>
+          </w:tcPr>
+          <w:p>
+            <w:pPr>
+              <w:spacing w:before="120" w:after="120"/>
+              <w:rPr>
+                <w:rFonts w:ascii="Calibri" w:eastAsia="Times New Roman" w:hAnsi="Calibri" w:cs="Calibri"/>
+                <w:color w:val="1A1A1A"/>
+                <w:sz w:val="22"/>
+                <w:szCs w:val="22"/>
+              </w:rPr>
+            </w:pPr>
+            <w:r>
+              <w:rPr>
+                <w:rFonts w:ascii="Calibri" w:eastAsia="Times New Roman" w:hAnsi="Calibri" w:cs="Calibri"/>
+                <w:color w:val="1A1A1A"/>
+                <w:sz w:val="22"/>
+                <w:szCs w:val="22"/>
+              </w:rPr>
+              <w:t>Set New Password</w:t>
+            </w:r>
+          </w:p>
+        </w:tc>
+        <w:tc>
+          <w:tcPr>
+            <w:tcW w:w="0" w:type="auto"/>
+            <w:tcBorders>
+              <w:top w:val="single" w:sz="6" w:space="0" w:color="BFBFBF"/>
+              <w:left w:val="single" w:sz="6" w:space="0" w:color="BFBFBF"/>
+              <w:bottom w:val="single" w:sz="6" w:space="0" w:color="BFBFBF"/>
+              <w:right w:val="single" w:sz="6" w:space="0" w:color="BFBFBF"/>
+            </w:tcBorders>
+            <w:tcMar>
+              <w:top w:w="60" w:type="dxa"/>
+              <w:left w:w="120" w:type="dxa"/>
+              <w:bottom w:w="60" w:type="dxa"/>
+              <w:right w:w="120" w:type="dxa"/>
+            </w:tcMar>
+            <w:hideMark/>
+          </w:tcPr>
+          <w:p>
+            <w:pPr>
+              <w:spacing w:before="120" w:after="120"/>
+              <w:rPr>
+                <w:rFonts w:ascii="Calibri" w:eastAsia="Times New Roman" w:hAnsi="Calibri" w:cs="Calibri"/>
+                <w:color w:val="1A1A1A"/>
+                <w:sz w:val="22"/>
+                <w:szCs w:val="22"/>
+              </w:rPr>
+            </w:pPr>
+            <w:r>
+              <w:rPr>
+                <w:rFonts w:ascii="Calibri" w:eastAsia="Times New Roman" w:hAnsi="Calibri" w:cs="Calibri"/>
+                <w:color w:val="1A1A1A"/>
+                <w:sz w:val="22"/>
+                <w:szCs w:val="22"/>
+              </w:rPr>
+              <w:t>Gives the person a new password (also unlocks it)</w:t>
+            </w:r>
+          </w:p>
+        </w:tc>
+      </w:tr>
+      <w:tr>
+        <w:tc>
+          <w:tcPr>
+            <w:tcW w:w="0" w:type="auto"/>
+            <w:tcBorders>
+              <w:top w:val="single" w:sz="6" w:space="0" w:color="BFBFBF"/>
+              <w:left w:val="single" w:sz="6" w:space="0" w:color="BFBFBF"/>
+              <w:bottom w:val="single" w:sz="6" w:space="0" w:color="BFBFBF"/>
+              <w:right w:val="single" w:sz="6" w:space="0" w:color="BFBFBF"/>
+            </w:tcBorders>
+            <w:tcMar>
+              <w:top w:w="60" w:type="dxa"/>
+              <w:left w:w="120" w:type="dxa"/>
+              <w:bottom w:w="60" w:type="dxa"/>
+              <w:right w:w="120" w:type="dxa"/>
+            </w:tcMar>
+            <w:hideMark/>
+          </w:tcPr>
+          <w:p>
+            <w:pPr>
+              <w:spacing w:before="120" w:after="120"/>
+              <w:rPr>
+                <w:rFonts w:ascii="Calibri" w:eastAsia="Times New Roman" w:hAnsi="Calibri" w:cs="Calibri"/>
+                <w:color w:val="1A1A1A"/>
+                <w:sz w:val="22"/>
+                <w:szCs w:val="22"/>
+              </w:rPr>
+            </w:pPr>
+            <w:r>
+              <w:rPr>
+                <w:rFonts w:ascii="Calibri" w:eastAsia="Times New Roman" w:hAnsi="Calibri" w:cs="Calibri"/>
+                <w:color w:val="1A1A1A"/>
+                <w:sz w:val="22"/>
+                <w:szCs w:val="22"/>
+              </w:rPr>
+              <w:t>Unlock</w:t>
+            </w:r>
+          </w:p>
+        </w:tc>
+        <w:tc>
+          <w:tcPr>
+            <w:tcW w:w="0" w:type="auto"/>
+            <w:tcBorders>
+              <w:top w:val="single" w:sz="6" w:space="0" w:color="BFBFBF"/>
+              <w:left w:val="single" w:sz="6" w:space="0" w:color="BFBFBF"/>
+              <w:bottom w:val="single" w:sz="6" w:space="0" w:color="BFBFBF"/>
+              <w:right w:val="single" w:sz="6" w:space="0" w:color="BFBFBF"/>
+            </w:tcBorders>
+            <w:tcMar>
+              <w:top w:w="60" w:type="dxa"/>
+              <w:left w:w="120" w:type="dxa"/>
+              <w:bottom w:w="60" w:type="dxa"/>
+              <w:right w:w="120" w:type="dxa"/>
+            </w:tcMar>
+            <w:hideMark/>
+          </w:tcPr>
+          <w:p>
+            <w:pPr>
+              <w:spacing w:before="120" w:after="120"/>
+              <w:rPr>
+                <w:rFonts w:ascii="Calibri" w:eastAsia="Times New Roman" w:hAnsi="Calibri" w:cs="Calibri"/>
+                <w:color w:val="1A1A1A"/>
+                <w:sz w:val="22"/>
+                <w:szCs w:val="22"/>
+              </w:rPr>
+            </w:pPr>
+            <w:r>
+              <w:rPr>
+                <w:rFonts w:ascii="Calibri" w:eastAsia="Times New Roman" w:hAnsi="Calibri" w:cs="Calibri"/>
+                <w:color w:val="1A1A1A"/>
+                <w:sz w:val="22"/>
+                <w:szCs w:val="22"/>
+              </w:rPr>
+              <w:t>For accounts locked after 5 wrong passwords</w:t>
+            </w:r>
+          </w:p>
+        </w:tc>
+      </w:tr>
+      <w:tr>
+        <w:tc>
+          <w:tcPr>
+            <w:tcW w:w="0" w:type="auto"/>
+            <w:tcBorders>
+              <w:top w:val="single" w:sz="6" w:space="0" w:color="BFBFBF"/>
+              <w:left w:val="single" w:sz="6" w:space="0" w:color="BFBFBF"/>
+              <w:bottom w:val="single" w:sz="6" w:space="0" w:color="BFBFBF"/>
+              <w:right w:val="single" w:sz="6" w:space="0" w:color="BFBFBF"/>
+            </w:tcBorders>
+            <w:tcMar>
+              <w:top w:w="60" w:type="dxa"/>
+              <w:left w:w="120" w:type="dxa"/>
+              <w:bottom w:w="60" w:type="dxa"/>
+              <w:right w:w="120" w:type="dxa"/>
+            </w:tcMar>
+            <w:hideMark/>
+          </w:tcPr>
+          <w:p>
+            <w:pPr>
+              <w:spacing w:before="120" w:after="120"/>
+              <w:rPr>
+                <w:rFonts w:ascii="Calibri" w:eastAsia="Times New Roman" w:hAnsi="Calibri" w:cs="Calibri"/>
+                <w:color w:val="1A1A1A"/>
+                <w:sz w:val="22"/>
+                <w:szCs w:val="22"/>
+              </w:rPr>
+            </w:pPr>
+            <w:r>
+              <w:rPr>
+                <w:rFonts w:ascii="Calibri" w:eastAsia="Times New Roman" w:hAnsi="Calibri" w:cs="Calibri"/>
+                <w:color w:val="1A1A1A"/>
+                <w:sz w:val="22"/>
+                <w:szCs w:val="22"/>
+              </w:rPr>
+              <w:t>Disable</w:t>
+            </w:r>
+          </w:p>
+        </w:tc>
+        <w:tc>
+          <w:tcPr>
+            <w:tcW w:w="0" w:type="auto"/>
+            <w:tcBorders>
+              <w:top w:val="single" w:sz="6" w:space="0" w:color="BFBFBF"/>
+              <w:left w:val="single" w:sz="6" w:space="0" w:color="BFBFBF"/>
+              <w:bottom w:val="single" w:sz="6" w:space="0" w:color="BFBFBF"/>
+              <w:right w:val="single" w:sz="6" w:space="0" w:color="BFBFBF"/>
+            </w:tcBorders>
+            <w:tcMar>
+              <w:top w:w="60" w:type="dxa"/>
+              <w:left w:w="120" w:type="dxa"/>
+              <w:bottom w:w="60" w:type="dxa"/>
+              <w:right w:w="120" w:type="dxa"/>
+            </w:tcMar>
+            <w:hideMark/>
+          </w:tcPr>
+          <w:p>
+            <w:pPr>
+              <w:spacing w:before="120" w:after="120"/>
+              <w:rPr>
+                <w:rFonts w:ascii="Calibri" w:eastAsia="Times New Roman" w:hAnsi="Calibri" w:cs="Calibri"/>
+                <w:color w:val="1A1A1A"/>
+                <w:sz w:val="22"/>
+                <w:szCs w:val="22"/>
+              </w:rPr>
+            </w:pPr>
+            <w:r>
+              <w:rPr>
+                <w:rFonts w:ascii="Calibri" w:eastAsia="Times New Roman" w:hAnsi="Calibri" w:cs="Calibri"/>
+                <w:color w:val="1A1A1A"/>
+                <w:sz w:val="22"/>
+                <w:szCs w:val="22"/>
+              </w:rPr>
+              <w:t>Turns the account off, e.g. when someone leaves. Their records are kept.</w:t>
+            </w:r>
+          </w:p>
+        </w:tc>
+      </w:tr>
+      <w:tr>
+        <w:tc>
+          <w:tcPr>
+            <w:tcW w:w="0" w:type="auto"/>
+            <w:tcBorders>
+              <w:top w:val="single" w:sz="6" w:space="0" w:color="BFBFBF"/>
+              <w:left w:val="single" w:sz="6" w:space="0" w:color="BFBFBF"/>
+              <w:bottom w:val="single" w:sz="6" w:space="0" w:color="BFBFBF"/>
+              <w:right w:val="single" w:sz="6" w:space="0" w:color="BFBFBF"/>
+            </w:tcBorders>
+            <w:tcMar>
+              <w:top w:w="60" w:type="dxa"/>
+              <w:left w:w="120" w:type="dxa"/>
+              <w:bottom w:w="60" w:type="dxa"/>
+              <w:right w:w="120" w:type="dxa"/>
+            </w:tcMar>
+            <w:hideMark/>
+          </w:tcPr>
+          <w:p>
+            <w:pPr>
+              <w:spacing w:before="120" w:after="120"/>
+              <w:rPr>
+                <w:rFonts w:ascii="Calibri" w:eastAsia="Times New Roman" w:hAnsi="Calibri" w:cs="Calibri"/>
+                <w:color w:val="1A1A1A"/>
+                <w:sz w:val="22"/>
+                <w:szCs w:val="22"/>
+              </w:rPr>
+            </w:pPr>
+            <w:r>
+              <w:rPr>
+                <w:rFonts w:ascii="Calibri" w:eastAsia="Times New Roman" w:hAnsi="Calibri" w:cs="Calibri"/>
+                <w:color w:val="1A1A1A"/>
+                <w:sz w:val="22"/>
+                <w:szCs w:val="22"/>
+              </w:rPr>
+              <w:t>Enable</w:t>
+            </w:r>
+          </w:p>
+        </w:tc>
+        <w:tc>
+          <w:tcPr>
+            <w:tcW w:w="0" w:type="auto"/>
+            <w:tcBorders>
+              <w:top w:val="single" w:sz="6" w:space="0" w:color="BFBFBF"/>
+              <w:left w:val="single" w:sz="6" w:space="0" w:color="BFBFBF"/>
+              <w:bottom w:val="single" w:sz="6" w:space="0" w:color="BFBFBF"/>
+              <w:right w:val="single" w:sz="6" w:space="0" w:color="BFBFBF"/>
+            </w:tcBorders>
+            <w:tcMar>
+              <w:top w:w="60" w:type="dxa"/>
+              <w:left w:w="120" w:type="dxa"/>
+              <w:bottom w:w="60" w:type="dxa"/>
+              <w:right w:w="120" w:type="dxa"/>
+            </w:tcMar>
+            <w:hideMark/>
+          </w:tcPr>
+          <w:p>
+            <w:pPr>
+              <w:spacing w:before="120" w:after="120"/>
+              <w:rPr>
+                <w:rFonts w:ascii="Calibri" w:eastAsia="Times New Roman" w:hAnsi="Calibri" w:cs="Calibri"/>
+                <w:color w:val="1A1A1A"/>
+                <w:sz w:val="22"/>
+                <w:szCs w:val="22"/>
+              </w:rPr>
+            </w:pPr>
+            <w:r>
+              <w:rPr>
+                <w:rFonts w:ascii="Calibri" w:eastAsia="Times New Roman" w:hAnsi="Calibri" w:cs="Calibri"/>
+                <w:color w:val="1A1A1A"/>
+                <w:sz w:val="22"/>
+                <w:szCs w:val="22"/>
+              </w:rPr>
+              <w:t>Turns a disabled account back on</w:t>
+            </w:r>
+          </w:p>
+        </w:tc>
+      </w:tr>
+    </w:tbl>
+    <w:p>
+      <w:pPr>
+        <w:pStyle w:val="NormalWeb"/>
+        <w:rPr>
+          <w:rFonts w:ascii="Calibri" w:hAnsi="Calibri" w:cs="Calibri"/>
+          <w:color w:val="1A1A1A"/>
+          <w:sz w:val="22"/>
+          <w:szCs w:val="22"/>
+        </w:rPr>
+      </w:pPr>
+      <w:r>
+        <w:rPr>
+          <w:rFonts w:ascii="Calibri" w:hAnsi="Calibri" w:cs="Calibri"/>
+          <w:color w:val="1A1A1A"/>
+          <w:sz w:val="22"/>
+          <w:szCs w:val="22"/>
+        </w:rPr>
+        <w:t>You can't disable your own account, and the last active Admin can't be disabled or changed to another level.</w:t>
       </w:r>
     </w:p>
     <w:p>
@@ -2800,7 +3504,74 @@
         <w:rPr>
           <w:rFonts w:ascii="Calibri" w:eastAsia="Times New Roman" w:hAnsi="Calibri" w:cs="Calibri"/>
         </w:rPr>
-        <w:t>Rules</w:t>
+        <w:t>"Still there?"</w:t>
+      </w:r>
+    </w:p>
+    <w:p>
+      <w:pPr>
+        <w:pStyle w:val="NormalWeb"/>
+        <w:rPr>
+          <w:rFonts w:ascii="Calibri" w:hAnsi="Calibri" w:cs="Calibri"/>
+          <w:color w:val="1A1A1A"/>
+          <w:sz w:val="22"/>
+          <w:szCs w:val="22"/>
+        </w:rPr>
+      </w:pPr>
+      <w:r>
+        <w:rPr>
+          <w:rFonts w:ascii="Calibri" w:hAnsi="Calibri" w:cs="Calibri"/>
+          <w:color w:val="1A1A1A"/>
+          <w:sz w:val="22"/>
+          <w:szCs w:val="22"/>
+        </w:rPr>
+        <w:t xml:space="preserve">If you don't touch the keyboard or mouse for </w:t>
+      </w:r>
+      <w:r>
+        <w:rPr>
+          <w:rStyle w:val="Strong"/>
+          <w:rFonts w:ascii="Calibri" w:hAnsi="Calibri" w:cs="Calibri"/>
+          <w:color w:val="1A1A1A"/>
+          <w:sz w:val="22"/>
+          <w:szCs w:val="22"/>
+        </w:rPr>
+        <w:t>5 minutes</w:t>
+      </w:r>
+      <w:r>
+        <w:rPr>
+          <w:rFonts w:ascii="Calibri" w:hAnsi="Calibri" w:cs="Calibri"/>
+          <w:color w:val="1A1A1A"/>
+          <w:sz w:val="22"/>
+          <w:szCs w:val="22"/>
+        </w:rPr>
+        <w:t xml:space="preserve">, a </w:t>
+      </w:r>
+      <w:r>
+        <w:rPr>
+          <w:rStyle w:val="Emphasis"/>
+          <w:rFonts w:ascii="Calibri" w:hAnsi="Calibri" w:cs="Calibri"/>
+          <w:color w:val="1A1A1A"/>
+          <w:sz w:val="22"/>
+          <w:szCs w:val="22"/>
+        </w:rPr>
+        <w:t>"Still there?"</w:t>
+      </w:r>
+      <w:r>
+        <w:rPr>
+          <w:rFonts w:ascii="Calibri" w:hAnsi="Calibri" w:cs="Calibri"/>
+          <w:color w:val="1A1A1A"/>
+          <w:sz w:val="22"/>
+          <w:szCs w:val="22"/>
+        </w:rPr>
+        <w:t xml:space="preserve"> </w:t>
+      </w:r>
+      <w:r>
+        <w:rPr>
+          <w:rFonts w:ascii="Calibri" w:hAnsi="Calibri" w:cs="Calibri"/>
+          <w:color w:val="1A1A1A"/>
+          <w:sz w:val="22"/>
+          <w:szCs w:val="22"/>
+        </w:rPr>
+        <w:t>message appears with a 60-second countdown.</w:t>
       </w:r>
     </w:p>
     <w:p>
@@ -2819,22 +3590,31 @@
       </w:pPr>
       <w:r>
         <w:rPr>
-          <w:rStyle w:val="Strong"/>
-          <w:rFonts w:ascii="Calibri" w:eastAsia="Times New Roman" w:hAnsi="Calibri" w:cs="Calibri"/>
-          <w:color w:val="1A1A1A"/>
-          <w:sz w:val="22"/>
-          <w:szCs w:val="22"/>
-        </w:rPr>
-        <w:t>One sign in</w:t>
-      </w:r>
-      <w:r>
-        <w:rPr>
-          <w:rFonts w:ascii="Calibri" w:eastAsia="Times New Roman" w:hAnsi="Calibri" w:cs="Calibri"/>
-          <w:color w:val="1A1A1A"/>
-          <w:sz w:val="22"/>
-          <w:szCs w:val="22"/>
-        </w:rPr>
-        <w:t xml:space="preserve"> for the whole app.</w:t>
+          <w:rFonts w:ascii="Calibri" w:eastAsia="Times New Roman" w:hAnsi="Calibri" w:cs="Calibri"/>
+          <w:color w:val="1A1A1A"/>
+          <w:sz w:val="22"/>
+          <w:szCs w:val="22"/>
+        </w:rPr>
+        <w:t xml:space="preserve">Click </w:t>
+      </w:r>
+      <w:r>
+        <w:rPr>
+          <w:rStyle w:val="Strong"/>
+          <w:rFonts w:ascii="Calibri" w:eastAsia="Times New Roman" w:hAnsi="Calibri" w:cs="Calibri"/>
+          <w:color w:val="1A1A1A"/>
+          <w:sz w:val="22"/>
+          <w:szCs w:val="22"/>
+        </w:rPr>
+        <w:t>Stay Signed In</w:t>
+      </w:r>
+      <w:r>
+        <w:rPr>
+          <w:rFonts w:ascii="Calibri" w:eastAsia="Times New Roman" w:hAnsi="Calibri" w:cs="Calibri"/>
+          <w:color w:val="1A1A1A"/>
+          <w:sz w:val="22"/>
+          <w:szCs w:val="22"/>
+        </w:rPr>
+        <w:t xml:space="preserve"> to keep working.</w:t>
       </w:r>
     </w:p>
     <w:p>
@@ -2853,22 +3633,31 @@
       </w:pPr>
       <w:r>
         <w:rPr>
-          <w:rStyle w:val="Strong"/>
-          <w:rFonts w:ascii="Calibri" w:eastAsia="Times New Roman" w:hAnsi="Calibri" w:cs="Calibri"/>
-          <w:color w:val="1A1A1A"/>
-          <w:sz w:val="22"/>
-          <w:szCs w:val="22"/>
-        </w:rPr>
-        <w:t>5 wrong passwords</w:t>
-      </w:r>
-      <w:r>
-        <w:rPr>
-          <w:rFonts w:ascii="Calibri" w:eastAsia="Times New Roman" w:hAnsi="Calibri" w:cs="Calibri"/>
-          <w:color w:val="1A1A1A"/>
-          <w:sz w:val="22"/>
-          <w:szCs w:val="22"/>
-        </w:rPr>
-        <w:t xml:space="preserve"> lock the account. Only an Admin can unlock it.</w:t>
+          <w:rFonts w:ascii="Calibri" w:eastAsia="Times New Roman" w:hAnsi="Calibri" w:cs="Calibri"/>
+          <w:color w:val="1A1A1A"/>
+          <w:sz w:val="22"/>
+          <w:szCs w:val="22"/>
+        </w:rPr>
+        <w:t xml:space="preserve">Click </w:t>
+      </w:r>
+      <w:r>
+        <w:rPr>
+          <w:rStyle w:val="Strong"/>
+          <w:rFonts w:ascii="Calibri" w:eastAsia="Times New Roman" w:hAnsi="Calibri" w:cs="Calibri"/>
+          <w:color w:val="1A1A1A"/>
+          <w:sz w:val="22"/>
+          <w:szCs w:val="22"/>
+        </w:rPr>
+        <w:t>Sign Out</w:t>
+      </w:r>
+      <w:r>
+        <w:rPr>
+          <w:rFonts w:ascii="Calibri" w:eastAsia="Times New Roman" w:hAnsi="Calibri" w:cs="Calibri"/>
+          <w:color w:val="1A1A1A"/>
+          <w:sz w:val="22"/>
+          <w:szCs w:val="22"/>
+        </w:rPr>
+        <w:t xml:space="preserve"> to sign out now.</w:t>
       </w:r>
     </w:p>
     <w:p>
@@ -2887,48 +3676,34 @@
       </w:pPr>
       <w:r>
         <w:rPr>
-          <w:rStyle w:val="Strong"/>
-          <w:rFonts w:ascii="Calibri" w:eastAsia="Times New Roman" w:hAnsi="Calibri" w:cs="Calibri"/>
-          <w:color w:val="1A1A1A"/>
-          <w:sz w:val="22"/>
-          <w:szCs w:val="22"/>
-        </w:rPr>
-        <w:t>Forgot your password?</w:t>
-      </w:r>
-      <w:r>
-        <w:rPr>
-          <w:rFonts w:ascii="Calibri" w:eastAsia="Times New Roman" w:hAnsi="Calibri" w:cs="Calibri"/>
-          <w:color w:val="1A1A1A"/>
-          <w:sz w:val="22"/>
-          <w:szCs w:val="22"/>
-        </w:rPr>
-        <w:t xml:space="preserve"> Click </w:t>
-      </w:r>
-      <w:r>
-        <w:rPr>
-          <w:rStyle w:val="Emphasis"/>
-          <w:rFonts w:ascii="Calibri" w:eastAsia="Times New Roman" w:hAnsi="Calibri" w:cs="Calibri"/>
-          <w:color w:val="1A1A1A"/>
-          <w:sz w:val="22"/>
-          <w:szCs w:val="22"/>
-        </w:rPr>
-        <w:t>Forgot Password</w:t>
-      </w:r>
-      <w:r>
-        <w:rPr>
-          <w:rFonts w:ascii="Calibri" w:eastAsia="Times New Roman" w:hAnsi="Calibri" w:cs="Calibri"/>
-          <w:color w:val="1A1A1A"/>
-          <w:sz w:val="22"/>
-          <w:szCs w:val="22"/>
-        </w:rPr>
-        <w:t xml:space="preserve"> and type your username. The Admins get a request and will give you a new password in person. (Admins use their security question instead.)</w:t>
+          <w:rFonts w:ascii="Calibri" w:eastAsia="Times New Roman" w:hAnsi="Calibri" w:cs="Calibri"/>
+          <w:color w:val="1A1A1A"/>
+          <w:sz w:val="22"/>
+          <w:szCs w:val="22"/>
+        </w:rPr>
+        <w:t>If nobody answers, the app signs out by itself, and the Sign In window says why.</w:t>
+      </w:r>
+    </w:p>
+    <w:p>
+      <w:pPr>
+        <w:pStyle w:val="Heading2"/>
+        <w:rPr>
+          <w:rFonts w:ascii="Calibri" w:eastAsia="Times New Roman" w:hAnsi="Calibri" w:cs="Calibri"/>
+        </w:rPr>
+      </w:pPr>
+      <w:r>
+        <w:rPr>
+          <w:rFonts w:ascii="Calibri" w:eastAsia="Times New Roman" w:hAnsi="Calibri" w:cs="Calibri"/>
+        </w:rPr>
+        <w:lastRenderedPageBreak/>
+        <w:t>Rules</w:t>
       </w:r>
     </w:p>
     <w:p>
       <w:pPr>
         <w:numPr>
           <w:ilvl w:val="0"/>
-          <w:numId w:val="9"/>
+          <w:numId w:val="10"/>
         </w:numPr>
         <w:spacing w:before="100" w:beforeAutospacing="1" w:after="100" w:afterAutospacing="1"/>
         <w:rPr>
@@ -2946,23 +3721,23 @@
           <w:sz w:val="22"/>
           <w:szCs w:val="22"/>
         </w:rPr>
-        <w:t>Only Admins change passwords.</w:t>
-      </w:r>
-      <w:r>
-        <w:rPr>
-          <w:rFonts w:ascii="Calibri" w:eastAsia="Times New Roman" w:hAnsi="Calibri" w:cs="Calibri"/>
-          <w:color w:val="1A1A1A"/>
-          <w:sz w:val="22"/>
-          <w:szCs w:val="22"/>
-        </w:rPr>
-        <w:t xml:space="preserve"> Employees and Supervisors can't change their own.</w:t>
+        <w:t>One sign in</w:t>
+      </w:r>
+      <w:r>
+        <w:rPr>
+          <w:rFonts w:ascii="Calibri" w:eastAsia="Times New Roman" w:hAnsi="Calibri" w:cs="Calibri"/>
+          <w:color w:val="1A1A1A"/>
+          <w:sz w:val="22"/>
+          <w:szCs w:val="22"/>
+        </w:rPr>
+        <w:t xml:space="preserve"> for the whole app.</w:t>
       </w:r>
     </w:p>
     <w:p>
       <w:pPr>
         <w:numPr>
           <w:ilvl w:val="0"/>
-          <w:numId w:val="9"/>
+          <w:numId w:val="10"/>
         </w:numPr>
         <w:spacing w:before="100" w:beforeAutospacing="1" w:after="100" w:afterAutospacing="1"/>
         <w:rPr>
@@ -2980,6 +3755,136 @@
           <w:sz w:val="22"/>
           <w:szCs w:val="22"/>
         </w:rPr>
+        <w:t>5 wrong passwords</w:t>
+      </w:r>
+      <w:r>
+        <w:rPr>
+          <w:rFonts w:ascii="Calibri" w:eastAsia="Times New Roman" w:hAnsi="Calibri" w:cs="Calibri"/>
+          <w:color w:val="1A1A1A"/>
+          <w:sz w:val="22"/>
+          <w:szCs w:val="22"/>
+        </w:rPr>
+        <w:t xml:space="preserve"> lock the account. Only an Admin can unlock it.</w:t>
+      </w:r>
+    </w:p>
+    <w:p>
+      <w:pPr>
+        <w:numPr>
+          <w:ilvl w:val="0"/>
+          <w:numId w:val="10"/>
+        </w:numPr>
+        <w:spacing w:before="100" w:beforeAutospacing="1" w:after="100" w:afterAutospacing="1"/>
+        <w:rPr>
+          <w:rFonts w:ascii="Calibri" w:eastAsia="Times New Roman" w:hAnsi="Calibri" w:cs="Calibri"/>
+          <w:color w:val="1A1A1A"/>
+          <w:sz w:val="22"/>
+          <w:szCs w:val="22"/>
+        </w:rPr>
+      </w:pPr>
+      <w:r>
+        <w:rPr>
+          <w:rStyle w:val="Strong"/>
+          <w:rFonts w:ascii="Calibri" w:eastAsia="Times New Roman" w:hAnsi="Calibri" w:cs="Calibri"/>
+          <w:color w:val="1A1A1A"/>
+          <w:sz w:val="22"/>
+          <w:szCs w:val="22"/>
+        </w:rPr>
+        <w:t>Forgot your password?</w:t>
+      </w:r>
+      <w:r>
+        <w:rPr>
+          <w:rFonts w:ascii="Calibri" w:eastAsia="Times New Roman" w:hAnsi="Calibri" w:cs="Calibri"/>
+          <w:color w:val="1A1A1A"/>
+          <w:sz w:val="22"/>
+          <w:szCs w:val="22"/>
+        </w:rPr>
+        <w:t xml:space="preserve"> Click </w:t>
+      </w:r>
+      <w:r>
+        <w:rPr>
+          <w:rStyle w:val="Emphasis"/>
+          <w:rFonts w:ascii="Calibri" w:eastAsia="Times New Roman" w:hAnsi="Calibri" w:cs="Calibri"/>
+          <w:color w:val="1A1A1A"/>
+          <w:sz w:val="22"/>
+          <w:szCs w:val="22"/>
+        </w:rPr>
+        <w:t>Forgot Password</w:t>
+      </w:r>
+      <w:r>
+        <w:rPr>
+          <w:rFonts w:ascii="Calibri" w:eastAsia="Times New Roman" w:hAnsi="Calibri" w:cs="Calibri"/>
+          <w:color w:val="1A1A1A"/>
+          <w:sz w:val="22"/>
+          <w:szCs w:val="22"/>
+        </w:rPr>
+        <w:t xml:space="preserve"> and type your username. The Admins get a request and will give you a new password in person. (Admins use their security question instead.)</w:t>
+      </w:r>
+    </w:p>
+    <w:p>
+      <w:pPr>
+        <w:numPr>
+          <w:ilvl w:val="0"/>
+          <w:numId w:val="10"/>
+        </w:numPr>
+        <w:spacing w:before="100" w:beforeAutospacing="1" w:after="100" w:afterAutospacing="1"/>
+        <w:rPr>
+          <w:rFonts w:ascii="Calibri" w:eastAsia="Times New Roman" w:hAnsi="Calibri" w:cs="Calibri"/>
+          <w:color w:val="1A1A1A"/>
+          <w:sz w:val="22"/>
+          <w:szCs w:val="22"/>
+        </w:rPr>
+      </w:pPr>
+      <w:r>
+        <w:rPr>
+          <w:rStyle w:val="Strong"/>
+          <w:rFonts w:ascii="Calibri" w:eastAsia="Times New Roman" w:hAnsi="Calibri" w:cs="Calibri"/>
+          <w:color w:val="1A1A1A"/>
+          <w:sz w:val="22"/>
+          <w:szCs w:val="22"/>
+        </w:rPr>
+        <w:t>Only Admins change passwords.</w:t>
+      </w:r>
+      <w:r>
+        <w:rPr>
+          <w:rFonts w:ascii="Calibri" w:eastAsia="Times New Roman" w:hAnsi="Calibri" w:cs="Calibri"/>
+          <w:color w:val="1A1A1A"/>
+          <w:sz w:val="22"/>
+          <w:szCs w:val="22"/>
+        </w:rPr>
+        <w:t xml:space="preserve"> </w:t>
+      </w:r>
+      <w:r>
+        <w:rPr>
+          <w:rFonts w:ascii="Calibri" w:eastAsia="Times New Roman" w:hAnsi="Calibri" w:cs="Calibri"/>
+          <w:color w:val="1A1A1A"/>
+          <w:sz w:val="22"/>
+          <w:szCs w:val="22"/>
+        </w:rPr>
+        <w:t>Employees and Supervisors can't change their own.</w:t>
+      </w:r>
+    </w:p>
+    <w:p>
+      <w:pPr>
+        <w:numPr>
+          <w:ilvl w:val="0"/>
+          <w:numId w:val="10"/>
+        </w:numPr>
+        <w:spacing w:before="100" w:beforeAutospacing="1" w:after="100" w:afterAutospacing="1"/>
+        <w:rPr>
+          <w:rFonts w:ascii="Calibri" w:eastAsia="Times New Roman" w:hAnsi="Calibri" w:cs="Calibri"/>
+          <w:color w:val="1A1A1A"/>
+          <w:sz w:val="22"/>
+          <w:szCs w:val="22"/>
+        </w:rPr>
+      </w:pPr>
+      <w:r>
+        <w:rPr>
+          <w:rStyle w:val="Strong"/>
+          <w:rFonts w:ascii="Calibri" w:eastAsia="Times New Roman" w:hAnsi="Calibri" w:cs="Calibri"/>
+          <w:color w:val="1A1A1A"/>
+          <w:sz w:val="22"/>
+          <w:szCs w:val="22"/>
+        </w:rPr>
         <w:t>Idle check:</w:t>
       </w:r>
       <w:r>
@@ -2999,17 +3904,7 @@
           <w:sz w:val="22"/>
           <w:szCs w:val="22"/>
         </w:rPr>
-        <w:t>"Still there?</w:t>
-      </w:r>
-      <w:r>
-        <w:rPr>
-          <w:rStyle w:val="Emphasis"/>
-          <w:rFonts w:ascii="Calibri" w:eastAsia="Times New Roman" w:hAnsi="Calibri" w:cs="Calibri"/>
-          <w:color w:val="1A1A1A"/>
-          <w:sz w:val="22"/>
-          <w:szCs w:val="22"/>
-        </w:rPr>
-        <w:t>"</w:t>
+        <w:t>"Still there?"</w:t>
       </w:r>
       <w:r>
         <w:rPr>
@@ -3181,9 +4076,122 @@
 <file path=word/numbering.xml><?xml version="1.0" encoding="utf-8"?>
 <w:numbering xmlns:wpc="http://schemas.microsoft.com/office/word/2010/wordprocessingCanvas" xmlns:cx="http://schemas.microsoft.com/office/drawing/2014/chartex" xmlns:cx1="http://schemas.microsoft.com/office/drawing/2015/9/8/chartex" xmlns:cx2="http://schemas.microsoft.com/office/drawing/2015/10/21/chartex" xmlns:cx3="http://schemas.microsoft.com/office/drawing/2016/5/9/chartex" xmlns:cx4="http://schemas.microsoft.com/office/drawing/2016/5/10/chartex" xmlns:cx5="http://schemas.microsoft.com/office/drawing/2016/5/11/chartex" xmlns:cx6="http://schemas.microsoft.com/office/drawing/2016/5/12/chartex" xmlns:cx7="http://schemas.microsoft.com/office/drawing/2016/5/13/chartex" xmlns:cx8="http://schemas.microsoft.com/office/drawing/2016/5/14/chartex" xmlns:mc="http://schemas.openxmlformats.org/markup-compatibility/2006" xmlns:aink="http://schemas.microsoft.com/office/drawing/2016/ink" xmlns:am3d="http://schemas.microsoft.com/office/drawing/2017/model3d" xmlns:o="urn:schemas-microsoft-com:office:office" xmlns:oel="http://schemas.microsoft.com/office/2019/extlst" xmlns:r="http://schemas.openxmlformats.org/officeDocument/2006/relationships" xmlns:m="http://schemas.openxmlformats.org/officeDocument/2006/math" xmlns:v="urn:schemas-microsoft-com:vml" xmlns:wp14="http://schemas.microsoft.com/office/word/2010/wordprocessingDrawing" xmlns:wp="http://schemas.openxmlformats.org/drawingml/2006/wordprocessingDrawing" xmlns:w10="urn:schemas-microsoft-com:office:word" xmlns:w="http://schemas.openxmlformats.org/wordprocessingml/2006/main" xmlns:w14="http://schemas.microsoft.com/office/word/2010/wordml" xmlns:w15="http://schemas.microsoft.com/office/word/2012/wordml" xmlns:w16cex="http://schemas.microsoft.com/office/word/2018/wordml/cex" xmlns:w16cid="http://schemas.microsoft.com/office/word/2016/wordml/cid" xmlns:w16="http://schemas.microsoft.com/office/word/2018/wordml" xmlns:w16du="http://schemas.microsoft.com/office/word/2023/wordml/word16du" xmlns:w16sdtdh="http://schemas.microsoft.com/office/word/2020/wordml/sdtdatahash" xmlns:w16sdtfl="http://schemas.microsoft.com/office/word/2024/wordml/sdtformatlock" xmlns:w16se="http://schemas.microsoft.com/office/word/2015/wordml/symex" xmlns:wpg="http://schemas.microsoft.com/office/word/2010/wordprocessingGroup" xmlns:wpi="http://schemas.microsoft.com/office/word/2010/wordprocessingInk" xmlns:wne="http://schemas.microsoft.com/office/word/2006/wordml" xmlns:wps="http://schemas.microsoft.com/office/word/2010/wordprocessingShape" mc:Ignorable="w14 w15 w16se w16cid w16 w16cex w16sdtdh w16sdtfl w16du wp14">
   <w:abstractNum w:abstractNumId="0" w15:restartNumberingAfterBreak="0">
-    <w:nsid w:val="0BE17B43"/>
+    <w:nsid w:val="04875B97"/>
     <w:multiLevelType w:val="multilevel"/>
-    <w:tmpl w:val="117E4DB2"/>
+    <w:tmpl w:val="F8B84320"/>
+    <w:lvl w:ilvl="0">
+      <w:start w:val="1"/>
+      <w:numFmt w:val="decimal"/>
+      <w:lvlText w:val="%1."/>
+      <w:lvlJc w:val="left"/>
+      <w:pPr>
+        <w:tabs>
+          <w:tab w:val="num" w:pos="720"/>
+        </w:tabs>
+        <w:ind w:left="720" w:hanging="360"/>
+      </w:pPr>
+    </w:lvl>
+    <w:lvl w:ilvl="1" w:tentative="1">
+      <w:start w:val="1"/>
+      <w:numFmt w:val="decimal"/>
+      <w:lvlText w:val="%2."/>
+      <w:lvlJc w:val="left"/>
+      <w:pPr>
+        <w:tabs>
+          <w:tab w:val="num" w:pos="1440"/>
+        </w:tabs>
+        <w:ind w:left="1440" w:hanging="360"/>
+      </w:pPr>
+    </w:lvl>
+    <w:lvl w:ilvl="2" w:tentative="1">
+      <w:start w:val="1"/>
+      <w:numFmt w:val="decimal"/>
+      <w:lvlText w:val="%3."/>
+      <w:lvlJc w:val="left"/>
+      <w:pPr>
+        <w:tabs>
+          <w:tab w:val="num" w:pos="2160"/>
+        </w:tabs>
+        <w:ind w:left="2160" w:hanging="360"/>
+      </w:pPr>
+    </w:lvl>
+    <w:lvl w:ilvl="3" w:tentative="1">
+      <w:start w:val="1"/>
+      <w:numFmt w:val="decimal"/>
+      <w:lvlText w:val="%4."/>
+      <w:lvlJc w:val="left"/>
+      <w:pPr>
+        <w:tabs>
+          <w:tab w:val="num" w:pos="2880"/>
+        </w:tabs>
+        <w:ind w:left="2880" w:hanging="360"/>
+      </w:pPr>
+    </w:lvl>
+    <w:lvl w:ilvl="4" w:tentative="1">
+      <w:start w:val="1"/>
+      <w:numFmt w:val="decimal"/>
+      <w:lvlText w:val="%5."/>
+      <w:lvlJc w:val="left"/>
+      <w:pPr>
+        <w:tabs>
+          <w:tab w:val="num" w:pos="3600"/>
+        </w:tabs>
+        <w:ind w:left="3600" w:hanging="360"/>
+      </w:pPr>
+    </w:lvl>
+    <w:lvl w:ilvl="5" w:tentative="1">
+      <w:start w:val="1"/>
+      <w:numFmt w:val="decimal"/>
+      <w:lvlText w:val="%6."/>
+      <w:lvlJc w:val="left"/>
+      <w:pPr>
+        <w:tabs>
+          <w:tab w:val="num" w:pos="4320"/>
+        </w:tabs>
+        <w:ind w:left="4320" w:hanging="360"/>
+      </w:pPr>
+    </w:lvl>
+    <w:lvl w:ilvl="6" w:tentative="1">
+      <w:start w:val="1"/>
+      <w:numFmt w:val="decimal"/>
+      <w:lvlText w:val="%7."/>
+      <w:lvlJc w:val="left"/>
+      <w:pPr>
+        <w:tabs>
+          <w:tab w:val="num" w:pos="5040"/>
+        </w:tabs>
+        <w:ind w:left="5040" w:hanging="360"/>
+      </w:pPr>
+    </w:lvl>
+    <w:lvl w:ilvl="7" w:tentative="1">
+      <w:start w:val="1"/>
+      <w:numFmt w:val="decimal"/>
+      <w:lvlText w:val="%8."/>
+      <w:lvlJc w:val="left"/>
+      <w:pPr>
+        <w:tabs>
+          <w:tab w:val="num" w:pos="5760"/>
+        </w:tabs>
+        <w:ind w:left="5760" w:hanging="360"/>
+      </w:pPr>
+    </w:lvl>
+    <w:lvl w:ilvl="8" w:tentative="1">
+      <w:start w:val="1"/>
+      <w:numFmt w:val="decimal"/>
+      <w:lvlText w:val="%9."/>
+      <w:lvlJc w:val="left"/>
+      <w:pPr>
+        <w:tabs>
+          <w:tab w:val="num" w:pos="6480"/>
+        </w:tabs>
+        <w:ind w:left="6480" w:hanging="360"/>
+      </w:pPr>
+    </w:lvl>
+  </w:abstractNum>
+  <w:abstractNum w:abstractNumId="1" w15:restartNumberingAfterBreak="0">
+    <w:nsid w:val="0EEF2933"/>
+    <w:multiLevelType w:val="multilevel"/>
+    <w:tmpl w:val="8CAC4B98"/>
     <w:lvl w:ilvl="0">
       <w:start w:val="1"/>
       <w:numFmt w:val="bullet"/>
@@ -3329,10 +4337,123 @@
       </w:rPr>
     </w:lvl>
   </w:abstractNum>
-  <w:abstractNum w:abstractNumId="1" w15:restartNumberingAfterBreak="0">
-    <w:nsid w:val="0F1F3E68"/>
+  <w:abstractNum w:abstractNumId="2" w15:restartNumberingAfterBreak="0">
+    <w:nsid w:val="17235F19"/>
     <w:multiLevelType w:val="multilevel"/>
-    <w:tmpl w:val="DFC6428E"/>
+    <w:tmpl w:val="0C2E8C96"/>
+    <w:lvl w:ilvl="0">
+      <w:start w:val="1"/>
+      <w:numFmt w:val="decimal"/>
+      <w:lvlText w:val="%1."/>
+      <w:lvlJc w:val="left"/>
+      <w:pPr>
+        <w:tabs>
+          <w:tab w:val="num" w:pos="720"/>
+        </w:tabs>
+        <w:ind w:left="720" w:hanging="360"/>
+      </w:pPr>
+    </w:lvl>
+    <w:lvl w:ilvl="1" w:tentative="1">
+      <w:start w:val="1"/>
+      <w:numFmt w:val="decimal"/>
+      <w:lvlText w:val="%2."/>
+      <w:lvlJc w:val="left"/>
+      <w:pPr>
+        <w:tabs>
+          <w:tab w:val="num" w:pos="1440"/>
+        </w:tabs>
+        <w:ind w:left="1440" w:hanging="360"/>
+      </w:pPr>
+    </w:lvl>
+    <w:lvl w:ilvl="2" w:tentative="1">
+      <w:start w:val="1"/>
+      <w:numFmt w:val="decimal"/>
+      <w:lvlText w:val="%3."/>
+      <w:lvlJc w:val="left"/>
+      <w:pPr>
+        <w:tabs>
+          <w:tab w:val="num" w:pos="2160"/>
+        </w:tabs>
+        <w:ind w:left="2160" w:hanging="360"/>
+      </w:pPr>
+    </w:lvl>
+    <w:lvl w:ilvl="3" w:tentative="1">
+      <w:start w:val="1"/>
+      <w:numFmt w:val="decimal"/>
+      <w:lvlText w:val="%4."/>
+      <w:lvlJc w:val="left"/>
+      <w:pPr>
+        <w:tabs>
+          <w:tab w:val="num" w:pos="2880"/>
+        </w:tabs>
+        <w:ind w:left="2880" w:hanging="360"/>
+      </w:pPr>
+    </w:lvl>
+    <w:lvl w:ilvl="4" w:tentative="1">
+      <w:start w:val="1"/>
+      <w:numFmt w:val="decimal"/>
+      <w:lvlText w:val="%5."/>
+      <w:lvlJc w:val="left"/>
+      <w:pPr>
+        <w:tabs>
+          <w:tab w:val="num" w:pos="3600"/>
+        </w:tabs>
+        <w:ind w:left="3600" w:hanging="360"/>
+      </w:pPr>
+    </w:lvl>
+    <w:lvl w:ilvl="5" w:tentative="1">
+      <w:start w:val="1"/>
+      <w:numFmt w:val="decimal"/>
+      <w:lvlText w:val="%6."/>
+      <w:lvlJc w:val="left"/>
+      <w:pPr>
+        <w:tabs>
+          <w:tab w:val="num" w:pos="4320"/>
+        </w:tabs>
+        <w:ind w:left="4320" w:hanging="360"/>
+      </w:pPr>
+    </w:lvl>
+    <w:lvl w:ilvl="6" w:tentative="1">
+      <w:start w:val="1"/>
+      <w:numFmt w:val="decimal"/>
+      <w:lvlText w:val="%7."/>
+      <w:lvlJc w:val="left"/>
+      <w:pPr>
+        <w:tabs>
+          <w:tab w:val="num" w:pos="5040"/>
+        </w:tabs>
+        <w:ind w:left="5040" w:hanging="360"/>
+      </w:pPr>
+    </w:lvl>
+    <w:lvl w:ilvl="7" w:tentative="1">
+      <w:start w:val="1"/>
+      <w:numFmt w:val="decimal"/>
+      <w:lvlText w:val="%8."/>
+      <w:lvlJc w:val="left"/>
+      <w:pPr>
+        <w:tabs>
+          <w:tab w:val="num" w:pos="5760"/>
+        </w:tabs>
+        <w:ind w:left="5760" w:hanging="360"/>
+      </w:pPr>
+    </w:lvl>
+    <w:lvl w:ilvl="8" w:tentative="1">
+      <w:start w:val="1"/>
+      <w:numFmt w:val="decimal"/>
+      <w:lvlText w:val="%9."/>
+      <w:lvlJc w:val="left"/>
+      <w:pPr>
+        <w:tabs>
+          <w:tab w:val="num" w:pos="6480"/>
+        </w:tabs>
+        <w:ind w:left="6480" w:hanging="360"/>
+      </w:pPr>
+    </w:lvl>
+  </w:abstractNum>
+  <w:abstractNum w:abstractNumId="3" w15:restartNumberingAfterBreak="0">
+    <w:nsid w:val="1E6012B1"/>
+    <w:multiLevelType w:val="multilevel"/>
+    <w:tmpl w:val="7F64C52A"/>
     <w:lvl w:ilvl="0">
       <w:start w:val="1"/>
       <w:numFmt w:val="bullet"/>
@@ -3478,10 +4599,10 @@
       </w:rPr>
     </w:lvl>
   </w:abstractNum>
-  <w:abstractNum w:abstractNumId="2" w15:restartNumberingAfterBreak="0">
-    <w:nsid w:val="1B0262E2"/>
+  <w:abstractNum w:abstractNumId="4" w15:restartNumberingAfterBreak="0">
+    <w:nsid w:val="1FC74510"/>
     <w:multiLevelType w:val="multilevel"/>
-    <w:tmpl w:val="6994F336"/>
+    <w:tmpl w:val="94CCED42"/>
     <w:lvl w:ilvl="0">
       <w:start w:val="1"/>
       <w:numFmt w:val="decimal"/>
@@ -3591,10 +4712,10 @@
       </w:pPr>
     </w:lvl>
   </w:abstractNum>
-  <w:abstractNum w:abstractNumId="3" w15:restartNumberingAfterBreak="0">
-    <w:nsid w:val="1F3278CA"/>
+  <w:abstractNum w:abstractNumId="5" w15:restartNumberingAfterBreak="0">
+    <w:nsid w:val="2F3A7F23"/>
     <w:multiLevelType w:val="multilevel"/>
-    <w:tmpl w:val="3C7A846E"/>
+    <w:tmpl w:val="5CEC55B4"/>
     <w:lvl w:ilvl="0">
       <w:start w:val="1"/>
       <w:numFmt w:val="decimal"/>
@@ -3704,10 +4825,10 @@
       </w:pPr>
     </w:lvl>
   </w:abstractNum>
-  <w:abstractNum w:abstractNumId="4" w15:restartNumberingAfterBreak="0">
-    <w:nsid w:val="2B5236F9"/>
+  <w:abstractNum w:abstractNumId="6" w15:restartNumberingAfterBreak="0">
+    <w:nsid w:val="38D45443"/>
     <w:multiLevelType w:val="multilevel"/>
-    <w:tmpl w:val="7206EBAE"/>
+    <w:tmpl w:val="966C2EAC"/>
     <w:lvl w:ilvl="0">
       <w:start w:val="1"/>
       <w:numFmt w:val="decimal"/>
@@ -3817,236 +4938,10 @@
       </w:pPr>
     </w:lvl>
   </w:abstractNum>
-  <w:abstractNum w:abstractNumId="5" w15:restartNumberingAfterBreak="0">
-    <w:nsid w:val="42057050"/>
+  <w:abstractNum w:abstractNumId="7" w15:restartNumberingAfterBreak="0">
+    <w:nsid w:val="5EEC50B9"/>
     <w:multiLevelType w:val="multilevel"/>
-    <w:tmpl w:val="1972A814"/>
-    <w:lvl w:ilvl="0">
-      <w:start w:val="1"/>
-      <w:numFmt w:val="decimal"/>
-      <w:lvlText w:val="%1."/>
-      <w:lvlJc w:val="left"/>
-      <w:pPr>
-        <w:tabs>
-          <w:tab w:val="num" w:pos="720"/>
-        </w:tabs>
-        <w:ind w:left="720" w:hanging="360"/>
-      </w:pPr>
-    </w:lvl>
-    <w:lvl w:ilvl="1" w:tentative="1">
-      <w:start w:val="1"/>
-      <w:numFmt w:val="decimal"/>
-      <w:lvlText w:val="%2."/>
-      <w:lvlJc w:val="left"/>
-      <w:pPr>
-        <w:tabs>
-          <w:tab w:val="num" w:pos="1440"/>
-        </w:tabs>
-        <w:ind w:left="1440" w:hanging="360"/>
-      </w:pPr>
-    </w:lvl>
-    <w:lvl w:ilvl="2" w:tentative="1">
-      <w:start w:val="1"/>
-      <w:numFmt w:val="decimal"/>
-      <w:lvlText w:val="%3."/>
-      <w:lvlJc w:val="left"/>
-      <w:pPr>
-        <w:tabs>
-          <w:tab w:val="num" w:pos="2160"/>
-        </w:tabs>
-        <w:ind w:left="2160" w:hanging="360"/>
-      </w:pPr>
-    </w:lvl>
-    <w:lvl w:ilvl="3" w:tentative="1">
-      <w:start w:val="1"/>
-      <w:numFmt w:val="decimal"/>
-      <w:lvlText w:val="%4."/>
-      <w:lvlJc w:val="left"/>
-      <w:pPr>
-        <w:tabs>
-          <w:tab w:val="num" w:pos="2880"/>
-        </w:tabs>
-        <w:ind w:left="2880" w:hanging="360"/>
-      </w:pPr>
-    </w:lvl>
-    <w:lvl w:ilvl="4" w:tentative="1">
-      <w:start w:val="1"/>
-      <w:numFmt w:val="decimal"/>
-      <w:lvlText w:val="%5."/>
-      <w:lvlJc w:val="left"/>
-      <w:pPr>
-        <w:tabs>
-          <w:tab w:val="num" w:pos="3600"/>
-        </w:tabs>
-        <w:ind w:left="3600" w:hanging="360"/>
-      </w:pPr>
-    </w:lvl>
-    <w:lvl w:ilvl="5" w:tentative="1">
-      <w:start w:val="1"/>
-      <w:numFmt w:val="decimal"/>
-      <w:lvlText w:val="%6."/>
-      <w:lvlJc w:val="left"/>
-      <w:pPr>
-        <w:tabs>
-          <w:tab w:val="num" w:pos="4320"/>
-        </w:tabs>
-        <w:ind w:left="4320" w:hanging="360"/>
-      </w:pPr>
-    </w:lvl>
-    <w:lvl w:ilvl="6" w:tentative="1">
-      <w:start w:val="1"/>
-      <w:numFmt w:val="decimal"/>
-      <w:lvlText w:val="%7."/>
-      <w:lvlJc w:val="left"/>
-      <w:pPr>
-        <w:tabs>
-          <w:tab w:val="num" w:pos="5040"/>
-        </w:tabs>
-        <w:ind w:left="5040" w:hanging="360"/>
-      </w:pPr>
-    </w:lvl>
-    <w:lvl w:ilvl="7" w:tentative="1">
-      <w:start w:val="1"/>
-      <w:numFmt w:val="decimal"/>
-      <w:lvlText w:val="%8."/>
-      <w:lvlJc w:val="left"/>
-      <w:pPr>
-        <w:tabs>
-          <w:tab w:val="num" w:pos="5760"/>
-        </w:tabs>
-        <w:ind w:left="5760" w:hanging="360"/>
-      </w:pPr>
-    </w:lvl>
-    <w:lvl w:ilvl="8" w:tentative="1">
-      <w:start w:val="1"/>
-      <w:numFmt w:val="decimal"/>
-      <w:lvlText w:val="%9."/>
-      <w:lvlJc w:val="left"/>
-      <w:pPr>
-        <w:tabs>
-          <w:tab w:val="num" w:pos="6480"/>
-        </w:tabs>
-        <w:ind w:left="6480" w:hanging="360"/>
-      </w:pPr>
-    </w:lvl>
-  </w:abstractNum>
-  <w:abstractNum w:abstractNumId="6" w15:restartNumberingAfterBreak="0">
-    <w:nsid w:val="4A75279D"/>
-    <w:multiLevelType w:val="multilevel"/>
-    <w:tmpl w:val="D17AE19A"/>
-    <w:lvl w:ilvl="0">
-      <w:start w:val="1"/>
-      <w:numFmt w:val="decimal"/>
-      <w:lvlText w:val="%1."/>
-      <w:lvlJc w:val="left"/>
-      <w:pPr>
-        <w:tabs>
-          <w:tab w:val="num" w:pos="720"/>
-        </w:tabs>
-        <w:ind w:left="720" w:hanging="360"/>
-      </w:pPr>
-    </w:lvl>
-    <w:lvl w:ilvl="1" w:tentative="1">
-      <w:start w:val="1"/>
-      <w:numFmt w:val="decimal"/>
-      <w:lvlText w:val="%2."/>
-      <w:lvlJc w:val="left"/>
-      <w:pPr>
-        <w:tabs>
-          <w:tab w:val="num" w:pos="1440"/>
-        </w:tabs>
-        <w:ind w:left="1440" w:hanging="360"/>
-      </w:pPr>
-    </w:lvl>
-    <w:lvl w:ilvl="2" w:tentative="1">
-      <w:start w:val="1"/>
-      <w:numFmt w:val="decimal"/>
-      <w:lvlText w:val="%3."/>
-      <w:lvlJc w:val="left"/>
-      <w:pPr>
-        <w:tabs>
-          <w:tab w:val="num" w:pos="2160"/>
-        </w:tabs>
-        <w:ind w:left="2160" w:hanging="360"/>
-      </w:pPr>
-    </w:lvl>
-    <w:lvl w:ilvl="3" w:tentative="1">
-      <w:start w:val="1"/>
-      <w:numFmt w:val="decimal"/>
-      <w:lvlText w:val="%4."/>
-      <w:lvlJc w:val="left"/>
-      <w:pPr>
-        <w:tabs>
-          <w:tab w:val="num" w:pos="2880"/>
-        </w:tabs>
-        <w:ind w:left="2880" w:hanging="360"/>
-      </w:pPr>
-    </w:lvl>
-    <w:lvl w:ilvl="4" w:tentative="1">
-      <w:start w:val="1"/>
-      <w:numFmt w:val="decimal"/>
-      <w:lvlText w:val="%5."/>
-      <w:lvlJc w:val="left"/>
-      <w:pPr>
-        <w:tabs>
-          <w:tab w:val="num" w:pos="3600"/>
-        </w:tabs>
-        <w:ind w:left="3600" w:hanging="360"/>
-      </w:pPr>
-    </w:lvl>
-    <w:lvl w:ilvl="5" w:tentative="1">
-      <w:start w:val="1"/>
-      <w:numFmt w:val="decimal"/>
-      <w:lvlText w:val="%6."/>
-      <w:lvlJc w:val="left"/>
-      <w:pPr>
-        <w:tabs>
-          <w:tab w:val="num" w:pos="4320"/>
-        </w:tabs>
-        <w:ind w:left="4320" w:hanging="360"/>
-      </w:pPr>
-    </w:lvl>
-    <w:lvl w:ilvl="6" w:tentative="1">
-      <w:start w:val="1"/>
-      <w:numFmt w:val="decimal"/>
-      <w:lvlText w:val="%7."/>
-      <w:lvlJc w:val="left"/>
-      <w:pPr>
-        <w:tabs>
-          <w:tab w:val="num" w:pos="5040"/>
-        </w:tabs>
-        <w:ind w:left="5040" w:hanging="360"/>
-      </w:pPr>
-    </w:lvl>
-    <w:lvl w:ilvl="7" w:tentative="1">
-      <w:start w:val="1"/>
-      <w:numFmt w:val="decimal"/>
-      <w:lvlText w:val="%8."/>
-      <w:lvlJc w:val="left"/>
-      <w:pPr>
-        <w:tabs>
-          <w:tab w:val="num" w:pos="5760"/>
-        </w:tabs>
-        <w:ind w:left="5760" w:hanging="360"/>
-      </w:pPr>
-    </w:lvl>
-    <w:lvl w:ilvl="8" w:tentative="1">
-      <w:start w:val="1"/>
-      <w:numFmt w:val="decimal"/>
-      <w:lvlText w:val="%9."/>
-      <w:lvlJc w:val="left"/>
-      <w:pPr>
-        <w:tabs>
-          <w:tab w:val="num" w:pos="6480"/>
-        </w:tabs>
-        <w:ind w:left="6480" w:hanging="360"/>
-      </w:pPr>
-    </w:lvl>
-  </w:abstractNum>
-  <w:abstractNum w:abstractNumId="7" w15:restartNumberingAfterBreak="0">
-    <w:nsid w:val="723F2EDA"/>
-    <w:multiLevelType w:val="multilevel"/>
-    <w:tmpl w:val="4936062E"/>
+    <w:tmpl w:val="3A346404"/>
     <w:lvl w:ilvl="0">
       <w:start w:val="1"/>
       <w:numFmt w:val="bullet"/>
@@ -4193,9 +5088,122 @@
     </w:lvl>
   </w:abstractNum>
   <w:abstractNum w:abstractNumId="8" w15:restartNumberingAfterBreak="0">
-    <w:nsid w:val="73EC650E"/>
+    <w:nsid w:val="60C76D4C"/>
     <w:multiLevelType w:val="multilevel"/>
-    <w:tmpl w:val="1B10A096"/>
+    <w:tmpl w:val="8C7CE0B4"/>
+    <w:lvl w:ilvl="0">
+      <w:start w:val="1"/>
+      <w:numFmt w:val="decimal"/>
+      <w:lvlText w:val="%1."/>
+      <w:lvlJc w:val="left"/>
+      <w:pPr>
+        <w:tabs>
+          <w:tab w:val="num" w:pos="720"/>
+        </w:tabs>
+        <w:ind w:left="720" w:hanging="360"/>
+      </w:pPr>
+    </w:lvl>
+    <w:lvl w:ilvl="1" w:tentative="1">
+      <w:start w:val="1"/>
+      <w:numFmt w:val="decimal"/>
+      <w:lvlText w:val="%2."/>
+      <w:lvlJc w:val="left"/>
+      <w:pPr>
+        <w:tabs>
+          <w:tab w:val="num" w:pos="1440"/>
+        </w:tabs>
+        <w:ind w:left="1440" w:hanging="360"/>
+      </w:pPr>
+    </w:lvl>
+    <w:lvl w:ilvl="2" w:tentative="1">
+      <w:start w:val="1"/>
+      <w:numFmt w:val="decimal"/>
+      <w:lvlText w:val="%3."/>
+      <w:lvlJc w:val="left"/>
+      <w:pPr>
+        <w:tabs>
+          <w:tab w:val="num" w:pos="2160"/>
+        </w:tabs>
+        <w:ind w:left="2160" w:hanging="360"/>
+      </w:pPr>
+    </w:lvl>
+    <w:lvl w:ilvl="3" w:tentative="1">
+      <w:start w:val="1"/>
+      <w:numFmt w:val="decimal"/>
+      <w:lvlText w:val="%4."/>
+      <w:lvlJc w:val="left"/>
+      <w:pPr>
+        <w:tabs>
+          <w:tab w:val="num" w:pos="2880"/>
+        </w:tabs>
+        <w:ind w:left="2880" w:hanging="360"/>
+      </w:pPr>
+    </w:lvl>
+    <w:lvl w:ilvl="4" w:tentative="1">
+      <w:start w:val="1"/>
+      <w:numFmt w:val="decimal"/>
+      <w:lvlText w:val="%5."/>
+      <w:lvlJc w:val="left"/>
+      <w:pPr>
+        <w:tabs>
+          <w:tab w:val="num" w:pos="3600"/>
+        </w:tabs>
+        <w:ind w:left="3600" w:hanging="360"/>
+      </w:pPr>
+    </w:lvl>
+    <w:lvl w:ilvl="5" w:tentative="1">
+      <w:start w:val="1"/>
+      <w:numFmt w:val="decimal"/>
+      <w:lvlText w:val="%6."/>
+      <w:lvlJc w:val="left"/>
+      <w:pPr>
+        <w:tabs>
+          <w:tab w:val="num" w:pos="4320"/>
+        </w:tabs>
+        <w:ind w:left="4320" w:hanging="360"/>
+      </w:pPr>
+    </w:lvl>
+    <w:lvl w:ilvl="6" w:tentative="1">
+      <w:start w:val="1"/>
+      <w:numFmt w:val="decimal"/>
+      <w:lvlText w:val="%7."/>
+      <w:lvlJc w:val="left"/>
+      <w:pPr>
+        <w:tabs>
+          <w:tab w:val="num" w:pos="5040"/>
+        </w:tabs>
+        <w:ind w:left="5040" w:hanging="360"/>
+      </w:pPr>
+    </w:lvl>
+    <w:lvl w:ilvl="7" w:tentative="1">
+      <w:start w:val="1"/>
+      <w:numFmt w:val="decimal"/>
+      <w:lvlText w:val="%8."/>
+      <w:lvlJc w:val="left"/>
+      <w:pPr>
+        <w:tabs>
+          <w:tab w:val="num" w:pos="5760"/>
+        </w:tabs>
+        <w:ind w:left="5760" w:hanging="360"/>
+      </w:pPr>
+    </w:lvl>
+    <w:lvl w:ilvl="8" w:tentative="1">
+      <w:start w:val="1"/>
+      <w:numFmt w:val="decimal"/>
+      <w:lvlText w:val="%9."/>
+      <w:lvlJc w:val="left"/>
+      <w:pPr>
+        <w:tabs>
+          <w:tab w:val="num" w:pos="6480"/>
+        </w:tabs>
+        <w:ind w:left="6480" w:hanging="360"/>
+      </w:pPr>
+    </w:lvl>
+  </w:abstractNum>
+  <w:abstractNum w:abstractNumId="9" w15:restartNumberingAfterBreak="0">
+    <w:nsid w:val="6BB2679A"/>
+    <w:multiLevelType w:val="multilevel"/>
+    <w:tmpl w:val="9180719A"/>
     <w:lvl w:ilvl="0">
       <w:start w:val="1"/>
       <w:numFmt w:val="bullet"/>
@@ -4341,32 +5349,35 @@
       </w:rPr>
     </w:lvl>
   </w:abstractNum>
-  <w:num w:numId="1" w16cid:durableId="50471628">
-    <w:abstractNumId w:val="3"/>
+  <w:num w:numId="1" w16cid:durableId="1422221690">
+    <w:abstractNumId w:val="0"/>
   </w:num>
-  <w:num w:numId="2" w16cid:durableId="392391051">
+  <w:num w:numId="2" w16cid:durableId="230194244">
+    <w:abstractNumId w:val="8"/>
+  </w:num>
+  <w:num w:numId="3" w16cid:durableId="2023706296">
+    <w:abstractNumId w:val="2"/>
+  </w:num>
+  <w:num w:numId="4" w16cid:durableId="1820295124">
+    <w:abstractNumId w:val="6"/>
+  </w:num>
+  <w:num w:numId="5" w16cid:durableId="906957041">
+    <w:abstractNumId w:val="5"/>
+  </w:num>
+  <w:num w:numId="6" w16cid:durableId="891577763">
+    <w:abstractNumId w:val="1"/>
+  </w:num>
+  <w:num w:numId="7" w16cid:durableId="1222710070">
+    <w:abstractNumId w:val="9"/>
+  </w:num>
+  <w:num w:numId="8" w16cid:durableId="1136025483">
     <w:abstractNumId w:val="4"/>
   </w:num>
-  <w:num w:numId="3" w16cid:durableId="627664924">
-    <w:abstractNumId w:val="6"/>
+  <w:num w:numId="9" w16cid:durableId="1171064095">
+    <w:abstractNumId w:val="7"/>
   </w:num>
-  <w:num w:numId="4" w16cid:durableId="1477644032">
-    <w:abstractNumId w:val="5"/>
-  </w:num>
-  <w:num w:numId="5" w16cid:durableId="258370203">
-    <w:abstractNumId w:val="2"/>
-  </w:num>
-  <w:num w:numId="6" w16cid:durableId="516038067">
-    <w:abstractNumId w:val="0"/>
-  </w:num>
-  <w:num w:numId="7" w16cid:durableId="1806044436">
-    <w:abstractNumId w:val="1"/>
-  </w:num>
-  <w:num w:numId="8" w16cid:durableId="495460970">
-    <w:abstractNumId w:val="8"/>
-  </w:num>
-  <w:num w:numId="9" w16cid:durableId="1236011574">
-    <w:abstractNumId w:val="7"/>
+  <w:num w:numId="10" w16cid:durableId="1193761675">
+    <w:abstractNumId w:val="3"/>
   </w:num>
 </w:numbering>
 </file>

</xml_diff>

<commit_message>
Make the app responsive: fit any screen, stay smooth
- PerMonitorV2 DPI awareness; main window opens maximized.
- UI/Responsive: FitGrid (tables grow on big screens, everything below
  moves down; small screens scroll instead of shrinking), OnTypingPause
  (search waits 300 ms), Busy (wait cursor), LatestOnly (newest results
  win). Applied to User Accounts, Projects and Employees.
- Db.WarmUpInBackground while the Sign In window is open (first query
  193 ms afterwards).
- 11 checks passed at 1600x1000 and 800x500 (test data removed).
- Guides: Developer Guide chapter 16, User Manual, UI guide note,
  CLAUDE.md convention for new list pages.

Co-Authored-By: Claude Opus 5.5 <noreply@anthropic.com>
</commit_message>
<xml_diff>
--- a/docs/User Manual.docx
+++ b/docs/User Manual.docx
@@ -2152,6 +2152,40 @@
         <w:rPr>
           <w:rFonts w:ascii="Calibri" w:eastAsia="Times New Roman" w:hAnsi="Calibri" w:cs="Calibri"/>
         </w:rPr>
+        <w:t>Screen size</w:t>
+      </w:r>
+    </w:p>
+    <w:p>
+      <w:pPr>
+        <w:pStyle w:val="NormalWeb"/>
+        <w:rPr>
+          <w:rFonts w:ascii="Calibri" w:hAnsi="Calibri" w:cs="Calibri"/>
+          <w:color w:val="1A1A1A"/>
+          <w:sz w:val="22"/>
+          <w:szCs w:val="22"/>
+        </w:rPr>
+      </w:pPr>
+      <w:r>
+        <w:rPr>
+          <w:rFonts w:ascii="Calibri" w:hAnsi="Calibri" w:cs="Calibri"/>
+          <w:color w:val="1A1A1A"/>
+          <w:sz w:val="22"/>
+          <w:szCs w:val="22"/>
+        </w:rPr>
+        <w:t>The app opens full screen. On big monitors, lists grow to show more rows; on small laptop screens, scroll down to see the rest of a page. Search boxes update the list when you stop typing.</w:t>
+      </w:r>
+    </w:p>
+    <w:p>
+      <w:pPr>
+        <w:pStyle w:val="Heading2"/>
+        <w:rPr>
+          <w:rFonts w:ascii="Calibri" w:eastAsia="Times New Roman" w:hAnsi="Calibri" w:cs="Calibri"/>
+        </w:rPr>
+      </w:pPr>
+      <w:r>
+        <w:rPr>
+          <w:rFonts w:ascii="Calibri" w:eastAsia="Times New Roman" w:hAnsi="Calibri" w:cs="Calibri"/>
+        </w:rPr>
         <w:t>Signing out</w:t>
       </w:r>
     </w:p>
@@ -2191,7 +2225,16 @@
           <w:sz w:val="22"/>
           <w:szCs w:val="22"/>
         </w:rPr>
-        <w:t xml:space="preserve"> at the bottom of the left sidebar, or close the window. Both are recorded.</w:t>
+        <w:t xml:space="preserve"> </w:t>
+      </w:r>
+      <w:r>
+        <w:rPr>
+          <w:rFonts w:ascii="Calibri" w:hAnsi="Calibri" w:cs="Calibri"/>
+          <w:color w:val="1A1A1A"/>
+          <w:sz w:val="22"/>
+          <w:szCs w:val="22"/>
+        </w:rPr>
+        <w:t>at the bottom of the left sidebar, or close the window. Both are recorded.</w:t>
       </w:r>
     </w:p>
     <w:p>
@@ -2292,16 +2335,7 @@
           <w:sz w:val="22"/>
           <w:szCs w:val="22"/>
         </w:rPr>
-        <w:t xml:space="preserve"> </w:t>
-      </w:r>
-      <w:r>
-        <w:rPr>
-          <w:rFonts w:ascii="Calibri" w:eastAsia="Times New Roman" w:hAnsi="Calibri" w:cs="Calibri"/>
-          <w:color w:val="1A1A1A"/>
-          <w:sz w:val="22"/>
-          <w:szCs w:val="22"/>
-        </w:rPr>
-        <w:t xml:space="preserve">the page name, your name, and your department and level. Admins also see </w:t>
+        <w:t xml:space="preserve"> the page name, your name, and your department and level. Admins also see </w:t>
       </w:r>
       <w:r>
         <w:rPr>
@@ -2462,7 +2496,16 @@
           <w:sz w:val="22"/>
           <w:szCs w:val="22"/>
         </w:rPr>
-        <w:t xml:space="preserve"> type your current password, then the new one twice (at least 8 characters, with a letter and a number), and click </w:t>
+        <w:t xml:space="preserve"> </w:t>
+      </w:r>
+      <w:r>
+        <w:rPr>
+          <w:rFonts w:ascii="Calibri" w:eastAsia="Times New Roman" w:hAnsi="Calibri" w:cs="Calibri"/>
+          <w:color w:val="1A1A1A"/>
+          <w:sz w:val="22"/>
+          <w:szCs w:val="22"/>
+        </w:rPr>
+        <w:t xml:space="preserve">type your current password, then the new one twice (at least 8 characters, with a letter and a number), and click </w:t>
       </w:r>
       <w:r>
         <w:rPr>
@@ -2574,6 +2617,7 @@
           <w:sz w:val="22"/>
           <w:szCs w:val="22"/>
         </w:rPr>
+        <w:lastRenderedPageBreak/>
         <w:t>Set your security question as soon as you get an Admin account.</w:t>
       </w:r>
       <w:r>
@@ -2603,7 +2647,16 @@
           <w:sz w:val="22"/>
           <w:szCs w:val="22"/>
         </w:rPr>
-        <w:t>Employees and Supervisors can't change their password here; ask an Admin.</w:t>
+        <w:t>Employees and Supervisors can'</w:t>
+      </w:r>
+      <w:r>
+        <w:rPr>
+          <w:rFonts w:ascii="Calibri" w:hAnsi="Calibri" w:cs="Calibri"/>
+          <w:color w:val="1A1A1A"/>
+          <w:sz w:val="22"/>
+          <w:szCs w:val="22"/>
+        </w:rPr>
+        <w:t>t change their password here; ask an Admin.</w:t>
       </w:r>
     </w:p>
     <w:p>
@@ -2617,7 +2670,6 @@
         <w:rPr>
           <w:rFonts w:ascii="Calibri" w:eastAsia="Times New Roman" w:hAnsi="Calibri" w:cs="Calibri"/>
         </w:rPr>
-        <w:lastRenderedPageBreak/>
         <w:t>For Admins: User Accounts</w:t>
       </w:r>
     </w:p>
@@ -3014,16 +3066,7 @@
           <w:sz w:val="22"/>
           <w:szCs w:val="22"/>
         </w:rPr>
-        <w:t>The login'</w:t>
-      </w:r>
-      <w:r>
-        <w:rPr>
-          <w:rFonts w:ascii="Calibri" w:hAnsi="Calibri" w:cs="Calibri"/>
-          <w:color w:val="1A1A1A"/>
-          <w:sz w:val="22"/>
-          <w:szCs w:val="22"/>
-        </w:rPr>
-        <w:t>s name and department follow the employee record. If HR renames someone or moves them to another department, their login updates too.</w:t>
+        <w:t>The login's name and department follow the employee record. If HR renames someone or moves them to another department, their login updates too.</w:t>
       </w:r>
     </w:p>
     <w:p>
@@ -3073,7 +3116,16 @@
           <w:sz w:val="22"/>
           <w:szCs w:val="22"/>
         </w:rPr>
-        <w:t xml:space="preserve"> click it in the list, change the username or level (or which employee it's for), and click </w:t>
+        <w:t xml:space="preserve"> </w:t>
+      </w:r>
+      <w:r>
+        <w:rPr>
+          <w:rFonts w:ascii="Calibri" w:hAnsi="Calibri" w:cs="Calibri"/>
+          <w:color w:val="1A1A1A"/>
+          <w:sz w:val="22"/>
+          <w:szCs w:val="22"/>
+        </w:rPr>
+        <w:t xml:space="preserve">click it in the list, change the username or level (or which employee it's for), and click </w:t>
       </w:r>
       <w:r>
         <w:rPr>
@@ -3582,7 +3634,16 @@
           <w:sz w:val="22"/>
           <w:szCs w:val="22"/>
         </w:rPr>
-        <w:t>You can't disable your own account, and the last active Admin can't be disabled or changed to another level.</w:t>
+        <w:t>You can'</w:t>
+      </w:r>
+      <w:r>
+        <w:rPr>
+          <w:rFonts w:ascii="Calibri" w:hAnsi="Calibri" w:cs="Calibri"/>
+          <w:color w:val="1A1A1A"/>
+          <w:sz w:val="22"/>
+          <w:szCs w:val="22"/>
+        </w:rPr>
+        <w:t>t disable your own account, and the last active Admin can't be disabled or changed to another level.</w:t>
       </w:r>
     </w:p>
     <w:p>
@@ -3596,6 +3657,7 @@
         <w:rPr>
           <w:rFonts w:ascii="Calibri" w:eastAsia="Times New Roman" w:hAnsi="Calibri" w:cs="Calibri"/>
         </w:rPr>
+        <w:lastRenderedPageBreak/>
         <w:t>"Still there?"</w:t>
       </w:r>
     </w:p>
@@ -3616,7 +3678,6 @@
           <w:sz w:val="22"/>
           <w:szCs w:val="22"/>
         </w:rPr>
-        <w:lastRenderedPageBreak/>
         <w:t xml:space="preserve">If you don't touch the keyboard or mouse for </w:t>
       </w:r>
       <w:r>
@@ -3881,7 +3942,16 @@
           <w:sz w:val="22"/>
           <w:szCs w:val="22"/>
         </w:rPr>
-        <w:t xml:space="preserve"> Click </w:t>
+        <w:t xml:space="preserve"> </w:t>
+      </w:r>
+      <w:r>
+        <w:rPr>
+          <w:rFonts w:ascii="Calibri" w:eastAsia="Times New Roman" w:hAnsi="Calibri" w:cs="Calibri"/>
+          <w:color w:val="1A1A1A"/>
+          <w:sz w:val="22"/>
+          <w:szCs w:val="22"/>
+        </w:rPr>
+        <w:t xml:space="preserve">Click </w:t>
       </w:r>
       <w:r>
         <w:rPr>
@@ -3968,16 +4038,7 @@
           <w:sz w:val="22"/>
           <w:szCs w:val="22"/>
         </w:rPr>
-        <w:t xml:space="preserve"> </w:t>
-      </w:r>
-      <w:r>
-        <w:rPr>
-          <w:rFonts w:ascii="Calibri" w:eastAsia="Times New Roman" w:hAnsi="Calibri" w:cs="Calibri"/>
-          <w:color w:val="1A1A1A"/>
-          <w:sz w:val="22"/>
-          <w:szCs w:val="22"/>
-        </w:rPr>
-        <w:t xml:space="preserve">after 5 minutes without using the app, a </w:t>
+        <w:t xml:space="preserve"> after 5 minutes without using the app, a </w:t>
       </w:r>
       <w:r>
         <w:rPr>
@@ -4061,7 +4122,16 @@
           <w:sz w:val="22"/>
           <w:szCs w:val="22"/>
         </w:rPr>
-        <w:t xml:space="preserve"> The company's one project list. Other departments pick projects from it.</w:t>
+        <w:t xml:space="preserve"> The company'</w:t>
+      </w:r>
+      <w:r>
+        <w:rPr>
+          <w:rFonts w:ascii="Calibri" w:hAnsi="Calibri" w:cs="Calibri"/>
+          <w:color w:val="1A1A1A"/>
+          <w:sz w:val="22"/>
+          <w:szCs w:val="22"/>
+        </w:rPr>
+        <w:t>s one project list. Other departments pick projects from it.</w:t>
       </w:r>
     </w:p>
     <w:p>
@@ -5002,16 +5072,7 @@
           <w:sz w:val="22"/>
           <w:szCs w:val="22"/>
         </w:rPr>
-        <w:t xml:space="preserve"> </w:t>
-      </w:r>
-      <w:r>
-        <w:rPr>
-          <w:rFonts w:ascii="Calibri" w:hAnsi="Calibri" w:cs="Calibri"/>
-          <w:color w:val="1A1A1A"/>
-          <w:sz w:val="22"/>
-          <w:szCs w:val="22"/>
-        </w:rPr>
-        <w:t xml:space="preserve">and </w:t>
+        <w:t xml:space="preserve"> and </w:t>
       </w:r>
       <w:r>
         <w:rPr>
@@ -5984,9 +6045,9 @@
 <file path=word/numbering.xml><?xml version="1.0" encoding="utf-8"?>
 <w:numbering xmlns:wpc="http://schemas.microsoft.com/office/word/2010/wordprocessingCanvas" xmlns:cx="http://schemas.microsoft.com/office/drawing/2014/chartex" xmlns:cx1="http://schemas.microsoft.com/office/drawing/2015/9/8/chartex" xmlns:cx2="http://schemas.microsoft.com/office/drawing/2015/10/21/chartex" xmlns:cx3="http://schemas.microsoft.com/office/drawing/2016/5/9/chartex" xmlns:cx4="http://schemas.microsoft.com/office/drawing/2016/5/10/chartex" xmlns:cx5="http://schemas.microsoft.com/office/drawing/2016/5/11/chartex" xmlns:cx6="http://schemas.microsoft.com/office/drawing/2016/5/12/chartex" xmlns:cx7="http://schemas.microsoft.com/office/drawing/2016/5/13/chartex" xmlns:cx8="http://schemas.microsoft.com/office/drawing/2016/5/14/chartex" xmlns:mc="http://schemas.openxmlformats.org/markup-compatibility/2006" xmlns:aink="http://schemas.microsoft.com/office/drawing/2016/ink" xmlns:am3d="http://schemas.microsoft.com/office/drawing/2017/model3d" xmlns:o="urn:schemas-microsoft-com:office:office" xmlns:oel="http://schemas.microsoft.com/office/2019/extlst" xmlns:r="http://schemas.openxmlformats.org/officeDocument/2006/relationships" xmlns:m="http://schemas.openxmlformats.org/officeDocument/2006/math" xmlns:v="urn:schemas-microsoft-com:vml" xmlns:wp14="http://schemas.microsoft.com/office/word/2010/wordprocessingDrawing" xmlns:wp="http://schemas.openxmlformats.org/drawingml/2006/wordprocessingDrawing" xmlns:w10="urn:schemas-microsoft-com:office:word" xmlns:w="http://schemas.openxmlformats.org/wordprocessingml/2006/main" xmlns:w14="http://schemas.microsoft.com/office/word/2010/wordml" xmlns:w15="http://schemas.microsoft.com/office/word/2012/wordml" xmlns:w16cex="http://schemas.microsoft.com/office/word/2018/wordml/cex" xmlns:w16cid="http://schemas.microsoft.com/office/word/2016/wordml/cid" xmlns:w16="http://schemas.microsoft.com/office/word/2018/wordml" xmlns:w16du="http://schemas.microsoft.com/office/word/2023/wordml/word16du" xmlns:w16sdtdh="http://schemas.microsoft.com/office/word/2020/wordml/sdtdatahash" xmlns:w16sdtfl="http://schemas.microsoft.com/office/word/2024/wordml/sdtformatlock" xmlns:w16se="http://schemas.microsoft.com/office/word/2015/wordml/symex" xmlns:wpg="http://schemas.microsoft.com/office/word/2010/wordprocessingGroup" xmlns:wpi="http://schemas.microsoft.com/office/word/2010/wordprocessingInk" xmlns:wne="http://schemas.microsoft.com/office/word/2006/wordml" xmlns:wps="http://schemas.microsoft.com/office/word/2010/wordprocessingShape" mc:Ignorable="w14 w15 w16se w16cid w16 w16cex w16sdtdh w16sdtfl w16du wp14">
   <w:abstractNum w:abstractNumId="0" w15:restartNumberingAfterBreak="0">
-    <w:nsid w:val="0A3F4A8C"/>
+    <w:nsid w:val="00A32D50"/>
     <w:multiLevelType w:val="multilevel"/>
-    <w:tmpl w:val="28C21508"/>
+    <w:tmpl w:val="45D6B1A2"/>
     <w:lvl w:ilvl="0">
       <w:start w:val="1"/>
       <w:numFmt w:val="decimal"/>
@@ -5999,7 +6060,124 @@
         <w:ind w:left="720" w:hanging="360"/>
       </w:pPr>
     </w:lvl>
-    <w:lvl w:ilvl="1">
+    <w:lvl w:ilvl="1" w:tentative="1">
+      <w:start w:val="1"/>
+      <w:numFmt w:val="decimal"/>
+      <w:lvlText w:val="%2."/>
+      <w:lvlJc w:val="left"/>
+      <w:pPr>
+        <w:tabs>
+          <w:tab w:val="num" w:pos="1440"/>
+        </w:tabs>
+        <w:ind w:left="1440" w:hanging="360"/>
+      </w:pPr>
+    </w:lvl>
+    <w:lvl w:ilvl="2" w:tentative="1">
+      <w:start w:val="1"/>
+      <w:numFmt w:val="decimal"/>
+      <w:lvlText w:val="%3."/>
+      <w:lvlJc w:val="left"/>
+      <w:pPr>
+        <w:tabs>
+          <w:tab w:val="num" w:pos="2160"/>
+        </w:tabs>
+        <w:ind w:left="2160" w:hanging="360"/>
+      </w:pPr>
+    </w:lvl>
+    <w:lvl w:ilvl="3" w:tentative="1">
+      <w:start w:val="1"/>
+      <w:numFmt w:val="decimal"/>
+      <w:lvlText w:val="%4."/>
+      <w:lvlJc w:val="left"/>
+      <w:pPr>
+        <w:tabs>
+          <w:tab w:val="num" w:pos="2880"/>
+        </w:tabs>
+        <w:ind w:left="2880" w:hanging="360"/>
+      </w:pPr>
+    </w:lvl>
+    <w:lvl w:ilvl="4" w:tentative="1">
+      <w:start w:val="1"/>
+      <w:numFmt w:val="decimal"/>
+      <w:lvlText w:val="%5."/>
+      <w:lvlJc w:val="left"/>
+      <w:pPr>
+        <w:tabs>
+          <w:tab w:val="num" w:pos="3600"/>
+        </w:tabs>
+        <w:ind w:left="3600" w:hanging="360"/>
+      </w:pPr>
+    </w:lvl>
+    <w:lvl w:ilvl="5" w:tentative="1">
+      <w:start w:val="1"/>
+      <w:numFmt w:val="decimal"/>
+      <w:lvlText w:val="%6."/>
+      <w:lvlJc w:val="left"/>
+      <w:pPr>
+        <w:tabs>
+          <w:tab w:val="num" w:pos="4320"/>
+        </w:tabs>
+        <w:ind w:left="4320" w:hanging="360"/>
+      </w:pPr>
+    </w:lvl>
+    <w:lvl w:ilvl="6" w:tentative="1">
+      <w:start w:val="1"/>
+      <w:numFmt w:val="decimal"/>
+      <w:lvlText w:val="%7."/>
+      <w:lvlJc w:val="left"/>
+      <w:pPr>
+        <w:tabs>
+          <w:tab w:val="num" w:pos="5040"/>
+        </w:tabs>
+        <w:ind w:left="5040" w:hanging="360"/>
+      </w:pPr>
+    </w:lvl>
+    <w:lvl w:ilvl="7" w:tentative="1">
+      <w:start w:val="1"/>
+      <w:numFmt w:val="decimal"/>
+      <w:lvlText w:val="%8."/>
+      <w:lvlJc w:val="left"/>
+      <w:pPr>
+        <w:tabs>
+          <w:tab w:val="num" w:pos="5760"/>
+        </w:tabs>
+        <w:ind w:left="5760" w:hanging="360"/>
+      </w:pPr>
+    </w:lvl>
+    <w:lvl w:ilvl="8" w:tentative="1">
+      <w:start w:val="1"/>
+      <w:numFmt w:val="decimal"/>
+      <w:lvlText w:val="%9."/>
+      <w:lvlJc w:val="left"/>
+      <w:pPr>
+        <w:tabs>
+          <w:tab w:val="num" w:pos="6480"/>
+        </w:tabs>
+        <w:ind w:left="6480" w:hanging="360"/>
+      </w:pPr>
+    </w:lvl>
+  </w:abstractNum>
+  <w:abstractNum w:abstractNumId="1" w15:restartNumberingAfterBreak="0">
+    <w:nsid w:val="05425D9E"/>
+    <w:multiLevelType w:val="multilevel"/>
+    <w:tmpl w:val="8DA6C074"/>
+    <w:lvl w:ilvl="0">
+      <w:start w:val="1"/>
+      <w:numFmt w:val="bullet"/>
+      <w:lvlText w:val=""/>
+      <w:lvlJc w:val="left"/>
+      <w:pPr>
+        <w:tabs>
+          <w:tab w:val="num" w:pos="720"/>
+        </w:tabs>
+        <w:ind w:left="720" w:hanging="360"/>
+      </w:pPr>
+      <w:rPr>
+        <w:rFonts w:ascii="Symbol" w:hAnsi="Symbol" w:hint="default"/>
+        <w:sz w:val="20"/>
+      </w:rPr>
+    </w:lvl>
+    <w:lvl w:ilvl="1" w:tentative="1">
       <w:start w:val="1"/>
       <w:numFmt w:val="bullet"/>
       <w:lvlText w:val="o"/>
@@ -6017,6 +6195,147 @@
     </w:lvl>
     <w:lvl w:ilvl="2" w:tentative="1">
       <w:start w:val="1"/>
+      <w:numFmt w:val="bullet"/>
+      <w:lvlText w:val=""/>
+      <w:lvlJc w:val="left"/>
+      <w:pPr>
+        <w:tabs>
+          <w:tab w:val="num" w:pos="2160"/>
+        </w:tabs>
+        <w:ind w:left="2160" w:hanging="360"/>
+      </w:pPr>
+      <w:rPr>
+        <w:rFonts w:ascii="Wingdings" w:hAnsi="Wingdings" w:hint="default"/>
+        <w:sz w:val="20"/>
+      </w:rPr>
+    </w:lvl>
+    <w:lvl w:ilvl="3" w:tentative="1">
+      <w:start w:val="1"/>
+      <w:numFmt w:val="bullet"/>
+      <w:lvlText w:val=""/>
+      <w:lvlJc w:val="left"/>
+      <w:pPr>
+        <w:tabs>
+          <w:tab w:val="num" w:pos="2880"/>
+        </w:tabs>
+        <w:ind w:left="2880" w:hanging="360"/>
+      </w:pPr>
+      <w:rPr>
+        <w:rFonts w:ascii="Wingdings" w:hAnsi="Wingdings" w:hint="default"/>
+        <w:sz w:val="20"/>
+      </w:rPr>
+    </w:lvl>
+    <w:lvl w:ilvl="4" w:tentative="1">
+      <w:start w:val="1"/>
+      <w:numFmt w:val="bullet"/>
+      <w:lvlText w:val=""/>
+      <w:lvlJc w:val="left"/>
+      <w:pPr>
+        <w:tabs>
+          <w:tab w:val="num" w:pos="3600"/>
+        </w:tabs>
+        <w:ind w:left="3600" w:hanging="360"/>
+      </w:pPr>
+      <w:rPr>
+        <w:rFonts w:ascii="Wingdings" w:hAnsi="Wingdings" w:hint="default"/>
+        <w:sz w:val="20"/>
+      </w:rPr>
+    </w:lvl>
+    <w:lvl w:ilvl="5" w:tentative="1">
+      <w:start w:val="1"/>
+      <w:numFmt w:val="bullet"/>
+      <w:lvlText w:val=""/>
+      <w:lvlJc w:val="left"/>
+      <w:pPr>
+        <w:tabs>
+          <w:tab w:val="num" w:pos="4320"/>
+        </w:tabs>
+        <w:ind w:left="4320" w:hanging="360"/>
+      </w:pPr>
+      <w:rPr>
+        <w:rFonts w:ascii="Wingdings" w:hAnsi="Wingdings" w:hint="default"/>
+        <w:sz w:val="20"/>
+      </w:rPr>
+    </w:lvl>
+    <w:lvl w:ilvl="6" w:tentative="1">
+      <w:start w:val="1"/>
+      <w:numFmt w:val="bullet"/>
+      <w:lvlText w:val=""/>
+      <w:lvlJc w:val="left"/>
+      <w:pPr>
+        <w:tabs>
+          <w:tab w:val="num" w:pos="5040"/>
+        </w:tabs>
+        <w:ind w:left="5040" w:hanging="360"/>
+      </w:pPr>
+      <w:rPr>
+        <w:rFonts w:ascii="Wingdings" w:hAnsi="Wingdings" w:hint="default"/>
+        <w:sz w:val="20"/>
+      </w:rPr>
+    </w:lvl>
+    <w:lvl w:ilvl="7" w:tentative="1">
+      <w:start w:val="1"/>
+      <w:numFmt w:val="bullet"/>
+      <w:lvlText w:val=""/>
+      <w:lvlJc w:val="left"/>
+      <w:pPr>
+        <w:tabs>
+          <w:tab w:val="num" w:pos="5760"/>
+        </w:tabs>
+        <w:ind w:left="5760" w:hanging="360"/>
+      </w:pPr>
+      <w:rPr>
+        <w:rFonts w:ascii="Wingdings" w:hAnsi="Wingdings" w:hint="default"/>
+        <w:sz w:val="20"/>
+      </w:rPr>
+    </w:lvl>
+    <w:lvl w:ilvl="8" w:tentative="1">
+      <w:start w:val="1"/>
+      <w:numFmt w:val="bullet"/>
+      <w:lvlText w:val=""/>
+      <w:lvlJc w:val="left"/>
+      <w:pPr>
+        <w:tabs>
+          <w:tab w:val="num" w:pos="6480"/>
+        </w:tabs>
+        <w:ind w:left="6480" w:hanging="360"/>
+      </w:pPr>
+      <w:rPr>
+        <w:rFonts w:ascii="Wingdings" w:hAnsi="Wingdings" w:hint="default"/>
+        <w:sz w:val="20"/>
+      </w:rPr>
+    </w:lvl>
+  </w:abstractNum>
+  <w:abstractNum w:abstractNumId="2" w15:restartNumberingAfterBreak="0">
+    <w:nsid w:val="12C71771"/>
+    <w:multiLevelType w:val="multilevel"/>
+    <w:tmpl w:val="22BC0C02"/>
+    <w:lvl w:ilvl="0">
+      <w:start w:val="1"/>
+      <w:numFmt w:val="decimal"/>
+      <w:lvlText w:val="%1."/>
+      <w:lvlJc w:val="left"/>
+      <w:pPr>
+        <w:tabs>
+          <w:tab w:val="num" w:pos="720"/>
+        </w:tabs>
+        <w:ind w:left="720" w:hanging="360"/>
+      </w:pPr>
+    </w:lvl>
+    <w:lvl w:ilvl="1" w:tentative="1">
+      <w:start w:val="1"/>
+      <w:numFmt w:val="decimal"/>
+      <w:lvlText w:val="%2."/>
+      <w:lvlJc w:val="left"/>
+      <w:pPr>
+        <w:tabs>
+          <w:tab w:val="num" w:pos="1440"/>
+        </w:tabs>
+        <w:ind w:left="1440" w:hanging="360"/>
+      </w:pPr>
+    </w:lvl>
+    <w:lvl w:ilvl="2" w:tentative="1">
+      <w:start w:val="1"/>
       <w:numFmt w:val="decimal"/>
       <w:lvlText w:val="%3."/>
       <w:lvlJc w:val="left"/>
@@ -6100,123 +6419,10 @@
       </w:pPr>
     </w:lvl>
   </w:abstractNum>
-  <w:abstractNum w:abstractNumId="1" w15:restartNumberingAfterBreak="0">
-    <w:nsid w:val="12770811"/>
+  <w:abstractNum w:abstractNumId="3" w15:restartNumberingAfterBreak="0">
+    <w:nsid w:val="151D2EB5"/>
     <w:multiLevelType w:val="multilevel"/>
-    <w:tmpl w:val="6752291E"/>
-    <w:lvl w:ilvl="0">
-      <w:start w:val="1"/>
-      <w:numFmt w:val="decimal"/>
-      <w:lvlText w:val="%1."/>
-      <w:lvlJc w:val="left"/>
-      <w:pPr>
-        <w:tabs>
-          <w:tab w:val="num" w:pos="720"/>
-        </w:tabs>
-        <w:ind w:left="720" w:hanging="360"/>
-      </w:pPr>
-    </w:lvl>
-    <w:lvl w:ilvl="1" w:tentative="1">
-      <w:start w:val="1"/>
-      <w:numFmt w:val="decimal"/>
-      <w:lvlText w:val="%2."/>
-      <w:lvlJc w:val="left"/>
-      <w:pPr>
-        <w:tabs>
-          <w:tab w:val="num" w:pos="1440"/>
-        </w:tabs>
-        <w:ind w:left="1440" w:hanging="360"/>
-      </w:pPr>
-    </w:lvl>
-    <w:lvl w:ilvl="2" w:tentative="1">
-      <w:start w:val="1"/>
-      <w:numFmt w:val="decimal"/>
-      <w:lvlText w:val="%3."/>
-      <w:lvlJc w:val="left"/>
-      <w:pPr>
-        <w:tabs>
-          <w:tab w:val="num" w:pos="2160"/>
-        </w:tabs>
-        <w:ind w:left="2160" w:hanging="360"/>
-      </w:pPr>
-    </w:lvl>
-    <w:lvl w:ilvl="3" w:tentative="1">
-      <w:start w:val="1"/>
-      <w:numFmt w:val="decimal"/>
-      <w:lvlText w:val="%4."/>
-      <w:lvlJc w:val="left"/>
-      <w:pPr>
-        <w:tabs>
-          <w:tab w:val="num" w:pos="2880"/>
-        </w:tabs>
-        <w:ind w:left="2880" w:hanging="360"/>
-      </w:pPr>
-    </w:lvl>
-    <w:lvl w:ilvl="4" w:tentative="1">
-      <w:start w:val="1"/>
-      <w:numFmt w:val="decimal"/>
-      <w:lvlText w:val="%5."/>
-      <w:lvlJc w:val="left"/>
-      <w:pPr>
-        <w:tabs>
-          <w:tab w:val="num" w:pos="3600"/>
-        </w:tabs>
-        <w:ind w:left="3600" w:hanging="360"/>
-      </w:pPr>
-    </w:lvl>
-    <w:lvl w:ilvl="5" w:tentative="1">
-      <w:start w:val="1"/>
-      <w:numFmt w:val="decimal"/>
-      <w:lvlText w:val="%6."/>
-      <w:lvlJc w:val="left"/>
-      <w:pPr>
-        <w:tabs>
-          <w:tab w:val="num" w:pos="4320"/>
-        </w:tabs>
-        <w:ind w:left="4320" w:hanging="360"/>
-      </w:pPr>
-    </w:lvl>
-    <w:lvl w:ilvl="6" w:tentative="1">
-      <w:start w:val="1"/>
-      <w:numFmt w:val="decimal"/>
-      <w:lvlText w:val="%7."/>
-      <w:lvlJc w:val="left"/>
-      <w:pPr>
-        <w:tabs>
-          <w:tab w:val="num" w:pos="5040"/>
-        </w:tabs>
-        <w:ind w:left="5040" w:hanging="360"/>
-      </w:pPr>
-    </w:lvl>
-    <w:lvl w:ilvl="7" w:tentative="1">
-      <w:start w:val="1"/>
-      <w:numFmt w:val="decimal"/>
-      <w:lvlText w:val="%8."/>
-      <w:lvlJc w:val="left"/>
-      <w:pPr>
-        <w:tabs>
-          <w:tab w:val="num" w:pos="5760"/>
-        </w:tabs>
-        <w:ind w:left="5760" w:hanging="360"/>
-      </w:pPr>
-    </w:lvl>
-    <w:lvl w:ilvl="8" w:tentative="1">
-      <w:start w:val="1"/>
-      <w:numFmt w:val="decimal"/>
-      <w:lvlText w:val="%9."/>
-      <w:lvlJc w:val="left"/>
-      <w:pPr>
-        <w:tabs>
-          <w:tab w:val="num" w:pos="6480"/>
-        </w:tabs>
-        <w:ind w:left="6480" w:hanging="360"/>
-      </w:pPr>
-    </w:lvl>
-  </w:abstractNum>
-  <w:abstractNum w:abstractNumId="2" w15:restartNumberingAfterBreak="0">
-    <w:nsid w:val="185A674E"/>
-    <w:multiLevelType w:val="multilevel"/>
-    <w:tmpl w:val="CEE014A2"/>
+    <w:tmpl w:val="1BD082F6"/>
     <w:lvl w:ilvl="0">
       <w:start w:val="1"/>
       <w:numFmt w:val="bullet"/>
@@ -6362,10 +6568,10 @@
       </w:rPr>
     </w:lvl>
   </w:abstractNum>
-  <w:abstractNum w:abstractNumId="3" w15:restartNumberingAfterBreak="0">
-    <w:nsid w:val="1D184AF3"/>
+  <w:abstractNum w:abstractNumId="4" w15:restartNumberingAfterBreak="0">
+    <w:nsid w:val="20D82971"/>
     <w:multiLevelType w:val="multilevel"/>
-    <w:tmpl w:val="458C77AE"/>
+    <w:tmpl w:val="101C81C8"/>
     <w:lvl w:ilvl="0">
       <w:start w:val="1"/>
       <w:numFmt w:val="bullet"/>
@@ -6511,236 +6717,10 @@
       </w:rPr>
     </w:lvl>
   </w:abstractNum>
-  <w:abstractNum w:abstractNumId="4" w15:restartNumberingAfterBreak="0">
-    <w:nsid w:val="252F2699"/>
+  <w:abstractNum w:abstractNumId="5" w15:restartNumberingAfterBreak="0">
+    <w:nsid w:val="40E559CE"/>
     <w:multiLevelType w:val="multilevel"/>
-    <w:tmpl w:val="D37848C6"/>
-    <w:lvl w:ilvl="0">
-      <w:start w:val="1"/>
-      <w:numFmt w:val="decimal"/>
-      <w:lvlText w:val="%1."/>
-      <w:lvlJc w:val="left"/>
-      <w:pPr>
-        <w:tabs>
-          <w:tab w:val="num" w:pos="720"/>
-        </w:tabs>
-        <w:ind w:left="720" w:hanging="360"/>
-      </w:pPr>
-    </w:lvl>
-    <w:lvl w:ilvl="1" w:tentative="1">
-      <w:start w:val="1"/>
-      <w:numFmt w:val="decimal"/>
-      <w:lvlText w:val="%2."/>
-      <w:lvlJc w:val="left"/>
-      <w:pPr>
-        <w:tabs>
-          <w:tab w:val="num" w:pos="1440"/>
-        </w:tabs>
-        <w:ind w:left="1440" w:hanging="360"/>
-      </w:pPr>
-    </w:lvl>
-    <w:lvl w:ilvl="2" w:tentative="1">
-      <w:start w:val="1"/>
-      <w:numFmt w:val="decimal"/>
-      <w:lvlText w:val="%3."/>
-      <w:lvlJc w:val="left"/>
-      <w:pPr>
-        <w:tabs>
-          <w:tab w:val="num" w:pos="2160"/>
-        </w:tabs>
-        <w:ind w:left="2160" w:hanging="360"/>
-      </w:pPr>
-    </w:lvl>
-    <w:lvl w:ilvl="3" w:tentative="1">
-      <w:start w:val="1"/>
-      <w:numFmt w:val="decimal"/>
-      <w:lvlText w:val="%4."/>
-      <w:lvlJc w:val="left"/>
-      <w:pPr>
-        <w:tabs>
-          <w:tab w:val="num" w:pos="2880"/>
-        </w:tabs>
-        <w:ind w:left="2880" w:hanging="360"/>
-      </w:pPr>
-    </w:lvl>
-    <w:lvl w:ilvl="4" w:tentative="1">
-      <w:start w:val="1"/>
-      <w:numFmt w:val="decimal"/>
-      <w:lvlText w:val="%5."/>
-      <w:lvlJc w:val="left"/>
-      <w:pPr>
-        <w:tabs>
-          <w:tab w:val="num" w:pos="3600"/>
-        </w:tabs>
-        <w:ind w:left="3600" w:hanging="360"/>
-      </w:pPr>
-    </w:lvl>
-    <w:lvl w:ilvl="5" w:tentative="1">
-      <w:start w:val="1"/>
-      <w:numFmt w:val="decimal"/>
-      <w:lvlText w:val="%6."/>
-      <w:lvlJc w:val="left"/>
-      <w:pPr>
-        <w:tabs>
-          <w:tab w:val="num" w:pos="4320"/>
-        </w:tabs>
-        <w:ind w:left="4320" w:hanging="360"/>
-      </w:pPr>
-    </w:lvl>
-    <w:lvl w:ilvl="6" w:tentative="1">
-      <w:start w:val="1"/>
-      <w:numFmt w:val="decimal"/>
-      <w:lvlText w:val="%7."/>
-      <w:lvlJc w:val="left"/>
-      <w:pPr>
-        <w:tabs>
-          <w:tab w:val="num" w:pos="5040"/>
-        </w:tabs>
-        <w:ind w:left="5040" w:hanging="360"/>
-      </w:pPr>
-    </w:lvl>
-    <w:lvl w:ilvl="7" w:tentative="1">
-      <w:start w:val="1"/>
-      <w:numFmt w:val="decimal"/>
-      <w:lvlText w:val="%8."/>
-      <w:lvlJc w:val="left"/>
-      <w:pPr>
-        <w:tabs>
-          <w:tab w:val="num" w:pos="5760"/>
-        </w:tabs>
-        <w:ind w:left="5760" w:hanging="360"/>
-      </w:pPr>
-    </w:lvl>
-    <w:lvl w:ilvl="8" w:tentative="1">
-      <w:start w:val="1"/>
-      <w:numFmt w:val="decimal"/>
-      <w:lvlText w:val="%9."/>
-      <w:lvlJc w:val="left"/>
-      <w:pPr>
-        <w:tabs>
-          <w:tab w:val="num" w:pos="6480"/>
-        </w:tabs>
-        <w:ind w:left="6480" w:hanging="360"/>
-      </w:pPr>
-    </w:lvl>
-  </w:abstractNum>
-  <w:abstractNum w:abstractNumId="5" w15:restartNumberingAfterBreak="0">
-    <w:nsid w:val="37B72970"/>
-    <w:multiLevelType w:val="multilevel"/>
-    <w:tmpl w:val="C61007D8"/>
-    <w:lvl w:ilvl="0">
-      <w:start w:val="1"/>
-      <w:numFmt w:val="decimal"/>
-      <w:lvlText w:val="%1."/>
-      <w:lvlJc w:val="left"/>
-      <w:pPr>
-        <w:tabs>
-          <w:tab w:val="num" w:pos="720"/>
-        </w:tabs>
-        <w:ind w:left="720" w:hanging="360"/>
-      </w:pPr>
-    </w:lvl>
-    <w:lvl w:ilvl="1" w:tentative="1">
-      <w:start w:val="1"/>
-      <w:numFmt w:val="decimal"/>
-      <w:lvlText w:val="%2."/>
-      <w:lvlJc w:val="left"/>
-      <w:pPr>
-        <w:tabs>
-          <w:tab w:val="num" w:pos="1440"/>
-        </w:tabs>
-        <w:ind w:left="1440" w:hanging="360"/>
-      </w:pPr>
-    </w:lvl>
-    <w:lvl w:ilvl="2" w:tentative="1">
-      <w:start w:val="1"/>
-      <w:numFmt w:val="decimal"/>
-      <w:lvlText w:val="%3."/>
-      <w:lvlJc w:val="left"/>
-      <w:pPr>
-        <w:tabs>
-          <w:tab w:val="num" w:pos="2160"/>
-        </w:tabs>
-        <w:ind w:left="2160" w:hanging="360"/>
-      </w:pPr>
-    </w:lvl>
-    <w:lvl w:ilvl="3" w:tentative="1">
-      <w:start w:val="1"/>
-      <w:numFmt w:val="decimal"/>
-      <w:lvlText w:val="%4."/>
-      <w:lvlJc w:val="left"/>
-      <w:pPr>
-        <w:tabs>
-          <w:tab w:val="num" w:pos="2880"/>
-        </w:tabs>
-        <w:ind w:left="2880" w:hanging="360"/>
-      </w:pPr>
-    </w:lvl>
-    <w:lvl w:ilvl="4" w:tentative="1">
-      <w:start w:val="1"/>
-      <w:numFmt w:val="decimal"/>
-      <w:lvlText w:val="%5."/>
-      <w:lvlJc w:val="left"/>
-      <w:pPr>
-        <w:tabs>
-          <w:tab w:val="num" w:pos="3600"/>
-        </w:tabs>
-        <w:ind w:left="3600" w:hanging="360"/>
-      </w:pPr>
-    </w:lvl>
-    <w:lvl w:ilvl="5" w:tentative="1">
-      <w:start w:val="1"/>
-      <w:numFmt w:val="decimal"/>
-      <w:lvlText w:val="%6."/>
-      <w:lvlJc w:val="left"/>
-      <w:pPr>
-        <w:tabs>
-          <w:tab w:val="num" w:pos="4320"/>
-        </w:tabs>
-        <w:ind w:left="4320" w:hanging="360"/>
-      </w:pPr>
-    </w:lvl>
-    <w:lvl w:ilvl="6" w:tentative="1">
-      <w:start w:val="1"/>
-      <w:numFmt w:val="decimal"/>
-      <w:lvlText w:val="%7."/>
-      <w:lvlJc w:val="left"/>
-      <w:pPr>
-        <w:tabs>
-          <w:tab w:val="num" w:pos="5040"/>
-        </w:tabs>
-        <w:ind w:left="5040" w:hanging="360"/>
-      </w:pPr>
-    </w:lvl>
-    <w:lvl w:ilvl="7" w:tentative="1">
-      <w:start w:val="1"/>
-      <w:numFmt w:val="decimal"/>
-      <w:lvlText w:val="%8."/>
-      <w:lvlJc w:val="left"/>
-      <w:pPr>
-        <w:tabs>
-          <w:tab w:val="num" w:pos="5760"/>
-        </w:tabs>
-        <w:ind w:left="5760" w:hanging="360"/>
-      </w:pPr>
-    </w:lvl>
-    <w:lvl w:ilvl="8" w:tentative="1">
-      <w:start w:val="1"/>
-      <w:numFmt w:val="decimal"/>
-      <w:lvlText w:val="%9."/>
-      <w:lvlJc w:val="left"/>
-      <w:pPr>
-        <w:tabs>
-          <w:tab w:val="num" w:pos="6480"/>
-        </w:tabs>
-        <w:ind w:left="6480" w:hanging="360"/>
-      </w:pPr>
-    </w:lvl>
-  </w:abstractNum>
-  <w:abstractNum w:abstractNumId="6" w15:restartNumberingAfterBreak="0">
-    <w:nsid w:val="3BCB19E1"/>
-    <w:multiLevelType w:val="multilevel"/>
-    <w:tmpl w:val="E17293EA"/>
+    <w:tmpl w:val="1892E94E"/>
     <w:lvl w:ilvl="0">
       <w:start w:val="1"/>
       <w:numFmt w:val="bullet"/>
@@ -6886,10 +6866,10 @@
       </w:rPr>
     </w:lvl>
   </w:abstractNum>
-  <w:abstractNum w:abstractNumId="7" w15:restartNumberingAfterBreak="0">
-    <w:nsid w:val="47FE17D9"/>
+  <w:abstractNum w:abstractNumId="6" w15:restartNumberingAfterBreak="0">
+    <w:nsid w:val="46DB071D"/>
     <w:multiLevelType w:val="multilevel"/>
-    <w:tmpl w:val="43CAEE8C"/>
+    <w:tmpl w:val="12F82C02"/>
     <w:lvl w:ilvl="0">
       <w:start w:val="1"/>
       <w:numFmt w:val="decimal"/>
@@ -6902,463 +6882,7 @@
         <w:ind w:left="720" w:hanging="360"/>
       </w:pPr>
     </w:lvl>
-    <w:lvl w:ilvl="1" w:tentative="1">
-      <w:start w:val="1"/>
-      <w:numFmt w:val="decimal"/>
-      <w:lvlText w:val="%2."/>
-      <w:lvlJc w:val="left"/>
-      <w:pPr>
-        <w:tabs>
-          <w:tab w:val="num" w:pos="1440"/>
-        </w:tabs>
-        <w:ind w:left="1440" w:hanging="360"/>
-      </w:pPr>
-    </w:lvl>
-    <w:lvl w:ilvl="2" w:tentative="1">
-      <w:start w:val="1"/>
-      <w:numFmt w:val="decimal"/>
-      <w:lvlText w:val="%3."/>
-      <w:lvlJc w:val="left"/>
-      <w:pPr>
-        <w:tabs>
-          <w:tab w:val="num" w:pos="2160"/>
-        </w:tabs>
-        <w:ind w:left="2160" w:hanging="360"/>
-      </w:pPr>
-    </w:lvl>
-    <w:lvl w:ilvl="3" w:tentative="1">
-      <w:start w:val="1"/>
-      <w:numFmt w:val="decimal"/>
-      <w:lvlText w:val="%4."/>
-      <w:lvlJc w:val="left"/>
-      <w:pPr>
-        <w:tabs>
-          <w:tab w:val="num" w:pos="2880"/>
-        </w:tabs>
-        <w:ind w:left="2880" w:hanging="360"/>
-      </w:pPr>
-    </w:lvl>
-    <w:lvl w:ilvl="4" w:tentative="1">
-      <w:start w:val="1"/>
-      <w:numFmt w:val="decimal"/>
-      <w:lvlText w:val="%5."/>
-      <w:lvlJc w:val="left"/>
-      <w:pPr>
-        <w:tabs>
-          <w:tab w:val="num" w:pos="3600"/>
-        </w:tabs>
-        <w:ind w:left="3600" w:hanging="360"/>
-      </w:pPr>
-    </w:lvl>
-    <w:lvl w:ilvl="5" w:tentative="1">
-      <w:start w:val="1"/>
-      <w:numFmt w:val="decimal"/>
-      <w:lvlText w:val="%6."/>
-      <w:lvlJc w:val="left"/>
-      <w:pPr>
-        <w:tabs>
-          <w:tab w:val="num" w:pos="4320"/>
-        </w:tabs>
-        <w:ind w:left="4320" w:hanging="360"/>
-      </w:pPr>
-    </w:lvl>
-    <w:lvl w:ilvl="6" w:tentative="1">
-      <w:start w:val="1"/>
-      <w:numFmt w:val="decimal"/>
-      <w:lvlText w:val="%7."/>
-      <w:lvlJc w:val="left"/>
-      <w:pPr>
-        <w:tabs>
-          <w:tab w:val="num" w:pos="5040"/>
-        </w:tabs>
-        <w:ind w:left="5040" w:hanging="360"/>
-      </w:pPr>
-    </w:lvl>
-    <w:lvl w:ilvl="7" w:tentative="1">
-      <w:start w:val="1"/>
-      <w:numFmt w:val="decimal"/>
-      <w:lvlText w:val="%8."/>
-      <w:lvlJc w:val="left"/>
-      <w:pPr>
-        <w:tabs>
-          <w:tab w:val="num" w:pos="5760"/>
-        </w:tabs>
-        <w:ind w:left="5760" w:hanging="360"/>
-      </w:pPr>
-    </w:lvl>
-    <w:lvl w:ilvl="8" w:tentative="1">
-      <w:start w:val="1"/>
-      <w:numFmt w:val="decimal"/>
-      <w:lvlText w:val="%9."/>
-      <w:lvlJc w:val="left"/>
-      <w:pPr>
-        <w:tabs>
-          <w:tab w:val="num" w:pos="6480"/>
-        </w:tabs>
-        <w:ind w:left="6480" w:hanging="360"/>
-      </w:pPr>
-    </w:lvl>
-  </w:abstractNum>
-  <w:abstractNum w:abstractNumId="8" w15:restartNumberingAfterBreak="0">
-    <w:nsid w:val="48F52517"/>
-    <w:multiLevelType w:val="multilevel"/>
-    <w:tmpl w:val="53204F86"/>
-    <w:lvl w:ilvl="0">
-      <w:start w:val="1"/>
-      <w:numFmt w:val="decimal"/>
-      <w:lvlText w:val="%1."/>
-      <w:lvlJc w:val="left"/>
-      <w:pPr>
-        <w:tabs>
-          <w:tab w:val="num" w:pos="720"/>
-        </w:tabs>
-        <w:ind w:left="720" w:hanging="360"/>
-      </w:pPr>
-    </w:lvl>
-    <w:lvl w:ilvl="1" w:tentative="1">
-      <w:start w:val="1"/>
-      <w:numFmt w:val="decimal"/>
-      <w:lvlText w:val="%2."/>
-      <w:lvlJc w:val="left"/>
-      <w:pPr>
-        <w:tabs>
-          <w:tab w:val="num" w:pos="1440"/>
-        </w:tabs>
-        <w:ind w:left="1440" w:hanging="360"/>
-      </w:pPr>
-    </w:lvl>
-    <w:lvl w:ilvl="2" w:tentative="1">
-      <w:start w:val="1"/>
-      <w:numFmt w:val="decimal"/>
-      <w:lvlText w:val="%3."/>
-      <w:lvlJc w:val="left"/>
-      <w:pPr>
-        <w:tabs>
-          <w:tab w:val="num" w:pos="2160"/>
-        </w:tabs>
-        <w:ind w:left="2160" w:hanging="360"/>
-      </w:pPr>
-    </w:lvl>
-    <w:lvl w:ilvl="3" w:tentative="1">
-      <w:start w:val="1"/>
-      <w:numFmt w:val="decimal"/>
-      <w:lvlText w:val="%4."/>
-      <w:lvlJc w:val="left"/>
-      <w:pPr>
-        <w:tabs>
-          <w:tab w:val="num" w:pos="2880"/>
-        </w:tabs>
-        <w:ind w:left="2880" w:hanging="360"/>
-      </w:pPr>
-    </w:lvl>
-    <w:lvl w:ilvl="4" w:tentative="1">
-      <w:start w:val="1"/>
-      <w:numFmt w:val="decimal"/>
-      <w:lvlText w:val="%5."/>
-      <w:lvlJc w:val="left"/>
-      <w:pPr>
-        <w:tabs>
-          <w:tab w:val="num" w:pos="3600"/>
-        </w:tabs>
-        <w:ind w:left="3600" w:hanging="360"/>
-      </w:pPr>
-    </w:lvl>
-    <w:lvl w:ilvl="5" w:tentative="1">
-      <w:start w:val="1"/>
-      <w:numFmt w:val="decimal"/>
-      <w:lvlText w:val="%6."/>
-      <w:lvlJc w:val="left"/>
-      <w:pPr>
-        <w:tabs>
-          <w:tab w:val="num" w:pos="4320"/>
-        </w:tabs>
-        <w:ind w:left="4320" w:hanging="360"/>
-      </w:pPr>
-    </w:lvl>
-    <w:lvl w:ilvl="6" w:tentative="1">
-      <w:start w:val="1"/>
-      <w:numFmt w:val="decimal"/>
-      <w:lvlText w:val="%7."/>
-      <w:lvlJc w:val="left"/>
-      <w:pPr>
-        <w:tabs>
-          <w:tab w:val="num" w:pos="5040"/>
-        </w:tabs>
-        <w:ind w:left="5040" w:hanging="360"/>
-      </w:pPr>
-    </w:lvl>
-    <w:lvl w:ilvl="7" w:tentative="1">
-      <w:start w:val="1"/>
-      <w:numFmt w:val="decimal"/>
-      <w:lvlText w:val="%8."/>
-      <w:lvlJc w:val="left"/>
-      <w:pPr>
-        <w:tabs>
-          <w:tab w:val="num" w:pos="5760"/>
-        </w:tabs>
-        <w:ind w:left="5760" w:hanging="360"/>
-      </w:pPr>
-    </w:lvl>
-    <w:lvl w:ilvl="8" w:tentative="1">
-      <w:start w:val="1"/>
-      <w:numFmt w:val="decimal"/>
-      <w:lvlText w:val="%9."/>
-      <w:lvlJc w:val="left"/>
-      <w:pPr>
-        <w:tabs>
-          <w:tab w:val="num" w:pos="6480"/>
-        </w:tabs>
-        <w:ind w:left="6480" w:hanging="360"/>
-      </w:pPr>
-    </w:lvl>
-  </w:abstractNum>
-  <w:abstractNum w:abstractNumId="9" w15:restartNumberingAfterBreak="0">
-    <w:nsid w:val="4A9B5BAC"/>
-    <w:multiLevelType w:val="multilevel"/>
-    <w:tmpl w:val="27DEE974"/>
-    <w:lvl w:ilvl="0">
-      <w:start w:val="1"/>
-      <w:numFmt w:val="decimal"/>
-      <w:lvlText w:val="%1."/>
-      <w:lvlJc w:val="left"/>
-      <w:pPr>
-        <w:tabs>
-          <w:tab w:val="num" w:pos="720"/>
-        </w:tabs>
-        <w:ind w:left="720" w:hanging="360"/>
-      </w:pPr>
-    </w:lvl>
-    <w:lvl w:ilvl="1" w:tentative="1">
-      <w:start w:val="1"/>
-      <w:numFmt w:val="decimal"/>
-      <w:lvlText w:val="%2."/>
-      <w:lvlJc w:val="left"/>
-      <w:pPr>
-        <w:tabs>
-          <w:tab w:val="num" w:pos="1440"/>
-        </w:tabs>
-        <w:ind w:left="1440" w:hanging="360"/>
-      </w:pPr>
-    </w:lvl>
-    <w:lvl w:ilvl="2" w:tentative="1">
-      <w:start w:val="1"/>
-      <w:numFmt w:val="decimal"/>
-      <w:lvlText w:val="%3."/>
-      <w:lvlJc w:val="left"/>
-      <w:pPr>
-        <w:tabs>
-          <w:tab w:val="num" w:pos="2160"/>
-        </w:tabs>
-        <w:ind w:left="2160" w:hanging="360"/>
-      </w:pPr>
-    </w:lvl>
-    <w:lvl w:ilvl="3" w:tentative="1">
-      <w:start w:val="1"/>
-      <w:numFmt w:val="decimal"/>
-      <w:lvlText w:val="%4."/>
-      <w:lvlJc w:val="left"/>
-      <w:pPr>
-        <w:tabs>
-          <w:tab w:val="num" w:pos="2880"/>
-        </w:tabs>
-        <w:ind w:left="2880" w:hanging="360"/>
-      </w:pPr>
-    </w:lvl>
-    <w:lvl w:ilvl="4" w:tentative="1">
-      <w:start w:val="1"/>
-      <w:numFmt w:val="decimal"/>
-      <w:lvlText w:val="%5."/>
-      <w:lvlJc w:val="left"/>
-      <w:pPr>
-        <w:tabs>
-          <w:tab w:val="num" w:pos="3600"/>
-        </w:tabs>
-        <w:ind w:left="3600" w:hanging="360"/>
-      </w:pPr>
-    </w:lvl>
-    <w:lvl w:ilvl="5" w:tentative="1">
-      <w:start w:val="1"/>
-      <w:numFmt w:val="decimal"/>
-      <w:lvlText w:val="%6."/>
-      <w:lvlJc w:val="left"/>
-      <w:pPr>
-        <w:tabs>
-          <w:tab w:val="num" w:pos="4320"/>
-        </w:tabs>
-        <w:ind w:left="4320" w:hanging="360"/>
-      </w:pPr>
-    </w:lvl>
-    <w:lvl w:ilvl="6" w:tentative="1">
-      <w:start w:val="1"/>
-      <w:numFmt w:val="decimal"/>
-      <w:lvlText w:val="%7."/>
-      <w:lvlJc w:val="left"/>
-      <w:pPr>
-        <w:tabs>
-          <w:tab w:val="num" w:pos="5040"/>
-        </w:tabs>
-        <w:ind w:left="5040" w:hanging="360"/>
-      </w:pPr>
-    </w:lvl>
-    <w:lvl w:ilvl="7" w:tentative="1">
-      <w:start w:val="1"/>
-      <w:numFmt w:val="decimal"/>
-      <w:lvlText w:val="%8."/>
-      <w:lvlJc w:val="left"/>
-      <w:pPr>
-        <w:tabs>
-          <w:tab w:val="num" w:pos="5760"/>
-        </w:tabs>
-        <w:ind w:left="5760" w:hanging="360"/>
-      </w:pPr>
-    </w:lvl>
-    <w:lvl w:ilvl="8" w:tentative="1">
-      <w:start w:val="1"/>
-      <w:numFmt w:val="decimal"/>
-      <w:lvlText w:val="%9."/>
-      <w:lvlJc w:val="left"/>
-      <w:pPr>
-        <w:tabs>
-          <w:tab w:val="num" w:pos="6480"/>
-        </w:tabs>
-        <w:ind w:left="6480" w:hanging="360"/>
-      </w:pPr>
-    </w:lvl>
-  </w:abstractNum>
-  <w:abstractNum w:abstractNumId="10" w15:restartNumberingAfterBreak="0">
-    <w:nsid w:val="55863A6D"/>
-    <w:multiLevelType w:val="multilevel"/>
-    <w:tmpl w:val="449C8758"/>
-    <w:lvl w:ilvl="0">
-      <w:start w:val="1"/>
-      <w:numFmt w:val="decimal"/>
-      <w:lvlText w:val="%1."/>
-      <w:lvlJc w:val="left"/>
-      <w:pPr>
-        <w:tabs>
-          <w:tab w:val="num" w:pos="720"/>
-        </w:tabs>
-        <w:ind w:left="720" w:hanging="360"/>
-      </w:pPr>
-    </w:lvl>
-    <w:lvl w:ilvl="1" w:tentative="1">
-      <w:start w:val="1"/>
-      <w:numFmt w:val="decimal"/>
-      <w:lvlText w:val="%2."/>
-      <w:lvlJc w:val="left"/>
-      <w:pPr>
-        <w:tabs>
-          <w:tab w:val="num" w:pos="1440"/>
-        </w:tabs>
-        <w:ind w:left="1440" w:hanging="360"/>
-      </w:pPr>
-    </w:lvl>
-    <w:lvl w:ilvl="2" w:tentative="1">
-      <w:start w:val="1"/>
-      <w:numFmt w:val="decimal"/>
-      <w:lvlText w:val="%3."/>
-      <w:lvlJc w:val="left"/>
-      <w:pPr>
-        <w:tabs>
-          <w:tab w:val="num" w:pos="2160"/>
-        </w:tabs>
-        <w:ind w:left="2160" w:hanging="360"/>
-      </w:pPr>
-    </w:lvl>
-    <w:lvl w:ilvl="3" w:tentative="1">
-      <w:start w:val="1"/>
-      <w:numFmt w:val="decimal"/>
-      <w:lvlText w:val="%4."/>
-      <w:lvlJc w:val="left"/>
-      <w:pPr>
-        <w:tabs>
-          <w:tab w:val="num" w:pos="2880"/>
-        </w:tabs>
-        <w:ind w:left="2880" w:hanging="360"/>
-      </w:pPr>
-    </w:lvl>
-    <w:lvl w:ilvl="4" w:tentative="1">
-      <w:start w:val="1"/>
-      <w:numFmt w:val="decimal"/>
-      <w:lvlText w:val="%5."/>
-      <w:lvlJc w:val="left"/>
-      <w:pPr>
-        <w:tabs>
-          <w:tab w:val="num" w:pos="3600"/>
-        </w:tabs>
-        <w:ind w:left="3600" w:hanging="360"/>
-      </w:pPr>
-    </w:lvl>
-    <w:lvl w:ilvl="5" w:tentative="1">
-      <w:start w:val="1"/>
-      <w:numFmt w:val="decimal"/>
-      <w:lvlText w:val="%6."/>
-      <w:lvlJc w:val="left"/>
-      <w:pPr>
-        <w:tabs>
-          <w:tab w:val="num" w:pos="4320"/>
-        </w:tabs>
-        <w:ind w:left="4320" w:hanging="360"/>
-      </w:pPr>
-    </w:lvl>
-    <w:lvl w:ilvl="6" w:tentative="1">
-      <w:start w:val="1"/>
-      <w:numFmt w:val="decimal"/>
-      <w:lvlText w:val="%7."/>
-      <w:lvlJc w:val="left"/>
-      <w:pPr>
-        <w:tabs>
-          <w:tab w:val="num" w:pos="5040"/>
-        </w:tabs>
-        <w:ind w:left="5040" w:hanging="360"/>
-      </w:pPr>
-    </w:lvl>
-    <w:lvl w:ilvl="7" w:tentative="1">
-      <w:start w:val="1"/>
-      <w:numFmt w:val="decimal"/>
-      <w:lvlText w:val="%8."/>
-      <w:lvlJc w:val="left"/>
-      <w:pPr>
-        <w:tabs>
-          <w:tab w:val="num" w:pos="5760"/>
-        </w:tabs>
-        <w:ind w:left="5760" w:hanging="360"/>
-      </w:pPr>
-    </w:lvl>
-    <w:lvl w:ilvl="8" w:tentative="1">
-      <w:start w:val="1"/>
-      <w:numFmt w:val="decimal"/>
-      <w:lvlText w:val="%9."/>
-      <w:lvlJc w:val="left"/>
-      <w:pPr>
-        <w:tabs>
-          <w:tab w:val="num" w:pos="6480"/>
-        </w:tabs>
-        <w:ind w:left="6480" w:hanging="360"/>
-      </w:pPr>
-    </w:lvl>
-  </w:abstractNum>
-  <w:abstractNum w:abstractNumId="11" w15:restartNumberingAfterBreak="0">
-    <w:nsid w:val="5D653B8B"/>
-    <w:multiLevelType w:val="multilevel"/>
-    <w:tmpl w:val="1CAEC68A"/>
-    <w:lvl w:ilvl="0">
-      <w:start w:val="1"/>
-      <w:numFmt w:val="bullet"/>
-      <w:lvlText w:val=""/>
-      <w:lvlJc w:val="left"/>
-      <w:pPr>
-        <w:tabs>
-          <w:tab w:val="num" w:pos="720"/>
-        </w:tabs>
-        <w:ind w:left="720" w:hanging="360"/>
-      </w:pPr>
-      <w:rPr>
-        <w:rFonts w:ascii="Symbol" w:hAnsi="Symbol" w:hint="default"/>
-        <w:sz w:val="20"/>
-      </w:rPr>
-    </w:lvl>
-    <w:lvl w:ilvl="1" w:tentative="1">
+    <w:lvl w:ilvl="1">
       <w:start w:val="1"/>
       <w:numFmt w:val="bullet"/>
       <w:lvlText w:val="o"/>
@@ -7376,8 +6900,8 @@
     </w:lvl>
     <w:lvl w:ilvl="2" w:tentative="1">
       <w:start w:val="1"/>
-      <w:numFmt w:val="bullet"/>
-      <w:lvlText w:val=""/>
+      <w:numFmt w:val="decimal"/>
+      <w:lvlText w:val="%3."/>
       <w:lvlJc w:val="left"/>
       <w:pPr>
         <w:tabs>
@@ -7385,15 +6909,11 @@
         </w:tabs>
         <w:ind w:left="2160" w:hanging="360"/>
       </w:pPr>
-      <w:rPr>
-        <w:rFonts w:ascii="Wingdings" w:hAnsi="Wingdings" w:hint="default"/>
-        <w:sz w:val="20"/>
-      </w:rPr>
     </w:lvl>
     <w:lvl w:ilvl="3" w:tentative="1">
       <w:start w:val="1"/>
-      <w:numFmt w:val="bullet"/>
-      <w:lvlText w:val=""/>
+      <w:numFmt w:val="decimal"/>
+      <w:lvlText w:val="%4."/>
       <w:lvlJc w:val="left"/>
       <w:pPr>
         <w:tabs>
@@ -7401,15 +6921,11 @@
         </w:tabs>
         <w:ind w:left="2880" w:hanging="360"/>
       </w:pPr>
-      <w:rPr>
-        <w:rFonts w:ascii="Wingdings" w:hAnsi="Wingdings" w:hint="default"/>
-        <w:sz w:val="20"/>
-      </w:rPr>
     </w:lvl>
     <w:lvl w:ilvl="4" w:tentative="1">
       <w:start w:val="1"/>
-      <w:numFmt w:val="bullet"/>
-      <w:lvlText w:val=""/>
+      <w:numFmt w:val="decimal"/>
+      <w:lvlText w:val="%5."/>
       <w:lvlJc w:val="left"/>
       <w:pPr>
         <w:tabs>
@@ -7417,15 +6933,11 @@
         </w:tabs>
         <w:ind w:left="3600" w:hanging="360"/>
       </w:pPr>
-      <w:rPr>
-        <w:rFonts w:ascii="Wingdings" w:hAnsi="Wingdings" w:hint="default"/>
-        <w:sz w:val="20"/>
-      </w:rPr>
     </w:lvl>
     <w:lvl w:ilvl="5" w:tentative="1">
       <w:start w:val="1"/>
-      <w:numFmt w:val="bullet"/>
-      <w:lvlText w:val=""/>
+      <w:numFmt w:val="decimal"/>
+      <w:lvlText w:val="%6."/>
       <w:lvlJc w:val="left"/>
       <w:pPr>
         <w:tabs>
@@ -7433,15 +6945,11 @@
         </w:tabs>
         <w:ind w:left="4320" w:hanging="360"/>
       </w:pPr>
-      <w:rPr>
-        <w:rFonts w:ascii="Wingdings" w:hAnsi="Wingdings" w:hint="default"/>
-        <w:sz w:val="20"/>
-      </w:rPr>
     </w:lvl>
     <w:lvl w:ilvl="6" w:tentative="1">
       <w:start w:val="1"/>
-      <w:numFmt w:val="bullet"/>
-      <w:lvlText w:val=""/>
+      <w:numFmt w:val="decimal"/>
+      <w:lvlText w:val="%7."/>
       <w:lvlJc w:val="left"/>
       <w:pPr>
         <w:tabs>
@@ -7449,15 +6957,11 @@
         </w:tabs>
         <w:ind w:left="5040" w:hanging="360"/>
       </w:pPr>
-      <w:rPr>
-        <w:rFonts w:ascii="Wingdings" w:hAnsi="Wingdings" w:hint="default"/>
-        <w:sz w:val="20"/>
-      </w:rPr>
     </w:lvl>
     <w:lvl w:ilvl="7" w:tentative="1">
       <w:start w:val="1"/>
-      <w:numFmt w:val="bullet"/>
-      <w:lvlText w:val=""/>
+      <w:numFmt w:val="decimal"/>
+      <w:lvlText w:val="%8."/>
       <w:lvlJc w:val="left"/>
       <w:pPr>
         <w:tabs>
@@ -7465,15 +6969,11 @@
         </w:tabs>
         <w:ind w:left="5760" w:hanging="360"/>
       </w:pPr>
-      <w:rPr>
-        <w:rFonts w:ascii="Wingdings" w:hAnsi="Wingdings" w:hint="default"/>
-        <w:sz w:val="20"/>
-      </w:rPr>
     </w:lvl>
     <w:lvl w:ilvl="8" w:tentative="1">
       <w:start w:val="1"/>
-      <w:numFmt w:val="bullet"/>
-      <w:lvlText w:val=""/>
+      <w:numFmt w:val="decimal"/>
+      <w:lvlText w:val="%9."/>
       <w:lvlJc w:val="left"/>
       <w:pPr>
         <w:tabs>
@@ -7481,16 +6981,577 @@
         </w:tabs>
         <w:ind w:left="6480" w:hanging="360"/>
       </w:pPr>
-      <w:rPr>
-        <w:rFonts w:ascii="Wingdings" w:hAnsi="Wingdings" w:hint="default"/>
-        <w:sz w:val="20"/>
-      </w:rPr>
+    </w:lvl>
+  </w:abstractNum>
+  <w:abstractNum w:abstractNumId="7" w15:restartNumberingAfterBreak="0">
+    <w:nsid w:val="509234FA"/>
+    <w:multiLevelType w:val="multilevel"/>
+    <w:tmpl w:val="0E4010E4"/>
+    <w:lvl w:ilvl="0">
+      <w:start w:val="1"/>
+      <w:numFmt w:val="decimal"/>
+      <w:lvlText w:val="%1."/>
+      <w:lvlJc w:val="left"/>
+      <w:pPr>
+        <w:tabs>
+          <w:tab w:val="num" w:pos="720"/>
+        </w:tabs>
+        <w:ind w:left="720" w:hanging="360"/>
+      </w:pPr>
+    </w:lvl>
+    <w:lvl w:ilvl="1" w:tentative="1">
+      <w:start w:val="1"/>
+      <w:numFmt w:val="decimal"/>
+      <w:lvlText w:val="%2."/>
+      <w:lvlJc w:val="left"/>
+      <w:pPr>
+        <w:tabs>
+          <w:tab w:val="num" w:pos="1440"/>
+        </w:tabs>
+        <w:ind w:left="1440" w:hanging="360"/>
+      </w:pPr>
+    </w:lvl>
+    <w:lvl w:ilvl="2" w:tentative="1">
+      <w:start w:val="1"/>
+      <w:numFmt w:val="decimal"/>
+      <w:lvlText w:val="%3."/>
+      <w:lvlJc w:val="left"/>
+      <w:pPr>
+        <w:tabs>
+          <w:tab w:val="num" w:pos="2160"/>
+        </w:tabs>
+        <w:ind w:left="2160" w:hanging="360"/>
+      </w:pPr>
+    </w:lvl>
+    <w:lvl w:ilvl="3" w:tentative="1">
+      <w:start w:val="1"/>
+      <w:numFmt w:val="decimal"/>
+      <w:lvlText w:val="%4."/>
+      <w:lvlJc w:val="left"/>
+      <w:pPr>
+        <w:tabs>
+          <w:tab w:val="num" w:pos="2880"/>
+        </w:tabs>
+        <w:ind w:left="2880" w:hanging="360"/>
+      </w:pPr>
+    </w:lvl>
+    <w:lvl w:ilvl="4" w:tentative="1">
+      <w:start w:val="1"/>
+      <w:numFmt w:val="decimal"/>
+      <w:lvlText w:val="%5."/>
+      <w:lvlJc w:val="left"/>
+      <w:pPr>
+        <w:tabs>
+          <w:tab w:val="num" w:pos="3600"/>
+        </w:tabs>
+        <w:ind w:left="3600" w:hanging="360"/>
+      </w:pPr>
+    </w:lvl>
+    <w:lvl w:ilvl="5" w:tentative="1">
+      <w:start w:val="1"/>
+      <w:numFmt w:val="decimal"/>
+      <w:lvlText w:val="%6."/>
+      <w:lvlJc w:val="left"/>
+      <w:pPr>
+        <w:tabs>
+          <w:tab w:val="num" w:pos="4320"/>
+        </w:tabs>
+        <w:ind w:left="4320" w:hanging="360"/>
+      </w:pPr>
+    </w:lvl>
+    <w:lvl w:ilvl="6" w:tentative="1">
+      <w:start w:val="1"/>
+      <w:numFmt w:val="decimal"/>
+      <w:lvlText w:val="%7."/>
+      <w:lvlJc w:val="left"/>
+      <w:pPr>
+        <w:tabs>
+          <w:tab w:val="num" w:pos="5040"/>
+        </w:tabs>
+        <w:ind w:left="5040" w:hanging="360"/>
+      </w:pPr>
+    </w:lvl>
+    <w:lvl w:ilvl="7" w:tentative="1">
+      <w:start w:val="1"/>
+      <w:numFmt w:val="decimal"/>
+      <w:lvlText w:val="%8."/>
+      <w:lvlJc w:val="left"/>
+      <w:pPr>
+        <w:tabs>
+          <w:tab w:val="num" w:pos="5760"/>
+        </w:tabs>
+        <w:ind w:left="5760" w:hanging="360"/>
+      </w:pPr>
+    </w:lvl>
+    <w:lvl w:ilvl="8" w:tentative="1">
+      <w:start w:val="1"/>
+      <w:numFmt w:val="decimal"/>
+      <w:lvlText w:val="%9."/>
+      <w:lvlJc w:val="left"/>
+      <w:pPr>
+        <w:tabs>
+          <w:tab w:val="num" w:pos="6480"/>
+        </w:tabs>
+        <w:ind w:left="6480" w:hanging="360"/>
+      </w:pPr>
+    </w:lvl>
+  </w:abstractNum>
+  <w:abstractNum w:abstractNumId="8" w15:restartNumberingAfterBreak="0">
+    <w:nsid w:val="5AF23109"/>
+    <w:multiLevelType w:val="multilevel"/>
+    <w:tmpl w:val="C61CB9E2"/>
+    <w:lvl w:ilvl="0">
+      <w:start w:val="1"/>
+      <w:numFmt w:val="decimal"/>
+      <w:lvlText w:val="%1."/>
+      <w:lvlJc w:val="left"/>
+      <w:pPr>
+        <w:tabs>
+          <w:tab w:val="num" w:pos="720"/>
+        </w:tabs>
+        <w:ind w:left="720" w:hanging="360"/>
+      </w:pPr>
+    </w:lvl>
+    <w:lvl w:ilvl="1" w:tentative="1">
+      <w:start w:val="1"/>
+      <w:numFmt w:val="decimal"/>
+      <w:lvlText w:val="%2."/>
+      <w:lvlJc w:val="left"/>
+      <w:pPr>
+        <w:tabs>
+          <w:tab w:val="num" w:pos="1440"/>
+        </w:tabs>
+        <w:ind w:left="1440" w:hanging="360"/>
+      </w:pPr>
+    </w:lvl>
+    <w:lvl w:ilvl="2" w:tentative="1">
+      <w:start w:val="1"/>
+      <w:numFmt w:val="decimal"/>
+      <w:lvlText w:val="%3."/>
+      <w:lvlJc w:val="left"/>
+      <w:pPr>
+        <w:tabs>
+          <w:tab w:val="num" w:pos="2160"/>
+        </w:tabs>
+        <w:ind w:left="2160" w:hanging="360"/>
+      </w:pPr>
+    </w:lvl>
+    <w:lvl w:ilvl="3" w:tentative="1">
+      <w:start w:val="1"/>
+      <w:numFmt w:val="decimal"/>
+      <w:lvlText w:val="%4."/>
+      <w:lvlJc w:val="left"/>
+      <w:pPr>
+        <w:tabs>
+          <w:tab w:val="num" w:pos="2880"/>
+        </w:tabs>
+        <w:ind w:left="2880" w:hanging="360"/>
+      </w:pPr>
+    </w:lvl>
+    <w:lvl w:ilvl="4" w:tentative="1">
+      <w:start w:val="1"/>
+      <w:numFmt w:val="decimal"/>
+      <w:lvlText w:val="%5."/>
+      <w:lvlJc w:val="left"/>
+      <w:pPr>
+        <w:tabs>
+          <w:tab w:val="num" w:pos="3600"/>
+        </w:tabs>
+        <w:ind w:left="3600" w:hanging="360"/>
+      </w:pPr>
+    </w:lvl>
+    <w:lvl w:ilvl="5" w:tentative="1">
+      <w:start w:val="1"/>
+      <w:numFmt w:val="decimal"/>
+      <w:lvlText w:val="%6."/>
+      <w:lvlJc w:val="left"/>
+      <w:pPr>
+        <w:tabs>
+          <w:tab w:val="num" w:pos="4320"/>
+        </w:tabs>
+        <w:ind w:left="4320" w:hanging="360"/>
+      </w:pPr>
+    </w:lvl>
+    <w:lvl w:ilvl="6" w:tentative="1">
+      <w:start w:val="1"/>
+      <w:numFmt w:val="decimal"/>
+      <w:lvlText w:val="%7."/>
+      <w:lvlJc w:val="left"/>
+      <w:pPr>
+        <w:tabs>
+          <w:tab w:val="num" w:pos="5040"/>
+        </w:tabs>
+        <w:ind w:left="5040" w:hanging="360"/>
+      </w:pPr>
+    </w:lvl>
+    <w:lvl w:ilvl="7" w:tentative="1">
+      <w:start w:val="1"/>
+      <w:numFmt w:val="decimal"/>
+      <w:lvlText w:val="%8."/>
+      <w:lvlJc w:val="left"/>
+      <w:pPr>
+        <w:tabs>
+          <w:tab w:val="num" w:pos="5760"/>
+        </w:tabs>
+        <w:ind w:left="5760" w:hanging="360"/>
+      </w:pPr>
+    </w:lvl>
+    <w:lvl w:ilvl="8" w:tentative="1">
+      <w:start w:val="1"/>
+      <w:numFmt w:val="decimal"/>
+      <w:lvlText w:val="%9."/>
+      <w:lvlJc w:val="left"/>
+      <w:pPr>
+        <w:tabs>
+          <w:tab w:val="num" w:pos="6480"/>
+        </w:tabs>
+        <w:ind w:left="6480" w:hanging="360"/>
+      </w:pPr>
+    </w:lvl>
+  </w:abstractNum>
+  <w:abstractNum w:abstractNumId="9" w15:restartNumberingAfterBreak="0">
+    <w:nsid w:val="63241E28"/>
+    <w:multiLevelType w:val="multilevel"/>
+    <w:tmpl w:val="20F261A4"/>
+    <w:lvl w:ilvl="0">
+      <w:start w:val="1"/>
+      <w:numFmt w:val="decimal"/>
+      <w:lvlText w:val="%1."/>
+      <w:lvlJc w:val="left"/>
+      <w:pPr>
+        <w:tabs>
+          <w:tab w:val="num" w:pos="720"/>
+        </w:tabs>
+        <w:ind w:left="720" w:hanging="360"/>
+      </w:pPr>
+    </w:lvl>
+    <w:lvl w:ilvl="1" w:tentative="1">
+      <w:start w:val="1"/>
+      <w:numFmt w:val="decimal"/>
+      <w:lvlText w:val="%2."/>
+      <w:lvlJc w:val="left"/>
+      <w:pPr>
+        <w:tabs>
+          <w:tab w:val="num" w:pos="1440"/>
+        </w:tabs>
+        <w:ind w:left="1440" w:hanging="360"/>
+      </w:pPr>
+    </w:lvl>
+    <w:lvl w:ilvl="2" w:tentative="1">
+      <w:start w:val="1"/>
+      <w:numFmt w:val="decimal"/>
+      <w:lvlText w:val="%3."/>
+      <w:lvlJc w:val="left"/>
+      <w:pPr>
+        <w:tabs>
+          <w:tab w:val="num" w:pos="2160"/>
+        </w:tabs>
+        <w:ind w:left="2160" w:hanging="360"/>
+      </w:pPr>
+    </w:lvl>
+    <w:lvl w:ilvl="3" w:tentative="1">
+      <w:start w:val="1"/>
+      <w:numFmt w:val="decimal"/>
+      <w:lvlText w:val="%4."/>
+      <w:lvlJc w:val="left"/>
+      <w:pPr>
+        <w:tabs>
+          <w:tab w:val="num" w:pos="2880"/>
+        </w:tabs>
+        <w:ind w:left="2880" w:hanging="360"/>
+      </w:pPr>
+    </w:lvl>
+    <w:lvl w:ilvl="4" w:tentative="1">
+      <w:start w:val="1"/>
+      <w:numFmt w:val="decimal"/>
+      <w:lvlText w:val="%5."/>
+      <w:lvlJc w:val="left"/>
+      <w:pPr>
+        <w:tabs>
+          <w:tab w:val="num" w:pos="3600"/>
+        </w:tabs>
+        <w:ind w:left="3600" w:hanging="360"/>
+      </w:pPr>
+    </w:lvl>
+    <w:lvl w:ilvl="5" w:tentative="1">
+      <w:start w:val="1"/>
+      <w:numFmt w:val="decimal"/>
+      <w:lvlText w:val="%6."/>
+      <w:lvlJc w:val="left"/>
+      <w:pPr>
+        <w:tabs>
+          <w:tab w:val="num" w:pos="4320"/>
+        </w:tabs>
+        <w:ind w:left="4320" w:hanging="360"/>
+      </w:pPr>
+    </w:lvl>
+    <w:lvl w:ilvl="6" w:tentative="1">
+      <w:start w:val="1"/>
+      <w:numFmt w:val="decimal"/>
+      <w:lvlText w:val="%7."/>
+      <w:lvlJc w:val="left"/>
+      <w:pPr>
+        <w:tabs>
+          <w:tab w:val="num" w:pos="5040"/>
+        </w:tabs>
+        <w:ind w:left="5040" w:hanging="360"/>
+      </w:pPr>
+    </w:lvl>
+    <w:lvl w:ilvl="7" w:tentative="1">
+      <w:start w:val="1"/>
+      <w:numFmt w:val="decimal"/>
+      <w:lvlText w:val="%8."/>
+      <w:lvlJc w:val="left"/>
+      <w:pPr>
+        <w:tabs>
+          <w:tab w:val="num" w:pos="5760"/>
+        </w:tabs>
+        <w:ind w:left="5760" w:hanging="360"/>
+      </w:pPr>
+    </w:lvl>
+    <w:lvl w:ilvl="8" w:tentative="1">
+      <w:start w:val="1"/>
+      <w:numFmt w:val="decimal"/>
+      <w:lvlText w:val="%9."/>
+      <w:lvlJc w:val="left"/>
+      <w:pPr>
+        <w:tabs>
+          <w:tab w:val="num" w:pos="6480"/>
+        </w:tabs>
+        <w:ind w:left="6480" w:hanging="360"/>
+      </w:pPr>
+    </w:lvl>
+  </w:abstractNum>
+  <w:abstractNum w:abstractNumId="10" w15:restartNumberingAfterBreak="0">
+    <w:nsid w:val="63A04ABC"/>
+    <w:multiLevelType w:val="multilevel"/>
+    <w:tmpl w:val="BE86CD38"/>
+    <w:lvl w:ilvl="0">
+      <w:start w:val="1"/>
+      <w:numFmt w:val="decimal"/>
+      <w:lvlText w:val="%1."/>
+      <w:lvlJc w:val="left"/>
+      <w:pPr>
+        <w:tabs>
+          <w:tab w:val="num" w:pos="720"/>
+        </w:tabs>
+        <w:ind w:left="720" w:hanging="360"/>
+      </w:pPr>
+    </w:lvl>
+    <w:lvl w:ilvl="1" w:tentative="1">
+      <w:start w:val="1"/>
+      <w:numFmt w:val="decimal"/>
+      <w:lvlText w:val="%2."/>
+      <w:lvlJc w:val="left"/>
+      <w:pPr>
+        <w:tabs>
+          <w:tab w:val="num" w:pos="1440"/>
+        </w:tabs>
+        <w:ind w:left="1440" w:hanging="360"/>
+      </w:pPr>
+    </w:lvl>
+    <w:lvl w:ilvl="2" w:tentative="1">
+      <w:start w:val="1"/>
+      <w:numFmt w:val="decimal"/>
+      <w:lvlText w:val="%3."/>
+      <w:lvlJc w:val="left"/>
+      <w:pPr>
+        <w:tabs>
+          <w:tab w:val="num" w:pos="2160"/>
+        </w:tabs>
+        <w:ind w:left="2160" w:hanging="360"/>
+      </w:pPr>
+    </w:lvl>
+    <w:lvl w:ilvl="3" w:tentative="1">
+      <w:start w:val="1"/>
+      <w:numFmt w:val="decimal"/>
+      <w:lvlText w:val="%4."/>
+      <w:lvlJc w:val="left"/>
+      <w:pPr>
+        <w:tabs>
+          <w:tab w:val="num" w:pos="2880"/>
+        </w:tabs>
+        <w:ind w:left="2880" w:hanging="360"/>
+      </w:pPr>
+    </w:lvl>
+    <w:lvl w:ilvl="4" w:tentative="1">
+      <w:start w:val="1"/>
+      <w:numFmt w:val="decimal"/>
+      <w:lvlText w:val="%5."/>
+      <w:lvlJc w:val="left"/>
+      <w:pPr>
+        <w:tabs>
+          <w:tab w:val="num" w:pos="3600"/>
+        </w:tabs>
+        <w:ind w:left="3600" w:hanging="360"/>
+      </w:pPr>
+    </w:lvl>
+    <w:lvl w:ilvl="5" w:tentative="1">
+      <w:start w:val="1"/>
+      <w:numFmt w:val="decimal"/>
+      <w:lvlText w:val="%6."/>
+      <w:lvlJc w:val="left"/>
+      <w:pPr>
+        <w:tabs>
+          <w:tab w:val="num" w:pos="4320"/>
+        </w:tabs>
+        <w:ind w:left="4320" w:hanging="360"/>
+      </w:pPr>
+    </w:lvl>
+    <w:lvl w:ilvl="6" w:tentative="1">
+      <w:start w:val="1"/>
+      <w:numFmt w:val="decimal"/>
+      <w:lvlText w:val="%7."/>
+      <w:lvlJc w:val="left"/>
+      <w:pPr>
+        <w:tabs>
+          <w:tab w:val="num" w:pos="5040"/>
+        </w:tabs>
+        <w:ind w:left="5040" w:hanging="360"/>
+      </w:pPr>
+    </w:lvl>
+    <w:lvl w:ilvl="7" w:tentative="1">
+      <w:start w:val="1"/>
+      <w:numFmt w:val="decimal"/>
+      <w:lvlText w:val="%8."/>
+      <w:lvlJc w:val="left"/>
+      <w:pPr>
+        <w:tabs>
+          <w:tab w:val="num" w:pos="5760"/>
+        </w:tabs>
+        <w:ind w:left="5760" w:hanging="360"/>
+      </w:pPr>
+    </w:lvl>
+    <w:lvl w:ilvl="8" w:tentative="1">
+      <w:start w:val="1"/>
+      <w:numFmt w:val="decimal"/>
+      <w:lvlText w:val="%9."/>
+      <w:lvlJc w:val="left"/>
+      <w:pPr>
+        <w:tabs>
+          <w:tab w:val="num" w:pos="6480"/>
+        </w:tabs>
+        <w:ind w:left="6480" w:hanging="360"/>
+      </w:pPr>
+    </w:lvl>
+  </w:abstractNum>
+  <w:abstractNum w:abstractNumId="11" w15:restartNumberingAfterBreak="0">
+    <w:nsid w:val="67707AA6"/>
+    <w:multiLevelType w:val="multilevel"/>
+    <w:tmpl w:val="EFBA4B66"/>
+    <w:lvl w:ilvl="0">
+      <w:start w:val="1"/>
+      <w:numFmt w:val="decimal"/>
+      <w:lvlText w:val="%1."/>
+      <w:lvlJc w:val="left"/>
+      <w:pPr>
+        <w:tabs>
+          <w:tab w:val="num" w:pos="720"/>
+        </w:tabs>
+        <w:ind w:left="720" w:hanging="360"/>
+      </w:pPr>
+    </w:lvl>
+    <w:lvl w:ilvl="1" w:tentative="1">
+      <w:start w:val="1"/>
+      <w:numFmt w:val="decimal"/>
+      <w:lvlText w:val="%2."/>
+      <w:lvlJc w:val="left"/>
+      <w:pPr>
+        <w:tabs>
+          <w:tab w:val="num" w:pos="1440"/>
+        </w:tabs>
+        <w:ind w:left="1440" w:hanging="360"/>
+      </w:pPr>
+    </w:lvl>
+    <w:lvl w:ilvl="2" w:tentative="1">
+      <w:start w:val="1"/>
+      <w:numFmt w:val="decimal"/>
+      <w:lvlText w:val="%3."/>
+      <w:lvlJc w:val="left"/>
+      <w:pPr>
+        <w:tabs>
+          <w:tab w:val="num" w:pos="2160"/>
+        </w:tabs>
+        <w:ind w:left="2160" w:hanging="360"/>
+      </w:pPr>
+    </w:lvl>
+    <w:lvl w:ilvl="3" w:tentative="1">
+      <w:start w:val="1"/>
+      <w:numFmt w:val="decimal"/>
+      <w:lvlText w:val="%4."/>
+      <w:lvlJc w:val="left"/>
+      <w:pPr>
+        <w:tabs>
+          <w:tab w:val="num" w:pos="2880"/>
+        </w:tabs>
+        <w:ind w:left="2880" w:hanging="360"/>
+      </w:pPr>
+    </w:lvl>
+    <w:lvl w:ilvl="4" w:tentative="1">
+      <w:start w:val="1"/>
+      <w:numFmt w:val="decimal"/>
+      <w:lvlText w:val="%5."/>
+      <w:lvlJc w:val="left"/>
+      <w:pPr>
+        <w:tabs>
+          <w:tab w:val="num" w:pos="3600"/>
+        </w:tabs>
+        <w:ind w:left="3600" w:hanging="360"/>
+      </w:pPr>
+    </w:lvl>
+    <w:lvl w:ilvl="5" w:tentative="1">
+      <w:start w:val="1"/>
+      <w:numFmt w:val="decimal"/>
+      <w:lvlText w:val="%6."/>
+      <w:lvlJc w:val="left"/>
+      <w:pPr>
+        <w:tabs>
+          <w:tab w:val="num" w:pos="4320"/>
+        </w:tabs>
+        <w:ind w:left="4320" w:hanging="360"/>
+      </w:pPr>
+    </w:lvl>
+    <w:lvl w:ilvl="6" w:tentative="1">
+      <w:start w:val="1"/>
+      <w:numFmt w:val="decimal"/>
+      <w:lvlText w:val="%7."/>
+      <w:lvlJc w:val="left"/>
+      <w:pPr>
+        <w:tabs>
+          <w:tab w:val="num" w:pos="5040"/>
+        </w:tabs>
+        <w:ind w:left="5040" w:hanging="360"/>
+      </w:pPr>
+    </w:lvl>
+    <w:lvl w:ilvl="7" w:tentative="1">
+      <w:start w:val="1"/>
+      <w:numFmt w:val="decimal"/>
+      <w:lvlText w:val="%8."/>
+      <w:lvlJc w:val="left"/>
+      <w:pPr>
+        <w:tabs>
+          <w:tab w:val="num" w:pos="5760"/>
+        </w:tabs>
+        <w:ind w:left="5760" w:hanging="360"/>
+      </w:pPr>
+    </w:lvl>
+    <w:lvl w:ilvl="8" w:tentative="1">
+      <w:start w:val="1"/>
+      <w:numFmt w:val="decimal"/>
+      <w:lvlText w:val="%9."/>
+      <w:lvlJc w:val="left"/>
+      <w:pPr>
+        <w:tabs>
+          <w:tab w:val="num" w:pos="6480"/>
+        </w:tabs>
+        <w:ind w:left="6480" w:hanging="360"/>
+      </w:pPr>
     </w:lvl>
   </w:abstractNum>
   <w:abstractNum w:abstractNumId="12" w15:restartNumberingAfterBreak="0">
-    <w:nsid w:val="67D652AC"/>
+    <w:nsid w:val="75231453"/>
     <w:multiLevelType w:val="multilevel"/>
-    <w:tmpl w:val="C05AE16A"/>
+    <w:tmpl w:val="ADF4D728"/>
     <w:lvl w:ilvl="0">
       <w:start w:val="1"/>
       <w:numFmt w:val="decimal"/>
@@ -7600,44 +7661,44 @@
       </w:pPr>
     </w:lvl>
   </w:abstractNum>
-  <w:num w:numId="1" w16cid:durableId="1453133762">
-    <w:abstractNumId w:val="10"/>
+  <w:num w:numId="1" w16cid:durableId="1398747181">
+    <w:abstractNumId w:val="12"/>
   </w:num>
-  <w:num w:numId="2" w16cid:durableId="749622731">
+  <w:num w:numId="2" w16cid:durableId="243347253">
+    <w:abstractNumId w:val="11"/>
+  </w:num>
+  <w:num w:numId="3" w16cid:durableId="492717753">
+    <w:abstractNumId w:val="0"/>
+  </w:num>
+  <w:num w:numId="4" w16cid:durableId="1532065568">
     <w:abstractNumId w:val="8"/>
   </w:num>
-  <w:num w:numId="3" w16cid:durableId="1841847073">
+  <w:num w:numId="5" w16cid:durableId="566263579">
+    <w:abstractNumId w:val="7"/>
+  </w:num>
+  <w:num w:numId="6" w16cid:durableId="1830826241">
     <w:abstractNumId w:val="1"/>
   </w:num>
-  <w:num w:numId="4" w16cid:durableId="493643930">
+  <w:num w:numId="7" w16cid:durableId="775028855">
+    <w:abstractNumId w:val="4"/>
+  </w:num>
+  <w:num w:numId="8" w16cid:durableId="1969312000">
+    <w:abstractNumId w:val="2"/>
+  </w:num>
+  <w:num w:numId="9" w16cid:durableId="1784180193">
     <w:abstractNumId w:val="5"/>
   </w:num>
-  <w:num w:numId="5" w16cid:durableId="389501527">
-    <w:abstractNumId w:val="4"/>
+  <w:num w:numId="10" w16cid:durableId="1435859751">
+    <w:abstractNumId w:val="3"/>
   </w:num>
-  <w:num w:numId="6" w16cid:durableId="1849712987">
-    <w:abstractNumId w:val="2"/>
+  <w:num w:numId="11" w16cid:durableId="649939187">
+    <w:abstractNumId w:val="9"/>
   </w:num>
-  <w:num w:numId="7" w16cid:durableId="2024014282">
+  <w:num w:numId="12" w16cid:durableId="1212155799">
     <w:abstractNumId w:val="6"/>
   </w:num>
-  <w:num w:numId="8" w16cid:durableId="1475948302">
-    <w:abstractNumId w:val="9"/>
-  </w:num>
-  <w:num w:numId="9" w16cid:durableId="409472197">
-    <w:abstractNumId w:val="11"/>
-  </w:num>
-  <w:num w:numId="10" w16cid:durableId="2047942830">
-    <w:abstractNumId w:val="3"/>
-  </w:num>
-  <w:num w:numId="11" w16cid:durableId="842357022">
-    <w:abstractNumId w:val="12"/>
-  </w:num>
-  <w:num w:numId="12" w16cid:durableId="337579610">
-    <w:abstractNumId w:val="0"/>
-  </w:num>
-  <w:num w:numId="13" w16cid:durableId="2102798508">
-    <w:abstractNumId w:val="7"/>
+  <w:num w:numId="13" w16cid:durableId="1129132168">
+    <w:abstractNumId w:val="10"/>
   </w:num>
 </w:numbering>
 </file>

</xml_diff>

<commit_message>
Add Subcontractors (directory, jobs & progress, billing & payouts)
- database/006_subcontractors.sql: subcontractors + trades, sub_jobs with
  payment stages (must total 100%) and retention %, papers, progress,
  vouchers (SV-0001, one live voucher per stage), payouts.
- SubcontractorService (PCAB expiry reminder; TIN and bank account kept
  out of Edit History), SubJobService (stages lock once billing starts),
  SubBillingService (mark reached -> voucher -> Supervisor approves ->
  payout for the exact amount; retention released after 100% done and
  all stages paid), VoucherPrint.
- Payouts are now project expenses in ProjectFinance; projects with
  subcontractor jobs can't be deleted.
- SubcontractorsPage: Directory, Jobs & Progress, Billing & Payouts,
  Edit History (Supervisor/Admin).
- 56 checks passed against the real database (test data removed).
- Guides: Developer Guide chapter 18, User Manual section 8.

Co-Authored-By: Claude Opus 5.5 <noreply@anthropic.com>
</commit_message>
<xml_diff>
--- a/docs/User Manual.docx
+++ b/docs/User Manual.docx
@@ -6926,14 +6926,1010 @@
         <w:rPr>
           <w:rFonts w:ascii="Calibri" w:eastAsia="Times New Roman" w:hAnsi="Calibri" w:cs="Calibri"/>
         </w:rPr>
-        <w:t xml:space="preserve">8. Subcontractors </w:t>
+        <w:t>8. Subcontractors</w:t>
+      </w:r>
+    </w:p>
+    <w:p>
+      <w:pPr>
+        <w:pStyle w:val="NormalWeb"/>
+        <w:rPr>
+          <w:rFonts w:ascii="Calibri" w:hAnsi="Calibri" w:cs="Calibri"/>
+          <w:color w:val="1A1A1A"/>
+          <w:sz w:val="22"/>
+          <w:szCs w:val="22"/>
+        </w:rPr>
+      </w:pPr>
+      <w:r>
+        <w:rPr>
+          <w:rFonts w:ascii="Calibri" w:hAnsi="Calibri" w:cs="Calibri"/>
+          <w:color w:val="1A1A1A"/>
+          <w:sz w:val="22"/>
+          <w:szCs w:val="22"/>
+        </w:rPr>
+        <w:t xml:space="preserve">For Admins and the Subcontractors department. Approve buttons are for the </w:t>
+      </w:r>
+      <w:r>
+        <w:rPr>
+          <w:rStyle w:val="Strong"/>
+          <w:rFonts w:ascii="Calibri" w:hAnsi="Calibri" w:cs="Calibri"/>
+          <w:color w:val="1A1A1A"/>
+          <w:sz w:val="22"/>
+          <w:szCs w:val="22"/>
+        </w:rPr>
+        <w:t>Subcontractors Supervisor</w:t>
+      </w:r>
+      <w:r>
+        <w:rPr>
+          <w:rFonts w:ascii="Calibri" w:hAnsi="Calibri" w:cs="Calibri"/>
+          <w:color w:val="1A1A1A"/>
+          <w:sz w:val="22"/>
+          <w:szCs w:val="22"/>
+        </w:rPr>
+        <w:t xml:space="preserve"> and Admins. Tabs: Directory, Jobs &amp; Progress, Billing &amp; Payouts, Edit History (Supervisor and Admins).</w:t>
+      </w:r>
+    </w:p>
+    <w:p>
+      <w:pPr>
+        <w:pStyle w:val="Heading2"/>
+        <w:rPr>
+          <w:rFonts w:ascii="Calibri" w:eastAsia="Times New Roman" w:hAnsi="Calibri" w:cs="Calibri"/>
+        </w:rPr>
+      </w:pPr>
+      <w:r>
+        <w:rPr>
+          <w:rFonts w:ascii="Calibri" w:eastAsia="Times New Roman" w:hAnsi="Calibri" w:cs="Calibri"/>
+        </w:rPr>
+        <w:t>Directory</w:t>
+      </w:r>
+    </w:p>
+    <w:p>
+      <w:pPr>
+        <w:pStyle w:val="NormalWeb"/>
+        <w:rPr>
+          <w:rFonts w:ascii="Calibri" w:hAnsi="Calibri" w:cs="Calibri"/>
+          <w:color w:val="1A1A1A"/>
+          <w:sz w:val="22"/>
+          <w:szCs w:val="22"/>
+        </w:rPr>
+      </w:pPr>
+      <w:r>
+        <w:rPr>
+          <w:rFonts w:ascii="Calibri" w:hAnsi="Calibri" w:cs="Calibri"/>
+          <w:color w:val="1A1A1A"/>
+          <w:sz w:val="22"/>
+          <w:szCs w:val="22"/>
+        </w:rPr>
+        <w:t>Your subcontractors: company details, two contact people, addresses, bank details (printed on vouchers), trade categories and PCAB license.</w:t>
+      </w:r>
+    </w:p>
+    <w:p>
+      <w:pPr>
+        <w:numPr>
+          <w:ilvl w:val="0"/>
+          <w:numId w:val="18"/>
+        </w:numPr>
+        <w:spacing w:before="100" w:beforeAutospacing="1" w:after="100" w:afterAutospacing="1"/>
+        <w:rPr>
+          <w:rFonts w:ascii="Calibri" w:eastAsia="Times New Roman" w:hAnsi="Calibri" w:cs="Calibri"/>
+          <w:color w:val="1A1A1A"/>
+          <w:sz w:val="22"/>
+          <w:szCs w:val="22"/>
+        </w:rPr>
+      </w:pPr>
+      <w:r>
+        <w:rPr>
+          <w:rStyle w:val="Strong"/>
+          <w:rFonts w:ascii="Calibri" w:eastAsia="Times New Roman" w:hAnsi="Calibri" w:cs="Calibri"/>
+          <w:color w:val="1A1A1A"/>
+          <w:sz w:val="22"/>
+          <w:szCs w:val="22"/>
+        </w:rPr>
+        <w:t>Add Subcontractor</w:t>
+      </w:r>
+      <w:r>
+        <w:rPr>
+          <w:rFonts w:ascii="Calibri" w:eastAsia="Times New Roman" w:hAnsi="Calibri" w:cs="Calibri"/>
+          <w:color w:val="1A1A1A"/>
+          <w:sz w:val="22"/>
+          <w:szCs w:val="22"/>
+        </w:rPr>
+        <w:t xml:space="preserve">, fill in the form, tick at least one trade, click </w:t>
+      </w:r>
+      <w:r>
+        <w:rPr>
+          <w:rStyle w:val="Strong"/>
+          <w:rFonts w:ascii="Calibri" w:eastAsia="Times New Roman" w:hAnsi="Calibri" w:cs="Calibri"/>
+          <w:color w:val="1A1A1A"/>
+          <w:sz w:val="22"/>
+          <w:szCs w:val="22"/>
+        </w:rPr>
+        <w:t>Save</w:t>
+      </w:r>
+      <w:r>
+        <w:rPr>
+          <w:rFonts w:ascii="Calibri" w:eastAsia="Times New Roman" w:hAnsi="Calibri" w:cs="Calibri"/>
+          <w:color w:val="1A1A1A"/>
+          <w:sz w:val="22"/>
+          <w:szCs w:val="22"/>
+        </w:rPr>
+        <w:t>.</w:t>
+      </w:r>
+    </w:p>
+    <w:p>
+      <w:pPr>
+        <w:numPr>
+          <w:ilvl w:val="0"/>
+          <w:numId w:val="18"/>
+        </w:numPr>
+        <w:spacing w:before="100" w:beforeAutospacing="1" w:after="100" w:afterAutospacing="1"/>
+        <w:rPr>
+          <w:rFonts w:ascii="Calibri" w:eastAsia="Times New Roman" w:hAnsi="Calibri" w:cs="Calibri"/>
+          <w:color w:val="1A1A1A"/>
+          <w:sz w:val="22"/>
+          <w:szCs w:val="22"/>
+        </w:rPr>
+      </w:pPr>
+      <w:r>
+        <w:rPr>
+          <w:rFonts w:ascii="Calibri" w:eastAsia="Times New Roman" w:hAnsi="Calibri" w:cs="Calibri"/>
+          <w:color w:val="1A1A1A"/>
+          <w:sz w:val="22"/>
+          <w:szCs w:val="22"/>
+        </w:rPr>
+        <w:t xml:space="preserve">PCAB reminder: a row turns </w:t>
+      </w:r>
+      <w:r>
+        <w:rPr>
+          <w:rStyle w:val="Strong"/>
+          <w:rFonts w:ascii="Calibri" w:eastAsia="Times New Roman" w:hAnsi="Calibri" w:cs="Calibri"/>
+          <w:color w:val="1A1A1A"/>
+          <w:sz w:val="22"/>
+          <w:szCs w:val="22"/>
+        </w:rPr>
+        <w:t>yellow</w:t>
+      </w:r>
+      <w:r>
+        <w:rPr>
+          <w:rFonts w:ascii="Calibri" w:eastAsia="Times New Roman" w:hAnsi="Calibri" w:cs="Calibri"/>
+          <w:color w:val="1A1A1A"/>
+          <w:sz w:val="22"/>
+          <w:szCs w:val="22"/>
+        </w:rPr>
+        <w:t xml:space="preserve"> when the license expires within 30 days and </w:t>
+      </w:r>
+      <w:r>
+        <w:rPr>
+          <w:rStyle w:val="Strong"/>
+          <w:rFonts w:ascii="Calibri" w:eastAsia="Times New Roman" w:hAnsi="Calibri" w:cs="Calibri"/>
+          <w:color w:val="1A1A1A"/>
+          <w:sz w:val="22"/>
+          <w:szCs w:val="22"/>
+        </w:rPr>
+        <w:t>light red</w:t>
+      </w:r>
+      <w:r>
+        <w:rPr>
+          <w:rFonts w:ascii="Calibri" w:eastAsia="Times New Roman" w:hAnsi="Calibri" w:cs="Calibri"/>
+          <w:color w:val="1A1A1A"/>
+          <w:sz w:val="22"/>
+          <w:szCs w:val="22"/>
+        </w:rPr>
+        <w:t xml:space="preserve"> once it has expired. The tab title says </w:t>
       </w:r>
       <w:r>
         <w:rPr>
           <w:rStyle w:val="Emphasis"/>
           <w:rFonts w:ascii="Calibri" w:eastAsia="Times New Roman" w:hAnsi="Calibri" w:cs="Calibri"/>
-        </w:rPr>
-        <w:t>(coming soon)</w:t>
+          <w:color w:val="1A1A1A"/>
+          <w:sz w:val="22"/>
+          <w:szCs w:val="22"/>
+        </w:rPr>
+        <w:t>Directory (N PCAB expiring)</w:t>
+      </w:r>
+      <w:r>
+        <w:rPr>
+          <w:rFonts w:ascii="Calibri" w:eastAsia="Times New Roman" w:hAnsi="Calibri" w:cs="Calibri"/>
+          <w:color w:val="1A1A1A"/>
+          <w:sz w:val="22"/>
+          <w:szCs w:val="22"/>
+        </w:rPr>
+        <w:t>.</w:t>
+      </w:r>
+    </w:p>
+    <w:p>
+      <w:pPr>
+        <w:numPr>
+          <w:ilvl w:val="0"/>
+          <w:numId w:val="18"/>
+        </w:numPr>
+        <w:spacing w:before="100" w:beforeAutospacing="1" w:after="100" w:afterAutospacing="1"/>
+        <w:rPr>
+          <w:rFonts w:ascii="Calibri" w:eastAsia="Times New Roman" w:hAnsi="Calibri" w:cs="Calibri"/>
+          <w:color w:val="1A1A1A"/>
+          <w:sz w:val="22"/>
+          <w:szCs w:val="22"/>
+        </w:rPr>
+      </w:pPr>
+      <w:r>
+        <w:rPr>
+          <w:rFonts w:ascii="Calibri" w:eastAsia="Times New Roman" w:hAnsi="Calibri" w:cs="Calibri"/>
+          <w:color w:val="1A1A1A"/>
+          <w:sz w:val="22"/>
+          <w:szCs w:val="22"/>
+        </w:rPr>
+        <w:t>A subcontractor with jobs can't be deleted.</w:t>
+      </w:r>
+    </w:p>
+    <w:p>
+      <w:pPr>
+        <w:pStyle w:val="Heading2"/>
+        <w:rPr>
+          <w:rFonts w:ascii="Calibri" w:eastAsia="Times New Roman" w:hAnsi="Calibri" w:cs="Calibri"/>
+        </w:rPr>
+      </w:pPr>
+      <w:r>
+        <w:rPr>
+          <w:rFonts w:ascii="Calibri" w:eastAsia="Times New Roman" w:hAnsi="Calibri" w:cs="Calibri"/>
+        </w:rPr>
+        <w:t>Jobs &amp; Progress</w:t>
+      </w:r>
+    </w:p>
+    <w:p>
+      <w:pPr>
+        <w:numPr>
+          <w:ilvl w:val="0"/>
+          <w:numId w:val="19"/>
+        </w:numPr>
+        <w:spacing w:before="100" w:beforeAutospacing="1" w:after="100" w:afterAutospacing="1"/>
+        <w:rPr>
+          <w:rFonts w:ascii="Calibri" w:eastAsia="Times New Roman" w:hAnsi="Calibri" w:cs="Calibri"/>
+          <w:color w:val="1A1A1A"/>
+          <w:sz w:val="22"/>
+          <w:szCs w:val="22"/>
+        </w:rPr>
+      </w:pPr>
+      <w:r>
+        <w:rPr>
+          <w:rFonts w:ascii="Calibri" w:eastAsia="Times New Roman" w:hAnsi="Calibri" w:cs="Calibri"/>
+          <w:color w:val="1A1A1A"/>
+          <w:sz w:val="22"/>
+          <w:szCs w:val="22"/>
+        </w:rPr>
+        <w:t xml:space="preserve">Click </w:t>
+      </w:r>
+      <w:r>
+        <w:rPr>
+          <w:rStyle w:val="Strong"/>
+          <w:rFonts w:ascii="Calibri" w:eastAsia="Times New Roman" w:hAnsi="Calibri" w:cs="Calibri"/>
+          <w:color w:val="1A1A1A"/>
+          <w:sz w:val="22"/>
+          <w:szCs w:val="22"/>
+        </w:rPr>
+        <w:t>New Job</w:t>
+      </w:r>
+      <w:r>
+        <w:rPr>
+          <w:rFonts w:ascii="Calibri" w:eastAsia="Times New Roman" w:hAnsi="Calibri" w:cs="Calibri"/>
+          <w:color w:val="1A1A1A"/>
+          <w:sz w:val="22"/>
+          <w:szCs w:val="22"/>
+        </w:rPr>
+        <w:t xml:space="preserve">. Choose the </w:t>
+      </w:r>
+      <w:r>
+        <w:rPr>
+          <w:rStyle w:val="Strong"/>
+          <w:rFonts w:ascii="Calibri" w:eastAsia="Times New Roman" w:hAnsi="Calibri" w:cs="Calibri"/>
+          <w:color w:val="1A1A1A"/>
+          <w:sz w:val="22"/>
+          <w:szCs w:val="22"/>
+        </w:rPr>
+        <w:t>subcontractor</w:t>
+      </w:r>
+      <w:r>
+        <w:rPr>
+          <w:rFonts w:ascii="Calibri" w:eastAsia="Times New Roman" w:hAnsi="Calibri" w:cs="Calibri"/>
+          <w:color w:val="1A1A1A"/>
+          <w:sz w:val="22"/>
+          <w:szCs w:val="22"/>
+        </w:rPr>
+        <w:t xml:space="preserve"> and the </w:t>
+      </w:r>
+      <w:r>
+        <w:rPr>
+          <w:rStyle w:val="Strong"/>
+          <w:rFonts w:ascii="Calibri" w:eastAsia="Times New Roman" w:hAnsi="Calibri" w:cs="Calibri"/>
+          <w:color w:val="1A1A1A"/>
+          <w:sz w:val="22"/>
+          <w:szCs w:val="22"/>
+        </w:rPr>
+        <w:t>project</w:t>
+      </w:r>
+      <w:r>
+        <w:rPr>
+          <w:rFonts w:ascii="Calibri" w:eastAsia="Times New Roman" w:hAnsi="Calibri" w:cs="Calibri"/>
+          <w:color w:val="1A1A1A"/>
+          <w:sz w:val="22"/>
+          <w:szCs w:val="22"/>
+        </w:rPr>
+        <w:t xml:space="preserve">, type the </w:t>
+      </w:r>
+      <w:r>
+        <w:rPr>
+          <w:rStyle w:val="Strong"/>
+          <w:rFonts w:ascii="Calibri" w:eastAsia="Times New Roman" w:hAnsi="Calibri" w:cs="Calibri"/>
+          <w:color w:val="1A1A1A"/>
+          <w:sz w:val="22"/>
+          <w:szCs w:val="22"/>
+        </w:rPr>
+        <w:t>scope</w:t>
+      </w:r>
+      <w:r>
+        <w:rPr>
+          <w:rFonts w:ascii="Calibri" w:eastAsia="Times New Roman" w:hAnsi="Calibri" w:cs="Calibri"/>
+          <w:color w:val="1A1A1A"/>
+          <w:sz w:val="22"/>
+          <w:szCs w:val="22"/>
+        </w:rPr>
+        <w:t xml:space="preserve">, </w:t>
+      </w:r>
+      <w:r>
+        <w:rPr>
+          <w:rStyle w:val="Strong"/>
+          <w:rFonts w:ascii="Calibri" w:eastAsia="Times New Roman" w:hAnsi="Calibri" w:cs="Calibri"/>
+          <w:color w:val="1A1A1A"/>
+          <w:sz w:val="22"/>
+          <w:szCs w:val="22"/>
+        </w:rPr>
+        <w:t>contract amount</w:t>
+      </w:r>
+      <w:r>
+        <w:rPr>
+          <w:rFonts w:ascii="Calibri" w:eastAsia="Times New Roman" w:hAnsi="Calibri" w:cs="Calibri"/>
+          <w:color w:val="1A1A1A"/>
+          <w:sz w:val="22"/>
+          <w:szCs w:val="22"/>
+        </w:rPr>
+        <w:t xml:space="preserve"> and dates.</w:t>
+      </w:r>
+    </w:p>
+    <w:p>
+      <w:pPr>
+        <w:numPr>
+          <w:ilvl w:val="0"/>
+          <w:numId w:val="19"/>
+        </w:numPr>
+        <w:spacing w:before="100" w:beforeAutospacing="1" w:after="100" w:afterAutospacing="1"/>
+        <w:rPr>
+          <w:rFonts w:ascii="Calibri" w:eastAsia="Times New Roman" w:hAnsi="Calibri" w:cs="Calibri"/>
+          <w:color w:val="1A1A1A"/>
+          <w:sz w:val="22"/>
+          <w:szCs w:val="22"/>
+        </w:rPr>
+      </w:pPr>
+      <w:r>
+        <w:rPr>
+          <w:rFonts w:ascii="Calibri" w:eastAsia="Times New Roman" w:hAnsi="Calibri" w:cs="Calibri"/>
+          <w:color w:val="1A1A1A"/>
+          <w:sz w:val="22"/>
+          <w:szCs w:val="22"/>
+        </w:rPr>
+        <w:t xml:space="preserve">Set the </w:t>
+      </w:r>
+      <w:r>
+        <w:rPr>
+          <w:rStyle w:val="Strong"/>
+          <w:rFonts w:ascii="Calibri" w:eastAsia="Times New Roman" w:hAnsi="Calibri" w:cs="Calibri"/>
+          <w:color w:val="1A1A1A"/>
+          <w:sz w:val="22"/>
+          <w:szCs w:val="22"/>
+        </w:rPr>
+        <w:t>retention %</w:t>
+      </w:r>
+      <w:r>
+        <w:rPr>
+          <w:rFonts w:ascii="Calibri" w:eastAsia="Times New Roman" w:hAnsi="Calibri" w:cs="Calibri"/>
+          <w:color w:val="1A1A1A"/>
+          <w:sz w:val="22"/>
+          <w:szCs w:val="22"/>
+        </w:rPr>
+        <w:t xml:space="preserve"> (default 10, can be 0). It is held back from every payment.</w:t>
+      </w:r>
+    </w:p>
+    <w:p>
+      <w:pPr>
+        <w:numPr>
+          <w:ilvl w:val="0"/>
+          <w:numId w:val="19"/>
+        </w:numPr>
+        <w:spacing w:before="100" w:beforeAutospacing="1" w:after="100" w:afterAutospacing="1"/>
+        <w:rPr>
+          <w:rFonts w:ascii="Calibri" w:eastAsia="Times New Roman" w:hAnsi="Calibri" w:cs="Calibri"/>
+          <w:color w:val="1A1A1A"/>
+          <w:sz w:val="22"/>
+          <w:szCs w:val="22"/>
+        </w:rPr>
+      </w:pPr>
+      <w:r>
+        <w:rPr>
+          <w:rFonts w:ascii="Calibri" w:eastAsia="Times New Roman" w:hAnsi="Calibri" w:cs="Calibri"/>
+          <w:color w:val="1A1A1A"/>
+          <w:sz w:val="22"/>
+          <w:szCs w:val="22"/>
+        </w:rPr>
+        <w:t xml:space="preserve">Set the </w:t>
+      </w:r>
+      <w:r>
+        <w:rPr>
+          <w:rStyle w:val="Strong"/>
+          <w:rFonts w:ascii="Calibri" w:eastAsia="Times New Roman" w:hAnsi="Calibri" w:cs="Calibri"/>
+          <w:color w:val="1A1A1A"/>
+          <w:sz w:val="22"/>
+          <w:szCs w:val="22"/>
+        </w:rPr>
+        <w:t>payment stages</w:t>
+      </w:r>
+      <w:r>
+        <w:rPr>
+          <w:rFonts w:ascii="Calibri" w:eastAsia="Times New Roman" w:hAnsi="Calibri" w:cs="Calibri"/>
+          <w:color w:val="1A1A1A"/>
+          <w:sz w:val="22"/>
+          <w:szCs w:val="22"/>
+        </w:rPr>
+        <w:t xml:space="preserve"> (default: Down payment 30%, Midway 40%, Completion 30%). Edit the names and %s in the table; </w:t>
+      </w:r>
+      <w:r>
+        <w:rPr>
+          <w:rStyle w:val="Strong"/>
+          <w:rFonts w:ascii="Calibri" w:eastAsia="Times New Roman" w:hAnsi="Calibri" w:cs="Calibri"/>
+          <w:color w:val="1A1A1A"/>
+          <w:sz w:val="22"/>
+          <w:szCs w:val="22"/>
+        </w:rPr>
+        <w:t>Add Stage</w:t>
+      </w:r>
+      <w:r>
+        <w:rPr>
+          <w:rFonts w:ascii="Calibri" w:eastAsia="Times New Roman" w:hAnsi="Calibri" w:cs="Calibri"/>
+          <w:color w:val="1A1A1A"/>
+          <w:sz w:val="22"/>
+          <w:szCs w:val="22"/>
+        </w:rPr>
+        <w:t xml:space="preserve"> / </w:t>
+      </w:r>
+      <w:r>
+        <w:rPr>
+          <w:rStyle w:val="Strong"/>
+          <w:rFonts w:ascii="Calibri" w:eastAsia="Times New Roman" w:hAnsi="Calibri" w:cs="Calibri"/>
+          <w:color w:val="1A1A1A"/>
+          <w:sz w:val="22"/>
+          <w:szCs w:val="22"/>
+        </w:rPr>
+        <w:t>Remove Stage</w:t>
+      </w:r>
+      <w:r>
+        <w:rPr>
+          <w:rFonts w:ascii="Calibri" w:eastAsia="Times New Roman" w:hAnsi="Calibri" w:cs="Calibri"/>
+          <w:color w:val="1A1A1A"/>
+          <w:sz w:val="22"/>
+          <w:szCs w:val="22"/>
+        </w:rPr>
+        <w:t xml:space="preserve">. They must add up to </w:t>
+      </w:r>
+      <w:r>
+        <w:rPr>
+          <w:rStyle w:val="Strong"/>
+          <w:rFonts w:ascii="Calibri" w:eastAsia="Times New Roman" w:hAnsi="Calibri" w:cs="Calibri"/>
+          <w:color w:val="1A1A1A"/>
+          <w:sz w:val="22"/>
+          <w:szCs w:val="22"/>
+        </w:rPr>
+        <w:t>100%</w:t>
+      </w:r>
+      <w:r>
+        <w:rPr>
+          <w:rFonts w:ascii="Calibri" w:eastAsia="Times New Roman" w:hAnsi="Calibri" w:cs="Calibri"/>
+          <w:color w:val="1A1A1A"/>
+          <w:sz w:val="22"/>
+          <w:szCs w:val="22"/>
+        </w:rPr>
+        <w:t>.</w:t>
+      </w:r>
+    </w:p>
+    <w:p>
+      <w:pPr>
+        <w:numPr>
+          <w:ilvl w:val="0"/>
+          <w:numId w:val="19"/>
+        </w:numPr>
+        <w:spacing w:before="100" w:beforeAutospacing="1" w:after="100" w:afterAutospacing="1"/>
+        <w:rPr>
+          <w:rFonts w:ascii="Calibri" w:eastAsia="Times New Roman" w:hAnsi="Calibri" w:cs="Calibri"/>
+          <w:color w:val="1A1A1A"/>
+          <w:sz w:val="22"/>
+          <w:szCs w:val="22"/>
+        </w:rPr>
+      </w:pPr>
+      <w:r>
+        <w:rPr>
+          <w:rFonts w:ascii="Calibri" w:eastAsia="Times New Roman" w:hAnsi="Calibri" w:cs="Calibri"/>
+          <w:color w:val="1A1A1A"/>
+          <w:sz w:val="22"/>
+          <w:szCs w:val="22"/>
+        </w:rPr>
+        <w:t xml:space="preserve">Click </w:t>
+      </w:r>
+      <w:r>
+        <w:rPr>
+          <w:rStyle w:val="Strong"/>
+          <w:rFonts w:ascii="Calibri" w:eastAsia="Times New Roman" w:hAnsi="Calibri" w:cs="Calibri"/>
+          <w:color w:val="1A1A1A"/>
+          <w:sz w:val="22"/>
+          <w:szCs w:val="22"/>
+        </w:rPr>
+        <w:t>Save Job</w:t>
+      </w:r>
+      <w:r>
+        <w:rPr>
+          <w:rFonts w:ascii="Calibri" w:eastAsia="Times New Roman" w:hAnsi="Calibri" w:cs="Calibri"/>
+          <w:color w:val="1A1A1A"/>
+          <w:sz w:val="22"/>
+          <w:szCs w:val="22"/>
+        </w:rPr>
+        <w:t xml:space="preserve">. Then </w:t>
+      </w:r>
+      <w:r>
+        <w:rPr>
+          <w:rStyle w:val="Strong"/>
+          <w:rFonts w:ascii="Calibri" w:eastAsia="Times New Roman" w:hAnsi="Calibri" w:cs="Calibri"/>
+          <w:color w:val="1A1A1A"/>
+          <w:sz w:val="22"/>
+          <w:szCs w:val="22"/>
+        </w:rPr>
+        <w:t>Upload Document</w:t>
+      </w:r>
+      <w:r>
+        <w:rPr>
+          <w:rFonts w:ascii="Calibri" w:eastAsia="Times New Roman" w:hAnsi="Calibri" w:cs="Calibri"/>
+          <w:color w:val="1A1A1A"/>
+          <w:sz w:val="22"/>
+          <w:szCs w:val="22"/>
+        </w:rPr>
+        <w:t xml:space="preserve"> for the contract or scope papers.</w:t>
+      </w:r>
+    </w:p>
+    <w:p>
+      <w:pPr>
+        <w:pStyle w:val="NormalWeb"/>
+        <w:rPr>
+          <w:rFonts w:ascii="Calibri" w:hAnsi="Calibri" w:cs="Calibri"/>
+          <w:color w:val="1A1A1A"/>
+          <w:sz w:val="22"/>
+          <w:szCs w:val="22"/>
+        </w:rPr>
+      </w:pPr>
+      <w:r>
+        <w:rPr>
+          <w:rFonts w:ascii="Calibri" w:hAnsi="Calibri" w:cs="Calibri"/>
+          <w:color w:val="1A1A1A"/>
+          <w:sz w:val="22"/>
+          <w:szCs w:val="22"/>
+        </w:rPr>
+        <w:t>Once billing starts, only the scope and dates can change.</w:t>
+      </w:r>
+    </w:p>
+    <w:p>
+      <w:pPr>
+        <w:pStyle w:val="NormalWeb"/>
+        <w:rPr>
+          <w:rFonts w:ascii="Calibri" w:hAnsi="Calibri" w:cs="Calibri"/>
+          <w:color w:val="1A1A1A"/>
+          <w:sz w:val="22"/>
+          <w:szCs w:val="22"/>
+        </w:rPr>
+      </w:pPr>
+      <w:r>
+        <w:rPr>
+          <w:rStyle w:val="Strong"/>
+          <w:rFonts w:ascii="Calibri" w:hAnsi="Calibri" w:cs="Calibri"/>
+          <w:color w:val="1A1A1A"/>
+          <w:sz w:val="22"/>
+          <w:szCs w:val="22"/>
+        </w:rPr>
+        <w:t>Progress:</w:t>
+      </w:r>
+      <w:r>
+        <w:rPr>
+          <w:rFonts w:ascii="Calibri" w:hAnsi="Calibri" w:cs="Calibri"/>
+          <w:color w:val="1A1A1A"/>
+          <w:sz w:val="22"/>
+          <w:szCs w:val="22"/>
+        </w:rPr>
+        <w:t xml:space="preserve"> type the </w:t>
+      </w:r>
+      <w:r>
+        <w:rPr>
+          <w:rStyle w:val="Strong"/>
+          <w:rFonts w:ascii="Calibri" w:hAnsi="Calibri" w:cs="Calibri"/>
+          <w:color w:val="1A1A1A"/>
+          <w:sz w:val="22"/>
+          <w:szCs w:val="22"/>
+        </w:rPr>
+        <w:t>% completed</w:t>
+      </w:r>
+      <w:r>
+        <w:rPr>
+          <w:rFonts w:ascii="Calibri" w:hAnsi="Calibri" w:cs="Calibri"/>
+          <w:color w:val="1A1A1A"/>
+          <w:sz w:val="22"/>
+          <w:szCs w:val="22"/>
+        </w:rPr>
+        <w:t xml:space="preserve">, the date and notes, optionally </w:t>
+      </w:r>
+      <w:r>
+        <w:rPr>
+          <w:rStyle w:val="Strong"/>
+          <w:rFonts w:ascii="Calibri" w:hAnsi="Calibri" w:cs="Calibri"/>
+          <w:color w:val="1A1A1A"/>
+          <w:sz w:val="22"/>
+          <w:szCs w:val="22"/>
+        </w:rPr>
+        <w:t>Attach Photo / File</w:t>
+      </w:r>
+      <w:r>
+        <w:rPr>
+          <w:rFonts w:ascii="Calibri" w:hAnsi="Calibri" w:cs="Calibri"/>
+          <w:color w:val="1A1A1A"/>
+          <w:sz w:val="22"/>
+          <w:szCs w:val="22"/>
+        </w:rPr>
+        <w:t xml:space="preserve">, then </w:t>
+      </w:r>
+      <w:r>
+        <w:rPr>
+          <w:rStyle w:val="Strong"/>
+          <w:rFonts w:ascii="Calibri" w:hAnsi="Calibri" w:cs="Calibri"/>
+          <w:color w:val="1A1A1A"/>
+          <w:sz w:val="22"/>
+          <w:szCs w:val="22"/>
+        </w:rPr>
+        <w:t>Add Update</w:t>
+      </w:r>
+      <w:r>
+        <w:rPr>
+          <w:rFonts w:ascii="Calibri" w:hAnsi="Calibri" w:cs="Calibri"/>
+          <w:color w:val="1A1A1A"/>
+          <w:sz w:val="22"/>
+          <w:szCs w:val="22"/>
+        </w:rPr>
+        <w:t>. Double-click an update to open its file.</w:t>
+      </w:r>
+    </w:p>
+    <w:p>
+      <w:pPr>
+        <w:pStyle w:val="Heading2"/>
+        <w:rPr>
+          <w:rFonts w:ascii="Calibri" w:eastAsia="Times New Roman" w:hAnsi="Calibri" w:cs="Calibri"/>
+        </w:rPr>
+      </w:pPr>
+      <w:r>
+        <w:rPr>
+          <w:rFonts w:ascii="Calibri" w:eastAsia="Times New Roman" w:hAnsi="Calibri" w:cs="Calibri"/>
+        </w:rPr>
+        <w:t>Billing &amp; Payouts</w:t>
+      </w:r>
+    </w:p>
+    <w:p>
+      <w:pPr>
+        <w:numPr>
+          <w:ilvl w:val="0"/>
+          <w:numId w:val="20"/>
+        </w:numPr>
+        <w:spacing w:before="100" w:beforeAutospacing="1" w:after="100" w:afterAutospacing="1"/>
+        <w:rPr>
+          <w:rFonts w:ascii="Calibri" w:eastAsia="Times New Roman" w:hAnsi="Calibri" w:cs="Calibri"/>
+          <w:color w:val="1A1A1A"/>
+          <w:sz w:val="22"/>
+          <w:szCs w:val="22"/>
+        </w:rPr>
+      </w:pPr>
+      <w:r>
+        <w:rPr>
+          <w:rFonts w:ascii="Calibri" w:eastAsia="Times New Roman" w:hAnsi="Calibri" w:cs="Calibri"/>
+          <w:color w:val="1A1A1A"/>
+          <w:sz w:val="22"/>
+          <w:szCs w:val="22"/>
+        </w:rPr>
+        <w:t xml:space="preserve">Choose the </w:t>
+      </w:r>
+      <w:r>
+        <w:rPr>
+          <w:rStyle w:val="Strong"/>
+          <w:rFonts w:ascii="Calibri" w:eastAsia="Times New Roman" w:hAnsi="Calibri" w:cs="Calibri"/>
+          <w:color w:val="1A1A1A"/>
+          <w:sz w:val="22"/>
+          <w:szCs w:val="22"/>
+        </w:rPr>
+        <w:t>job</w:t>
+      </w:r>
+      <w:r>
+        <w:rPr>
+          <w:rFonts w:ascii="Calibri" w:eastAsia="Times New Roman" w:hAnsi="Calibri" w:cs="Calibri"/>
+          <w:color w:val="1A1A1A"/>
+          <w:sz w:val="22"/>
+          <w:szCs w:val="22"/>
+        </w:rPr>
+        <w:t>. The top line shows the contract, paid so far, retention held and remaining balance.</w:t>
+      </w:r>
+    </w:p>
+    <w:p>
+      <w:pPr>
+        <w:numPr>
+          <w:ilvl w:val="0"/>
+          <w:numId w:val="20"/>
+        </w:numPr>
+        <w:spacing w:before="100" w:beforeAutospacing="1" w:after="100" w:afterAutospacing="1"/>
+        <w:rPr>
+          <w:rFonts w:ascii="Calibri" w:eastAsia="Times New Roman" w:hAnsi="Calibri" w:cs="Calibri"/>
+          <w:color w:val="1A1A1A"/>
+          <w:sz w:val="22"/>
+          <w:szCs w:val="22"/>
+        </w:rPr>
+      </w:pPr>
+      <w:r>
+        <w:rPr>
+          <w:rFonts w:ascii="Calibri" w:eastAsia="Times New Roman" w:hAnsi="Calibri" w:cs="Calibri"/>
+          <w:color w:val="1A1A1A"/>
+          <w:sz w:val="22"/>
+          <w:szCs w:val="22"/>
+        </w:rPr>
+        <w:t xml:space="preserve">Select a stage and click </w:t>
+      </w:r>
+      <w:r>
+        <w:rPr>
+          <w:rStyle w:val="Strong"/>
+          <w:rFonts w:ascii="Calibri" w:eastAsia="Times New Roman" w:hAnsi="Calibri" w:cs="Calibri"/>
+          <w:color w:val="1A1A1A"/>
+          <w:sz w:val="22"/>
+          <w:szCs w:val="22"/>
+        </w:rPr>
+        <w:t>Mark Stage Reached</w:t>
+      </w:r>
+      <w:r>
+        <w:rPr>
+          <w:rFonts w:ascii="Calibri" w:eastAsia="Times New Roman" w:hAnsi="Calibri" w:cs="Calibri"/>
+          <w:color w:val="1A1A1A"/>
+          <w:sz w:val="22"/>
+          <w:szCs w:val="22"/>
+        </w:rPr>
+        <w:t xml:space="preserve">, then </w:t>
+      </w:r>
+      <w:r>
+        <w:rPr>
+          <w:rStyle w:val="Strong"/>
+          <w:rFonts w:ascii="Calibri" w:eastAsia="Times New Roman" w:hAnsi="Calibri" w:cs="Calibri"/>
+          <w:color w:val="1A1A1A"/>
+          <w:sz w:val="22"/>
+          <w:szCs w:val="22"/>
+        </w:rPr>
+        <w:t>Prepare Voucher</w:t>
+      </w:r>
+      <w:r>
+        <w:rPr>
+          <w:rFonts w:ascii="Calibri" w:eastAsia="Times New Roman" w:hAnsi="Calibri" w:cs="Calibri"/>
+          <w:color w:val="1A1A1A"/>
+          <w:sz w:val="22"/>
+          <w:szCs w:val="22"/>
+        </w:rPr>
+        <w:t>.</w:t>
+      </w:r>
+    </w:p>
+    <w:p>
+      <w:pPr>
+        <w:numPr>
+          <w:ilvl w:val="0"/>
+          <w:numId w:val="20"/>
+        </w:numPr>
+        <w:spacing w:before="100" w:beforeAutospacing="1" w:after="100" w:afterAutospacing="1"/>
+        <w:rPr>
+          <w:rFonts w:ascii="Calibri" w:eastAsia="Times New Roman" w:hAnsi="Calibri" w:cs="Calibri"/>
+          <w:color w:val="1A1A1A"/>
+          <w:sz w:val="22"/>
+          <w:szCs w:val="22"/>
+        </w:rPr>
+      </w:pPr>
+      <w:r>
+        <w:rPr>
+          <w:rFonts w:ascii="Calibri" w:eastAsia="Times New Roman" w:hAnsi="Calibri" w:cs="Calibri"/>
+          <w:color w:val="1A1A1A"/>
+          <w:sz w:val="22"/>
+          <w:szCs w:val="22"/>
+        </w:rPr>
+        <w:t xml:space="preserve">The Supervisor selects it and clicks </w:t>
+      </w:r>
+      <w:r>
+        <w:rPr>
+          <w:rStyle w:val="Strong"/>
+          <w:rFonts w:ascii="Calibri" w:eastAsia="Times New Roman" w:hAnsi="Calibri" w:cs="Calibri"/>
+          <w:color w:val="1A1A1A"/>
+          <w:sz w:val="22"/>
+          <w:szCs w:val="22"/>
+        </w:rPr>
+        <w:t>Approve Voucher</w:t>
+      </w:r>
+      <w:r>
+        <w:rPr>
+          <w:rFonts w:ascii="Calibri" w:eastAsia="Times New Roman" w:hAnsi="Calibri" w:cs="Calibri"/>
+          <w:color w:val="1A1A1A"/>
+          <w:sz w:val="22"/>
+          <w:szCs w:val="22"/>
+        </w:rPr>
+        <w:t xml:space="preserve"> (or </w:t>
+      </w:r>
+      <w:r>
+        <w:rPr>
+          <w:rStyle w:val="Strong"/>
+          <w:rFonts w:ascii="Calibri" w:eastAsia="Times New Roman" w:hAnsi="Calibri" w:cs="Calibri"/>
+          <w:color w:val="1A1A1A"/>
+          <w:sz w:val="22"/>
+          <w:szCs w:val="22"/>
+        </w:rPr>
+        <w:t>Reject Voucher</w:t>
+      </w:r>
+      <w:r>
+        <w:rPr>
+          <w:rFonts w:ascii="Calibri" w:eastAsia="Times New Roman" w:hAnsi="Calibri" w:cs="Calibri"/>
+          <w:color w:val="1A1A1A"/>
+          <w:sz w:val="22"/>
+          <w:szCs w:val="22"/>
+        </w:rPr>
+        <w:t>; the Employee can then prepare a new one).</w:t>
+      </w:r>
+    </w:p>
+    <w:p>
+      <w:pPr>
+        <w:numPr>
+          <w:ilvl w:val="0"/>
+          <w:numId w:val="20"/>
+        </w:numPr>
+        <w:spacing w:before="100" w:beforeAutospacing="1" w:after="100" w:afterAutospacing="1"/>
+        <w:rPr>
+          <w:rFonts w:ascii="Calibri" w:eastAsia="Times New Roman" w:hAnsi="Calibri" w:cs="Calibri"/>
+          <w:color w:val="1A1A1A"/>
+          <w:sz w:val="22"/>
+          <w:szCs w:val="22"/>
+        </w:rPr>
+      </w:pPr>
+      <w:r>
+        <w:rPr>
+          <w:rStyle w:val="Strong"/>
+          <w:rFonts w:ascii="Calibri" w:eastAsia="Times New Roman" w:hAnsi="Calibri" w:cs="Calibri"/>
+          <w:color w:val="1A1A1A"/>
+          <w:sz w:val="22"/>
+          <w:szCs w:val="22"/>
+        </w:rPr>
+        <w:t>Print Voucher</w:t>
+      </w:r>
+      <w:r>
+        <w:rPr>
+          <w:rFonts w:ascii="Calibri" w:eastAsia="Times New Roman" w:hAnsi="Calibri" w:cs="Calibri"/>
+          <w:color w:val="1A1A1A"/>
+          <w:sz w:val="22"/>
+          <w:szCs w:val="22"/>
+        </w:rPr>
+        <w:t xml:space="preserve"> shows it with the subcontractor's bank details (choose "Microsoft Print to PDF" for a PDF).</w:t>
+      </w:r>
+    </w:p>
+    <w:p>
+      <w:pPr>
+        <w:numPr>
+          <w:ilvl w:val="0"/>
+          <w:numId w:val="20"/>
+        </w:numPr>
+        <w:spacing w:before="100" w:beforeAutospacing="1" w:after="100" w:afterAutospacing="1"/>
+        <w:rPr>
+          <w:rFonts w:ascii="Calibri" w:eastAsia="Times New Roman" w:hAnsi="Calibri" w:cs="Calibri"/>
+          <w:color w:val="1A1A1A"/>
+          <w:sz w:val="22"/>
+          <w:szCs w:val="22"/>
+        </w:rPr>
+      </w:pPr>
+      <w:r>
+        <w:rPr>
+          <w:rFonts w:ascii="Calibri" w:eastAsia="Times New Roman" w:hAnsi="Calibri" w:cs="Calibri"/>
+          <w:color w:val="1A1A1A"/>
+          <w:sz w:val="22"/>
+          <w:szCs w:val="22"/>
+        </w:rPr>
+        <w:t xml:space="preserve">After paying, select the approved voucher, enter the date, method and reference number, and click </w:t>
+      </w:r>
+      <w:r>
+        <w:rPr>
+          <w:rStyle w:val="Strong"/>
+          <w:rFonts w:ascii="Calibri" w:eastAsia="Times New Roman" w:hAnsi="Calibri" w:cs="Calibri"/>
+          <w:color w:val="1A1A1A"/>
+          <w:sz w:val="22"/>
+          <w:szCs w:val="22"/>
+        </w:rPr>
+        <w:t>Record Payout</w:t>
+      </w:r>
+      <w:r>
+        <w:rPr>
+          <w:rFonts w:ascii="Calibri" w:eastAsia="Times New Roman" w:hAnsi="Calibri" w:cs="Calibri"/>
+          <w:color w:val="1A1A1A"/>
+          <w:sz w:val="22"/>
+          <w:szCs w:val="22"/>
+        </w:rPr>
+        <w:t>. The amount must match the voucher.</w:t>
+      </w:r>
+    </w:p>
+    <w:p>
+      <w:pPr>
+        <w:pStyle w:val="NormalWeb"/>
+        <w:rPr>
+          <w:rFonts w:ascii="Calibri" w:hAnsi="Calibri" w:cs="Calibri"/>
+          <w:color w:val="1A1A1A"/>
+          <w:sz w:val="22"/>
+          <w:szCs w:val="22"/>
+        </w:rPr>
+      </w:pPr>
+      <w:r>
+        <w:rPr>
+          <w:rStyle w:val="Strong"/>
+          <w:rFonts w:ascii="Calibri" w:hAnsi="Calibri" w:cs="Calibri"/>
+          <w:color w:val="1A1A1A"/>
+          <w:sz w:val="22"/>
+          <w:szCs w:val="22"/>
+        </w:rPr>
+        <w:t>Retention:</w:t>
+      </w:r>
+      <w:r>
+        <w:rPr>
+          <w:rFonts w:ascii="Calibri" w:hAnsi="Calibri" w:cs="Calibri"/>
+          <w:color w:val="1A1A1A"/>
+          <w:sz w:val="22"/>
+          <w:szCs w:val="22"/>
+        </w:rPr>
+        <w:t xml:space="preserve"> when the job is 100% done (progress update) and every stage is paid, click </w:t>
+      </w:r>
+      <w:r>
+        <w:rPr>
+          <w:rStyle w:val="Strong"/>
+          <w:rFonts w:ascii="Calibri" w:hAnsi="Calibri" w:cs="Calibri"/>
+          <w:color w:val="1A1A1A"/>
+          <w:sz w:val="22"/>
+          <w:szCs w:val="22"/>
+        </w:rPr>
+        <w:t>Release Retention</w:t>
+      </w:r>
+      <w:r>
+        <w:rPr>
+          <w:rFonts w:ascii="Calibri" w:hAnsi="Calibri" w:cs="Calibri"/>
+          <w:color w:val="1A1A1A"/>
+          <w:sz w:val="22"/>
+          <w:szCs w:val="22"/>
+        </w:rPr>
+        <w:t>. That voucher is approved and paid the same way.</w:t>
+      </w:r>
+    </w:p>
+    <w:p>
+      <w:pPr>
+        <w:pStyle w:val="NormalWeb"/>
+        <w:rPr>
+          <w:rFonts w:ascii="Calibri" w:hAnsi="Calibri" w:cs="Calibri"/>
+          <w:color w:val="1A1A1A"/>
+          <w:sz w:val="22"/>
+          <w:szCs w:val="22"/>
+        </w:rPr>
+      </w:pPr>
+      <w:r>
+        <w:rPr>
+          <w:rFonts w:ascii="Calibri" w:hAnsi="Calibri" w:cs="Calibri"/>
+          <w:color w:val="1A1A1A"/>
+          <w:sz w:val="22"/>
+          <w:szCs w:val="22"/>
+        </w:rPr>
+        <w:t>Payouts count as the project's expenses on the Projects page and Dashboard.</w:t>
       </w:r>
     </w:p>
     <w:p>
@@ -6991,9 +7987,9 @@
 <file path=word/numbering.xml><?xml version="1.0" encoding="utf-8"?>
 <w:numbering xmlns:wpc="http://schemas.microsoft.com/office/word/2010/wordprocessingCanvas" xmlns:cx="http://schemas.microsoft.com/office/drawing/2014/chartex" xmlns:cx1="http://schemas.microsoft.com/office/drawing/2015/9/8/chartex" xmlns:cx2="http://schemas.microsoft.com/office/drawing/2015/10/21/chartex" xmlns:cx3="http://schemas.microsoft.com/office/drawing/2016/5/9/chartex" xmlns:cx4="http://schemas.microsoft.com/office/drawing/2016/5/10/chartex" xmlns:cx5="http://schemas.microsoft.com/office/drawing/2016/5/11/chartex" xmlns:cx6="http://schemas.microsoft.com/office/drawing/2016/5/12/chartex" xmlns:cx7="http://schemas.microsoft.com/office/drawing/2016/5/13/chartex" xmlns:cx8="http://schemas.microsoft.com/office/drawing/2016/5/14/chartex" xmlns:mc="http://schemas.openxmlformats.org/markup-compatibility/2006" xmlns:aink="http://schemas.microsoft.com/office/drawing/2016/ink" xmlns:am3d="http://schemas.microsoft.com/office/drawing/2017/model3d" xmlns:o="urn:schemas-microsoft-com:office:office" xmlns:oel="http://schemas.microsoft.com/office/2019/extlst" xmlns:r="http://schemas.openxmlformats.org/officeDocument/2006/relationships" xmlns:m="http://schemas.openxmlformats.org/officeDocument/2006/math" xmlns:v="urn:schemas-microsoft-com:vml" xmlns:wp14="http://schemas.microsoft.com/office/word/2010/wordprocessingDrawing" xmlns:wp="http://schemas.openxmlformats.org/drawingml/2006/wordprocessingDrawing" xmlns:w10="urn:schemas-microsoft-com:office:word" xmlns:w="http://schemas.openxmlformats.org/wordprocessingml/2006/main" xmlns:w14="http://schemas.microsoft.com/office/word/2010/wordml" xmlns:w15="http://schemas.microsoft.com/office/word/2012/wordml" xmlns:w16cex="http://schemas.microsoft.com/office/word/2018/wordml/cex" xmlns:w16cid="http://schemas.microsoft.com/office/word/2016/wordml/cid" xmlns:w16="http://schemas.microsoft.com/office/word/2018/wordml" xmlns:w16du="http://schemas.microsoft.com/office/word/2023/wordml/word16du" xmlns:w16sdtdh="http://schemas.microsoft.com/office/word/2020/wordml/sdtdatahash" xmlns:w16sdtfl="http://schemas.microsoft.com/office/word/2024/wordml/sdtformatlock" xmlns:w16se="http://schemas.microsoft.com/office/word/2015/wordml/symex" xmlns:wpg="http://schemas.microsoft.com/office/word/2010/wordprocessingGroup" xmlns:wpi="http://schemas.microsoft.com/office/word/2010/wordprocessingInk" xmlns:wne="http://schemas.microsoft.com/office/word/2006/wordml" xmlns:wps="http://schemas.microsoft.com/office/word/2010/wordprocessingShape" mc:Ignorable="w14 w15 w16se w16cid w16 w16cex w16sdtdh w16sdtfl w16du wp14">
   <w:abstractNum w:abstractNumId="0" w15:restartNumberingAfterBreak="0">
-    <w:nsid w:val="05680B94"/>
+    <w:nsid w:val="0C4B3804"/>
     <w:multiLevelType w:val="multilevel"/>
-    <w:tmpl w:val="B6AC70FC"/>
+    <w:tmpl w:val="558C5D04"/>
     <w:lvl w:ilvl="0">
       <w:start w:val="1"/>
       <w:numFmt w:val="decimal"/>
@@ -7104,9 +8100,9 @@
     </w:lvl>
   </w:abstractNum>
   <w:abstractNum w:abstractNumId="1" w15:restartNumberingAfterBreak="0">
-    <w:nsid w:val="10B469D1"/>
+    <w:nsid w:val="0DE66782"/>
     <w:multiLevelType w:val="multilevel"/>
-    <w:tmpl w:val="6CAC990C"/>
+    <w:tmpl w:val="47F882C8"/>
     <w:lvl w:ilvl="0">
       <w:start w:val="1"/>
       <w:numFmt w:val="bullet"/>
@@ -7253,9 +8249,9 @@
     </w:lvl>
   </w:abstractNum>
   <w:abstractNum w:abstractNumId="2" w15:restartNumberingAfterBreak="0">
-    <w:nsid w:val="17513F5D"/>
+    <w:nsid w:val="104C749B"/>
     <w:multiLevelType w:val="multilevel"/>
-    <w:tmpl w:val="0F56D128"/>
+    <w:tmpl w:val="38EAB934"/>
     <w:lvl w:ilvl="0">
       <w:start w:val="1"/>
       <w:numFmt w:val="decimal"/>
@@ -7366,9 +8362,9 @@
     </w:lvl>
   </w:abstractNum>
   <w:abstractNum w:abstractNumId="3" w15:restartNumberingAfterBreak="0">
-    <w:nsid w:val="222A5786"/>
+    <w:nsid w:val="111E5777"/>
     <w:multiLevelType w:val="multilevel"/>
-    <w:tmpl w:val="D8C0D46C"/>
+    <w:tmpl w:val="6816720A"/>
     <w:lvl w:ilvl="0">
       <w:start w:val="1"/>
       <w:numFmt w:val="decimal"/>
@@ -7479,9 +8475,9 @@
     </w:lvl>
   </w:abstractNum>
   <w:abstractNum w:abstractNumId="4" w15:restartNumberingAfterBreak="0">
-    <w:nsid w:val="28991DAA"/>
+    <w:nsid w:val="141B7E22"/>
     <w:multiLevelType w:val="multilevel"/>
-    <w:tmpl w:val="845E9140"/>
+    <w:tmpl w:val="538EE7D8"/>
     <w:lvl w:ilvl="0">
       <w:start w:val="1"/>
       <w:numFmt w:val="decimal"/>
@@ -7592,9 +8588,9 @@
     </w:lvl>
   </w:abstractNum>
   <w:abstractNum w:abstractNumId="5" w15:restartNumberingAfterBreak="0">
-    <w:nsid w:val="2B7434BA"/>
+    <w:nsid w:val="14A53377"/>
     <w:multiLevelType w:val="multilevel"/>
-    <w:tmpl w:val="1F36E1D4"/>
+    <w:tmpl w:val="13E23122"/>
     <w:lvl w:ilvl="0">
       <w:start w:val="1"/>
       <w:numFmt w:val="decimal"/>
@@ -7705,9 +8701,235 @@
     </w:lvl>
   </w:abstractNum>
   <w:abstractNum w:abstractNumId="6" w15:restartNumberingAfterBreak="0">
-    <w:nsid w:val="2C131AA3"/>
+    <w:nsid w:val="224201AE"/>
     <w:multiLevelType w:val="multilevel"/>
-    <w:tmpl w:val="4C7C8866"/>
+    <w:tmpl w:val="23968EC6"/>
+    <w:lvl w:ilvl="0">
+      <w:start w:val="1"/>
+      <w:numFmt w:val="decimal"/>
+      <w:lvlText w:val="%1."/>
+      <w:lvlJc w:val="left"/>
+      <w:pPr>
+        <w:tabs>
+          <w:tab w:val="num" w:pos="720"/>
+        </w:tabs>
+        <w:ind w:left="720" w:hanging="360"/>
+      </w:pPr>
+    </w:lvl>
+    <w:lvl w:ilvl="1" w:tentative="1">
+      <w:start w:val="1"/>
+      <w:numFmt w:val="decimal"/>
+      <w:lvlText w:val="%2."/>
+      <w:lvlJc w:val="left"/>
+      <w:pPr>
+        <w:tabs>
+          <w:tab w:val="num" w:pos="1440"/>
+        </w:tabs>
+        <w:ind w:left="1440" w:hanging="360"/>
+      </w:pPr>
+    </w:lvl>
+    <w:lvl w:ilvl="2" w:tentative="1">
+      <w:start w:val="1"/>
+      <w:numFmt w:val="decimal"/>
+      <w:lvlText w:val="%3."/>
+      <w:lvlJc w:val="left"/>
+      <w:pPr>
+        <w:tabs>
+          <w:tab w:val="num" w:pos="2160"/>
+        </w:tabs>
+        <w:ind w:left="2160" w:hanging="360"/>
+      </w:pPr>
+    </w:lvl>
+    <w:lvl w:ilvl="3" w:tentative="1">
+      <w:start w:val="1"/>
+      <w:numFmt w:val="decimal"/>
+      <w:lvlText w:val="%4."/>
+      <w:lvlJc w:val="left"/>
+      <w:pPr>
+        <w:tabs>
+          <w:tab w:val="num" w:pos="2880"/>
+        </w:tabs>
+        <w:ind w:left="2880" w:hanging="360"/>
+      </w:pPr>
+    </w:lvl>
+    <w:lvl w:ilvl="4" w:tentative="1">
+      <w:start w:val="1"/>
+      <w:numFmt w:val="decimal"/>
+      <w:lvlText w:val="%5."/>
+      <w:lvlJc w:val="left"/>
+      <w:pPr>
+        <w:tabs>
+          <w:tab w:val="num" w:pos="3600"/>
+        </w:tabs>
+        <w:ind w:left="3600" w:hanging="360"/>
+      </w:pPr>
+    </w:lvl>
+    <w:lvl w:ilvl="5" w:tentative="1">
+      <w:start w:val="1"/>
+      <w:numFmt w:val="decimal"/>
+      <w:lvlText w:val="%6."/>
+      <w:lvlJc w:val="left"/>
+      <w:pPr>
+        <w:tabs>
+          <w:tab w:val="num" w:pos="4320"/>
+        </w:tabs>
+        <w:ind w:left="4320" w:hanging="360"/>
+      </w:pPr>
+    </w:lvl>
+    <w:lvl w:ilvl="6" w:tentative="1">
+      <w:start w:val="1"/>
+      <w:numFmt w:val="decimal"/>
+      <w:lvlText w:val="%7."/>
+      <w:lvlJc w:val="left"/>
+      <w:pPr>
+        <w:tabs>
+          <w:tab w:val="num" w:pos="5040"/>
+        </w:tabs>
+        <w:ind w:left="5040" w:hanging="360"/>
+      </w:pPr>
+    </w:lvl>
+    <w:lvl w:ilvl="7" w:tentative="1">
+      <w:start w:val="1"/>
+      <w:numFmt w:val="decimal"/>
+      <w:lvlText w:val="%8."/>
+      <w:lvlJc w:val="left"/>
+      <w:pPr>
+        <w:tabs>
+          <w:tab w:val="num" w:pos="5760"/>
+        </w:tabs>
+        <w:ind w:left="5760" w:hanging="360"/>
+      </w:pPr>
+    </w:lvl>
+    <w:lvl w:ilvl="8" w:tentative="1">
+      <w:start w:val="1"/>
+      <w:numFmt w:val="decimal"/>
+      <w:lvlText w:val="%9."/>
+      <w:lvlJc w:val="left"/>
+      <w:pPr>
+        <w:tabs>
+          <w:tab w:val="num" w:pos="6480"/>
+        </w:tabs>
+        <w:ind w:left="6480" w:hanging="360"/>
+      </w:pPr>
+    </w:lvl>
+  </w:abstractNum>
+  <w:abstractNum w:abstractNumId="7" w15:restartNumberingAfterBreak="0">
+    <w:nsid w:val="29071ACB"/>
+    <w:multiLevelType w:val="multilevel"/>
+    <w:tmpl w:val="43127C02"/>
+    <w:lvl w:ilvl="0">
+      <w:start w:val="1"/>
+      <w:numFmt w:val="decimal"/>
+      <w:lvlText w:val="%1."/>
+      <w:lvlJc w:val="left"/>
+      <w:pPr>
+        <w:tabs>
+          <w:tab w:val="num" w:pos="720"/>
+        </w:tabs>
+        <w:ind w:left="720" w:hanging="360"/>
+      </w:pPr>
+    </w:lvl>
+    <w:lvl w:ilvl="1" w:tentative="1">
+      <w:start w:val="1"/>
+      <w:numFmt w:val="decimal"/>
+      <w:lvlText w:val="%2."/>
+      <w:lvlJc w:val="left"/>
+      <w:pPr>
+        <w:tabs>
+          <w:tab w:val="num" w:pos="1440"/>
+        </w:tabs>
+        <w:ind w:left="1440" w:hanging="360"/>
+      </w:pPr>
+    </w:lvl>
+    <w:lvl w:ilvl="2" w:tentative="1">
+      <w:start w:val="1"/>
+      <w:numFmt w:val="decimal"/>
+      <w:lvlText w:val="%3."/>
+      <w:lvlJc w:val="left"/>
+      <w:pPr>
+        <w:tabs>
+          <w:tab w:val="num" w:pos="2160"/>
+        </w:tabs>
+        <w:ind w:left="2160" w:hanging="360"/>
+      </w:pPr>
+    </w:lvl>
+    <w:lvl w:ilvl="3" w:tentative="1">
+      <w:start w:val="1"/>
+      <w:numFmt w:val="decimal"/>
+      <w:lvlText w:val="%4."/>
+      <w:lvlJc w:val="left"/>
+      <w:pPr>
+        <w:tabs>
+          <w:tab w:val="num" w:pos="2880"/>
+        </w:tabs>
+        <w:ind w:left="2880" w:hanging="360"/>
+      </w:pPr>
+    </w:lvl>
+    <w:lvl w:ilvl="4" w:tentative="1">
+      <w:start w:val="1"/>
+      <w:numFmt w:val="decimal"/>
+      <w:lvlText w:val="%5."/>
+      <w:lvlJc w:val="left"/>
+      <w:pPr>
+        <w:tabs>
+          <w:tab w:val="num" w:pos="3600"/>
+        </w:tabs>
+        <w:ind w:left="3600" w:hanging="360"/>
+      </w:pPr>
+    </w:lvl>
+    <w:lvl w:ilvl="5" w:tentative="1">
+      <w:start w:val="1"/>
+      <w:numFmt w:val="decimal"/>
+      <w:lvlText w:val="%6."/>
+      <w:lvlJc w:val="left"/>
+      <w:pPr>
+        <w:tabs>
+          <w:tab w:val="num" w:pos="4320"/>
+        </w:tabs>
+        <w:ind w:left="4320" w:hanging="360"/>
+      </w:pPr>
+    </w:lvl>
+    <w:lvl w:ilvl="6" w:tentative="1">
+      <w:start w:val="1"/>
+      <w:numFmt w:val="decimal"/>
+      <w:lvlText w:val="%7."/>
+      <w:lvlJc w:val="left"/>
+      <w:pPr>
+        <w:tabs>
+          <w:tab w:val="num" w:pos="5040"/>
+        </w:tabs>
+        <w:ind w:left="5040" w:hanging="360"/>
+      </w:pPr>
+    </w:lvl>
+    <w:lvl w:ilvl="7" w:tentative="1">
+      <w:start w:val="1"/>
+      <w:numFmt w:val="decimal"/>
+      <w:lvlText w:val="%8."/>
+      <w:lvlJc w:val="left"/>
+      <w:pPr>
+        <w:tabs>
+          <w:tab w:val="num" w:pos="5760"/>
+        </w:tabs>
+        <w:ind w:left="5760" w:hanging="360"/>
+      </w:pPr>
+    </w:lvl>
+    <w:lvl w:ilvl="8" w:tentative="1">
+      <w:start w:val="1"/>
+      <w:numFmt w:val="decimal"/>
+      <w:lvlText w:val="%9."/>
+      <w:lvlJc w:val="left"/>
+      <w:pPr>
+        <w:tabs>
+          <w:tab w:val="num" w:pos="6480"/>
+        </w:tabs>
+        <w:ind w:left="6480" w:hanging="360"/>
+      </w:pPr>
+    </w:lvl>
+  </w:abstractNum>
+  <w:abstractNum w:abstractNumId="8" w15:restartNumberingAfterBreak="0">
+    <w:nsid w:val="2B534A1F"/>
+    <w:multiLevelType w:val="multilevel"/>
+    <w:tmpl w:val="83585102"/>
     <w:lvl w:ilvl="0">
       <w:start w:val="1"/>
       <w:numFmt w:val="bullet"/>
@@ -7853,10 +9075,10 @@
       </w:rPr>
     </w:lvl>
   </w:abstractNum>
-  <w:abstractNum w:abstractNumId="7" w15:restartNumberingAfterBreak="0">
-    <w:nsid w:val="2EE4225A"/>
+  <w:abstractNum w:abstractNumId="9" w15:restartNumberingAfterBreak="0">
+    <w:nsid w:val="35B64F83"/>
     <w:multiLevelType w:val="multilevel"/>
-    <w:tmpl w:val="402410F0"/>
+    <w:tmpl w:val="4DAC1DEE"/>
     <w:lvl w:ilvl="0">
       <w:start w:val="1"/>
       <w:numFmt w:val="decimal"/>
@@ -7966,10 +9188,10 @@
       </w:pPr>
     </w:lvl>
   </w:abstractNum>
-  <w:abstractNum w:abstractNumId="8" w15:restartNumberingAfterBreak="0">
-    <w:nsid w:val="3C930968"/>
+  <w:abstractNum w:abstractNumId="10" w15:restartNumberingAfterBreak="0">
+    <w:nsid w:val="36522989"/>
     <w:multiLevelType w:val="multilevel"/>
-    <w:tmpl w:val="1B6EBE18"/>
+    <w:tmpl w:val="352683C4"/>
     <w:lvl w:ilvl="0">
       <w:start w:val="1"/>
       <w:numFmt w:val="decimal"/>
@@ -8079,10 +9301,236 @@
       </w:pPr>
     </w:lvl>
   </w:abstractNum>
-  <w:abstractNum w:abstractNumId="9" w15:restartNumberingAfterBreak="0">
-    <w:nsid w:val="56C80F49"/>
+  <w:abstractNum w:abstractNumId="11" w15:restartNumberingAfterBreak="0">
+    <w:nsid w:val="3AFA462D"/>
     <w:multiLevelType w:val="multilevel"/>
-    <w:tmpl w:val="4F4CA6CE"/>
+    <w:tmpl w:val="E56A9DE0"/>
+    <w:lvl w:ilvl="0">
+      <w:start w:val="1"/>
+      <w:numFmt w:val="decimal"/>
+      <w:lvlText w:val="%1."/>
+      <w:lvlJc w:val="left"/>
+      <w:pPr>
+        <w:tabs>
+          <w:tab w:val="num" w:pos="720"/>
+        </w:tabs>
+        <w:ind w:left="720" w:hanging="360"/>
+      </w:pPr>
+    </w:lvl>
+    <w:lvl w:ilvl="1" w:tentative="1">
+      <w:start w:val="1"/>
+      <w:numFmt w:val="decimal"/>
+      <w:lvlText w:val="%2."/>
+      <w:lvlJc w:val="left"/>
+      <w:pPr>
+        <w:tabs>
+          <w:tab w:val="num" w:pos="1440"/>
+        </w:tabs>
+        <w:ind w:left="1440" w:hanging="360"/>
+      </w:pPr>
+    </w:lvl>
+    <w:lvl w:ilvl="2" w:tentative="1">
+      <w:start w:val="1"/>
+      <w:numFmt w:val="decimal"/>
+      <w:lvlText w:val="%3."/>
+      <w:lvlJc w:val="left"/>
+      <w:pPr>
+        <w:tabs>
+          <w:tab w:val="num" w:pos="2160"/>
+        </w:tabs>
+        <w:ind w:left="2160" w:hanging="360"/>
+      </w:pPr>
+    </w:lvl>
+    <w:lvl w:ilvl="3" w:tentative="1">
+      <w:start w:val="1"/>
+      <w:numFmt w:val="decimal"/>
+      <w:lvlText w:val="%4."/>
+      <w:lvlJc w:val="left"/>
+      <w:pPr>
+        <w:tabs>
+          <w:tab w:val="num" w:pos="2880"/>
+        </w:tabs>
+        <w:ind w:left="2880" w:hanging="360"/>
+      </w:pPr>
+    </w:lvl>
+    <w:lvl w:ilvl="4" w:tentative="1">
+      <w:start w:val="1"/>
+      <w:numFmt w:val="decimal"/>
+      <w:lvlText w:val="%5."/>
+      <w:lvlJc w:val="left"/>
+      <w:pPr>
+        <w:tabs>
+          <w:tab w:val="num" w:pos="3600"/>
+        </w:tabs>
+        <w:ind w:left="3600" w:hanging="360"/>
+      </w:pPr>
+    </w:lvl>
+    <w:lvl w:ilvl="5" w:tentative="1">
+      <w:start w:val="1"/>
+      <w:numFmt w:val="decimal"/>
+      <w:lvlText w:val="%6."/>
+      <w:lvlJc w:val="left"/>
+      <w:pPr>
+        <w:tabs>
+          <w:tab w:val="num" w:pos="4320"/>
+        </w:tabs>
+        <w:ind w:left="4320" w:hanging="360"/>
+      </w:pPr>
+    </w:lvl>
+    <w:lvl w:ilvl="6" w:tentative="1">
+      <w:start w:val="1"/>
+      <w:numFmt w:val="decimal"/>
+      <w:lvlText w:val="%7."/>
+      <w:lvlJc w:val="left"/>
+      <w:pPr>
+        <w:tabs>
+          <w:tab w:val="num" w:pos="5040"/>
+        </w:tabs>
+        <w:ind w:left="5040" w:hanging="360"/>
+      </w:pPr>
+    </w:lvl>
+    <w:lvl w:ilvl="7" w:tentative="1">
+      <w:start w:val="1"/>
+      <w:numFmt w:val="decimal"/>
+      <w:lvlText w:val="%8."/>
+      <w:lvlJc w:val="left"/>
+      <w:pPr>
+        <w:tabs>
+          <w:tab w:val="num" w:pos="5760"/>
+        </w:tabs>
+        <w:ind w:left="5760" w:hanging="360"/>
+      </w:pPr>
+    </w:lvl>
+    <w:lvl w:ilvl="8" w:tentative="1">
+      <w:start w:val="1"/>
+      <w:numFmt w:val="decimal"/>
+      <w:lvlText w:val="%9."/>
+      <w:lvlJc w:val="left"/>
+      <w:pPr>
+        <w:tabs>
+          <w:tab w:val="num" w:pos="6480"/>
+        </w:tabs>
+        <w:ind w:left="6480" w:hanging="360"/>
+      </w:pPr>
+    </w:lvl>
+  </w:abstractNum>
+  <w:abstractNum w:abstractNumId="12" w15:restartNumberingAfterBreak="0">
+    <w:nsid w:val="3B781A01"/>
+    <w:multiLevelType w:val="multilevel"/>
+    <w:tmpl w:val="ABC677E2"/>
+    <w:lvl w:ilvl="0">
+      <w:start w:val="1"/>
+      <w:numFmt w:val="decimal"/>
+      <w:lvlText w:val="%1."/>
+      <w:lvlJc w:val="left"/>
+      <w:pPr>
+        <w:tabs>
+          <w:tab w:val="num" w:pos="720"/>
+        </w:tabs>
+        <w:ind w:left="720" w:hanging="360"/>
+      </w:pPr>
+    </w:lvl>
+    <w:lvl w:ilvl="1" w:tentative="1">
+      <w:start w:val="1"/>
+      <w:numFmt w:val="decimal"/>
+      <w:lvlText w:val="%2."/>
+      <w:lvlJc w:val="left"/>
+      <w:pPr>
+        <w:tabs>
+          <w:tab w:val="num" w:pos="1440"/>
+        </w:tabs>
+        <w:ind w:left="1440" w:hanging="360"/>
+      </w:pPr>
+    </w:lvl>
+    <w:lvl w:ilvl="2" w:tentative="1">
+      <w:start w:val="1"/>
+      <w:numFmt w:val="decimal"/>
+      <w:lvlText w:val="%3."/>
+      <w:lvlJc w:val="left"/>
+      <w:pPr>
+        <w:tabs>
+          <w:tab w:val="num" w:pos="2160"/>
+        </w:tabs>
+        <w:ind w:left="2160" w:hanging="360"/>
+      </w:pPr>
+    </w:lvl>
+    <w:lvl w:ilvl="3" w:tentative="1">
+      <w:start w:val="1"/>
+      <w:numFmt w:val="decimal"/>
+      <w:lvlText w:val="%4."/>
+      <w:lvlJc w:val="left"/>
+      <w:pPr>
+        <w:tabs>
+          <w:tab w:val="num" w:pos="2880"/>
+        </w:tabs>
+        <w:ind w:left="2880" w:hanging="360"/>
+      </w:pPr>
+    </w:lvl>
+    <w:lvl w:ilvl="4" w:tentative="1">
+      <w:start w:val="1"/>
+      <w:numFmt w:val="decimal"/>
+      <w:lvlText w:val="%5."/>
+      <w:lvlJc w:val="left"/>
+      <w:pPr>
+        <w:tabs>
+          <w:tab w:val="num" w:pos="3600"/>
+        </w:tabs>
+        <w:ind w:left="3600" w:hanging="360"/>
+      </w:pPr>
+    </w:lvl>
+    <w:lvl w:ilvl="5" w:tentative="1">
+      <w:start w:val="1"/>
+      <w:numFmt w:val="decimal"/>
+      <w:lvlText w:val="%6."/>
+      <w:lvlJc w:val="left"/>
+      <w:pPr>
+        <w:tabs>
+          <w:tab w:val="num" w:pos="4320"/>
+        </w:tabs>
+        <w:ind w:left="4320" w:hanging="360"/>
+      </w:pPr>
+    </w:lvl>
+    <w:lvl w:ilvl="6" w:tentative="1">
+      <w:start w:val="1"/>
+      <w:numFmt w:val="decimal"/>
+      <w:lvlText w:val="%7."/>
+      <w:lvlJc w:val="left"/>
+      <w:pPr>
+        <w:tabs>
+          <w:tab w:val="num" w:pos="5040"/>
+        </w:tabs>
+        <w:ind w:left="5040" w:hanging="360"/>
+      </w:pPr>
+    </w:lvl>
+    <w:lvl w:ilvl="7" w:tentative="1">
+      <w:start w:val="1"/>
+      <w:numFmt w:val="decimal"/>
+      <w:lvlText w:val="%8."/>
+      <w:lvlJc w:val="left"/>
+      <w:pPr>
+        <w:tabs>
+          <w:tab w:val="num" w:pos="5760"/>
+        </w:tabs>
+        <w:ind w:left="5760" w:hanging="360"/>
+      </w:pPr>
+    </w:lvl>
+    <w:lvl w:ilvl="8" w:tentative="1">
+      <w:start w:val="1"/>
+      <w:numFmt w:val="decimal"/>
+      <w:lvlText w:val="%9."/>
+      <w:lvlJc w:val="left"/>
+      <w:pPr>
+        <w:tabs>
+          <w:tab w:val="num" w:pos="6480"/>
+        </w:tabs>
+        <w:ind w:left="6480" w:hanging="360"/>
+      </w:pPr>
+    </w:lvl>
+  </w:abstractNum>
+  <w:abstractNum w:abstractNumId="13" w15:restartNumberingAfterBreak="0">
+    <w:nsid w:val="41C67CF2"/>
+    <w:multiLevelType w:val="multilevel"/>
+    <w:tmpl w:val="341A5868"/>
     <w:lvl w:ilvl="0">
       <w:start w:val="1"/>
       <w:numFmt w:val="bullet"/>
@@ -8228,236 +9676,10 @@
       </w:rPr>
     </w:lvl>
   </w:abstractNum>
-  <w:abstractNum w:abstractNumId="10" w15:restartNumberingAfterBreak="0">
-    <w:nsid w:val="585918CE"/>
+  <w:abstractNum w:abstractNumId="14" w15:restartNumberingAfterBreak="0">
+    <w:nsid w:val="4E4A3197"/>
     <w:multiLevelType w:val="multilevel"/>
-    <w:tmpl w:val="ABD0FFF0"/>
-    <w:lvl w:ilvl="0">
-      <w:start w:val="1"/>
-      <w:numFmt w:val="decimal"/>
-      <w:lvlText w:val="%1."/>
-      <w:lvlJc w:val="left"/>
-      <w:pPr>
-        <w:tabs>
-          <w:tab w:val="num" w:pos="720"/>
-        </w:tabs>
-        <w:ind w:left="720" w:hanging="360"/>
-      </w:pPr>
-    </w:lvl>
-    <w:lvl w:ilvl="1" w:tentative="1">
-      <w:start w:val="1"/>
-      <w:numFmt w:val="decimal"/>
-      <w:lvlText w:val="%2."/>
-      <w:lvlJc w:val="left"/>
-      <w:pPr>
-        <w:tabs>
-          <w:tab w:val="num" w:pos="1440"/>
-        </w:tabs>
-        <w:ind w:left="1440" w:hanging="360"/>
-      </w:pPr>
-    </w:lvl>
-    <w:lvl w:ilvl="2" w:tentative="1">
-      <w:start w:val="1"/>
-      <w:numFmt w:val="decimal"/>
-      <w:lvlText w:val="%3."/>
-      <w:lvlJc w:val="left"/>
-      <w:pPr>
-        <w:tabs>
-          <w:tab w:val="num" w:pos="2160"/>
-        </w:tabs>
-        <w:ind w:left="2160" w:hanging="360"/>
-      </w:pPr>
-    </w:lvl>
-    <w:lvl w:ilvl="3" w:tentative="1">
-      <w:start w:val="1"/>
-      <w:numFmt w:val="decimal"/>
-      <w:lvlText w:val="%4."/>
-      <w:lvlJc w:val="left"/>
-      <w:pPr>
-        <w:tabs>
-          <w:tab w:val="num" w:pos="2880"/>
-        </w:tabs>
-        <w:ind w:left="2880" w:hanging="360"/>
-      </w:pPr>
-    </w:lvl>
-    <w:lvl w:ilvl="4" w:tentative="1">
-      <w:start w:val="1"/>
-      <w:numFmt w:val="decimal"/>
-      <w:lvlText w:val="%5."/>
-      <w:lvlJc w:val="left"/>
-      <w:pPr>
-        <w:tabs>
-          <w:tab w:val="num" w:pos="3600"/>
-        </w:tabs>
-        <w:ind w:left="3600" w:hanging="360"/>
-      </w:pPr>
-    </w:lvl>
-    <w:lvl w:ilvl="5" w:tentative="1">
-      <w:start w:val="1"/>
-      <w:numFmt w:val="decimal"/>
-      <w:lvlText w:val="%6."/>
-      <w:lvlJc w:val="left"/>
-      <w:pPr>
-        <w:tabs>
-          <w:tab w:val="num" w:pos="4320"/>
-        </w:tabs>
-        <w:ind w:left="4320" w:hanging="360"/>
-      </w:pPr>
-    </w:lvl>
-    <w:lvl w:ilvl="6" w:tentative="1">
-      <w:start w:val="1"/>
-      <w:numFmt w:val="decimal"/>
-      <w:lvlText w:val="%7."/>
-      <w:lvlJc w:val="left"/>
-      <w:pPr>
-        <w:tabs>
-          <w:tab w:val="num" w:pos="5040"/>
-        </w:tabs>
-        <w:ind w:left="5040" w:hanging="360"/>
-      </w:pPr>
-    </w:lvl>
-    <w:lvl w:ilvl="7" w:tentative="1">
-      <w:start w:val="1"/>
-      <w:numFmt w:val="decimal"/>
-      <w:lvlText w:val="%8."/>
-      <w:lvlJc w:val="left"/>
-      <w:pPr>
-        <w:tabs>
-          <w:tab w:val="num" w:pos="5760"/>
-        </w:tabs>
-        <w:ind w:left="5760" w:hanging="360"/>
-      </w:pPr>
-    </w:lvl>
-    <w:lvl w:ilvl="8" w:tentative="1">
-      <w:start w:val="1"/>
-      <w:numFmt w:val="decimal"/>
-      <w:lvlText w:val="%9."/>
-      <w:lvlJc w:val="left"/>
-      <w:pPr>
-        <w:tabs>
-          <w:tab w:val="num" w:pos="6480"/>
-        </w:tabs>
-        <w:ind w:left="6480" w:hanging="360"/>
-      </w:pPr>
-    </w:lvl>
-  </w:abstractNum>
-  <w:abstractNum w:abstractNumId="11" w15:restartNumberingAfterBreak="0">
-    <w:nsid w:val="59706EED"/>
-    <w:multiLevelType w:val="multilevel"/>
-    <w:tmpl w:val="933E50B8"/>
-    <w:lvl w:ilvl="0">
-      <w:start w:val="1"/>
-      <w:numFmt w:val="decimal"/>
-      <w:lvlText w:val="%1."/>
-      <w:lvlJc w:val="left"/>
-      <w:pPr>
-        <w:tabs>
-          <w:tab w:val="num" w:pos="720"/>
-        </w:tabs>
-        <w:ind w:left="720" w:hanging="360"/>
-      </w:pPr>
-    </w:lvl>
-    <w:lvl w:ilvl="1" w:tentative="1">
-      <w:start w:val="1"/>
-      <w:numFmt w:val="decimal"/>
-      <w:lvlText w:val="%2."/>
-      <w:lvlJc w:val="left"/>
-      <w:pPr>
-        <w:tabs>
-          <w:tab w:val="num" w:pos="1440"/>
-        </w:tabs>
-        <w:ind w:left="1440" w:hanging="360"/>
-      </w:pPr>
-    </w:lvl>
-    <w:lvl w:ilvl="2" w:tentative="1">
-      <w:start w:val="1"/>
-      <w:numFmt w:val="decimal"/>
-      <w:lvlText w:val="%3."/>
-      <w:lvlJc w:val="left"/>
-      <w:pPr>
-        <w:tabs>
-          <w:tab w:val="num" w:pos="2160"/>
-        </w:tabs>
-        <w:ind w:left="2160" w:hanging="360"/>
-      </w:pPr>
-    </w:lvl>
-    <w:lvl w:ilvl="3" w:tentative="1">
-      <w:start w:val="1"/>
-      <w:numFmt w:val="decimal"/>
-      <w:lvlText w:val="%4."/>
-      <w:lvlJc w:val="left"/>
-      <w:pPr>
-        <w:tabs>
-          <w:tab w:val="num" w:pos="2880"/>
-        </w:tabs>
-        <w:ind w:left="2880" w:hanging="360"/>
-      </w:pPr>
-    </w:lvl>
-    <w:lvl w:ilvl="4" w:tentative="1">
-      <w:start w:val="1"/>
-      <w:numFmt w:val="decimal"/>
-      <w:lvlText w:val="%5."/>
-      <w:lvlJc w:val="left"/>
-      <w:pPr>
-        <w:tabs>
-          <w:tab w:val="num" w:pos="3600"/>
-        </w:tabs>
-        <w:ind w:left="3600" w:hanging="360"/>
-      </w:pPr>
-    </w:lvl>
-    <w:lvl w:ilvl="5" w:tentative="1">
-      <w:start w:val="1"/>
-      <w:numFmt w:val="decimal"/>
-      <w:lvlText w:val="%6."/>
-      <w:lvlJc w:val="left"/>
-      <w:pPr>
-        <w:tabs>
-          <w:tab w:val="num" w:pos="4320"/>
-        </w:tabs>
-        <w:ind w:left="4320" w:hanging="360"/>
-      </w:pPr>
-    </w:lvl>
-    <w:lvl w:ilvl="6" w:tentative="1">
-      <w:start w:val="1"/>
-      <w:numFmt w:val="decimal"/>
-      <w:lvlText w:val="%7."/>
-      <w:lvlJc w:val="left"/>
-      <w:pPr>
-        <w:tabs>
-          <w:tab w:val="num" w:pos="5040"/>
-        </w:tabs>
-        <w:ind w:left="5040" w:hanging="360"/>
-      </w:pPr>
-    </w:lvl>
-    <w:lvl w:ilvl="7" w:tentative="1">
-      <w:start w:val="1"/>
-      <w:numFmt w:val="decimal"/>
-      <w:lvlText w:val="%8."/>
-      <w:lvlJc w:val="left"/>
-      <w:pPr>
-        <w:tabs>
-          <w:tab w:val="num" w:pos="5760"/>
-        </w:tabs>
-        <w:ind w:left="5760" w:hanging="360"/>
-      </w:pPr>
-    </w:lvl>
-    <w:lvl w:ilvl="8" w:tentative="1">
-      <w:start w:val="1"/>
-      <w:numFmt w:val="decimal"/>
-      <w:lvlText w:val="%9."/>
-      <w:lvlJc w:val="left"/>
-      <w:pPr>
-        <w:tabs>
-          <w:tab w:val="num" w:pos="6480"/>
-        </w:tabs>
-        <w:ind w:left="6480" w:hanging="360"/>
-      </w:pPr>
-    </w:lvl>
-  </w:abstractNum>
-  <w:abstractNum w:abstractNumId="12" w15:restartNumberingAfterBreak="0">
-    <w:nsid w:val="682E0846"/>
-    <w:multiLevelType w:val="multilevel"/>
-    <w:tmpl w:val="265E509E"/>
+    <w:tmpl w:val="4D2C0B3E"/>
     <w:lvl w:ilvl="0">
       <w:start w:val="1"/>
       <w:numFmt w:val="bullet"/>
@@ -8603,10 +9825,236 @@
       </w:rPr>
     </w:lvl>
   </w:abstractNum>
-  <w:abstractNum w:abstractNumId="13" w15:restartNumberingAfterBreak="0">
-    <w:nsid w:val="68C5131F"/>
+  <w:abstractNum w:abstractNumId="15" w15:restartNumberingAfterBreak="0">
+    <w:nsid w:val="58A152EC"/>
     <w:multiLevelType w:val="multilevel"/>
-    <w:tmpl w:val="60FE7E2E"/>
+    <w:tmpl w:val="FC74B74E"/>
+    <w:lvl w:ilvl="0">
+      <w:start w:val="1"/>
+      <w:numFmt w:val="decimal"/>
+      <w:lvlText w:val="%1."/>
+      <w:lvlJc w:val="left"/>
+      <w:pPr>
+        <w:tabs>
+          <w:tab w:val="num" w:pos="720"/>
+        </w:tabs>
+        <w:ind w:left="720" w:hanging="360"/>
+      </w:pPr>
+    </w:lvl>
+    <w:lvl w:ilvl="1" w:tentative="1">
+      <w:start w:val="1"/>
+      <w:numFmt w:val="decimal"/>
+      <w:lvlText w:val="%2."/>
+      <w:lvlJc w:val="left"/>
+      <w:pPr>
+        <w:tabs>
+          <w:tab w:val="num" w:pos="1440"/>
+        </w:tabs>
+        <w:ind w:left="1440" w:hanging="360"/>
+      </w:pPr>
+    </w:lvl>
+    <w:lvl w:ilvl="2" w:tentative="1">
+      <w:start w:val="1"/>
+      <w:numFmt w:val="decimal"/>
+      <w:lvlText w:val="%3."/>
+      <w:lvlJc w:val="left"/>
+      <w:pPr>
+        <w:tabs>
+          <w:tab w:val="num" w:pos="2160"/>
+        </w:tabs>
+        <w:ind w:left="2160" w:hanging="360"/>
+      </w:pPr>
+    </w:lvl>
+    <w:lvl w:ilvl="3" w:tentative="1">
+      <w:start w:val="1"/>
+      <w:numFmt w:val="decimal"/>
+      <w:lvlText w:val="%4."/>
+      <w:lvlJc w:val="left"/>
+      <w:pPr>
+        <w:tabs>
+          <w:tab w:val="num" w:pos="2880"/>
+        </w:tabs>
+        <w:ind w:left="2880" w:hanging="360"/>
+      </w:pPr>
+    </w:lvl>
+    <w:lvl w:ilvl="4" w:tentative="1">
+      <w:start w:val="1"/>
+      <w:numFmt w:val="decimal"/>
+      <w:lvlText w:val="%5."/>
+      <w:lvlJc w:val="left"/>
+      <w:pPr>
+        <w:tabs>
+          <w:tab w:val="num" w:pos="3600"/>
+        </w:tabs>
+        <w:ind w:left="3600" w:hanging="360"/>
+      </w:pPr>
+    </w:lvl>
+    <w:lvl w:ilvl="5" w:tentative="1">
+      <w:start w:val="1"/>
+      <w:numFmt w:val="decimal"/>
+      <w:lvlText w:val="%6."/>
+      <w:lvlJc w:val="left"/>
+      <w:pPr>
+        <w:tabs>
+          <w:tab w:val="num" w:pos="4320"/>
+        </w:tabs>
+        <w:ind w:left="4320" w:hanging="360"/>
+      </w:pPr>
+    </w:lvl>
+    <w:lvl w:ilvl="6" w:tentative="1">
+      <w:start w:val="1"/>
+      <w:numFmt w:val="decimal"/>
+      <w:lvlText w:val="%7."/>
+      <w:lvlJc w:val="left"/>
+      <w:pPr>
+        <w:tabs>
+          <w:tab w:val="num" w:pos="5040"/>
+        </w:tabs>
+        <w:ind w:left="5040" w:hanging="360"/>
+      </w:pPr>
+    </w:lvl>
+    <w:lvl w:ilvl="7" w:tentative="1">
+      <w:start w:val="1"/>
+      <w:numFmt w:val="decimal"/>
+      <w:lvlText w:val="%8."/>
+      <w:lvlJc w:val="left"/>
+      <w:pPr>
+        <w:tabs>
+          <w:tab w:val="num" w:pos="5760"/>
+        </w:tabs>
+        <w:ind w:left="5760" w:hanging="360"/>
+      </w:pPr>
+    </w:lvl>
+    <w:lvl w:ilvl="8" w:tentative="1">
+      <w:start w:val="1"/>
+      <w:numFmt w:val="decimal"/>
+      <w:lvlText w:val="%9."/>
+      <w:lvlJc w:val="left"/>
+      <w:pPr>
+        <w:tabs>
+          <w:tab w:val="num" w:pos="6480"/>
+        </w:tabs>
+        <w:ind w:left="6480" w:hanging="360"/>
+      </w:pPr>
+    </w:lvl>
+  </w:abstractNum>
+  <w:abstractNum w:abstractNumId="16" w15:restartNumberingAfterBreak="0">
+    <w:nsid w:val="59AA2026"/>
+    <w:multiLevelType w:val="multilevel"/>
+    <w:tmpl w:val="2CEA7688"/>
+    <w:lvl w:ilvl="0">
+      <w:start w:val="1"/>
+      <w:numFmt w:val="decimal"/>
+      <w:lvlText w:val="%1."/>
+      <w:lvlJc w:val="left"/>
+      <w:pPr>
+        <w:tabs>
+          <w:tab w:val="num" w:pos="720"/>
+        </w:tabs>
+        <w:ind w:left="720" w:hanging="360"/>
+      </w:pPr>
+    </w:lvl>
+    <w:lvl w:ilvl="1" w:tentative="1">
+      <w:start w:val="1"/>
+      <w:numFmt w:val="decimal"/>
+      <w:lvlText w:val="%2."/>
+      <w:lvlJc w:val="left"/>
+      <w:pPr>
+        <w:tabs>
+          <w:tab w:val="num" w:pos="1440"/>
+        </w:tabs>
+        <w:ind w:left="1440" w:hanging="360"/>
+      </w:pPr>
+    </w:lvl>
+    <w:lvl w:ilvl="2" w:tentative="1">
+      <w:start w:val="1"/>
+      <w:numFmt w:val="decimal"/>
+      <w:lvlText w:val="%3."/>
+      <w:lvlJc w:val="left"/>
+      <w:pPr>
+        <w:tabs>
+          <w:tab w:val="num" w:pos="2160"/>
+        </w:tabs>
+        <w:ind w:left="2160" w:hanging="360"/>
+      </w:pPr>
+    </w:lvl>
+    <w:lvl w:ilvl="3" w:tentative="1">
+      <w:start w:val="1"/>
+      <w:numFmt w:val="decimal"/>
+      <w:lvlText w:val="%4."/>
+      <w:lvlJc w:val="left"/>
+      <w:pPr>
+        <w:tabs>
+          <w:tab w:val="num" w:pos="2880"/>
+        </w:tabs>
+        <w:ind w:left="2880" w:hanging="360"/>
+      </w:pPr>
+    </w:lvl>
+    <w:lvl w:ilvl="4" w:tentative="1">
+      <w:start w:val="1"/>
+      <w:numFmt w:val="decimal"/>
+      <w:lvlText w:val="%5."/>
+      <w:lvlJc w:val="left"/>
+      <w:pPr>
+        <w:tabs>
+          <w:tab w:val="num" w:pos="3600"/>
+        </w:tabs>
+        <w:ind w:left="3600" w:hanging="360"/>
+      </w:pPr>
+    </w:lvl>
+    <w:lvl w:ilvl="5" w:tentative="1">
+      <w:start w:val="1"/>
+      <w:numFmt w:val="decimal"/>
+      <w:lvlText w:val="%6."/>
+      <w:lvlJc w:val="left"/>
+      <w:pPr>
+        <w:tabs>
+          <w:tab w:val="num" w:pos="4320"/>
+        </w:tabs>
+        <w:ind w:left="4320" w:hanging="360"/>
+      </w:pPr>
+    </w:lvl>
+    <w:lvl w:ilvl="6" w:tentative="1">
+      <w:start w:val="1"/>
+      <w:numFmt w:val="decimal"/>
+      <w:lvlText w:val="%7."/>
+      <w:lvlJc w:val="left"/>
+      <w:pPr>
+        <w:tabs>
+          <w:tab w:val="num" w:pos="5040"/>
+        </w:tabs>
+        <w:ind w:left="5040" w:hanging="360"/>
+      </w:pPr>
+    </w:lvl>
+    <w:lvl w:ilvl="7" w:tentative="1">
+      <w:start w:val="1"/>
+      <w:numFmt w:val="decimal"/>
+      <w:lvlText w:val="%8."/>
+      <w:lvlJc w:val="left"/>
+      <w:pPr>
+        <w:tabs>
+          <w:tab w:val="num" w:pos="5760"/>
+        </w:tabs>
+        <w:ind w:left="5760" w:hanging="360"/>
+      </w:pPr>
+    </w:lvl>
+    <w:lvl w:ilvl="8" w:tentative="1">
+      <w:start w:val="1"/>
+      <w:numFmt w:val="decimal"/>
+      <w:lvlText w:val="%9."/>
+      <w:lvlJc w:val="left"/>
+      <w:pPr>
+        <w:tabs>
+          <w:tab w:val="num" w:pos="6480"/>
+        </w:tabs>
+        <w:ind w:left="6480" w:hanging="360"/>
+      </w:pPr>
+    </w:lvl>
+  </w:abstractNum>
+  <w:abstractNum w:abstractNumId="17" w15:restartNumberingAfterBreak="0">
+    <w:nsid w:val="5AAC4C14"/>
+    <w:multiLevelType w:val="multilevel"/>
+    <w:tmpl w:val="C57A759A"/>
     <w:lvl w:ilvl="0">
       <w:start w:val="1"/>
       <w:numFmt w:val="bullet"/>
@@ -8752,14 +10200,14 @@
       </w:rPr>
     </w:lvl>
   </w:abstractNum>
-  <w:abstractNum w:abstractNumId="14" w15:restartNumberingAfterBreak="0">
-    <w:nsid w:val="6C84439E"/>
+  <w:abstractNum w:abstractNumId="18" w15:restartNumberingAfterBreak="0">
+    <w:nsid w:val="62B91924"/>
     <w:multiLevelType w:val="multilevel"/>
-    <w:tmpl w:val="9E768162"/>
+    <w:tmpl w:val="5E38F778"/>
     <w:lvl w:ilvl="0">
       <w:start w:val="1"/>
-      <w:numFmt w:val="decimal"/>
-      <w:lvlText w:val="%1."/>
+      <w:numFmt w:val="bullet"/>
+      <w:lvlText w:val=""/>
       <w:lvlJc w:val="left"/>
       <w:pPr>
         <w:tabs>
@@ -8767,8 +10215,12 @@
         </w:tabs>
         <w:ind w:left="720" w:hanging="360"/>
       </w:pPr>
-    </w:lvl>
-    <w:lvl w:ilvl="1">
+      <w:rPr>
+        <w:rFonts w:ascii="Symbol" w:hAnsi="Symbol" w:hint="default"/>
+        <w:sz w:val="20"/>
+      </w:rPr>
+    </w:lvl>
+    <w:lvl w:ilvl="1" w:tentative="1">
       <w:start w:val="1"/>
       <w:numFmt w:val="bullet"/>
       <w:lvlText w:val="o"/>
@@ -8786,6 +10238,151 @@
     </w:lvl>
     <w:lvl w:ilvl="2" w:tentative="1">
       <w:start w:val="1"/>
+      <w:numFmt w:val="bullet"/>
+      <w:lvlText w:val=""/>
+      <w:lvlJc w:val="left"/>
+      <w:pPr>
+        <w:tabs>
+          <w:tab w:val="num" w:pos="2160"/>
+        </w:tabs>
+        <w:ind w:left="2160" w:hanging="360"/>
+      </w:pPr>
+      <w:rPr>
+        <w:rFonts w:ascii="Wingdings" w:hAnsi="Wingdings" w:hint="default"/>
+        <w:sz w:val="20"/>
+      </w:rPr>
+    </w:lvl>
+    <w:lvl w:ilvl="3" w:tentative="1">
+      <w:start w:val="1"/>
+      <w:numFmt w:val="bullet"/>
+      <w:lvlText w:val=""/>
+      <w:lvlJc w:val="left"/>
+      <w:pPr>
+        <w:tabs>
+          <w:tab w:val="num" w:pos="2880"/>
+        </w:tabs>
+        <w:ind w:left="2880" w:hanging="360"/>
+      </w:pPr>
+      <w:rPr>
+        <w:rFonts w:ascii="Wingdings" w:hAnsi="Wingdings" w:hint="default"/>
+        <w:sz w:val="20"/>
+      </w:rPr>
+    </w:lvl>
+    <w:lvl w:ilvl="4" w:tentative="1">
+      <w:start w:val="1"/>
+      <w:numFmt w:val="bullet"/>
+      <w:lvlText w:val=""/>
+      <w:lvlJc w:val="left"/>
+      <w:pPr>
+        <w:tabs>
+          <w:tab w:val="num" w:pos="3600"/>
+        </w:tabs>
+        <w:ind w:left="3600" w:hanging="360"/>
+      </w:pPr>
+      <w:rPr>
+        <w:rFonts w:ascii="Wingdings" w:hAnsi="Wingdings" w:hint="default"/>
+        <w:sz w:val="20"/>
+      </w:rPr>
+    </w:lvl>
+    <w:lvl w:ilvl="5" w:tentative="1">
+      <w:start w:val="1"/>
+      <w:numFmt w:val="bullet"/>
+      <w:lvlText w:val=""/>
+      <w:lvlJc w:val="left"/>
+      <w:pPr>
+        <w:tabs>
+          <w:tab w:val="num" w:pos="4320"/>
+        </w:tabs>
+        <w:ind w:left="4320" w:hanging="360"/>
+      </w:pPr>
+      <w:rPr>
+        <w:rFonts w:ascii="Wingdings" w:hAnsi="Wingdings" w:hint="default"/>
+        <w:sz w:val="20"/>
+      </w:rPr>
+    </w:lvl>
+    <w:lvl w:ilvl="6" w:tentative="1">
+      <w:start w:val="1"/>
+      <w:numFmt w:val="bullet"/>
+      <w:lvlText w:val=""/>
+      <w:lvlJc w:val="left"/>
+      <w:pPr>
+        <w:tabs>
+          <w:tab w:val="num" w:pos="5040"/>
+        </w:tabs>
+        <w:ind w:left="5040" w:hanging="360"/>
+      </w:pPr>
+      <w:rPr>
+        <w:rFonts w:ascii="Wingdings" w:hAnsi="Wingdings" w:hint="default"/>
+        <w:sz w:val="20"/>
+      </w:rPr>
+    </w:lvl>
+    <w:lvl w:ilvl="7" w:tentative="1">
+      <w:start w:val="1"/>
+      <w:numFmt w:val="bullet"/>
+      <w:lvlText w:val=""/>
+      <w:lvlJc w:val="left"/>
+      <w:pPr>
+        <w:tabs>
+          <w:tab w:val="num" w:pos="5760"/>
+        </w:tabs>
+        <w:ind w:left="5760" w:hanging="360"/>
+      </w:pPr>
+      <w:rPr>
+        <w:rFonts w:ascii="Wingdings" w:hAnsi="Wingdings" w:hint="default"/>
+        <w:sz w:val="20"/>
+      </w:rPr>
+    </w:lvl>
+    <w:lvl w:ilvl="8" w:tentative="1">
+      <w:start w:val="1"/>
+      <w:numFmt w:val="bullet"/>
+      <w:lvlText w:val=""/>
+      <w:lvlJc w:val="left"/>
+      <w:pPr>
+        <w:tabs>
+          <w:tab w:val="num" w:pos="6480"/>
+        </w:tabs>
+        <w:ind w:left="6480" w:hanging="360"/>
+      </w:pPr>
+      <w:rPr>
+        <w:rFonts w:ascii="Wingdings" w:hAnsi="Wingdings" w:hint="default"/>
+        <w:sz w:val="20"/>
+      </w:rPr>
+    </w:lvl>
+  </w:abstractNum>
+  <w:abstractNum w:abstractNumId="19" w15:restartNumberingAfterBreak="0">
+    <w:nsid w:val="7BAC3E75"/>
+    <w:multiLevelType w:val="multilevel"/>
+    <w:tmpl w:val="BEBCD31C"/>
+    <w:lvl w:ilvl="0">
+      <w:start w:val="1"/>
+      <w:numFmt w:val="decimal"/>
+      <w:lvlText w:val="%1."/>
+      <w:lvlJc w:val="left"/>
+      <w:pPr>
+        <w:tabs>
+          <w:tab w:val="num" w:pos="720"/>
+        </w:tabs>
+        <w:ind w:left="720" w:hanging="360"/>
+      </w:pPr>
+    </w:lvl>
+    <w:lvl w:ilvl="1">
+      <w:start w:val="1"/>
+      <w:numFmt w:val="bullet"/>
+      <w:lvlText w:val="o"/>
+      <w:lvlJc w:val="left"/>
+      <w:pPr>
+        <w:tabs>
+          <w:tab w:val="num" w:pos="1440"/>
+        </w:tabs>
+        <w:ind w:left="1440" w:hanging="360"/>
+      </w:pPr>
+      <w:rPr>
+        <w:rFonts w:ascii="Courier New" w:hAnsi="Courier New" w:hint="default"/>
+        <w:sz w:val="20"/>
+      </w:rPr>
+    </w:lvl>
+    <w:lvl w:ilvl="2" w:tentative="1">
+      <w:start w:val="1"/>
       <w:numFmt w:val="decimal"/>
       <w:lvlText w:val="%3."/>
       <w:lvlJc w:val="left"/>
@@ -8869,282 +10466,65 @@
       </w:pPr>
     </w:lvl>
   </w:abstractNum>
-  <w:abstractNum w:abstractNumId="15" w15:restartNumberingAfterBreak="0">
-    <w:nsid w:val="6F723E22"/>
-    <w:multiLevelType w:val="multilevel"/>
-    <w:tmpl w:val="B100F56C"/>
-    <w:lvl w:ilvl="0">
-      <w:start w:val="1"/>
-      <w:numFmt w:val="decimal"/>
-      <w:lvlText w:val="%1."/>
-      <w:lvlJc w:val="left"/>
-      <w:pPr>
-        <w:tabs>
-          <w:tab w:val="num" w:pos="720"/>
-        </w:tabs>
-        <w:ind w:left="720" w:hanging="360"/>
-      </w:pPr>
-    </w:lvl>
-    <w:lvl w:ilvl="1" w:tentative="1">
-      <w:start w:val="1"/>
-      <w:numFmt w:val="decimal"/>
-      <w:lvlText w:val="%2."/>
-      <w:lvlJc w:val="left"/>
-      <w:pPr>
-        <w:tabs>
-          <w:tab w:val="num" w:pos="1440"/>
-        </w:tabs>
-        <w:ind w:left="1440" w:hanging="360"/>
-      </w:pPr>
-    </w:lvl>
-    <w:lvl w:ilvl="2" w:tentative="1">
-      <w:start w:val="1"/>
-      <w:numFmt w:val="decimal"/>
-      <w:lvlText w:val="%3."/>
-      <w:lvlJc w:val="left"/>
-      <w:pPr>
-        <w:tabs>
-          <w:tab w:val="num" w:pos="2160"/>
-        </w:tabs>
-        <w:ind w:left="2160" w:hanging="360"/>
-      </w:pPr>
-    </w:lvl>
-    <w:lvl w:ilvl="3" w:tentative="1">
-      <w:start w:val="1"/>
-      <w:numFmt w:val="decimal"/>
-      <w:lvlText w:val="%4."/>
-      <w:lvlJc w:val="left"/>
-      <w:pPr>
-        <w:tabs>
-          <w:tab w:val="num" w:pos="2880"/>
-        </w:tabs>
-        <w:ind w:left="2880" w:hanging="360"/>
-      </w:pPr>
-    </w:lvl>
-    <w:lvl w:ilvl="4" w:tentative="1">
-      <w:start w:val="1"/>
-      <w:numFmt w:val="decimal"/>
-      <w:lvlText w:val="%5."/>
-      <w:lvlJc w:val="left"/>
-      <w:pPr>
-        <w:tabs>
-          <w:tab w:val="num" w:pos="3600"/>
-        </w:tabs>
-        <w:ind w:left="3600" w:hanging="360"/>
-      </w:pPr>
-    </w:lvl>
-    <w:lvl w:ilvl="5" w:tentative="1">
-      <w:start w:val="1"/>
-      <w:numFmt w:val="decimal"/>
-      <w:lvlText w:val="%6."/>
-      <w:lvlJc w:val="left"/>
-      <w:pPr>
-        <w:tabs>
-          <w:tab w:val="num" w:pos="4320"/>
-        </w:tabs>
-        <w:ind w:left="4320" w:hanging="360"/>
-      </w:pPr>
-    </w:lvl>
-    <w:lvl w:ilvl="6" w:tentative="1">
-      <w:start w:val="1"/>
-      <w:numFmt w:val="decimal"/>
-      <w:lvlText w:val="%7."/>
-      <w:lvlJc w:val="left"/>
-      <w:pPr>
-        <w:tabs>
-          <w:tab w:val="num" w:pos="5040"/>
-        </w:tabs>
-        <w:ind w:left="5040" w:hanging="360"/>
-      </w:pPr>
-    </w:lvl>
-    <w:lvl w:ilvl="7" w:tentative="1">
-      <w:start w:val="1"/>
-      <w:numFmt w:val="decimal"/>
-      <w:lvlText w:val="%8."/>
-      <w:lvlJc w:val="left"/>
-      <w:pPr>
-        <w:tabs>
-          <w:tab w:val="num" w:pos="5760"/>
-        </w:tabs>
-        <w:ind w:left="5760" w:hanging="360"/>
-      </w:pPr>
-    </w:lvl>
-    <w:lvl w:ilvl="8" w:tentative="1">
-      <w:start w:val="1"/>
-      <w:numFmt w:val="decimal"/>
-      <w:lvlText w:val="%9."/>
-      <w:lvlJc w:val="left"/>
-      <w:pPr>
-        <w:tabs>
-          <w:tab w:val="num" w:pos="6480"/>
-        </w:tabs>
-        <w:ind w:left="6480" w:hanging="360"/>
-      </w:pPr>
-    </w:lvl>
-  </w:abstractNum>
-  <w:abstractNum w:abstractNumId="16" w15:restartNumberingAfterBreak="0">
-    <w:nsid w:val="72C82266"/>
-    <w:multiLevelType w:val="multilevel"/>
-    <w:tmpl w:val="C9CE6DD4"/>
-    <w:lvl w:ilvl="0">
-      <w:start w:val="1"/>
-      <w:numFmt w:val="decimal"/>
-      <w:lvlText w:val="%1."/>
-      <w:lvlJc w:val="left"/>
-      <w:pPr>
-        <w:tabs>
-          <w:tab w:val="num" w:pos="720"/>
-        </w:tabs>
-        <w:ind w:left="720" w:hanging="360"/>
-      </w:pPr>
-    </w:lvl>
-    <w:lvl w:ilvl="1" w:tentative="1">
-      <w:start w:val="1"/>
-      <w:numFmt w:val="decimal"/>
-      <w:lvlText w:val="%2."/>
-      <w:lvlJc w:val="left"/>
-      <w:pPr>
-        <w:tabs>
-          <w:tab w:val="num" w:pos="1440"/>
-        </w:tabs>
-        <w:ind w:left="1440" w:hanging="360"/>
-      </w:pPr>
-    </w:lvl>
-    <w:lvl w:ilvl="2" w:tentative="1">
-      <w:start w:val="1"/>
-      <w:numFmt w:val="decimal"/>
-      <w:lvlText w:val="%3."/>
-      <w:lvlJc w:val="left"/>
-      <w:pPr>
-        <w:tabs>
-          <w:tab w:val="num" w:pos="2160"/>
-        </w:tabs>
-        <w:ind w:left="2160" w:hanging="360"/>
-      </w:pPr>
-    </w:lvl>
-    <w:lvl w:ilvl="3" w:tentative="1">
-      <w:start w:val="1"/>
-      <w:numFmt w:val="decimal"/>
-      <w:lvlText w:val="%4."/>
-      <w:lvlJc w:val="left"/>
-      <w:pPr>
-        <w:tabs>
-          <w:tab w:val="num" w:pos="2880"/>
-        </w:tabs>
-        <w:ind w:left="2880" w:hanging="360"/>
-      </w:pPr>
-    </w:lvl>
-    <w:lvl w:ilvl="4" w:tentative="1">
-      <w:start w:val="1"/>
-      <w:numFmt w:val="decimal"/>
-      <w:lvlText w:val="%5."/>
-      <w:lvlJc w:val="left"/>
-      <w:pPr>
-        <w:tabs>
-          <w:tab w:val="num" w:pos="3600"/>
-        </w:tabs>
-        <w:ind w:left="3600" w:hanging="360"/>
-      </w:pPr>
-    </w:lvl>
-    <w:lvl w:ilvl="5" w:tentative="1">
-      <w:start w:val="1"/>
-      <w:numFmt w:val="decimal"/>
-      <w:lvlText w:val="%6."/>
-      <w:lvlJc w:val="left"/>
-      <w:pPr>
-        <w:tabs>
-          <w:tab w:val="num" w:pos="4320"/>
-        </w:tabs>
-        <w:ind w:left="4320" w:hanging="360"/>
-      </w:pPr>
-    </w:lvl>
-    <w:lvl w:ilvl="6" w:tentative="1">
-      <w:start w:val="1"/>
-      <w:numFmt w:val="decimal"/>
-      <w:lvlText w:val="%7."/>
-      <w:lvlJc w:val="left"/>
-      <w:pPr>
-        <w:tabs>
-          <w:tab w:val="num" w:pos="5040"/>
-        </w:tabs>
-        <w:ind w:left="5040" w:hanging="360"/>
-      </w:pPr>
-    </w:lvl>
-    <w:lvl w:ilvl="7" w:tentative="1">
-      <w:start w:val="1"/>
-      <w:numFmt w:val="decimal"/>
-      <w:lvlText w:val="%8."/>
-      <w:lvlJc w:val="left"/>
-      <w:pPr>
-        <w:tabs>
-          <w:tab w:val="num" w:pos="5760"/>
-        </w:tabs>
-        <w:ind w:left="5760" w:hanging="360"/>
-      </w:pPr>
-    </w:lvl>
-    <w:lvl w:ilvl="8" w:tentative="1">
-      <w:start w:val="1"/>
-      <w:numFmt w:val="decimal"/>
-      <w:lvlText w:val="%9."/>
-      <w:lvlJc w:val="left"/>
-      <w:pPr>
-        <w:tabs>
-          <w:tab w:val="num" w:pos="6480"/>
-        </w:tabs>
-        <w:ind w:left="6480" w:hanging="360"/>
-      </w:pPr>
-    </w:lvl>
-  </w:abstractNum>
-  <w:num w:numId="1" w16cid:durableId="588658421">
+  <w:num w:numId="1" w16cid:durableId="1005790333">
+    <w:abstractNumId w:val="12"/>
+  </w:num>
+  <w:num w:numId="2" w16cid:durableId="1552185558">
+    <w:abstractNumId w:val="2"/>
+  </w:num>
+  <w:num w:numId="3" w16cid:durableId="1404138574">
+    <w:abstractNumId w:val="6"/>
+  </w:num>
+  <w:num w:numId="4" w16cid:durableId="2147114299">
     <w:abstractNumId w:val="7"/>
   </w:num>
-  <w:num w:numId="2" w16cid:durableId="77287500">
+  <w:num w:numId="5" w16cid:durableId="1836604046">
+    <w:abstractNumId w:val="15"/>
+  </w:num>
+  <w:num w:numId="6" w16cid:durableId="1532108955">
+    <w:abstractNumId w:val="14"/>
+  </w:num>
+  <w:num w:numId="7" w16cid:durableId="1634362345">
+    <w:abstractNumId w:val="1"/>
+  </w:num>
+  <w:num w:numId="8" w16cid:durableId="1218125718">
+    <w:abstractNumId w:val="10"/>
+  </w:num>
+  <w:num w:numId="9" w16cid:durableId="545988728">
+    <w:abstractNumId w:val="8"/>
+  </w:num>
+  <w:num w:numId="10" w16cid:durableId="903218102">
+    <w:abstractNumId w:val="18"/>
+  </w:num>
+  <w:num w:numId="11" w16cid:durableId="799112040">
+    <w:abstractNumId w:val="3"/>
+  </w:num>
+  <w:num w:numId="12" w16cid:durableId="1029602983">
+    <w:abstractNumId w:val="19"/>
+  </w:num>
+  <w:num w:numId="13" w16cid:durableId="2036495369">
+    <w:abstractNumId w:val="4"/>
+  </w:num>
+  <w:num w:numId="14" w16cid:durableId="2024085498">
+    <w:abstractNumId w:val="13"/>
+  </w:num>
+  <w:num w:numId="15" w16cid:durableId="2043361117">
     <w:abstractNumId w:val="0"/>
   </w:num>
-  <w:num w:numId="3" w16cid:durableId="1976179768">
+  <w:num w:numId="16" w16cid:durableId="152989485">
+    <w:abstractNumId w:val="11"/>
+  </w:num>
+  <w:num w:numId="17" w16cid:durableId="1295215038">
     <w:abstractNumId w:val="16"/>
   </w:num>
-  <w:num w:numId="4" w16cid:durableId="447093566">
-    <w:abstractNumId w:val="11"/>
+  <w:num w:numId="18" w16cid:durableId="469909168">
+    <w:abstractNumId w:val="17"/>
   </w:num>
-  <w:num w:numId="5" w16cid:durableId="386145168">
-    <w:abstractNumId w:val="10"/>
-  </w:num>
-  <w:num w:numId="6" w16cid:durableId="1755396889">
-    <w:abstractNumId w:val="1"/>
-  </w:num>
-  <w:num w:numId="7" w16cid:durableId="348219532">
-    <w:abstractNumId w:val="13"/>
-  </w:num>
-  <w:num w:numId="8" w16cid:durableId="2053311935">
-    <w:abstractNumId w:val="3"/>
-  </w:num>
-  <w:num w:numId="9" w16cid:durableId="425227820">
-    <w:abstractNumId w:val="6"/>
-  </w:num>
-  <w:num w:numId="10" w16cid:durableId="1888103644">
+  <w:num w:numId="19" w16cid:durableId="1378772618">
     <w:abstractNumId w:val="9"/>
   </w:num>
-  <w:num w:numId="11" w16cid:durableId="398946144">
+  <w:num w:numId="20" w16cid:durableId="838428163">
     <w:abstractNumId w:val="5"/>
-  </w:num>
-  <w:num w:numId="12" w16cid:durableId="1964071382">
-    <w:abstractNumId w:val="14"/>
-  </w:num>
-  <w:num w:numId="13" w16cid:durableId="445152200">
-    <w:abstractNumId w:val="8"/>
-  </w:num>
-  <w:num w:numId="14" w16cid:durableId="345135903">
-    <w:abstractNumId w:val="12"/>
-  </w:num>
-  <w:num w:numId="15" w16cid:durableId="2076269531">
-    <w:abstractNumId w:val="15"/>
-  </w:num>
-  <w:num w:numId="16" w16cid:durableId="962882768">
-    <w:abstractNumId w:val="2"/>
-  </w:num>
-  <w:num w:numId="17" w16cid:durableId="1635913980">
-    <w:abstractNumId w:val="4"/>
   </w:num>
 </w:numbering>
 </file>

</xml_diff>